<commit_message>
Apply reviewer fixes: colour-blind-safe figures, historical counterfactual uncertainty note, add reproduce.sh, rebuild manuscript
- Figure 2 uses plasma sequential palette; Figure 3 uses blue/vermillion colour-blind-safe diverging palette.

- Figure 3 caption/figure title note point-estimate uncertainty.

- Add top-level reproduce.sh to regenerate all results and manuscript.

- Rebuild docx, md, pptx, pdf and figures from latest results.

Co-Authored-By: Tatsuki Onishi <bougtoir@gmail.com>
</commit_message>
<xml_diff>
--- a/researcher_mobility_ode/docs/manuscript_full_article.docx
+++ b/researcher_mobility_ode/docs/manuscript_full_article.docx
@@ -28,7 +28,7 @@
         <w:jc w:val="center"/>
       </w:pPr>
       <w:r>
-        <w:t>Approximate word count (main text incl. tables, excl. references): 7525</w:t>
+        <w:t>Approximate word count (main text incl. tables, excl. references): 7786</w:t>
       </w:r>
     </w:p>
     <w:p>
@@ -54,7 +54,7 @@
     </w:p>
     <w:p>
       <w:r>
-        <w:t>Artificial intelligence (AI) and machine learning (ML) research is increasingly concentrated in a few regions, raising the risk that smaller research communities fall below a minimum viable coauthor pool and cannot recover. We model each civilisation as a six-compartment system of domestic and abroad early-career, high-impact, and principal-investigator researchers, and estimate transition rates from OpenAlex Artificial Intelligence works (subfield 1702). The minimum viable coauthor threshold is defined as M = k × c_bar, where c_bar is the mean number of authors per work and k is the median number of distinct last-author groups observed per recent year. Across 9 groups, equilibrium domestic active pools remain above their thresholds, but the closest point of no return is observed for the Other Civilizations group, where a proportional change of 0.75 in I0 (critical factor 0.25×) would drive the active pool to its threshold. Dropout is the most powerful positive policy lever: reducing it by 10% yields the largest margin gain per unit effort in every group. Historical and saturating-inflow counterfactuals show that the model is most sensitive to exogenous entry and attrition. These results provide a quantitative framework for early, safety-factor-bound interventions that preserve civilisational diversity in AI/ML research.</w:t>
+        <w:t>Artificial intelligence (AI) and machine learning (ML) research is increasingly concentrated in a few regions, raising the risk that smaller research communities fall below a minimum viable coauthor pool and cannot recover. We model each civilisation as a six-compartment system of domestic and abroad early-career, high-impact, and principal-investigator researchers, and estimate transition rates from OpenAlex Artificial Intelligence works (subfield 1702). The minimum viable coauthor threshold is defined as M = k × c_bar, where c_bar is the mean number of authors per work and k is the median number of distinct last-author groups observed per recent year. Across 9 groups, equilibrium domestic active pools remain above their thresholds, but the closest point of no return is observed for the Other Civilizations group, where a proportional change of 0.75 in I0 (critical factor 0.25×) would drive the active pool to its threshold. A 10% simulated reduction in dropout yields the largest margin gain per unit proportional change in every group, making it the most sensitive transition lever in the model. Historical and saturating-inflow counterfactuals show that the model is most sensitive to exogenous entry and attrition. These results provide a quantitative framework for early, safety-factor-bound policy scenarios that preserve civilisational diversity in AI/ML research.</w:t>
       </w:r>
     </w:p>
     <w:p>
@@ -97,7 +97,7 @@
         <w:pStyle w:val="ListBullet"/>
       </w:pPr>
       <w:r>
-        <w:t>Reducing researcher dropout is the largest positive lever across all groups.</w:t>
+        <w:t>Simulated dropout reduction yields the largest margin gain per unit proportional change across all groups.</w:t>
       </w:r>
     </w:p>
     <w:p>
@@ -204,7 +204,7 @@
         <w:rPr>
           <w:vertAlign w:val="superscript"/>
         </w:rPr>
-        <w:t>[6]</w:t>
+        <w:t>[2]</w:t>
       </w:r>
       <w:r>
         <w:t>, and their development depends on a relatively small, highly mobile workforce of doctoral and post-doctoral researchers, principal investigators, and research engineers</w:t>
@@ -213,7 +213,7 @@
         <w:rPr>
           <w:vertAlign w:val="superscript"/>
         </w:rPr>
-        <w:t>[6]</w:t>
+        <w:t>[2]</w:t>
       </w:r>
       <w:r>
         <w:t>. The geographic concentration of this workforce has generated both scientific and geopolitical concern. Policymakers in the United States, China, Europe, Japan, India and elsewhere now treat AI talent as a strategic input, and several governments have introduced incentives to attract or retain researchers</w:t>
@@ -222,7 +222,7 @@
         <w:rPr>
           <w:vertAlign w:val="superscript"/>
         </w:rPr>
-        <w:t>[5]</w:t>
+        <w:t>[3]</w:t>
       </w:r>
       <w:r>
         <w:t>. Most of those policies are evaluated by their immediate net-flow effects. They rarely ask which transition in the career pipeline is the binding constraint, or how close a community is to a threshold where the field can no longer sustain itself. The economic literature on science has long emphasised that researchers are a scarce input and that their mobility responds to career incentives and institutional quality</w:t>
@@ -231,7 +231,7 @@
         <w:rPr>
           <w:vertAlign w:val="superscript"/>
         </w:rPr>
-        <w:t>[15]</w:t>
+        <w:t>[4]</w:t>
       </w:r>
       <w:r>
         <w:t>. That literature provides the microfoundation for our rates: individuals decide where to train, whether to go abroad, when to return, and when to leave academia. We aggregate those individual decisions into civilisation-level transition rates and ask what the resulting dynamics imply for community survival.</w:t>
@@ -245,7 +245,7 @@
         <w:rPr>
           <w:vertAlign w:val="superscript"/>
         </w:rPr>
-        <w:t>[2]</w:t>
+        <w:t>[5]</w:t>
       </w:r>
       <w:r>
         <w:t>. We adapt Huntington's nine civilisations for AI/ML mobility by keeping the United States, China (Sinic), India (Hindu), Japan, and the Islamic world as distinct groups, splitting the Western bloc into the United States, Anglosphere excluding the United States, Continental Europe and Other Western, and merging the smaller Latin American, Orthodox and African communities into Other Civilizations. This grouping reflects the empirical size and mobility patterns observed in the data rather than a normative claim about civilisational identity.</w:t>
@@ -259,7 +259,7 @@
         <w:rPr>
           <w:vertAlign w:val="superscript"/>
         </w:rPr>
-        <w:t>[11]</w:t>
+        <w:t>[6]</w:t>
       </w:r>
       <w:r>
         <w:t>. A diverse ecosystem generates competing approaches, which increases the probability that unexpected breakthroughs and error correction survive</w:t>
@@ -268,7 +268,7 @@
         <w:rPr>
           <w:vertAlign w:val="superscript"/>
         </w:rPr>
-        <w:t>[11]</w:t>
+        <w:t>[6]</w:t>
       </w:r>
       <w:r>
         <w:t>. If transition rates can be observed with enough temporal resolution, policy can intervene before a community reaches the point of no return. Early, proportionate interventions can prevent the emergence of a monopoly or oligopoly without requiring large ex post rescues.</w:t>
@@ -287,7 +287,7 @@
         <w:rPr>
           <w:vertAlign w:val="superscript"/>
         </w:rPr>
-        <w:t>[3]</w:t>
+        <w:t>[7]</w:t>
       </w:r>
       <w:r>
         <w:t>. The model is intentionally simple: it does not explain why a rate is high or low, but it identifies which rate is closest to a threshold and therefore where early intervention is most urgent.</w:t>
@@ -309,7 +309,7 @@
         <w:rPr>
           <w:vertAlign w:val="superscript"/>
         </w:rPr>
-        <w:t>[4]</w:t>
+        <w:t>[8]</w:t>
       </w:r>
       <w:r>
         <w:t>. Thorn and Holm-Nielsen argue that the mobility of researchers from developing countries can become a gain when return migration and diaspora networks are supported, but it can become a drain when local research environments cannot retain or reproduce talent</w:t>
@@ -318,7 +318,7 @@
         <w:rPr>
           <w:vertAlign w:val="superscript"/>
         </w:rPr>
-        <w:t>[4]</w:t>
+        <w:t>[8]</w:t>
       </w:r>
       <w:r>
         <w:t>. Appelt et al., using a gravity framework for 1996-2011, find that scientific collaboration, economic convergence and visa restrictions are the strongest correlates of bilateral mobility</w:t>
@@ -327,7 +327,7 @@
         <w:rPr>
           <w:vertAlign w:val="superscript"/>
         </w:rPr>
-        <w:t>[5]</w:t>
+        <w:t>[3]</w:t>
       </w:r>
       <w:r>
         <w:t>. Their analysis shows that mobility is multi-directional: a large share of researcher movement is better described as circulation than as one-way migration.</w:t>
@@ -341,7 +341,7 @@
         <w:rPr>
           <w:vertAlign w:val="superscript"/>
         </w:rPr>
-        <w:t>[6]</w:t>
+        <w:t>[2]</w:t>
       </w:r>
       <w:r>
         <w:t>. AlShebli et al. show that U.S.-China collaboration in AI is more impactful than either country working alone, and that most mobile AI scientists retain collaboration links with their origin country</w:t>
@@ -350,7 +350,7 @@
         <w:rPr>
           <w:vertAlign w:val="superscript"/>
         </w:rPr>
-        <w:t>[7]</w:t>
+        <w:t>[9]</w:t>
       </w:r>
       <w:r>
         <w:t>. Yuan et al. find that the brain-drain problem for AI scientists is increasingly serious in developing countries, and that the ties among AI elites are highly clustered</w:t>
@@ -359,7 +359,7 @@
         <w:rPr>
           <w:vertAlign w:val="superscript"/>
         </w:rPr>
-        <w:t>[8]</w:t>
+        <w:t>[10]</w:t>
       </w:r>
       <w:r>
         <w:t>. These studies establish that AI/ML talent is mobile, concentrated and strategically important.</w:t>
@@ -373,7 +373,7 @@
         <w:rPr>
           <w:vertAlign w:val="superscript"/>
         </w:rPr>
-        <w:t>[9]</w:t>
+        <w:t>[11]</w:t>
       </w:r>
       <w:r>
         <w:t>. Transferred to science, the equivalent idea is a minimum viable coauthor pool: the smallest number of active researchers that can continue to produce work at the field's observed coauthor intensity. Below that pool, collaboration networks fragment, mentorship chains break, and the field enters a self-reinforcing decline.</w:t>
@@ -392,7 +392,7 @@
         <w:rPr>
           <w:vertAlign w:val="superscript"/>
         </w:rPr>
-        <w:t>[11]</w:t>
+        <w:t>[6]</w:t>
       </w:r>
       <w:r>
         <w:t>. Translated to global science, this suggests that a single dominant region or a tight oligopoly may slow the rate of methodological and conceptual breakthroughs. Maintaining multiple centres of AI/ML research is therefore not merely a distributional concern; it may increase the long-run productivity of the field.</w:t>
@@ -422,7 +422,7 @@
         <w:rPr>
           <w:vertAlign w:val="superscript"/>
         </w:rPr>
-        <w:t>[10]</w:t>
+        <w:t>[12]</w:t>
       </w:r>
       <w:r>
         <w:t>. That work consistently finds that the United States, parts of Europe and, increasingly, China and India are central nodes in the global mobility network. It also finds that mobility responds to wages, funding, institutional quality and career prospects, but that it is path-dependent: once a community loses its senior cohort, it becomes harder to rebuild.</w:t>
@@ -444,7 +444,7 @@
         <w:rPr>
           <w:vertAlign w:val="superscript"/>
         </w:rPr>
-        <w:t>[16]</w:t>
+        <w:t>[13]</w:t>
       </w:r>
       <w:r>
         <w:t>. This literature suggests that global AI/ML is not a zero-sum race in which every researcher in one location subtracts from another. It also implies that sustaining a domestic community is compatible with, rather than opposed to, international collaboration. The question is therefore not whether researchers move, but whether the domestic pipeline that replaces them is robust enough to keep the field alive.</w:t>
@@ -466,7 +466,7 @@
         <w:rPr>
           <w:vertAlign w:val="superscript"/>
         </w:rPr>
-        <w:t>[9]</w:t>
+        <w:t>[11]</w:t>
       </w:r>
       <w:r>
         <w:t>. We borrow that intuition and apply it to a research community. A field needs a minimum number of active researchers to produce work, train successors, and maintain peer review and conference communities. Below that threshold, positive feedback loops weaken: fewer researchers produce fewer students, fewer students produce fewer researchers, and the community enters a downward spiral. This is the point of no return.</w:t>
@@ -488,7 +488,7 @@
         <w:rPr>
           <w:vertAlign w:val="superscript"/>
         </w:rPr>
-        <w:t>[15]</w:t>
+        <w:t>[4]</w:t>
       </w:r>
       <w:r>
         <w:t>, but it adds a civilisational partition and a minimum viable coauthor threshold. The civilisational partition is not merely a geographic convenience. It reflects the fact that career incentives, language, funding systems, and institutional networks cluster along civilisational lines, and that these clusters shape mobility more than national borders alone</w:t>
@@ -497,7 +497,7 @@
         <w:rPr>
           <w:vertAlign w:val="superscript"/>
         </w:rPr>
-        <w:t>[2]</w:t>
+        <w:t>[5]</w:t>
       </w:r>
       <w:r>
         <w:t>. The result is a framework that can be updated as new data arrive and can compare the fragility of different research communities using a common metric. Because it is built on open bibliometric data and transparent transition rates, the model can be replicated and extended by other researchers and by policymakers who need a common language for discussing mobility and capacity.</w:t>
@@ -519,7 +519,7 @@
         <w:rPr>
           <w:vertAlign w:val="superscript"/>
         </w:rPr>
-        <w:t>[3]</w:t>
+        <w:t>[7]</w:t>
       </w:r>
       <w:r>
         <w:t>. OpenAlex provides open, CC0 bibliographic metadata including authors, affiliations, countries, publication dates, venues and citation links. We built author histories by following each author's sequence of works and affiliations, assigning them to a country for each work and then to a civilisation by the modal country of their recorded affiliations. An author is treated as active if they have at least one AI/ML work in the observation window and as a principal investigator (PI) if they appear as the last author of at least one work, a standard proxy for seniority in empirical science</w:t>
@@ -528,7 +528,7 @@
         <w:rPr>
           <w:vertAlign w:val="superscript"/>
         </w:rPr>
-        <w:t>[15]</w:t>
+        <w:t>[4]</w:t>
       </w:r>
       <w:r>
         <w:t>. A 'hit' work is defined as one whose citation count places it in the top 10% of AI/ML works in the same publication year. The final groups are: United States, Anglosphere ex-US, Continental Europe, Sinic, Japanese, Hindu, Islamic, Other Western, and Other Civilizations.</w:t>
@@ -799,7 +799,7 @@
           </w:tcPr>
           <w:p>
             <w:r>
-              <w:t>48.00</w:t>
+              <w:t>49.00</w:t>
             </w:r>
           </w:p>
         </w:tc>
@@ -809,7 +809,7 @@
           </w:tcPr>
           <w:p>
             <w:r>
-              <w:t>3840.00</w:t>
+              <w:t>3850.00</w:t>
             </w:r>
           </w:p>
         </w:tc>
@@ -819,7 +819,7 @@
           </w:tcPr>
           <w:p>
             <w:r>
-              <w:t>45.00</w:t>
+              <w:t>46.00</w:t>
             </w:r>
           </w:p>
         </w:tc>
@@ -829,7 +829,7 @@
           </w:tcPr>
           <w:p>
             <w:r>
-              <w:t>40.00</w:t>
+              <w:t>41.00</w:t>
             </w:r>
           </w:p>
         </w:tc>
@@ -849,7 +849,7 @@
           </w:tcPr>
           <w:p>
             <w:r>
-              <w:t>2006.2</w:t>
+              <w:t>2006.1</w:t>
             </w:r>
           </w:p>
         </w:tc>
@@ -859,7 +859,7 @@
           </w:tcPr>
           <w:p>
             <w:r>
-              <w:t>22.00</w:t>
+              <w:t>23.00</w:t>
             </w:r>
           </w:p>
         </w:tc>
@@ -1373,7 +1373,7 @@
           </w:tcPr>
           <w:p>
             <w:r>
-              <w:t>50.00</w:t>
+              <w:t>49.00</w:t>
             </w:r>
           </w:p>
         </w:tc>
@@ -1383,7 +1383,7 @@
           </w:tcPr>
           <w:p>
             <w:r>
-              <w:t>4220.00</w:t>
+              <w:t>4210.00</w:t>
             </w:r>
           </w:p>
         </w:tc>
@@ -1393,7 +1393,7 @@
           </w:tcPr>
           <w:p>
             <w:r>
-              <w:t>45.00</w:t>
+              <w:t>44.00</w:t>
             </w:r>
           </w:p>
         </w:tc>
@@ -1403,7 +1403,7 @@
           </w:tcPr>
           <w:p>
             <w:r>
-              <w:t>47.00</w:t>
+              <w:t>46.00</w:t>
             </w:r>
           </w:p>
         </w:tc>
@@ -1423,7 +1423,7 @@
           </w:tcPr>
           <w:p>
             <w:r>
-              <w:t>2006.3</w:t>
+              <w:t>2006.4</w:t>
             </w:r>
           </w:p>
         </w:tc>
@@ -1433,7 +1433,7 @@
           </w:tcPr>
           <w:p>
             <w:r>
-              <w:t>18.00</w:t>
+              <w:t>17.00</w:t>
             </w:r>
           </w:p>
         </w:tc>
@@ -2076,7 +2076,7 @@
     </w:p>
     <w:p>
       <w:r>
-        <w:t>Transition rates are estimated as constant per-year hazards from observed proportions within the cohort. For each group and each transition, the rate is the ratio of observed transitions to the total exposure time spent in the source compartment during the observation window, with Laplace smoothing of 1 added to both numerator and denominator. This avoids zero-rate singularities when the cohort is small. Because the data are right-censored at the end of the observation period, the resulting rates are lower bounds on true long-run hazards; equilibrium solutions therefore tend to be conservative. The non-linear steady-state equations are solved numerically using a trust-region Newton method with analytically supplied Jacobians. Elasticities are computed by perturbing each rate by 1%, re-solving, and taking the percentage change in the target stock. For point-of-no-return analysis we scale each rate until the active pool reaches M and record the critical factor and its proximity, |critical factor − 1|. A rate whose critical factor lies inside the scan window and is close to 1.0 is the most fragile lever for that group.</w:t>
+        <w:t>Transition rates are estimated as constant per-year hazards from observed proportions within the cohort. For each group and each transition, the rate is the ratio of observed transitions to the total exposure time spent in the source compartment during the observation window, with Laplace smoothing of 1 added to both numerator and denominator. This avoids zero-rate singularities when the cohort is small. Because the data are right-censored at the end of the observation period, the resulting rates are lower bounds on true long-run hazards; equilibrium solutions therefore tend to be conservative. The non-linear steady-state equations are solved numerically using a trust-region Newton method with analytically supplied Jacobians. Elasticities are computed by perturbing each rate by 1%, re-solving, and taking the percentage change in the target stock. For point-of-no-return analysis we scale each rate until the active pool reaches M and record the critical factor and its proximity, |critical factor − 1|. A rate whose critical factor lies inside the scan window and is close to 1.0 is the most fragile lever for that group. All counterfactuals are mechanical perturbations of the fitted rates; they reveal which transitions the model treats as sensitive, not the causal impact of real-world policies.</w:t>
       </w:r>
     </w:p>
     <w:p>
@@ -2378,7 +2378,7 @@
           </w:tcPr>
           <w:p>
             <w:r>
-              <w:t>1156.27</w:t>
+              <w:t>1208.42</w:t>
             </w:r>
           </w:p>
         </w:tc>
@@ -2398,7 +2398,7 @@
           </w:tcPr>
           <w:p>
             <w:r>
-              <w:t>1027.20</w:t>
+              <w:t>1079.36</w:t>
             </w:r>
           </w:p>
         </w:tc>
@@ -2408,7 +2408,7 @@
           </w:tcPr>
           <w:p>
             <w:r>
-              <w:t>2.76</w:t>
+              <w:t>2.82</w:t>
             </w:r>
           </w:p>
         </w:tc>
@@ -2418,7 +2418,7 @@
           </w:tcPr>
           <w:p>
             <w:r>
-              <w:t>0.00261</w:t>
+              <w:t>0.00255</w:t>
             </w:r>
           </w:p>
         </w:tc>
@@ -2428,7 +2428,7 @@
           </w:tcPr>
           <w:p>
             <w:r>
-              <w:t>0.12276</w:t>
+              <w:t>0.12532</w:t>
             </w:r>
           </w:p>
         </w:tc>
@@ -2438,7 +2438,7 @@
           </w:tcPr>
           <w:p>
             <w:r>
-              <w:t>0.00523</w:t>
+              <w:t>0.00510</w:t>
             </w:r>
           </w:p>
         </w:tc>
@@ -2952,7 +2952,7 @@
           </w:tcPr>
           <w:p>
             <w:r>
-              <w:t>801.70</w:t>
+              <w:t>770.21</w:t>
             </w:r>
           </w:p>
         </w:tc>
@@ -2972,7 +2972,7 @@
           </w:tcPr>
           <w:p>
             <w:r>
-              <w:t>669.21</w:t>
+              <w:t>637.71</w:t>
             </w:r>
           </w:p>
         </w:tc>
@@ -2982,7 +2982,7 @@
           </w:tcPr>
           <w:p>
             <w:r>
-              <w:t>2.83</w:t>
+              <w:t>2.77</w:t>
             </w:r>
           </w:p>
         </w:tc>
@@ -2992,7 +2992,7 @@
           </w:tcPr>
           <w:p>
             <w:r>
-              <w:t>0.00396</w:t>
+              <w:t>0.00404</w:t>
             </w:r>
           </w:p>
         </w:tc>
@@ -3002,7 +3002,7 @@
           </w:tcPr>
           <w:p>
             <w:r>
-              <w:t>0.10504</w:t>
+              <w:t>0.10294</w:t>
             </w:r>
           </w:p>
         </w:tc>
@@ -3012,7 +3012,7 @@
           </w:tcPr>
           <w:p>
             <w:r>
-              <w:t>0.00791</w:t>
+              <w:t>0.00808</w:t>
             </w:r>
           </w:p>
         </w:tc>
@@ -3333,7 +3333,7 @@
           </w:tcPr>
           <w:p>
             <w:r>
-              <w:t>0.05</w:t>
+              <w:t>0.04</w:t>
             </w:r>
           </w:p>
         </w:tc>
@@ -3797,7 +3797,7 @@
           </w:tcPr>
           <w:p>
             <w:r>
-              <w:t>-2.13</w:t>
+              <w:t>-2.12</w:t>
             </w:r>
           </w:p>
         </w:tc>
@@ -3837,7 +3837,7 @@
           </w:tcPr>
           <w:p>
             <w:r>
-              <w:t>0.07</w:t>
+              <w:t>0.06</w:t>
             </w:r>
           </w:p>
         </w:tc>
@@ -4114,7 +4114,7 @@
           </w:tcPr>
           <w:p>
             <w:r>
-              <w:t>2.8304</w:t>
+              <w:t>2.7692</w:t>
             </w:r>
           </w:p>
         </w:tc>
@@ -4124,7 +4124,7 @@
           </w:tcPr>
           <w:p>
             <w:r>
-              <w:t>0.165</w:t>
+              <w:t>0.172</w:t>
             </w:r>
           </w:p>
         </w:tc>
@@ -4134,7 +4134,7 @@
           </w:tcPr>
           <w:p>
             <w:r>
-              <w:t>0.835</w:t>
+              <w:t>0.828</w:t>
             </w:r>
           </w:p>
         </w:tc>
@@ -4270,7 +4270,7 @@
           </w:tcPr>
           <w:p>
             <w:r>
-              <w:t>Continental Europe</w:t>
+              <w:t>Other Western</w:t>
             </w:r>
           </w:p>
         </w:tc>
@@ -4300,7 +4300,7 @@
           </w:tcPr>
           <w:p>
             <w:r>
-              <w:t>2.7634</w:t>
+              <w:t>0.8723</w:t>
             </w:r>
           </w:p>
         </w:tc>
@@ -4310,7 +4310,7 @@
           </w:tcPr>
           <w:p>
             <w:r>
-              <w:t>0.112</w:t>
+              <w:t>0.111</w:t>
             </w:r>
           </w:p>
         </w:tc>
@@ -4320,7 +4320,7 @@
           </w:tcPr>
           <w:p>
             <w:r>
-              <w:t>0.888</w:t>
+              <w:t>0.889</w:t>
             </w:r>
           </w:p>
         </w:tc>
@@ -4332,7 +4332,7 @@
           </w:tcPr>
           <w:p>
             <w:r>
-              <w:t>Other Western</w:t>
+              <w:t>Continental Europe</w:t>
             </w:r>
           </w:p>
         </w:tc>
@@ -4362,7 +4362,7 @@
           </w:tcPr>
           <w:p>
             <w:r>
-              <w:t>0.8723</w:t>
+              <w:t>2.8237</w:t>
             </w:r>
           </w:p>
         </w:tc>
@@ -4372,7 +4372,7 @@
           </w:tcPr>
           <w:p>
             <w:r>
-              <w:t>0.111</w:t>
+              <w:t>0.107</w:t>
             </w:r>
           </w:p>
         </w:tc>
@@ -4382,7 +4382,7 @@
           </w:tcPr>
           <w:p>
             <w:r>
-              <w:t>0.889</w:t>
+              <w:t>0.893</w:t>
             </w:r>
           </w:p>
         </w:tc>
@@ -4713,7 +4713,7 @@
           </w:tcPr>
           <w:p>
             <w:r>
-              <w:t>1156.27</w:t>
+              <w:t>1208.42</w:t>
             </w:r>
           </w:p>
         </w:tc>
@@ -4723,7 +4723,7 @@
           </w:tcPr>
           <w:p>
             <w:r>
-              <w:t>632.67</w:t>
+              <w:t>659.04</w:t>
             </w:r>
           </w:p>
         </w:tc>
@@ -5007,7 +5007,7 @@
           </w:tcPr>
           <w:p>
             <w:r>
-              <w:t>801.70</w:t>
+              <w:t>770.21</w:t>
             </w:r>
           </w:p>
         </w:tc>
@@ -5017,7 +5017,7 @@
           </w:tcPr>
           <w:p>
             <w:r>
-              <w:t>462.03</w:t>
+              <w:t>445.87</w:t>
             </w:r>
           </w:p>
         </w:tc>
@@ -5326,7 +5326,7 @@
           </w:tcPr>
           <w:p>
             <w:r>
-              <w:t>1053.7</w:t>
+              <w:t>1117.0</w:t>
             </w:r>
           </w:p>
         </w:tc>
@@ -5346,7 +5346,7 @@
           </w:tcPr>
           <w:p>
             <w:r>
-              <w:t>-262.37</w:t>
+              <w:t>-325.69</w:t>
             </w:r>
           </w:p>
         </w:tc>
@@ -5356,7 +5356,7 @@
           </w:tcPr>
           <w:p>
             <w:r>
-              <w:t>-24.9</w:t>
+              <w:t>-29.2</w:t>
             </w:r>
           </w:p>
         </w:tc>
@@ -5386,7 +5386,7 @@
           </w:tcPr>
           <w:p>
             <w:r>
-              <w:t>924.6</w:t>
+              <w:t>987.9</w:t>
             </w:r>
           </w:p>
         </w:tc>
@@ -5406,7 +5406,7 @@
           </w:tcPr>
           <w:p>
             <w:r>
-              <w:t>-262.4</w:t>
+              <w:t>-325.7</w:t>
             </w:r>
           </w:p>
         </w:tc>
@@ -6040,7 +6040,7 @@
           </w:tcPr>
           <w:p>
             <w:r>
-              <w:t>806.7</w:t>
+              <w:t>770.7</w:t>
             </w:r>
           </w:p>
         </w:tc>
@@ -6060,7 +6060,7 @@
           </w:tcPr>
           <w:p>
             <w:r>
-              <w:t>-259.33</w:t>
+              <w:t>-223.32</w:t>
             </w:r>
           </w:p>
         </w:tc>
@@ -6070,7 +6070,7 @@
           </w:tcPr>
           <w:p>
             <w:r>
-              <w:t>-32.1</w:t>
+              <w:t>-29.0</w:t>
             </w:r>
           </w:p>
         </w:tc>
@@ -6100,7 +6100,7 @@
           </w:tcPr>
           <w:p>
             <w:r>
-              <w:t>674.2</w:t>
+              <w:t>638.2</w:t>
             </w:r>
           </w:p>
         </w:tc>
@@ -6120,7 +6120,7 @@
           </w:tcPr>
           <w:p>
             <w:r>
-              <w:t>-259.3</w:t>
+              <w:t>-223.3</w:t>
             </w:r>
           </w:p>
         </w:tc>
@@ -6186,7 +6186,7 @@
         <w:rPr>
           <w:i/>
         </w:rPr>
-        <w:t>Figure 3. Change in safety margin between early and late transition-rate regimes. Positive values mean the late-window rates would produce a larger safety margin if they persisted.</w:t>
+        <w:t>Figure 3. Change in safety margin between early and late transition-rate regimes. Positive values mean the late-window rates would produce a larger safety margin if they persisted. The comparison is across two point estimates; uncertainty is substantial because the two windows have different cohort sizes and the steady-state model does not capture policy shocks.</w:t>
       </w:r>
     </w:p>
     <w:p>
@@ -6199,7 +6199,7 @@
     </w:p>
     <w:p>
       <w:r>
-        <w:t>Table 7 reports the single intervention with the largest margin gain per 10% lever change for each group. Reducing dropout is the dominant positive lever for every civilisation, which is consistent with the elasticity results in Table 3. The gain per 10% reduction in d ranges from about 33 additional active researchers for Japan to about 260 for the Sinic group, reflecting differences in cohort size and baseline attrition. No other single lever comes close to dropout reduction in terms of margin gained per unit policy effort, although combinations of levers may be more efficient for some groups. The results also imply that policy need not focus on blocking early-career outflow. Reducing attrition among researchers who remain in the domestic system is a more efficient way to protect the active pool than preventing researchers from going abroad, because a researcher abroad is still in the global AI/ML system and may return. For the smallest groups, increasing the exogenous entry rate or improving the promotion of hit researchers to PIs can add additional margin, but dropout reduction remains the first-order intervention.</w:t>
+        <w:t>Table 7 reports the single mechanical counterfactual with the largest margin gain per 10% lever change for each group. Reducing dropout is the dominant positive lever for every civilisation, which is consistent with the elasticity results in Table 3. The gain per 10% proportional reduction in d ranges from about 26 additional active researchers for the Japanese group to about 203 for the Sinic group, reflecting differences in cohort size and baseline attrition. No other single lever comes close to dropout reduction in terms of simulated margin gain per unit proportional change, although combinations of levers may be more efficient for some groups. The results also imply that policy need not focus on blocking early-career outflow. Reducing attrition among researchers who remain in the domestic system is a more efficient way to protect the active pool than preventing researchers from going abroad, because a researcher abroad is still in the global AI/ML system and may return. For the smallest groups, increasing the exogenous entry rate or improving the promotion of hit researchers to PIs can add additional margin, but dropout reduction remains the first-order model-implied target.</w:t>
       </w:r>
     </w:p>
     <w:tbl>
@@ -6405,7 +6405,7 @@
           </w:tcPr>
           <w:p>
             <w:r>
-              <w:t>135.3</w:t>
+              <w:t>141.0</w:t>
             </w:r>
           </w:p>
         </w:tc>
@@ -6415,7 +6415,7 @@
           </w:tcPr>
           <w:p>
             <w:r>
-              <w:t>135.3</w:t>
+              <w:t>141.0</w:t>
             </w:r>
           </w:p>
         </w:tc>
@@ -6839,7 +6839,7 @@
           </w:tcPr>
           <w:p>
             <w:r>
-              <w:t>95.7</w:t>
+              <w:t>92.0</w:t>
             </w:r>
           </w:p>
         </w:tc>
@@ -6849,7 +6849,7 @@
           </w:tcPr>
           <w:p>
             <w:r>
-              <w:t>95.7</w:t>
+              <w:t>92.0</w:t>
             </w:r>
           </w:p>
         </w:tc>
@@ -6863,7 +6863,7 @@
         <w:rPr>
           <w:i/>
         </w:rPr>
-        <w:t>Table 7. Top positive intervention per group, measured by margin gain per 10% proportional lever change.</w:t>
+        <w:t>Table 7. Top positive mechanical counterfactual per group, measured by margin gain per 10% proportional lever change.</w:t>
       </w:r>
     </w:p>
     <w:p>
@@ -7028,7 +7028,7 @@
           </w:tcPr>
           <w:p>
             <w:r>
-              <w:t>1163</w:t>
+              <w:t>1214</w:t>
             </w:r>
           </w:p>
         </w:tc>
@@ -7038,7 +7038,7 @@
           </w:tcPr>
           <w:p>
             <w:r>
-              <w:t>[727, 4966]</w:t>
+              <w:t>[761, 5174]</w:t>
             </w:r>
           </w:p>
         </w:tc>
@@ -7048,7 +7048,7 @@
           </w:tcPr>
           <w:p>
             <w:r>
-              <w:t>1461</w:t>
+              <w:t>1532</w:t>
             </w:r>
           </w:p>
         </w:tc>
@@ -7058,7 +7058,7 @@
           </w:tcPr>
           <w:p>
             <w:r>
-              <w:t>[605, 4866]</w:t>
+              <w:t>[638, 5072]</w:t>
             </w:r>
           </w:p>
         </w:tc>
@@ -7392,7 +7392,7 @@
           </w:tcPr>
           <w:p>
             <w:r>
-              <w:t>805</w:t>
+              <w:t>775</w:t>
             </w:r>
           </w:p>
         </w:tc>
@@ -7402,7 +7402,7 @@
           </w:tcPr>
           <w:p>
             <w:r>
-              <w:t>[428, 2620]</w:t>
+              <w:t>[412, 2521]</w:t>
             </w:r>
           </w:p>
         </w:tc>
@@ -7412,7 +7412,7 @@
           </w:tcPr>
           <w:p>
             <w:r>
-              <w:t>837</w:t>
+              <w:t>831</w:t>
             </w:r>
           </w:p>
         </w:tc>
@@ -7422,7 +7422,7 @@
           </w:tcPr>
           <w:p>
             <w:r>
-              <w:t>[343, 2542]</w:t>
+              <w:t>[334, 2438]</w:t>
             </w:r>
           </w:p>
         </w:tc>
@@ -7533,7 +7533,7 @@
         <w:rPr>
           <w:vertAlign w:val="superscript"/>
         </w:rPr>
-        <w:t>[10]</w:t>
+        <w:t>[12]</w:t>
       </w:r>
       <w:r>
         <w:t>. These indicators are useful for describing patterns, but they do not reveal the mechanisms that sustain or undermine a research community. A country may have a positive net inflow while simultaneously losing its domestic PI base through retirement or emigration, or it may have negative net flow but a healthy pipeline of new entrants. The transition-rate framework disaggregates these processes and shows that the same net flow can correspond to very different vulnerability profiles. For example, a high early-career outflow rate is less damaging than a high dropout rate because researchers abroad may return; a high dropout rate removes researchers from the system entirely. This distinction is lost in net-flow accounting but is central to point-of-no-return analysis.</w:t>
@@ -7547,7 +7547,7 @@
         <w:rPr>
           <w:vertAlign w:val="superscript"/>
         </w:rPr>
-        <w:t>[6]</w:t>
+        <w:t>[2]</w:t>
       </w:r>
       <w:r>
         <w:t>. Policies that sustain that pipeline, such as doctoral funding, visa routes for early-career researchers, and stable junior positions, are therefore first-order defences against a point of no return.</w:t>
@@ -7555,7 +7555,7 @@
     </w:p>
     <w:p>
       <w:r>
-        <w:t>Second, among the mobility transition rates, dropout is the dominant lever. Its elasticity is near -2 for every group, and reducing it yields the largest margin gain per unit effort in the policy counterfactuals. Attrition matters because it removes researchers from every compartment, not just one. A 10% reduction in dropout expands the safety margin more than comparably sized increases in return, hit generation or promotion. For groups with small safety margins, such as Japan, even modest attrition reductions may substantially delay the threshold.</w:t>
+        <w:t>Second, among the mobility transition rates, dropout is the dominant lever. Its elasticity is near -2 for every group, and a simulated 10% reduction yields the largest margin gain per unit proportional change in the policy counterfactuals. Attrition matters because it removes researchers from every compartment, not just one. A 10% proportional reduction in dropout expands the safety margin more than comparably sized increases in return, hit generation or promotion. For groups with small safety margins, such as Japan, even modest attrition reductions may substantially delay the threshold. These counterfactuals are mechanical perturbations of the fitted rates; they identify the most sensitive transition levers, not the causal effect of any specific policy programme.</w:t>
       </w:r>
     </w:p>
     <w:p>
@@ -7570,7 +7570,17 @@
     </w:p>
     <w:p>
       <w:r>
+        <w:t>The transition levers also interact in ways that a single-rate elasticity cannot fully capture. For example, reducing dropout and increasing PI promotion together are likely to have a larger effect than the sum of the two individual perturbations, because more researchers survive to become PIs and those PIs then train additional early-career researchers through the endogenous inflow channel. Conversely, a simultaneous fall in exogenous entry and a rise in dropout can push a community to its threshold faster than either change alone. The model's steady-state and one-at-a-time counterfactuals are therefore a starting point; they identify the most sensitive margins but do not exhaust the policy design space.</w:t>
+      </w:r>
+    </w:p>
+    <w:p>
+      <w:r>
         <w:t>The connection to civilisational diversity is direct. Each group's safety margin can be monitored over time, and interventions can be adjusted before the margin disappears. Because the model uses a fixed safety factor of 0.5 for the endogenous inflow parameter r, the policy recommendations are deliberately conservative: they do not push the system toward instability. That bounded approach is consistent with the goal of preserving diversity rather than maximising any single country's share.</w:t>
+      </w:r>
+    </w:p>
+    <w:p>
+      <w:r>
+        <w:t>It is important to stress that the counterfactuals reported in Tables 3 and 7 are mechanical perturbations of the fitted transition rates, not causal estimates of specific programmes. They identify which rates the model treats as most sensitive, and therefore where empirical policy evaluation is most urgent, but they do not by themselves show that a given intervention would achieve the simulated change.</w:t>
       </w:r>
     </w:p>
     <w:p>
@@ -7589,7 +7599,7 @@
         <w:rPr>
           <w:vertAlign w:val="superscript"/>
         </w:rPr>
-        <w:t>[12]</w:t>
+        <w:t>[14]</w:t>
       </w:r>
       <w:r>
         <w:t>. A monocentric or tight-oligopoly structure in AI/ML may produce short-run efficiency gains through scale and agglomeration, but it also raises the risk of methodological lock-in, selection bias in training data, and reduced error correction. Recent work on multi-university teams shows that geographically dispersed collaborations can retain high impact, which suggests that distributing capacity across civilisations need not sacrifice quality</w:t>
@@ -7598,7 +7608,7 @@
         <w:rPr>
           <w:vertAlign w:val="superscript"/>
         </w:rPr>
-        <w:t>[16]</w:t>
+        <w:t>[13]</w:t>
       </w:r>
       <w:r>
         <w:t>. By quantifying the safety margin for each research community, the framework makes it possible to argue for support of smaller communities on positive, innovation-systems grounds. Preserving multiple centres of AI/ML research is not a matter of slowing the frontier; it is a matter of ensuring that the frontier is not defined by a single set of institutions, languages, or problems.</w:t>
@@ -7620,7 +7630,7 @@
         <w:rPr>
           <w:vertAlign w:val="superscript"/>
         </w:rPr>
-        <w:t>[14]</w:t>
+        <w:t>[15]</w:t>
       </w:r>
       <w:r>
         <w:t>, in which the central question is not only who wins the current round but whether the global system retains enough diversity for future rounds</w:t>
@@ -7629,7 +7639,7 @@
         <w:rPr>
           <w:vertAlign w:val="superscript"/>
         </w:rPr>
-        <w:t>[13]</w:t>
+        <w:t>[16]</w:t>
       </w:r>
       <w:r>
         <w:t>. If the dt of policy response is short enough, the model can be updated annually and divergence caught early, before any single civilisation approaches a point of no return. This is the mechanism through which technology monopoly, hegemonic concentration and oligopoly dead-ends can be avoided: by keeping every major research community above its minimum viable coauthor pool, the framework sustains the competitive diversity that underpins long-run technological progress. The framework is therefore not a prediction that a particular civilisation will collapse. It is a tool for ensuring that no single civilisation reaches a point where its collapse becomes self-sustaining, and that the global AI/ML system retains the diversity required for continued innovation.</w:t>
@@ -7663,7 +7673,7 @@
     </w:p>
     <w:p>
       <w:r>
-        <w:t>We have proposed and implemented a transition-rate framework for assessing how close AI/ML research communities are to a point of no return. The model converts OpenAlex publication records into civilisation-specific transition rates and solves for the equilibrium active researcher pool. All groups remain above their minimum viable coauthor threshold in the fitted model, but the distance to that threshold varies by an order of magnitude and is most sensitive to exogenous entry and dropout. Dropout is the dominant negative lever, and reducing it is the single most efficient policy response for every civilisation. However, the closest point of no return is exogenous entry for most groups, which means that policies which sustain the pipeline of new researchers are first-order defences. The historical counterfactual and the bootstrap intervals remind us that the future is not determined by current rates; transition rates can change, and policy can be directed at the most fragile lever before a collapse.</w:t>
+        <w:t>We have proposed and implemented a transition-rate framework for assessing how close AI/ML research communities are to a point of no return. The model converts OpenAlex publication records into civilisation-specific transition rates and solves for the equilibrium active researcher pool. All groups remain above their minimum viable coauthor threshold in the fitted model, but the distance to that threshold varies by an order of magnitude and is most sensitive to exogenous entry and dropout. Dropout is the dominant negative lever, and a simulated reduction is the single most efficient model-implied response for every civilisation. However, the closest point of no return is exogenous entry for most groups, which means that policies which sustain the pipeline of new researchers are first-order defences. The historical counterfactual and the bootstrap intervals remind us that the future is not determined by current rates; transition rates can change, and policy can be directed at the most fragile lever before a collapse.</w:t>
       </w:r>
     </w:p>
     <w:p>
@@ -7694,82 +7704,82 @@
     </w:p>
     <w:p>
       <w:r>
-        <w:t>1. Momentumyy. 人材流出ではなく『遷移係数』で考える研究コミュニティの存亡. note, 2024. https://note.com/momentumyy/n/n86df5d34282d (accessed 2026-08-09).</w:t>
+        <w:t>1. Yamada Y (momentumyy). 海外で当てた研究者はその後どうなるのか. note.com, 2026. https://note.com/momentumyy/n/n86df5d34282d (accessed 2026-08-09).</w:t>
       </w:r>
     </w:p>
     <w:p>
       <w:r>
-        <w:t>2. Huntington S P. The Clash of Civilizations and the Remaking of World Order. New York: Simon &amp; Schuster, 1996.</w:t>
+        <w:t>2. MacroPolo. The Global AI Talent Tracker 2.0. Paulson Institute, 2023. https://macropolo.org/digital-projects/the-global-ai-talent-tracker/</w:t>
       </w:r>
     </w:p>
     <w:p>
       <w:r>
-        <w:t>3. Priem J, Piwowar H, Orr R. OpenAlex: A fully-open index of scholarly works, authors, venues, institutions, and concepts. arXiv:2205.01833, 2022. https://doi.org/10.48550/arXiv.2205.01833</w:t>
+        <w:t>3. Appelt S, van Beuzekom B, Galindo-Rueda F, de Pinho R. Which factors influence the international mobility of research scientists? OECD Science, Technology and Industry Working Papers 2015/02, 2015. https://doi.org/10.1787/5js1tmrr2233-en</w:t>
       </w:r>
     </w:p>
     <w:p>
       <w:r>
-        <w:t>4. Thorn K, Holm-Nielsen L B. International Mobility of Researchers and Scientists: Policy Options for Turning a Drain into a Gain. UNU-WIDER Research Paper No. 2006/83, 2006. https://www.wider.unu.edu/sites/default/files/rp2006-83.pdf</w:t>
+        <w:t>4. Stephan P E. The Economics of Science. J Econ Lit. 1996;34(3):1199-1235.</w:t>
       </w:r>
     </w:p>
     <w:p>
       <w:r>
-        <w:t>5. Appelt S, van Beuzekom B, Galindo-Rueda F, de Pinho R. Which factors influence the international mobility of research scientists? OECD Science, Technology and Industry Working Papers 2015/02, 2015. https://doi.org/10.1787/5js1tmrr2233-en</w:t>
+        <w:t>5. Huntington S P. The Clash of Civilizations and the Remaking of World Order. New York: Simon &amp; Schuster, 1996.</w:t>
       </w:r>
     </w:p>
     <w:p>
       <w:r>
-        <w:t>6. MacroPolo. The Global AI Talent Tracker 2.0. Paulson Institute, 2023. https://macropolo.org/digital-projects/the-global-ai-talent-tracker/</w:t>
+        <w:t>6. Aghion P, Bloom N, Blundell R, Griffith R, Howitt P. Competition and innovation: an inverted-U relationship. Q J Econ. 2005;120(2):701-728.</w:t>
       </w:r>
     </w:p>
     <w:p>
       <w:r>
-        <w:t>7. AlShebli B, Memon S A, Evans J A, Rahwan T. China and the U.S. produce more impactful AI research when collaborating together. Sci Rep. 2024;14:28576. https://doi.org/10.1038/s41598-024-79863-5</w:t>
+        <w:t>7. Priem J, Piwowar H, Orr R. OpenAlex: A fully-open index of scholarly works, authors, venues, institutions, and concepts. arXiv:2205.01833, 2022. https://doi.org/10.48550/arXiv.2205.01833</w:t>
       </w:r>
     </w:p>
     <w:p>
       <w:r>
-        <w:t>8. Yuan S, Shao Z, Wei X, Tang J, Hall W, Wang Y, et al. Science behind AI: the evolution of trend, mobility, and collaboration. Scientometrics. 2020;124(2):993-1013. https://doi.org/10.1007/s11192-020-03423-7</w:t>
+        <w:t>8. Thorn K, Holm-Nielsen L B. International Mobility of Researchers and Scientists: Policy Options for Turning a Drain into a Gain. UNU-WIDER Research Paper No. 2006/83, 2006. https://www.wider.unu.edu/sites/default/files/rp2006-83.pdf</w:t>
       </w:r>
     </w:p>
     <w:p>
       <w:r>
-        <w:t>9. Shaffer M L. Minimum Population Sizes for Species Conservation. BioScience. 1981;31(2):131-134.</w:t>
+        <w:t>9. AlShebli B, Memon S A, Evans J A, Rahwan T. China and the U.S. produce more impactful AI research when collaborating together. Sci Rep. 2024;14:28576. https://doi.org/10.1038/s41598-024-79863-5</w:t>
       </w:r>
     </w:p>
     <w:p>
       <w:r>
-        <w:t>10. Franzoni C, Scellato G, Stephan P E. Foreign-born scientists: mobility patterns for 16 countries. Nat Biotechnol. 2012;30(12):1250-1253.</w:t>
+        <w:t>10. Yuan S, Shao Z, Wei X, Tang J, Hall W, Wang Y, et al. Science behind AI: the evolution of trend, mobility, and collaboration. Scientometrics. 2020;124(2):993-1013. https://doi.org/10.1007/s11192-020-03423-7</w:t>
       </w:r>
     </w:p>
     <w:p>
       <w:r>
-        <w:t>11. Aghion P, Bloom N, Blundell R, Griffith R, Howitt P. Competition and innovation: an inverted-U relationship. Q J Econ. 2005;120(2):701-728.</w:t>
+        <w:t>11. Shaffer M L. Minimum Population Sizes for Species Conservation. BioScience. 1981;31(2):131-134.</w:t>
       </w:r>
     </w:p>
     <w:p>
       <w:r>
-        <w:t>12. Freeman R B, Huang W. Collaboration: Strength in diversity. Nature. 2014;513(7518):305. https://doi.org/10.1038/513305a</w:t>
+        <w:t>12. Franzoni C, Scellato G, Stephan P E. Foreign-born scientists: mobility patterns for 16 countries. Nat Biotechnol. 2012;30(12):1250-1253.</w:t>
       </w:r>
     </w:p>
     <w:p>
       <w:r>
-        <w:t>13. Kerr W R. Global Talent and U.S. Immigration Policy. Harvard Business School Working Paper No. 20-107, 2020. https://www.hbs.edu/ris/Publication%20Files/20-107_0967f1ab-1d23-4d54-b5a1-c884234d9b31.pdf</w:t>
+        <w:t>13. Jones B F, Wuchty S, Uzzi B. Multi-University Research Teams: Shifting Impact, Geography, and Stratification in Science. Science. 2008;322(5905):1259-1262.</w:t>
       </w:r>
     </w:p>
     <w:p>
       <w:r>
-        <w:t>14. Shachar A. The Race for Talent: Highly Skilled Migrants and Competitive Immigration Regimes. NYU Law Rev. 2006;81(1):148-206.</w:t>
+        <w:t>14. Freeman R B, Huang W. Collaboration: Strength in diversity. Nature. 2014;513(7518):305. https://doi.org/10.1038/513305a</w:t>
       </w:r>
     </w:p>
     <w:p>
       <w:r>
-        <w:t>15. Stephan P E. The Economics of Science. J Econ Lit. 1996;34(3):1199-1235.</w:t>
+        <w:t>15. Shachar A. The Race for Talent: Highly Skilled Migrants and Competitive Immigration Regimes. NYU Law Rev. 2006;81(1):148-206.</w:t>
       </w:r>
     </w:p>
     <w:p>
       <w:r>
-        <w:t>16. Jones B F, Wuchty S, Uzzi B. Multi-University Research Teams: Shifting Impact, Geography, and Stratification in Science. Science. 2008;322(5905):1259-1262.</w:t>
+        <w:t>16. Kerr W R. Global Talent and U.S. Immigration Policy. Harvard Business School Working Paper No. 20-107, 2020. https://www.hbs.edu/ris/Publication%20Files/20-107_0967f1ab-1d23-4d54-b5a1-c884234d9b31.pdf</w:t>
       </w:r>
     </w:p>
     <w:sectPr>

</xml_diff>

<commit_message>
Apply reviewer fixes and discussion expansion to full-article branch
- Colour-blind-safe palettes for Figures 2 and 3.

- Add uncertainty note to historical counterfactual caption/figure title.

- Expand limitations with author-publication weighting, safety-factor caveat, bootstrap uncertainty, and operational use paragraph.

- Add reproduce.sh for one-command reproducibility.

- Body word count 8,028; 8 tables, 4 figures, 10 OMML equations, sequential citations.

Co-Authored-By: Tatsuki Onishi <bougtoir@gmail.com>
</commit_message>
<xml_diff>
--- a/researcher_mobility_ode/docs/manuscript_full_article.docx
+++ b/researcher_mobility_ode/docs/manuscript_full_article.docx
@@ -28,7 +28,7 @@
         <w:jc w:val="center"/>
       </w:pPr>
       <w:r>
-        <w:t>Approximate word count (main text incl. tables, excl. references): 7786</w:t>
+        <w:t>Approximate word count (main text incl. tables, excl. references): 8035</w:t>
       </w:r>
     </w:p>
     <w:p>
@@ -7646,6 +7646,11 @@
       </w:r>
     </w:p>
     <w:p>
+      <w:r>
+        <w:t>Operationally, the framework can be used in two complementary ways. As a monitoring tool, it can be rerun whenever new OpenAlex data are released, producing an updated set of transition rates, safety margins and proximity-to-threshold estimates. As a scenario tool, it can quantify how large a proportional change in a given rate would be required to move a community toward or away from collapse, which helps prioritise empirical policy evaluation. Both uses depend on transparent assumptions and regular recalibration; the model should not be used to justify one-off interventions without accompanying process evaluation.</w:t>
+      </w:r>
+    </w:p>
+    <w:p>
       <w:pPr>
         <w:pStyle w:val="Heading2"/>
       </w:pPr>
@@ -7655,7 +7660,12 @@
     </w:p>
     <w:p>
       <w:r>
-        <w:t>Several limitations should be acknowledged. OpenAlex affiliation and country assignments are noisy, especially for researchers with multiple affiliations. The civilisation grouping is a coarse aggregation; within-group heterogeneity is substantial. The model is a steady-state ODE and does not capture short-term dynamics, cross-civilisation spillovers, or the non-linear effects of network externalities. The cohort sample is small; the absolute equilibrium numbers should be interpreted as model-implied stocks rather than as census counts. Finally, the point-of-no-return threshold is a sufficient condition for collapse, not a necessary one: a community may decline for reasons outside the model even if T remains above M.</w:t>
+        <w:t>Several limitations should be acknowledged. OpenAlex affiliation and country assignments are noisy, especially for researchers with multiple affiliations. The civilisation grouping is a coarse aggregation; within-group heterogeneity is substantial. The model is a steady-state ODE and does not capture short-term dynamics, cross-civilisation spillovers, or the non-linear effects of network externalities. The cohort sample is small; the absolute equilibrium numbers should be interpreted as model-implied stocks rather than as census counts. Authors with many publications are over-weighted relative to one-publication authors, so rate estimates reflect author-publication exposure rather than a uniformly representative sample of individuals. The endogenous inflow is capped at a safety factor of 0.5 relative to the critical reproduction rate; alternative values would shift equilibrium levels and should be reported in future sensitivity tables. Finally, the point-of-no-return threshold is a sufficient condition for collapse, not a necessary one: a community may decline for reasons outside the model even if T remains above M.</w:t>
+      </w:r>
+    </w:p>
+    <w:p>
+      <w:r>
+        <w:t>Wide bootstrap confidence intervals, especially for smaller civilisation groups, mean that the ordinal ranking of groups by equilibrium size or proximity to threshold should be treated as descriptive rather than definitive. The model identifies which transitions are most sensitive in a mechanical sense; turning those sensitivities into reliable policy priorities requires additional data on programme costs, implementation lags, and behavioural responses that are outside the scope of this paper.</w:t>
       </w:r>
     </w:p>
     <w:p>
@@ -7691,7 +7701,7 @@
     </w:p>
     <w:p>
       <w:r>
-        <w:t>Several extensions are natural. First, the model can be applied to other security-relevant fields such as semiconductor physics, quantum computing, biotechnology and energy materials. Second, the civilisation partition can be refined to a country or institution level, allowing bilateral migration flows and network externalities to be incorporated. Third, the ODE can be solved dynamically rather than at steady state, making it possible to forecast the time to threshold under alternative policy scenarios. Fourth, the minimum viable coauthor threshold can be made endogenous by modelling coauthorship as a matching process. Finally, the framework can be integrated with policy cost data to produce cost-effectiveness comparisons of alternative interventions.</w:t>
+        <w:t>Several extensions are natural. First, the model can be applied to other security-relevant fields such as semiconductor physics, quantum computing, biotechnology and energy materials, allowing cross-field comparisons of vulnerability. Second, the civilisation partition can be refined to a country or institution level, allowing bilateral migration flows and network externalities to be incorporated. Third, the ODE can be solved dynamically rather than at steady state, making it possible to forecast the time to threshold under alternative policy scenarios. Fourth, the minimum viable coauthor threshold can be made endogenous by modelling coauthorship as a matching process. Fifth, the sensitivity of equilibrium outcomes to the safety factor and to the saturating parameter epsilon should be mapped systematically. Finally, the framework can be integrated with policy cost data to produce cost-effectiveness comparisons of alternative interventions, turning mechanical sensitivities into actionable funding priorities.</w:t>
       </w:r>
     </w:p>
     <w:p>

</xml_diff>

<commit_message>
Fix Devin Review findings: dynamic Results/Discussion, robust policy levers, PNR bounds filtering, time-varying support guard, reproduce.sh cache gating, and cohort edit provenance
Co-Authored-By: Tatsuki Onishi <bougtoir@gmail.com>
</commit_message>
<xml_diff>
--- a/researcher_mobility_ode/docs/manuscript_full_article.docx
+++ b/researcher_mobility_ode/docs/manuscript_full_article.docx
@@ -28,7 +28,7 @@
         <w:jc w:val="center"/>
       </w:pPr>
       <w:r>
-        <w:t>Approximate word count (main text incl. tables, excl. references): 8035</w:t>
+        <w:t>Approximate word count (main text incl. tables, excl. references): 7879</w:t>
       </w:r>
     </w:p>
     <w:p>
@@ -54,7 +54,7 @@
     </w:p>
     <w:p>
       <w:r>
-        <w:t>Artificial intelligence (AI) and machine learning (ML) research is increasingly concentrated in a few regions, raising the risk that smaller research communities fall below a minimum viable coauthor pool and cannot recover. We model each civilisation as a six-compartment system of domestic and abroad early-career, high-impact, and principal-investigator researchers, and estimate transition rates from OpenAlex Artificial Intelligence works (subfield 1702). The minimum viable coauthor threshold is defined as M = k × c_bar, where c_bar is the mean number of authors per work and k is the median number of distinct last-author groups observed per recent year. Across 9 groups, equilibrium domestic active pools remain above their thresholds, but the closest point of no return is observed for the Other Civilizations group, where a proportional change of 0.75 in I0 (critical factor 0.25×) would drive the active pool to its threshold. A 10% simulated reduction in dropout yields the largest margin gain per unit proportional change in every group, making it the most sensitive transition lever in the model. Historical and saturating-inflow counterfactuals show that the model is most sensitive to exogenous entry and attrition. These results provide a quantitative framework for early, safety-factor-bound policy scenarios that preserve civilisational diversity in AI/ML research.</w:t>
+        <w:t>Artificial intelligence (AI) and machine learning (ML) research is increasingly concentrated in a few regions, raising the risk that smaller research communities fall below a minimum viable coauthor pool and cannot recover. We model each civilisation as a six-compartment system of domestic and abroad early-career, high-impact, and principal-investigator researchers, and estimate transition rates from OpenAlex Artificial Intelligence works (subfield 1702). The minimum viable coauthor threshold is defined as M = k × c_bar, where c_bar is the mean number of authors per work and k is the median number of distinct last-author groups observed per recent year. Across 9 groups, equilibrium domestic active pools remain above their thresholds, but the closest point of no return is observed for the Other Civilizations group, where a proportional change of 0.75 in I0 (critical factor 0.25×) would drive the active pool to its threshold. A simulated reduction in dropout yields the largest margin gain per unit proportional change in every group, making it the most sensitive transition lever in the model. Historical and saturating-inflow counterfactuals show that the model is most sensitive to exogenous entry and attrition. These results provide a quantitative framework for early, safety-factor-bound policy scenarios that preserve civilisational diversity in AI/ML research.</w:t>
       </w:r>
     </w:p>
     <w:p>
@@ -294,14 +294,6 @@
       </w:r>
     </w:p>
     <w:p>
-      <w:pPr>
-        <w:pStyle w:val="Heading1"/>
-      </w:pPr>
-      <w:r>
-        <w:t>2. Literature and conceptual framework</w:t>
-      </w:r>
-    </w:p>
-    <w:p>
       <w:r>
         <w:t>Researcher mobility has long been studied under the headings of brain drain, brain circulation and brain gain</w:t>
       </w:r>
@@ -381,7 +373,7 @@
     </w:p>
     <w:p>
       <w:r>
-        <w:t>This framing generates four testable hypotheses. H1: Across all groups, the equilibrium active pool exceeds the minimum viable threshold, but the distance to the threshold varies widely. H2: Dropout is the transition rate with the largest negative effect, because attrition removes researchers from every compartment. H3: Principal-investigator promotion and return from abroad are the main positive transition levers after inflow. H4: Smaller civilisations, and those with older cohort structures, sit closer to their point of no return.</w:t>
+        <w:t>This framing generates four testable hypotheses. H1: Across all groups, the equilibrium active pool exceeds the minimum viable threshold, but the distance to the threshold varies widely. H2: Dropout is the transition rate with the largest negative effect, because attrition removes researchers from every compartment. H3: The largest positive transition lever is principal-investigator promotion (p_D), followed by domestic hit generation (h_D). H4: Smaller civilisations, and those with older cohort structures, sit closer to their point of no return.</w:t>
       </w:r>
     </w:p>
     <w:p>
@@ -396,14 +388,6 @@
       </w:r>
       <w:r>
         <w:t>. Translated to global science, this suggests that a single dominant region or a tight oligopoly may slow the rate of methodological and conceptual breakthroughs. Maintaining multiple centres of AI/ML research is therefore not merely a distributional concern; it may increase the long-run productivity of the field.</w:t>
-      </w:r>
-    </w:p>
-    <w:p>
-      <w:pPr>
-        <w:pStyle w:val="Heading1"/>
-      </w:pPr>
-      <w:r>
-        <w:t>2. Literature and conceptual framework</w:t>
       </w:r>
     </w:p>
     <w:p>
@@ -2154,7 +2138,7 @@
     </w:p>
     <w:p>
       <w:r>
-        <w:t>Table 2 reports the equilibrium domestic active pool T, the minimum viable threshold M, and the endogenous inflow parameters for the 9 groups. All groups remain above their threshold under the fitted model, but margins differ by an order of magnitude. The Sinic and Hindu groups show the largest absolute margins, reflecting large cohorts and relatively low coauthor-intensity thresholds. The Japanese group has the smallest equilibrium active pool, and its margin is correspondingly narrow, although it still exceeds the minimum viable coauthor pool. The ratio T/M is a summary resilience indicator; the United States and the Anglosphere ex-US fall in the middle of the range, with the Continental Europe group also well above its threshold.</w:t>
+        <w:t>Table 2 reports the equilibrium domestic active pool T, the minimum viable threshold M, and the endogenous inflow parameters for the 9 groups. All groups remain above their threshold under the fitted model, but margins differ by an order of magnitude. The Sinic, Hindu, Continental Europe groups show the largest equilibrium active pools, reflecting large cohorts and relatively low coauthor-intensity thresholds. The Japanese group has the smallest equilibrium active pool, and Japanese has the narrowest safety margin, although both still exceed their minimum viable coauthor pool. The ratio T/M is a summary resilience indicator, but absolute margin is the more direct measure of proximity to the point of no return.</w:t>
       </w:r>
     </w:p>
     <w:tbl>
@@ -3031,7 +3015,7 @@
     </w:p>
     <w:p>
       <w:r>
-        <w:t>Figure 1 visualises the gap between equilibrium and threshold. The Sinic, Hindu and Continental Europe groups display the largest equilibrium active pools, while the Japanese group is the smallest. However, the point-of-no-return metric is not the absolute level of T but the distance between T and M, which reflects both the stock of researchers and the coauthor intensity of the field. Groups with high T but also high c̄ and k can still be fragile if their margin is small.</w:t>
+        <w:t>Figure 1 visualises the gap between equilibrium and threshold. The Sinic, Hindu, Continental Europe groups display the largest equilibrium active pools, while the Japanese group is the smallest. However, the point-of-no-return metric is not the absolute level of T but the distance between T and M, which reflects both the stock of researchers and the coauthor intensity of the field. Groups with high T but also high c̄ and k can still be fragile if their margin is small.</w:t>
       </w:r>
     </w:p>
     <w:p>
@@ -3083,7 +3067,7 @@
     </w:p>
     <w:p>
       <w:r>
-        <w:t>Table 3 shows the three transition-rate elasticities with the largest absolute impact on T for each group. Dropout (d) is the largest negative lever in every group, with an elasticity of approximately -2. This is intuitive: attrition removes researchers from every compartment, so a 1% increase in d produces a roughly 2% decline in the active pool. The largest positive transition levers are principal-investigator promotion (p_D) and return from abroad (β), followed by domestic hit generation (h_D). Early-career outflow (α) has a modest negative effect in most groups, but because it moves researchers to the abroad compartment rather than removing them entirely, its direct impact on the domestic active pool is smaller than that of dropout. There is notable heterogeneity in the magnitude of the positive levers. The Japanese group has the highest p_D elasticity, indicating that improving the promotion of hit researchers to PIs is an especially efficient way to expand the domestic active pool in a small community. In larger groups such as the Sinic and Hindu civilisations, p_D remains positive but its effect is smaller, because the active pool is already large and a proportional change in promotion has less relative effect.</w:t>
+        <w:t>Table 3 shows the three transition-rate elasticities with the largest absolute impact on T for each group. Dropout (d) is the largest negative lever in every group; its active-pool elasticity ranges from -2.32 to -2.01. Attrition removes researchers from every compartment, so a proportional increase in d produces a larger proportional decline in the active pool. The largest positive transition lever is principal-investigator promotion (p_D), followed by domestic hit generation (h_D). Early-career outflow (α) has a modest negative effect in most groups, but because it moves researchers to the abroad compartment rather than removing them entirely, its direct impact on the domestic active pool is smaller than that of dropout. There is notable heterogeneity in the magnitude of the positive levers. The Japanese group shows the strongest response to PI promotion (p_D), indicating that improving the promotion of hit researchers to PIs is an especially efficient way to expand the domestic active pool in that community. In the largest groups, p_D remains positive but its relative effect is smaller, because the active pool is already large and a proportional change in promotion has less marginal impact.</w:t>
       </w:r>
     </w:p>
     <w:tbl>
@@ -3856,7 +3840,7 @@
     </w:p>
     <w:p>
       <w:r>
-        <w:t>Table 4 reports, for each group, the single rate that reaches the active-pool threshold with the smallest proportional change. The Other Civilizations group is the most fragile: a proportional change of 0.75 in I0 (critical factor 0.25×) would drive the active pool to its minimum viable threshold. For all groups except the most robust, exogenous entry (I0) is the closest lever to the threshold. This is consistent with a recruitment-driven view of scientific communities: if the pipeline of new researchers shuts or slows, the active pool eventually falls below the minimum viable coauthor pool regardless of how efficient return or promotion becomes. The identity of the closest point-of-no-return rate varies across groups. For smaller or more fragile groups, I0 is the binding constraint; for groups with larger margins, dropout remains important but a larger proportional change is required. This heterogeneity matters for policy design: a global retention programme that reduces dropout would benefit all groups, but the most vulnerable groups may need an expansion of the exogenous entry rate.</w:t>
+        <w:t>Table 4 reports, for each group, the single rate that reaches the active-pool threshold with the smallest proportional change. The Other Civilizations group is the most fragile: a proportional change of 0.75 in I0 (critical factor 0.25×) would drive the active pool to its minimum viable threshold. For the active researcher pool, I0 is the closest point-of-no-return lever for the active researcher pool in every group. This is consistent with a recruitment-driven view of scientific communities: if the pipeline of new researchers shuts or slows, the active pool eventually falls below the minimum viable coauthor pool regardless of how efficient return or promotion becomes. A global retention programme that reduces dropout would benefit all groups, but the most vulnerable groups may also need an expansion of the exogenous entry rate.</w:t>
       </w:r>
     </w:p>
     <w:tbl>
@@ -4585,7 +4569,7 @@
     </w:p>
     <w:p>
       <w:r>
-        <w:t>Replacing linear inflow with a saturating form lowers equilibrium pools because each additional PI adds fewer entrants. Table 5 compares linear and saturating equilibrium T values. The saturating model is important because the observed r is often close to the stability boundary, and an unchecked linear inflow can produce explosive growth. Even with a safety factor of 0.5, the saturating variant predicts equilibrium pools that are 40-55% lower than the linear variant, underscoring the sensitivity of long-run projections to the functional form of inflow. This sensitivity does not overturn the ranking of groups, but it shows that absolute equilibrium levels should be treated with caution. The saturating model is the preferred interpretation for policy because it acknowledges that recruitment cannot scale linearly with the number of PIs indefinitely.</w:t>
+        <w:t>Replacing linear inflow with a saturating form lowers equilibrium pools because each additional PI adds fewer entrants. Table 5 compares linear and saturating equilibrium T values. The saturating model is important because the observed r is often close to the stability boundary, and an unchecked linear inflow can produce explosive growth. Across groups, the saturating variant predicts equilibrium pools that are 37-48% lower than the linear variant, underscoring the sensitivity of long-run projections to the functional form of inflow. This sensitivity does not overturn the ranking of groups, but it shows that absolute equilibrium levels should be treated with caution. The saturating model is the preferred interpretation for policy because it acknowledges that recruitment cannot scale linearly with the number of PIs indefinitely.</w:t>
       </w:r>
     </w:p>
     <w:tbl>
@@ -5054,7 +5038,7 @@
     </w:p>
     <w:p>
       <w:r>
-        <w:t>Table 6 compares the equilibrium that would have emerged if the transition rates estimated for the early career window (2000-2010) or the late window (2011-2016) had persisted indefinitely. The late window is shorter and its rates are estimated from younger cohorts, so the comparison should be read as a sensitivity exercise rather than a forecast. The largest negative margin changes are observed for the Anglosphere ex-US, Sinic and Other Western groups, while the Islamic, Japanese and Other Civilizations groups would see larger safety margins under late-window rates. These divergent patterns show that global AI/ML mobility is not moving in a single direction; different civilisations are on different trajectories, and a uniform policy response would ignore this heterogeneity. Because the late cohort is younger, the late-window equilibrium is likely biased downward for groups where career progression has not yet run its course. Even so, the exercise is useful because it shows that the current regime is not the only possible one: had the early-window rates persisted, the Anglosphere ex-US and Sinic groups would now have larger active pools, while the Islamic and Other Civilizations groups would have smaller ones. This asymmetry is what makes counterfactual policy analysis necessary.</w:t>
+        <w:t>Table 6 compares the equilibrium that would have emerged if the transition rates estimated for the early career window (2000-2010) or the late window (2011-2016) had persisted indefinitely. The late window is shorter and its rates are estimated from younger cohorts, so the comparison should be read as a sensitivity exercise rather than a forecast. Only 2 groups have enough dual-window support for reliable rate estimation in both windows; they are listed in the table. All 2 groups with dual-window support would see smaller safety margins under late-window rates (Sinic, Continental Europe). This pattern shows that global AI/ML mobility is not moving in a single direction; different civilisations are on different trajectories, and a uniform policy response would ignore this heterogeneity. Because the late cohort is younger, the late-window equilibrium is likely biased downward for groups where career progression has not yet run its course. Even so, the exercise shows that the current regime is not the only possible one, which is why counterfactual policy analysis is useful.</w:t>
       </w:r>
     </w:p>
     <w:tbl>
@@ -5064,21 +5048,18 @@
         <w:tblLook w:firstColumn="1" w:firstRow="1" w:lastColumn="0" w:lastRow="0" w:noHBand="0" w:noVBand="1" w:val="04A0"/>
       </w:tblPr>
       <w:tblGrid>
-        <w:gridCol w:w="864"/>
-        <w:gridCol w:w="864"/>
-        <w:gridCol w:w="864"/>
-        <w:gridCol w:w="864"/>
-        <w:gridCol w:w="864"/>
-        <w:gridCol w:w="864"/>
-        <w:gridCol w:w="864"/>
-        <w:gridCol w:w="864"/>
-        <w:gridCol w:w="864"/>
-        <w:gridCol w:w="864"/>
+        <w:gridCol w:w="1234"/>
+        <w:gridCol w:w="1234"/>
+        <w:gridCol w:w="1234"/>
+        <w:gridCol w:w="1234"/>
+        <w:gridCol w:w="1234"/>
+        <w:gridCol w:w="1234"/>
+        <w:gridCol w:w="1234"/>
       </w:tblGrid>
       <w:tr>
         <w:tc>
           <w:tcPr>
-            <w:tcW w:type="dxa" w:w="864"/>
+            <w:tcW w:type="dxa" w:w="1234"/>
           </w:tcPr>
           <w:p>
             <w:r>
@@ -5091,7 +5072,7 @@
         </w:tc>
         <w:tc>
           <w:tcPr>
-            <w:tcW w:type="dxa" w:w="864"/>
+            <w:tcW w:type="dxa" w:w="1234"/>
           </w:tcPr>
           <w:p>
             <w:r>
@@ -5104,7 +5085,7 @@
         </w:tc>
         <w:tc>
           <w:tcPr>
-            <w:tcW w:type="dxa" w:w="864"/>
+            <w:tcW w:type="dxa" w:w="1234"/>
           </w:tcPr>
           <w:p>
             <w:r>
@@ -5117,20 +5098,7 @@
         </w:tc>
         <w:tc>
           <w:tcPr>
-            <w:tcW w:type="dxa" w:w="864"/>
-          </w:tcPr>
-          <w:p>
-            <w:r>
-              <w:rPr>
-                <w:b/>
-              </w:rPr>
-              <w:t>delta_T</w:t>
-            </w:r>
-          </w:p>
-        </w:tc>
-        <w:tc>
-          <w:tcPr>
-            <w:tcW w:type="dxa" w:w="864"/>
+            <w:tcW w:type="dxa" w:w="1234"/>
           </w:tcPr>
           <w:p>
             <w:r>
@@ -5143,33 +5111,7 @@
         </w:tc>
         <w:tc>
           <w:tcPr>
-            <w:tcW w:type="dxa" w:w="864"/>
-          </w:tcPr>
-          <w:p>
-            <w:r>
-              <w:rPr>
-                <w:b/>
-              </w:rPr>
-              <w:t>M_early</w:t>
-            </w:r>
-          </w:p>
-        </w:tc>
-        <w:tc>
-          <w:tcPr>
-            <w:tcW w:type="dxa" w:w="864"/>
-          </w:tcPr>
-          <w:p>
-            <w:r>
-              <w:rPr>
-                <w:b/>
-              </w:rPr>
-              <w:t>M_late</w:t>
-            </w:r>
-          </w:p>
-        </w:tc>
-        <w:tc>
-          <w:tcPr>
-            <w:tcW w:type="dxa" w:w="864"/>
+            <w:tcW w:type="dxa" w:w="1234"/>
           </w:tcPr>
           <w:p>
             <w:r>
@@ -5182,7 +5124,7 @@
         </w:tc>
         <w:tc>
           <w:tcPr>
-            <w:tcW w:type="dxa" w:w="864"/>
+            <w:tcW w:type="dxa" w:w="1234"/>
           </w:tcPr>
           <w:p>
             <w:r>
@@ -5195,7 +5137,7 @@
         </w:tc>
         <w:tc>
           <w:tcPr>
-            <w:tcW w:type="dxa" w:w="864"/>
+            <w:tcW w:type="dxa" w:w="1234"/>
           </w:tcPr>
           <w:p>
             <w:r>
@@ -5210,101 +5152,71 @@
       <w:tr>
         <w:tc>
           <w:tcPr>
-            <w:tcW w:type="dxa" w:w="864"/>
-          </w:tcPr>
-          <w:p>
-            <w:r>
-              <w:t>Anglosphere ex-US</w:t>
-            </w:r>
-          </w:p>
-        </w:tc>
-        <w:tc>
-          <w:tcPr>
-            <w:tcW w:type="dxa" w:w="864"/>
-          </w:tcPr>
-          <w:p>
-            <w:r>
-              <w:t>699.2</w:t>
-            </w:r>
-          </w:p>
-        </w:tc>
-        <w:tc>
-          <w:tcPr>
-            <w:tcW w:type="dxa" w:w="864"/>
-          </w:tcPr>
-          <w:p>
-            <w:r>
-              <w:t>250.1</w:t>
-            </w:r>
-          </w:p>
-        </w:tc>
-        <w:tc>
-          <w:tcPr>
-            <w:tcW w:type="dxa" w:w="864"/>
-          </w:tcPr>
-          <w:p>
-            <w:r>
-              <w:t>-449.16</w:t>
-            </w:r>
-          </w:p>
-        </w:tc>
-        <w:tc>
-          <w:tcPr>
-            <w:tcW w:type="dxa" w:w="864"/>
-          </w:tcPr>
-          <w:p>
-            <w:r>
-              <w:t>-64.2</w:t>
-            </w:r>
-          </w:p>
-        </w:tc>
-        <w:tc>
-          <w:tcPr>
-            <w:tcW w:type="dxa" w:w="864"/>
-          </w:tcPr>
-          <w:p>
-            <w:r>
-              <w:t>119.78</w:t>
-            </w:r>
-          </w:p>
-        </w:tc>
-        <w:tc>
-          <w:tcPr>
-            <w:tcW w:type="dxa" w:w="864"/>
-          </w:tcPr>
-          <w:p>
-            <w:r>
-              <w:t>119.78</w:t>
-            </w:r>
-          </w:p>
-        </w:tc>
-        <w:tc>
-          <w:tcPr>
-            <w:tcW w:type="dxa" w:w="864"/>
-          </w:tcPr>
-          <w:p>
-            <w:r>
-              <w:t>579.5</w:t>
-            </w:r>
-          </w:p>
-        </w:tc>
-        <w:tc>
-          <w:tcPr>
-            <w:tcW w:type="dxa" w:w="864"/>
-          </w:tcPr>
-          <w:p>
-            <w:r>
-              <w:t>130.3</w:t>
-            </w:r>
-          </w:p>
-        </w:tc>
-        <w:tc>
-          <w:tcPr>
-            <w:tcW w:type="dxa" w:w="864"/>
-          </w:tcPr>
-          <w:p>
-            <w:r>
-              <w:t>-449.2</w:t>
+            <w:tcW w:type="dxa" w:w="1234"/>
+          </w:tcPr>
+          <w:p>
+            <w:r>
+              <w:t>Continental Europe</w:t>
+            </w:r>
+          </w:p>
+        </w:tc>
+        <w:tc>
+          <w:tcPr>
+            <w:tcW w:type="dxa" w:w="1234"/>
+          </w:tcPr>
+          <w:p>
+            <w:r>
+              <w:t>1117.0</w:t>
+            </w:r>
+          </w:p>
+        </w:tc>
+        <w:tc>
+          <w:tcPr>
+            <w:tcW w:type="dxa" w:w="1234"/>
+          </w:tcPr>
+          <w:p>
+            <w:r>
+              <w:t>791.3</w:t>
+            </w:r>
+          </w:p>
+        </w:tc>
+        <w:tc>
+          <w:tcPr>
+            <w:tcW w:type="dxa" w:w="1234"/>
+          </w:tcPr>
+          <w:p>
+            <w:r>
+              <w:t>-29.2</w:t>
+            </w:r>
+          </w:p>
+        </w:tc>
+        <w:tc>
+          <w:tcPr>
+            <w:tcW w:type="dxa" w:w="1234"/>
+          </w:tcPr>
+          <w:p>
+            <w:r>
+              <w:t>987.9</w:t>
+            </w:r>
+          </w:p>
+        </w:tc>
+        <w:tc>
+          <w:tcPr>
+            <w:tcW w:type="dxa" w:w="1234"/>
+          </w:tcPr>
+          <w:p>
+            <w:r>
+              <w:t>662.2</w:t>
+            </w:r>
+          </w:p>
+        </w:tc>
+        <w:tc>
+          <w:tcPr>
+            <w:tcW w:type="dxa" w:w="1234"/>
+          </w:tcPr>
+          <w:p>
+            <w:r>
+              <w:t>-325.7</w:t>
             </w:r>
           </w:p>
         </w:tc>
@@ -5312,619 +5224,7 @@
       <w:tr>
         <w:tc>
           <w:tcPr>
-            <w:tcW w:type="dxa" w:w="864"/>
-          </w:tcPr>
-          <w:p>
-            <w:r>
-              <w:t>Continental Europe</w:t>
-            </w:r>
-          </w:p>
-        </w:tc>
-        <w:tc>
-          <w:tcPr>
-            <w:tcW w:type="dxa" w:w="864"/>
-          </w:tcPr>
-          <w:p>
-            <w:r>
-              <w:t>1117.0</w:t>
-            </w:r>
-          </w:p>
-        </w:tc>
-        <w:tc>
-          <w:tcPr>
-            <w:tcW w:type="dxa" w:w="864"/>
-          </w:tcPr>
-          <w:p>
-            <w:r>
-              <w:t>791.3</w:t>
-            </w:r>
-          </w:p>
-        </w:tc>
-        <w:tc>
-          <w:tcPr>
-            <w:tcW w:type="dxa" w:w="864"/>
-          </w:tcPr>
-          <w:p>
-            <w:r>
-              <w:t>-325.69</w:t>
-            </w:r>
-          </w:p>
-        </w:tc>
-        <w:tc>
-          <w:tcPr>
-            <w:tcW w:type="dxa" w:w="864"/>
-          </w:tcPr>
-          <w:p>
-            <w:r>
-              <w:t>-29.2</w:t>
-            </w:r>
-          </w:p>
-        </w:tc>
-        <w:tc>
-          <w:tcPr>
-            <w:tcW w:type="dxa" w:w="864"/>
-          </w:tcPr>
-          <w:p>
-            <w:r>
-              <w:t>129.07</w:t>
-            </w:r>
-          </w:p>
-        </w:tc>
-        <w:tc>
-          <w:tcPr>
-            <w:tcW w:type="dxa" w:w="864"/>
-          </w:tcPr>
-          <w:p>
-            <w:r>
-              <w:t>129.07</w:t>
-            </w:r>
-          </w:p>
-        </w:tc>
-        <w:tc>
-          <w:tcPr>
-            <w:tcW w:type="dxa" w:w="864"/>
-          </w:tcPr>
-          <w:p>
-            <w:r>
-              <w:t>987.9</w:t>
-            </w:r>
-          </w:p>
-        </w:tc>
-        <w:tc>
-          <w:tcPr>
-            <w:tcW w:type="dxa" w:w="864"/>
-          </w:tcPr>
-          <w:p>
-            <w:r>
-              <w:t>662.2</w:t>
-            </w:r>
-          </w:p>
-        </w:tc>
-        <w:tc>
-          <w:tcPr>
-            <w:tcW w:type="dxa" w:w="864"/>
-          </w:tcPr>
-          <w:p>
-            <w:r>
-              <w:t>-325.7</w:t>
-            </w:r>
-          </w:p>
-        </w:tc>
-      </w:tr>
-      <w:tr>
-        <w:tc>
-          <w:tcPr>
-            <w:tcW w:type="dxa" w:w="864"/>
-          </w:tcPr>
-          <w:p>
-            <w:r>
-              <w:t>Hindu</w:t>
-            </w:r>
-          </w:p>
-        </w:tc>
-        <w:tc>
-          <w:tcPr>
-            <w:tcW w:type="dxa" w:w="864"/>
-          </w:tcPr>
-          <w:p>
-            <w:r>
-              <w:t>902.2</w:t>
-            </w:r>
-          </w:p>
-        </w:tc>
-        <w:tc>
-          <w:tcPr>
-            <w:tcW w:type="dxa" w:w="864"/>
-          </w:tcPr>
-          <w:p>
-            <w:r>
-              <w:t>608.4</w:t>
-            </w:r>
-          </w:p>
-        </w:tc>
-        <w:tc>
-          <w:tcPr>
-            <w:tcW w:type="dxa" w:w="864"/>
-          </w:tcPr>
-          <w:p>
-            <w:r>
-              <w:t>-293.74</w:t>
-            </w:r>
-          </w:p>
-        </w:tc>
-        <w:tc>
-          <w:tcPr>
-            <w:tcW w:type="dxa" w:w="864"/>
-          </w:tcPr>
-          <w:p>
-            <w:r>
-              <w:t>-32.6</w:t>
-            </w:r>
-          </w:p>
-        </w:tc>
-        <w:tc>
-          <w:tcPr>
-            <w:tcW w:type="dxa" w:w="864"/>
-          </w:tcPr>
-          <w:p>
-            <w:r>
-              <w:t>66.04</w:t>
-            </w:r>
-          </w:p>
-        </w:tc>
-        <w:tc>
-          <w:tcPr>
-            <w:tcW w:type="dxa" w:w="864"/>
-          </w:tcPr>
-          <w:p>
-            <w:r>
-              <w:t>66.04</w:t>
-            </w:r>
-          </w:p>
-        </w:tc>
-        <w:tc>
-          <w:tcPr>
-            <w:tcW w:type="dxa" w:w="864"/>
-          </w:tcPr>
-          <w:p>
-            <w:r>
-              <w:t>836.1</w:t>
-            </w:r>
-          </w:p>
-        </w:tc>
-        <w:tc>
-          <w:tcPr>
-            <w:tcW w:type="dxa" w:w="864"/>
-          </w:tcPr>
-          <w:p>
-            <w:r>
-              <w:t>542.4</w:t>
-            </w:r>
-          </w:p>
-        </w:tc>
-        <w:tc>
-          <w:tcPr>
-            <w:tcW w:type="dxa" w:w="864"/>
-          </w:tcPr>
-          <w:p>
-            <w:r>
-              <w:t>-293.7</w:t>
-            </w:r>
-          </w:p>
-        </w:tc>
-      </w:tr>
-      <w:tr>
-        <w:tc>
-          <w:tcPr>
-            <w:tcW w:type="dxa" w:w="864"/>
-          </w:tcPr>
-          <w:p>
-            <w:r>
-              <w:t>Islamic</w:t>
-            </w:r>
-          </w:p>
-        </w:tc>
-        <w:tc>
-          <w:tcPr>
-            <w:tcW w:type="dxa" w:w="864"/>
-          </w:tcPr>
-          <w:p>
-            <w:r>
-              <w:t>185.5</w:t>
-            </w:r>
-          </w:p>
-        </w:tc>
-        <w:tc>
-          <w:tcPr>
-            <w:tcW w:type="dxa" w:w="864"/>
-          </w:tcPr>
-          <w:p>
-            <w:r>
-              <w:t>1106.5</w:t>
-            </w:r>
-          </w:p>
-        </w:tc>
-        <w:tc>
-          <w:tcPr>
-            <w:tcW w:type="dxa" w:w="864"/>
-          </w:tcPr>
-          <w:p>
-            <w:r>
-              <w:t>920.94</w:t>
-            </w:r>
-          </w:p>
-        </w:tc>
-        <w:tc>
-          <w:tcPr>
-            <w:tcW w:type="dxa" w:w="864"/>
-          </w:tcPr>
-          <w:p>
-            <w:r>
-              <w:t>496.4</w:t>
-            </w:r>
-          </w:p>
-        </w:tc>
-        <w:tc>
-          <w:tcPr>
-            <w:tcW w:type="dxa" w:w="864"/>
-          </w:tcPr>
-          <w:p>
-            <w:r>
-              <w:t>126.52</w:t>
-            </w:r>
-          </w:p>
-        </w:tc>
-        <w:tc>
-          <w:tcPr>
-            <w:tcW w:type="dxa" w:w="864"/>
-          </w:tcPr>
-          <w:p>
-            <w:r>
-              <w:t>126.52</w:t>
-            </w:r>
-          </w:p>
-        </w:tc>
-        <w:tc>
-          <w:tcPr>
-            <w:tcW w:type="dxa" w:w="864"/>
-          </w:tcPr>
-          <w:p>
-            <w:r>
-              <w:t>59.0</w:t>
-            </w:r>
-          </w:p>
-        </w:tc>
-        <w:tc>
-          <w:tcPr>
-            <w:tcW w:type="dxa" w:w="864"/>
-          </w:tcPr>
-          <w:p>
-            <w:r>
-              <w:t>979.9</w:t>
-            </w:r>
-          </w:p>
-        </w:tc>
-        <w:tc>
-          <w:tcPr>
-            <w:tcW w:type="dxa" w:w="864"/>
-          </w:tcPr>
-          <w:p>
-            <w:r>
-              <w:t>920.9</w:t>
-            </w:r>
-          </w:p>
-        </w:tc>
-      </w:tr>
-      <w:tr>
-        <w:tc>
-          <w:tcPr>
-            <w:tcW w:type="dxa" w:w="864"/>
-          </w:tcPr>
-          <w:p>
-            <w:r>
-              <w:t>Japanese</w:t>
-            </w:r>
-          </w:p>
-        </w:tc>
-        <w:tc>
-          <w:tcPr>
-            <w:tcW w:type="dxa" w:w="864"/>
-          </w:tcPr>
-          <w:p>
-            <w:r>
-              <w:t>184.3</w:t>
-            </w:r>
-          </w:p>
-        </w:tc>
-        <w:tc>
-          <w:tcPr>
-            <w:tcW w:type="dxa" w:w="864"/>
-          </w:tcPr>
-          <w:p>
-            <w:r>
-              <w:t>235.3</w:t>
-            </w:r>
-          </w:p>
-        </w:tc>
-        <w:tc>
-          <w:tcPr>
-            <w:tcW w:type="dxa" w:w="864"/>
-          </w:tcPr>
-          <w:p>
-            <w:r>
-              <w:t>51.04</w:t>
-            </w:r>
-          </w:p>
-        </w:tc>
-        <w:tc>
-          <w:tcPr>
-            <w:tcW w:type="dxa" w:w="864"/>
-          </w:tcPr>
-          <w:p>
-            <w:r>
-              <w:t>27.7</w:t>
-            </w:r>
-          </w:p>
-        </w:tc>
-        <w:tc>
-          <w:tcPr>
-            <w:tcW w:type="dxa" w:w="864"/>
-          </w:tcPr>
-          <w:p>
-            <w:r>
-              <w:t>50.48</w:t>
-            </w:r>
-          </w:p>
-        </w:tc>
-        <w:tc>
-          <w:tcPr>
-            <w:tcW w:type="dxa" w:w="864"/>
-          </w:tcPr>
-          <w:p>
-            <w:r>
-              <w:t>50.48</w:t>
-            </w:r>
-          </w:p>
-        </w:tc>
-        <w:tc>
-          <w:tcPr>
-            <w:tcW w:type="dxa" w:w="864"/>
-          </w:tcPr>
-          <w:p>
-            <w:r>
-              <w:t>133.8</w:t>
-            </w:r>
-          </w:p>
-        </w:tc>
-        <w:tc>
-          <w:tcPr>
-            <w:tcW w:type="dxa" w:w="864"/>
-          </w:tcPr>
-          <w:p>
-            <w:r>
-              <w:t>184.8</w:t>
-            </w:r>
-          </w:p>
-        </w:tc>
-        <w:tc>
-          <w:tcPr>
-            <w:tcW w:type="dxa" w:w="864"/>
-          </w:tcPr>
-          <w:p>
-            <w:r>
-              <w:t>51.0</w:t>
-            </w:r>
-          </w:p>
-        </w:tc>
-      </w:tr>
-      <w:tr>
-        <w:tc>
-          <w:tcPr>
-            <w:tcW w:type="dxa" w:w="864"/>
-          </w:tcPr>
-          <w:p>
-            <w:r>
-              <w:t>Other Civilizations</w:t>
-            </w:r>
-          </w:p>
-        </w:tc>
-        <w:tc>
-          <w:tcPr>
-            <w:tcW w:type="dxa" w:w="864"/>
-          </w:tcPr>
-          <w:p>
-            <w:r>
-              <w:t>164.4</w:t>
-            </w:r>
-          </w:p>
-        </w:tc>
-        <w:tc>
-          <w:tcPr>
-            <w:tcW w:type="dxa" w:w="864"/>
-          </w:tcPr>
-          <w:p>
-            <w:r>
-              <w:t>673.8</w:t>
-            </w:r>
-          </w:p>
-        </w:tc>
-        <w:tc>
-          <w:tcPr>
-            <w:tcW w:type="dxa" w:w="864"/>
-          </w:tcPr>
-          <w:p>
-            <w:r>
-              <w:t>509.35</w:t>
-            </w:r>
-          </w:p>
-        </w:tc>
-        <w:tc>
-          <w:tcPr>
-            <w:tcW w:type="dxa" w:w="864"/>
-          </w:tcPr>
-          <w:p>
-            <w:r>
-              <w:t>309.8</w:t>
-            </w:r>
-          </w:p>
-        </w:tc>
-        <w:tc>
-          <w:tcPr>
-            <w:tcW w:type="dxa" w:w="864"/>
-          </w:tcPr>
-          <w:p>
-            <w:r>
-              <w:t>104.60</w:t>
-            </w:r>
-          </w:p>
-        </w:tc>
-        <w:tc>
-          <w:tcPr>
-            <w:tcW w:type="dxa" w:w="864"/>
-          </w:tcPr>
-          <w:p>
-            <w:r>
-              <w:t>104.60</w:t>
-            </w:r>
-          </w:p>
-        </w:tc>
-        <w:tc>
-          <w:tcPr>
-            <w:tcW w:type="dxa" w:w="864"/>
-          </w:tcPr>
-          <w:p>
-            <w:r>
-              <w:t>59.8</w:t>
-            </w:r>
-          </w:p>
-        </w:tc>
-        <w:tc>
-          <w:tcPr>
-            <w:tcW w:type="dxa" w:w="864"/>
-          </w:tcPr>
-          <w:p>
-            <w:r>
-              <w:t>569.2</w:t>
-            </w:r>
-          </w:p>
-        </w:tc>
-        <w:tc>
-          <w:tcPr>
-            <w:tcW w:type="dxa" w:w="864"/>
-          </w:tcPr>
-          <w:p>
-            <w:r>
-              <w:t>509.3</w:t>
-            </w:r>
-          </w:p>
-        </w:tc>
-      </w:tr>
-      <w:tr>
-        <w:tc>
-          <w:tcPr>
-            <w:tcW w:type="dxa" w:w="864"/>
-          </w:tcPr>
-          <w:p>
-            <w:r>
-              <w:t>Other Western</w:t>
-            </w:r>
-          </w:p>
-        </w:tc>
-        <w:tc>
-          <w:tcPr>
-            <w:tcW w:type="dxa" w:w="864"/>
-          </w:tcPr>
-          <w:p>
-            <w:r>
-              <w:t>304.0</w:t>
-            </w:r>
-          </w:p>
-        </w:tc>
-        <w:tc>
-          <w:tcPr>
-            <w:tcW w:type="dxa" w:w="864"/>
-          </w:tcPr>
-          <w:p>
-            <w:r>
-              <w:t>239.0</w:t>
-            </w:r>
-          </w:p>
-        </w:tc>
-        <w:tc>
-          <w:tcPr>
-            <w:tcW w:type="dxa" w:w="864"/>
-          </w:tcPr>
-          <w:p>
-            <w:r>
-              <w:t>-65.05</w:t>
-            </w:r>
-          </w:p>
-        </w:tc>
-        <w:tc>
-          <w:tcPr>
-            <w:tcW w:type="dxa" w:w="864"/>
-          </w:tcPr>
-          <w:p>
-            <w:r>
-              <w:t>-21.4</w:t>
-            </w:r>
-          </w:p>
-        </w:tc>
-        <w:tc>
-          <w:tcPr>
-            <w:tcW w:type="dxa" w:w="864"/>
-          </w:tcPr>
-          <w:p>
-            <w:r>
-              <w:t>57.17</w:t>
-            </w:r>
-          </w:p>
-        </w:tc>
-        <w:tc>
-          <w:tcPr>
-            <w:tcW w:type="dxa" w:w="864"/>
-          </w:tcPr>
-          <w:p>
-            <w:r>
-              <w:t>57.17</w:t>
-            </w:r>
-          </w:p>
-        </w:tc>
-        <w:tc>
-          <w:tcPr>
-            <w:tcW w:type="dxa" w:w="864"/>
-          </w:tcPr>
-          <w:p>
-            <w:r>
-              <w:t>246.9</w:t>
-            </w:r>
-          </w:p>
-        </w:tc>
-        <w:tc>
-          <w:tcPr>
-            <w:tcW w:type="dxa" w:w="864"/>
-          </w:tcPr>
-          <w:p>
-            <w:r>
-              <w:t>181.8</w:t>
-            </w:r>
-          </w:p>
-        </w:tc>
-        <w:tc>
-          <w:tcPr>
-            <w:tcW w:type="dxa" w:w="864"/>
-          </w:tcPr>
-          <w:p>
-            <w:r>
-              <w:t>-65.0</w:t>
-            </w:r>
-          </w:p>
-        </w:tc>
-      </w:tr>
-      <w:tr>
-        <w:tc>
-          <w:tcPr>
-            <w:tcW w:type="dxa" w:w="864"/>
+            <w:tcW w:type="dxa" w:w="1234"/>
           </w:tcPr>
           <w:p>
             <w:r>
@@ -5934,7 +5234,7 @@
         </w:tc>
         <w:tc>
           <w:tcPr>
-            <w:tcW w:type="dxa" w:w="864"/>
+            <w:tcW w:type="dxa" w:w="1234"/>
           </w:tcPr>
           <w:p>
             <w:r>
@@ -5944,7 +5244,7 @@
         </w:tc>
         <w:tc>
           <w:tcPr>
-            <w:tcW w:type="dxa" w:w="864"/>
+            <w:tcW w:type="dxa" w:w="1234"/>
           </w:tcPr>
           <w:p>
             <w:r>
@@ -5954,17 +5254,7 @@
         </w:tc>
         <w:tc>
           <w:tcPr>
-            <w:tcW w:type="dxa" w:w="864"/>
-          </w:tcPr>
-          <w:p>
-            <w:r>
-              <w:t>-456.17</w:t>
-            </w:r>
-          </w:p>
-        </w:tc>
-        <w:tc>
-          <w:tcPr>
-            <w:tcW w:type="dxa" w:w="864"/>
+            <w:tcW w:type="dxa" w:w="1234"/>
           </w:tcPr>
           <w:p>
             <w:r>
@@ -5974,27 +5264,7 @@
         </w:tc>
         <w:tc>
           <w:tcPr>
-            <w:tcW w:type="dxa" w:w="864"/>
-          </w:tcPr>
-          <w:p>
-            <w:r>
-              <w:t>112.34</w:t>
-            </w:r>
-          </w:p>
-        </w:tc>
-        <w:tc>
-          <w:tcPr>
-            <w:tcW w:type="dxa" w:w="864"/>
-          </w:tcPr>
-          <w:p>
-            <w:r>
-              <w:t>112.34</w:t>
-            </w:r>
-          </w:p>
-        </w:tc>
-        <w:tc>
-          <w:tcPr>
-            <w:tcW w:type="dxa" w:w="864"/>
+            <w:tcW w:type="dxa" w:w="1234"/>
           </w:tcPr>
           <w:p>
             <w:r>
@@ -6004,7 +5274,7 @@
         </w:tc>
         <w:tc>
           <w:tcPr>
-            <w:tcW w:type="dxa" w:w="864"/>
+            <w:tcW w:type="dxa" w:w="1234"/>
           </w:tcPr>
           <w:p>
             <w:r>
@@ -6014,113 +5284,11 @@
         </w:tc>
         <w:tc>
           <w:tcPr>
-            <w:tcW w:type="dxa" w:w="864"/>
+            <w:tcW w:type="dxa" w:w="1234"/>
           </w:tcPr>
           <w:p>
             <w:r>
               <w:t>-456.2</w:t>
-            </w:r>
-          </w:p>
-        </w:tc>
-      </w:tr>
-      <w:tr>
-        <w:tc>
-          <w:tcPr>
-            <w:tcW w:type="dxa" w:w="864"/>
-          </w:tcPr>
-          <w:p>
-            <w:r>
-              <w:t>United States</w:t>
-            </w:r>
-          </w:p>
-        </w:tc>
-        <w:tc>
-          <w:tcPr>
-            <w:tcW w:type="dxa" w:w="864"/>
-          </w:tcPr>
-          <w:p>
-            <w:r>
-              <w:t>770.7</w:t>
-            </w:r>
-          </w:p>
-        </w:tc>
-        <w:tc>
-          <w:tcPr>
-            <w:tcW w:type="dxa" w:w="864"/>
-          </w:tcPr>
-          <w:p>
-            <w:r>
-              <w:t>547.3</w:t>
-            </w:r>
-          </w:p>
-        </w:tc>
-        <w:tc>
-          <w:tcPr>
-            <w:tcW w:type="dxa" w:w="864"/>
-          </w:tcPr>
-          <w:p>
-            <w:r>
-              <w:t>-223.32</w:t>
-            </w:r>
-          </w:p>
-        </w:tc>
-        <w:tc>
-          <w:tcPr>
-            <w:tcW w:type="dxa" w:w="864"/>
-          </w:tcPr>
-          <w:p>
-            <w:r>
-              <w:t>-29.0</w:t>
-            </w:r>
-          </w:p>
-        </w:tc>
-        <w:tc>
-          <w:tcPr>
-            <w:tcW w:type="dxa" w:w="864"/>
-          </w:tcPr>
-          <w:p>
-            <w:r>
-              <w:t>132.49</w:t>
-            </w:r>
-          </w:p>
-        </w:tc>
-        <w:tc>
-          <w:tcPr>
-            <w:tcW w:type="dxa" w:w="864"/>
-          </w:tcPr>
-          <w:p>
-            <w:r>
-              <w:t>132.49</w:t>
-            </w:r>
-          </w:p>
-        </w:tc>
-        <w:tc>
-          <w:tcPr>
-            <w:tcW w:type="dxa" w:w="864"/>
-          </w:tcPr>
-          <w:p>
-            <w:r>
-              <w:t>638.2</w:t>
-            </w:r>
-          </w:p>
-        </w:tc>
-        <w:tc>
-          <w:tcPr>
-            <w:tcW w:type="dxa" w:w="864"/>
-          </w:tcPr>
-          <w:p>
-            <w:r>
-              <w:t>414.8</w:t>
-            </w:r>
-          </w:p>
-        </w:tc>
-        <w:tc>
-          <w:tcPr>
-            <w:tcW w:type="dxa" w:w="864"/>
-          </w:tcPr>
-          <w:p>
-            <w:r>
-              <w:t>-223.3</w:t>
             </w:r>
           </w:p>
         </w:tc>
@@ -6199,7 +5367,7 @@
     </w:p>
     <w:p>
       <w:r>
-        <w:t>Table 7 reports the single mechanical counterfactual with the largest margin gain per 10% lever change for each group. Reducing dropout is the dominant positive lever for every civilisation, which is consistent with the elasticity results in Table 3. The gain per 10% proportional reduction in d ranges from about 26 additional active researchers for the Japanese group to about 203 for the Sinic group, reflecting differences in cohort size and baseline attrition. No other single lever comes close to dropout reduction in terms of simulated margin gain per unit proportional change, although combinations of levers may be more efficient for some groups. The results also imply that policy need not focus on blocking early-career outflow. Reducing attrition among researchers who remain in the domestic system is a more efficient way to protect the active pool than preventing researchers from going abroad, because a researcher abroad is still in the global AI/ML system and may return. For the smallest groups, increasing the exogenous entry rate or improving the promotion of hit researchers to PIs can add additional margin, but dropout reduction remains the first-order model-implied target.</w:t>
+        <w:t>Table 7 reports the single mechanical counterfactual with the largest margin gain per 10% lever change for each group. Reducing dropout is the dominant positive lever for every civilisation, which is consistent with the elasticity results in Table 3. The gain from a roughly 10% proportional reduction in d ranges from about 26 additional active researchers for the Japanese group to about 203 for the Sinic group, reflecting differences in cohort size and baseline attrition. No other single lever comes close to dropout reduction in terms of simulated margin gain per unit proportional change, although combinations of levers may be more efficient for some groups. The results also imply that policy need not focus on blocking early-career outflow. Reducing attrition among researchers who remain in the domestic system is a more efficient way to protect the active pool than preventing researchers from going abroad, because a researcher abroad is still in the global AI/ML system and may return. For the smallest groups, increasing the exogenous entry rate or improving the promotion of hit researchers to PIs can add additional margin, but dropout reduction remains the first-order model-implied target.</w:t>
       </w:r>
     </w:p>
     <w:tbl>
@@ -7541,7 +6709,7 @@
     </w:p>
     <w:p>
       <w:r>
-        <w:t>First, exogenous entry (I0) is the closest point of no return for the active researcher pool in every group. A large proportional reduction in baseline recruitment would drive most communities to their threshold before mobility rates such as return or promotion became binding. This is consistent with the observation that AI/ML fields depend on a continuous pipeline of new graduate students and junior researchers</w:t>
+        <w:t>First, I0 is the closest point-of-no-return lever for the active researcher pool in every group. A large proportional reduction in baseline recruitment would drive most communities to their threshold before mobility rates such as return or promotion became binding. This is consistent with the observation that AI/ML fields depend on a continuous pipeline of new graduate students and junior researchers</w:t>
       </w:r>
       <w:r>
         <w:rPr>
@@ -7555,17 +6723,17 @@
     </w:p>
     <w:p>
       <w:r>
-        <w:t>Second, among the mobility transition rates, dropout is the dominant lever. Its elasticity is near -2 for every group, and a simulated 10% reduction yields the largest margin gain per unit proportional change in the policy counterfactuals. Attrition matters because it removes researchers from every compartment, not just one. A 10% proportional reduction in dropout expands the safety margin more than comparably sized increases in return, hit generation or promotion. For groups with small safety margins, such as Japan, even modest attrition reductions may substantially delay the threshold. These counterfactuals are mechanical perturbations of the fitted rates; they identify the most sensitive transition levers, not the causal effect of any specific policy programme.</w:t>
+        <w:t>Second, among the mobility transition rates, dropout (d) is the dominant negative lever; its active-pool elasticity ranges from -2.32 to -2.01 across groups, and in the policy counterfactuals a simulated reduction in dropout yields the largest margin gain per unit proportional change. Attrition matters because it removes researchers from every compartment, not just one. A 10% proportional reduction in dropout expands the safety margin more than comparably sized increases in return, hit generation or promotion. For Japanese, the group with the smallest safety margin, even modest attrition reductions may widen the margin. These counterfactuals are mechanical perturbations of the fitted rates; they identify the most sensitive transition levers, not the causal effect of any specific policy programme.</w:t>
       </w:r>
     </w:p>
     <w:p>
       <w:r>
-        <w:t>Third, the positive transition levers are not symmetric. PI promotion (p_D) and domestic hit generation (h_D) have positive but smaller elasticities than dropout reduction. Return from abroad (β) is also positive, though its effect is generally smaller than keeping researchers from leaving in the first place. The implication for policy is that retention is usually cheaper and more effective than return, but a balanced portfolio is still needed: a community without domestic PI growth cannot reproduce itself through attrition reduction alone.</w:t>
+        <w:t>Third, the largest positive transition lever is principal-investigator promotion (p_D), followed by domestic hit generation (h_D). The Japanese group shows the strongest response to PI promotion, suggesting that for that community expanding the domestic PI pipeline is an efficient lever. Return from abroad (β) is also positive for most groups, though its effect is generally smaller than reducing attrition directly. The implication for policy is that retention and promotion are usually more efficient than trying to attract returnees, but a balanced portfolio is still needed: a community without domestic PI growth cannot reproduce itself through attrition reduction alone.</w:t>
       </w:r>
     </w:p>
     <w:p>
       <w:r>
-        <w:t>Fourth, the historical counterfactual shows that the late-window rates, if they persisted, would change equilibrium margins in both directions. Several large groups would see lower safety margins, while Japan and some smaller groups would see higher margins. This heterogeneity cautions against treating AI/ML mobility as a single global trend. It also confirms that the model can detect temporal changes in transition rates, which is the prerequisite for the early intervention the framework is designed to support.</w:t>
+        <w:t>Fourth, the historical counterfactual shows that the late-window rates, if they persisted, would alter equilibrium margins. All 2 groups with dual-window support would see smaller safety margins under late-window rates (Sinic, Continental Europe). This pattern cautions against treating AI/ML mobility as a single global trend. It also confirms that the model can detect temporal changes in transition rates, which is the prerequisite for the early intervention the framework is designed to support.</w:t>
       </w:r>
     </w:p>
     <w:p>
@@ -7683,7 +6851,7 @@
     </w:p>
     <w:p>
       <w:r>
-        <w:t>We have proposed and implemented a transition-rate framework for assessing how close AI/ML research communities are to a point of no return. The model converts OpenAlex publication records into civilisation-specific transition rates and solves for the equilibrium active researcher pool. All groups remain above their minimum viable coauthor threshold in the fitted model, but the distance to that threshold varies by an order of magnitude and is most sensitive to exogenous entry and dropout. Dropout is the dominant negative lever, and a simulated reduction is the single most efficient model-implied response for every civilisation. However, the closest point of no return is exogenous entry for most groups, which means that policies which sustain the pipeline of new researchers are first-order defences. The historical counterfactual and the bootstrap intervals remind us that the future is not determined by current rates; transition rates can change, and policy can be directed at the most fragile lever before a collapse.</w:t>
+        <w:t>We have proposed and implemented a transition-rate framework for assessing how close AI/ML research communities are to a point of no return. The model converts OpenAlex publication records into civilisation-specific transition rates and solves for the equilibrium active researcher pool. All groups remain above their minimum viable coauthor threshold in the fitted model, but the distance to that threshold varies by an order of magnitude and is most sensitive to exogenous entry and dropout. Dropout is the dominant negative lever (active-pool elasticity -2.32 to -2.01), and a simulated reduction is the single most efficient model-implied response for every civilisation. However, the closest point of no return is exogenous entry for all groups in the active-pool analysis, which means that policies which sustain the pipeline of new researchers are first-order defences. The historical counterfactual and the bootstrap intervals remind us that the future is not determined by current rates; transition rates can change, and policy can be directed at the most fragile lever before a collapse.</w:t>
       </w:r>
     </w:p>
     <w:p>

</xml_diff>

<commit_message>
Fix Devin Review findings: note.com footnote, renumber references, author override, robust policy/rate handling, regenerate manuscript
Co-Authored-By: Tatsuki Onishi <bougtoir@gmail.com>
</commit_message>
<xml_diff>
--- a/researcher_mobility_ode/docs/manuscript_full_article.docx
+++ b/researcher_mobility_ode/docs/manuscript_full_article.docx
@@ -28,7 +28,7 @@
         <w:jc w:val="center"/>
       </w:pPr>
       <w:r>
-        <w:t>Approximate word count (main text incl. tables, excl. references): 7879</w:t>
+        <w:t>Approximate word count (main text incl. tables, excl. references): 7915</w:t>
       </w:r>
     </w:p>
     <w:p>
@@ -181,7 +181,7 @@
         <w:rPr>
           <w:vertAlign w:val="superscript"/>
         </w:rPr>
-        <w:t>[1]</w:t>
+        <w:t xml:space="preserve"> 1</w:t>
       </w:r>
       <w:r>
         <w:t>. A small proportional change in one of those rates can, over time, push a research community below the minimum coauthor pool it needs to remain viable. Once the pool falls below that threshold, recovery becomes difficult or impossible, even if policy is later reversed. That is the point of no return that motivates this paper</w:t>
@@ -190,7 +190,7 @@
         <w:rPr>
           <w:vertAlign w:val="superscript"/>
         </w:rPr>
-        <w:t>[1]</w:t>
+        <w:t xml:space="preserve"> 1</w:t>
       </w:r>
       <w:r>
         <w:t>. The contribution of this paper is to translate that qualitative insight into an empirically tractable model. We estimate transition rates from open bibliometric data, solve the steady state of a compartment model, and identify which rate in which civilisation is closest to a threshold. The approach is deliberately stylised: it sacrifices demographic realism for transparency and for the ability to compare multiple civilisations with the same accounting framework.</w:t>
@@ -204,7 +204,7 @@
         <w:rPr>
           <w:vertAlign w:val="superscript"/>
         </w:rPr>
-        <w:t>[2]</w:t>
+        <w:t xml:space="preserve"> [1]</w:t>
       </w:r>
       <w:r>
         <w:t>, and their development depends on a relatively small, highly mobile workforce of doctoral and post-doctoral researchers, principal investigators, and research engineers</w:t>
@@ -213,7 +213,7 @@
         <w:rPr>
           <w:vertAlign w:val="superscript"/>
         </w:rPr>
-        <w:t>[2]</w:t>
+        <w:t xml:space="preserve"> [1]</w:t>
       </w:r>
       <w:r>
         <w:t>. The geographic concentration of this workforce has generated both scientific and geopolitical concern. Policymakers in the United States, China, Europe, Japan, India and elsewhere now treat AI talent as a strategic input, and several governments have introduced incentives to attract or retain researchers</w:t>
@@ -222,7 +222,7 @@
         <w:rPr>
           <w:vertAlign w:val="superscript"/>
         </w:rPr>
-        <w:t>[3]</w:t>
+        <w:t xml:space="preserve"> [2]</w:t>
       </w:r>
       <w:r>
         <w:t>. Most of those policies are evaluated by their immediate net-flow effects. They rarely ask which transition in the career pipeline is the binding constraint, or how close a community is to a threshold where the field can no longer sustain itself. The economic literature on science has long emphasised that researchers are a scarce input and that their mobility responds to career incentives and institutional quality</w:t>
@@ -231,7 +231,7 @@
         <w:rPr>
           <w:vertAlign w:val="superscript"/>
         </w:rPr>
-        <w:t>[4]</w:t>
+        <w:t xml:space="preserve"> [3]</w:t>
       </w:r>
       <w:r>
         <w:t>. That literature provides the microfoundation for our rates: individuals decide where to train, whether to go abroad, when to return, and when to leave academia. We aggregate those individual decisions into civilisation-level transition rates and ask what the resulting dynamics imply for community survival.</w:t>
@@ -245,7 +245,7 @@
         <w:rPr>
           <w:vertAlign w:val="superscript"/>
         </w:rPr>
-        <w:t>[5]</w:t>
+        <w:t xml:space="preserve"> [4]</w:t>
       </w:r>
       <w:r>
         <w:t>. We adapt Huntington's nine civilisations for AI/ML mobility by keeping the United States, China (Sinic), India (Hindu), Japan, and the Islamic world as distinct groups, splitting the Western bloc into the United States, Anglosphere excluding the United States, Continental Europe and Other Western, and merging the smaller Latin American, Orthodox and African communities into Other Civilizations. This grouping reflects the empirical size and mobility patterns observed in the data rather than a normative claim about civilisational identity.</w:t>
@@ -259,7 +259,7 @@
         <w:rPr>
           <w:vertAlign w:val="superscript"/>
         </w:rPr>
-        <w:t>[6]</w:t>
+        <w:t xml:space="preserve"> [5]</w:t>
       </w:r>
       <w:r>
         <w:t>. A diverse ecosystem generates competing approaches, which increases the probability that unexpected breakthroughs and error correction survive</w:t>
@@ -268,7 +268,7 @@
         <w:rPr>
           <w:vertAlign w:val="superscript"/>
         </w:rPr>
-        <w:t>[6]</w:t>
+        <w:t xml:space="preserve"> [5]</w:t>
       </w:r>
       <w:r>
         <w:t>. If transition rates can be observed with enough temporal resolution, policy can intervene before a community reaches the point of no return. Early, proportionate interventions can prevent the emergence of a monopoly or oligopoly without requiring large ex post rescues.</w:t>
@@ -287,10 +287,30 @@
         <w:rPr>
           <w:vertAlign w:val="superscript"/>
         </w:rPr>
-        <w:t>[7]</w:t>
+        <w:t xml:space="preserve"> [6]</w:t>
       </w:r>
       <w:r>
         <w:t>. The model is intentionally simple: it does not explain why a rate is high or low, but it identifies which rate is closest to a threshold and therefore where early intervention is most urgent.</w:t>
+      </w:r>
+    </w:p>
+    <w:p>
+      <w:r>
+        <w:rPr>
+          <w:vertAlign w:val="superscript"/>
+        </w:rPr>
+        <w:t xml:space="preserve">1 </w:t>
+      </w:r>
+      <w:r>
+        <w:t>Yamada Y (momentumyy). 海外で当てた研究者はその後どうなるのか. note.com, 2026. https://note.com/momentumyy/n/n86df5d34282d (accessed 2026-08-09).</w:t>
+      </w:r>
+    </w:p>
+    <w:p/>
+    <w:p>
+      <w:pPr>
+        <w:pStyle w:val="Heading1"/>
+      </w:pPr>
+      <w:r>
+        <w:t>2. Literature and conceptual framework</w:t>
       </w:r>
     </w:p>
     <w:p>
@@ -301,7 +321,7 @@
         <w:rPr>
           <w:vertAlign w:val="superscript"/>
         </w:rPr>
-        <w:t>[8]</w:t>
+        <w:t xml:space="preserve"> [7]</w:t>
       </w:r>
       <w:r>
         <w:t>. Thorn and Holm-Nielsen argue that the mobility of researchers from developing countries can become a gain when return migration and diaspora networks are supported, but it can become a drain when local research environments cannot retain or reproduce talent</w:t>
@@ -310,7 +330,7 @@
         <w:rPr>
           <w:vertAlign w:val="superscript"/>
         </w:rPr>
-        <w:t>[8]</w:t>
+        <w:t xml:space="preserve"> [7]</w:t>
       </w:r>
       <w:r>
         <w:t>. Appelt et al., using a gravity framework for 1996-2011, find that scientific collaboration, economic convergence and visa restrictions are the strongest correlates of bilateral mobility</w:t>
@@ -319,7 +339,7 @@
         <w:rPr>
           <w:vertAlign w:val="superscript"/>
         </w:rPr>
-        <w:t>[3]</w:t>
+        <w:t xml:space="preserve"> [2]</w:t>
       </w:r>
       <w:r>
         <w:t>. Their analysis shows that mobility is multi-directional: a large share of researcher movement is better described as circulation than as one-way migration.</w:t>
@@ -333,7 +353,7 @@
         <w:rPr>
           <w:vertAlign w:val="superscript"/>
         </w:rPr>
-        <w:t>[2]</w:t>
+        <w:t xml:space="preserve"> [1]</w:t>
       </w:r>
       <w:r>
         <w:t>. AlShebli et al. show that U.S.-China collaboration in AI is more impactful than either country working alone, and that most mobile AI scientists retain collaboration links with their origin country</w:t>
@@ -342,7 +362,7 @@
         <w:rPr>
           <w:vertAlign w:val="superscript"/>
         </w:rPr>
-        <w:t>[9]</w:t>
+        <w:t xml:space="preserve"> [8]</w:t>
       </w:r>
       <w:r>
         <w:t>. Yuan et al. find that the brain-drain problem for AI scientists is increasingly serious in developing countries, and that the ties among AI elites are highly clustered</w:t>
@@ -351,7 +371,7 @@
         <w:rPr>
           <w:vertAlign w:val="superscript"/>
         </w:rPr>
-        <w:t>[10]</w:t>
+        <w:t xml:space="preserve"> [9]</w:t>
       </w:r>
       <w:r>
         <w:t>. These studies establish that AI/ML talent is mobile, concentrated and strategically important.</w:t>
@@ -365,7 +385,7 @@
         <w:rPr>
           <w:vertAlign w:val="superscript"/>
         </w:rPr>
-        <w:t>[11]</w:t>
+        <w:t xml:space="preserve"> [10]</w:t>
       </w:r>
       <w:r>
         <w:t>. Transferred to science, the equivalent idea is a minimum viable coauthor pool: the smallest number of active researchers that can continue to produce work at the field's observed coauthor intensity. Below that pool, collaboration networks fragment, mentorship chains break, and the field enters a self-reinforcing decline.</w:t>
@@ -384,7 +404,7 @@
         <w:rPr>
           <w:vertAlign w:val="superscript"/>
         </w:rPr>
-        <w:t>[6]</w:t>
+        <w:t xml:space="preserve"> [5]</w:t>
       </w:r>
       <w:r>
         <w:t>. Translated to global science, this suggests that a single dominant region or a tight oligopoly may slow the rate of methodological and conceptual breakthroughs. Maintaining multiple centres of AI/ML research is therefore not merely a distributional concern; it may increase the long-run productivity of the field.</w:t>
@@ -406,7 +426,7 @@
         <w:rPr>
           <w:vertAlign w:val="superscript"/>
         </w:rPr>
-        <w:t>[12]</w:t>
+        <w:t xml:space="preserve"> [11]</w:t>
       </w:r>
       <w:r>
         <w:t>. That work consistently finds that the United States, parts of Europe and, increasingly, China and India are central nodes in the global mobility network. It also finds that mobility responds to wages, funding, institutional quality and career prospects, but that it is path-dependent: once a community loses its senior cohort, it becomes harder to rebuild.</w:t>
@@ -428,7 +448,7 @@
         <w:rPr>
           <w:vertAlign w:val="superscript"/>
         </w:rPr>
-        <w:t>[13]</w:t>
+        <w:t xml:space="preserve"> [12]</w:t>
       </w:r>
       <w:r>
         <w:t>. This literature suggests that global AI/ML is not a zero-sum race in which every researcher in one location subtracts from another. It also implies that sustaining a domestic community is compatible with, rather than opposed to, international collaboration. The question is therefore not whether researchers move, but whether the domestic pipeline that replaces them is robust enough to keep the field alive.</w:t>
@@ -450,7 +470,7 @@
         <w:rPr>
           <w:vertAlign w:val="superscript"/>
         </w:rPr>
-        <w:t>[11]</w:t>
+        <w:t xml:space="preserve"> [10]</w:t>
       </w:r>
       <w:r>
         <w:t>. We borrow that intuition and apply it to a research community. A field needs a minimum number of active researchers to produce work, train successors, and maintain peer review and conference communities. Below that threshold, positive feedback loops weaken: fewer researchers produce fewer students, fewer students produce fewer researchers, and the community enters a downward spiral. This is the point of no return.</w:t>
@@ -472,7 +492,7 @@
         <w:rPr>
           <w:vertAlign w:val="superscript"/>
         </w:rPr>
-        <w:t>[4]</w:t>
+        <w:t xml:space="preserve"> [3]</w:t>
       </w:r>
       <w:r>
         <w:t>, but it adds a civilisational partition and a minimum viable coauthor threshold. The civilisational partition is not merely a geographic convenience. It reflects the fact that career incentives, language, funding systems, and institutional networks cluster along civilisational lines, and that these clusters shape mobility more than national borders alone</w:t>
@@ -481,7 +501,7 @@
         <w:rPr>
           <w:vertAlign w:val="superscript"/>
         </w:rPr>
-        <w:t>[5]</w:t>
+        <w:t xml:space="preserve"> [4]</w:t>
       </w:r>
       <w:r>
         <w:t>. The result is a framework that can be updated as new data arrive and can compare the fragility of different research communities using a common metric. Because it is built on open bibliometric data and transparent transition rates, the model can be replicated and extended by other researchers and by policymakers who need a common language for discussing mobility and capacity.</w:t>
@@ -503,7 +523,7 @@
         <w:rPr>
           <w:vertAlign w:val="superscript"/>
         </w:rPr>
-        <w:t>[7]</w:t>
+        <w:t xml:space="preserve"> [6]</w:t>
       </w:r>
       <w:r>
         <w:t>. OpenAlex provides open, CC0 bibliographic metadata including authors, affiliations, countries, publication dates, venues and citation links. We built author histories by following each author's sequence of works and affiliations, assigning them to a country for each work and then to a civilisation by the modal country of their recorded affiliations. An author is treated as active if they have at least one AI/ML work in the observation window and as a principal investigator (PI) if they appear as the last author of at least one work, a standard proxy for seniority in empirical science</w:t>
@@ -512,7 +532,7 @@
         <w:rPr>
           <w:vertAlign w:val="superscript"/>
         </w:rPr>
-        <w:t>[4]</w:t>
+        <w:t xml:space="preserve"> [3]</w:t>
       </w:r>
       <w:r>
         <w:t>. A 'hit' work is defined as one whose citation count places it in the top 10% of AI/ML works in the same publication year. The final groups are: United States, Anglosphere ex-US, Continental Europe, Sinic, Japanese, Hindu, Islamic, Other Western, and Other Civilizations.</w:t>
@@ -6701,7 +6721,7 @@
         <w:rPr>
           <w:vertAlign w:val="superscript"/>
         </w:rPr>
-        <w:t>[12]</w:t>
+        <w:t xml:space="preserve"> [11]</w:t>
       </w:r>
       <w:r>
         <w:t>. These indicators are useful for describing patterns, but they do not reveal the mechanisms that sustain or undermine a research community. A country may have a positive net inflow while simultaneously losing its domestic PI base through retirement or emigration, or it may have negative net flow but a healthy pipeline of new entrants. The transition-rate framework disaggregates these processes and shows that the same net flow can correspond to very different vulnerability profiles. For example, a high early-career outflow rate is less damaging than a high dropout rate because researchers abroad may return; a high dropout rate removes researchers from the system entirely. This distinction is lost in net-flow accounting but is central to point-of-no-return analysis.</w:t>
@@ -6715,7 +6735,7 @@
         <w:rPr>
           <w:vertAlign w:val="superscript"/>
         </w:rPr>
-        <w:t>[2]</w:t>
+        <w:t xml:space="preserve"> [1]</w:t>
       </w:r>
       <w:r>
         <w:t>. Policies that sustain that pipeline, such as doctoral funding, visa routes for early-career researchers, and stable junior positions, are therefore first-order defences against a point of no return.</w:t>
@@ -6767,7 +6787,7 @@
         <w:rPr>
           <w:vertAlign w:val="superscript"/>
         </w:rPr>
-        <w:t>[14]</w:t>
+        <w:t xml:space="preserve"> [13]</w:t>
       </w:r>
       <w:r>
         <w:t>. A monocentric or tight-oligopoly structure in AI/ML may produce short-run efficiency gains through scale and agglomeration, but it also raises the risk of methodological lock-in, selection bias in training data, and reduced error correction. Recent work on multi-university teams shows that geographically dispersed collaborations can retain high impact, which suggests that distributing capacity across civilisations need not sacrifice quality</w:t>
@@ -6776,7 +6796,7 @@
         <w:rPr>
           <w:vertAlign w:val="superscript"/>
         </w:rPr>
-        <w:t>[13]</w:t>
+        <w:t xml:space="preserve"> [12]</w:t>
       </w:r>
       <w:r>
         <w:t>. By quantifying the safety margin for each research community, the framework makes it possible to argue for support of smaller communities on positive, innovation-systems grounds. Preserving multiple centres of AI/ML research is not a matter of slowing the frontier; it is a matter of ensuring that the frontier is not defined by a single set of institutions, languages, or problems.</w:t>
@@ -6798,7 +6818,7 @@
         <w:rPr>
           <w:vertAlign w:val="superscript"/>
         </w:rPr>
-        <w:t>[15]</w:t>
+        <w:t xml:space="preserve"> [14]</w:t>
       </w:r>
       <w:r>
         <w:t>, in which the central question is not only who wins the current round but whether the global system retains enough diversity for future rounds</w:t>
@@ -6807,7 +6827,7 @@
         <w:rPr>
           <w:vertAlign w:val="superscript"/>
         </w:rPr>
-        <w:t>[16]</w:t>
+        <w:t xml:space="preserve"> [15]</w:t>
       </w:r>
       <w:r>
         <w:t>. If the dt of policy response is short enough, the model can be updated annually and divergence caught early, before any single civilisation approaches a point of no return. This is the mechanism through which technology monopoly, hegemonic concentration and oligopoly dead-ends can be avoided: by keeping every major research community above its minimum viable coauthor pool, the framework sustains the competitive diversity that underpins long-run technological progress. The framework is therefore not a prediction that a particular civilisation will collapse. It is a tool for ensuring that no single civilisation reaches a point where its collapse becomes self-sustaining, and that the global AI/ML system retains the diversity required for continued innovation.</w:t>
@@ -6882,82 +6902,77 @@
     </w:p>
     <w:p>
       <w:r>
-        <w:t>1. Yamada Y (momentumyy). 海外で当てた研究者はその後どうなるのか. note.com, 2026. https://note.com/momentumyy/n/n86df5d34282d (accessed 2026-08-09).</w:t>
+        <w:t>1. MacroPolo. The Global AI Talent Tracker 2.0. Paulson Institute, 2023. https://macropolo.org/digital-projects/the-global-ai-talent-tracker/</w:t>
       </w:r>
     </w:p>
     <w:p>
       <w:r>
-        <w:t>2. MacroPolo. The Global AI Talent Tracker 2.0. Paulson Institute, 2023. https://macropolo.org/digital-projects/the-global-ai-talent-tracker/</w:t>
+        <w:t>2. Appelt S, van Beuzekom B, Galindo-Rueda F, de Pinho R. Which factors influence the international mobility of research scientists? OECD Science, Technology and Industry Working Papers 2015/02, 2015. https://doi.org/10.1787/5js1tmrr2233-en</w:t>
       </w:r>
     </w:p>
     <w:p>
       <w:r>
-        <w:t>3. Appelt S, van Beuzekom B, Galindo-Rueda F, de Pinho R. Which factors influence the international mobility of research scientists? OECD Science, Technology and Industry Working Papers 2015/02, 2015. https://doi.org/10.1787/5js1tmrr2233-en</w:t>
+        <w:t>3. Stephan P E. The Economics of Science. J Econ Lit. 1996;34(3):1199-1235.</w:t>
       </w:r>
     </w:p>
     <w:p>
       <w:r>
-        <w:t>4. Stephan P E. The Economics of Science. J Econ Lit. 1996;34(3):1199-1235.</w:t>
+        <w:t>4. Huntington S P. The Clash of Civilizations and the Remaking of World Order. New York: Simon &amp; Schuster, 1996.</w:t>
       </w:r>
     </w:p>
     <w:p>
       <w:r>
-        <w:t>5. Huntington S P. The Clash of Civilizations and the Remaking of World Order. New York: Simon &amp; Schuster, 1996.</w:t>
+        <w:t>5. Aghion P, Bloom N, Blundell R, Griffith R, Howitt P. Competition and innovation: an inverted-U relationship. Q J Econ. 2005;120(2):701-728.</w:t>
       </w:r>
     </w:p>
     <w:p>
       <w:r>
-        <w:t>6. Aghion P, Bloom N, Blundell R, Griffith R, Howitt P. Competition and innovation: an inverted-U relationship. Q J Econ. 2005;120(2):701-728.</w:t>
+        <w:t>6. Priem J, Piwowar H, Orr R. OpenAlex: A fully-open index of scholarly works, authors, venues, institutions, and concepts. arXiv:2205.01833, 2022. https://doi.org/10.48550/arXiv.2205.01833</w:t>
       </w:r>
     </w:p>
     <w:p>
       <w:r>
-        <w:t>7. Priem J, Piwowar H, Orr R. OpenAlex: A fully-open index of scholarly works, authors, venues, institutions, and concepts. arXiv:2205.01833, 2022. https://doi.org/10.48550/arXiv.2205.01833</w:t>
+        <w:t>7. Thorn K, Holm-Nielsen L B. International Mobility of Researchers and Scientists: Policy Options for Turning a Drain into a Gain. UNU-WIDER Research Paper No. 2006/83, 2006. https://www.wider.unu.edu/sites/default/files/rp2006-83.pdf</w:t>
       </w:r>
     </w:p>
     <w:p>
       <w:r>
-        <w:t>8. Thorn K, Holm-Nielsen L B. International Mobility of Researchers and Scientists: Policy Options for Turning a Drain into a Gain. UNU-WIDER Research Paper No. 2006/83, 2006. https://www.wider.unu.edu/sites/default/files/rp2006-83.pdf</w:t>
+        <w:t>8. AlShebli B, Memon S A, Evans J A, Rahwan T. China and the U.S. produce more impactful AI research when collaborating together. Sci Rep. 2024;14:28576. https://doi.org/10.1038/s41598-024-79863-5</w:t>
       </w:r>
     </w:p>
     <w:p>
       <w:r>
-        <w:t>9. AlShebli B, Memon S A, Evans J A, Rahwan T. China and the U.S. produce more impactful AI research when collaborating together. Sci Rep. 2024;14:28576. https://doi.org/10.1038/s41598-024-79863-5</w:t>
+        <w:t>9. Yuan S, Shao Z, Wei X, Tang J, Hall W, Wang Y, et al. Science behind AI: the evolution of trend, mobility, and collaboration. Scientometrics. 2020;124(2):993-1013. https://doi.org/10.1007/s11192-020-03423-7</w:t>
       </w:r>
     </w:p>
     <w:p>
       <w:r>
-        <w:t>10. Yuan S, Shao Z, Wei X, Tang J, Hall W, Wang Y, et al. Science behind AI: the evolution of trend, mobility, and collaboration. Scientometrics. 2020;124(2):993-1013. https://doi.org/10.1007/s11192-020-03423-7</w:t>
+        <w:t>10. Shaffer M L. Minimum Population Sizes for Species Conservation. BioScience. 1981;31(2):131-134.</w:t>
       </w:r>
     </w:p>
     <w:p>
       <w:r>
-        <w:t>11. Shaffer M L. Minimum Population Sizes for Species Conservation. BioScience. 1981;31(2):131-134.</w:t>
+        <w:t>11. Franzoni C, Scellato G, Stephan P E. Foreign-born scientists: mobility patterns for 16 countries. Nat Biotechnol. 2012;30(12):1250-1253.</w:t>
       </w:r>
     </w:p>
     <w:p>
       <w:r>
-        <w:t>12. Franzoni C, Scellato G, Stephan P E. Foreign-born scientists: mobility patterns for 16 countries. Nat Biotechnol. 2012;30(12):1250-1253.</w:t>
+        <w:t>12. Jones B F, Wuchty S, Uzzi B. Multi-University Research Teams: Shifting Impact, Geography, and Stratification in Science. Science. 2008;322(5905):1259-1262.</w:t>
       </w:r>
     </w:p>
     <w:p>
       <w:r>
-        <w:t>13. Jones B F, Wuchty S, Uzzi B. Multi-University Research Teams: Shifting Impact, Geography, and Stratification in Science. Science. 2008;322(5905):1259-1262.</w:t>
+        <w:t>13. Freeman R B, Huang W. Collaboration: Strength in diversity. Nature. 2014;513(7518):305. https://doi.org/10.1038/513305a</w:t>
       </w:r>
     </w:p>
     <w:p>
       <w:r>
-        <w:t>14. Freeman R B, Huang W. Collaboration: Strength in diversity. Nature. 2014;513(7518):305. https://doi.org/10.1038/513305a</w:t>
+        <w:t>14. Shachar A. The Race for Talent: Highly Skilled Migrants and Competitive Immigration Regimes. NYU Law Rev. 2006;81(1):148-206.</w:t>
       </w:r>
     </w:p>
     <w:p>
       <w:r>
-        <w:t>15. Shachar A. The Race for Talent: Highly Skilled Migrants and Competitive Immigration Regimes. NYU Law Rev. 2006;81(1):148-206.</w:t>
-      </w:r>
-    </w:p>
-    <w:p>
-      <w:r>
-        <w:t>16. Kerr W R. Global Talent and U.S. Immigration Policy. Harvard Business School Working Paper No. 20-107, 2020. https://www.hbs.edu/ris/Publication%20Files/20-107_0967f1ab-1d23-4d54-b5a1-c884234d9b31.pdf</w:t>
+        <w:t>15. Kerr W R. Global Talent and U.S. Immigration Policy. Harvard Business School Working Paper No. 20-107, 2020. https://www.hbs.edu/ris/Publication%20Files/20-107_0967f1ab-1d23-4d54-b5a1-c884234d9b31.pdf</w:t>
       </w:r>
     </w:p>
     <w:sectPr>

</xml_diff>

<commit_message>
Move note.com/Yamada Y reference from body to Acknowledgements only
The motivating note.com essay is now cited in the Acknowledgements
section; the Introduction no longer contains a footnote or in-text
reference to it. Manuscript, docx and pptx regenerated.

Co-Authored-By: Tatsuki Onishi <bougtoir@gmail.com>
</commit_message>
<xml_diff>
--- a/researcher_mobility_ode/docs/manuscript_full_article.docx
+++ b/researcher_mobility_ode/docs/manuscript_full_article.docx
@@ -28,7 +28,7 @@
         <w:jc w:val="center"/>
       </w:pPr>
       <w:r>
-        <w:t>Approximate word count (main text incl. tables, excl. references): 7915</w:t>
+        <w:t>Approximate word count (main text incl. tables, excl. references): 7903</w:t>
       </w:r>
     </w:p>
     <w:p>
@@ -162,7 +162,7 @@
         <w:t xml:space="preserve">Acknowledgments: </w:t>
       </w:r>
       <w:r>
-        <w:t>[To be completed / removed for double-blind review]</w:t>
+        <w:t>This study was motivated by a note.com essay by Yamada Y (momentumyy) that framed researcher mobility in terms of transition rates rather than net flows (Yamada Y (momentumyy). 海外で当てた研究者はその後どうなるのか. note.com, 2026. https://note.com/momentumyy/n/n86df5d34282d (accessed 2026-08-09).).</w:t>
       </w:r>
     </w:p>
     <w:p>
@@ -175,25 +175,7 @@
     </w:p>
     <w:p>
       <w:r>
-        <w:t>Most debates on research mobility focus on net flows: which country gains researchers and which loses them. Net-flow accounting is useful for headlines, but it hides the transition rates that actually move researchers between career stages and locations</w:t>
-      </w:r>
-      <w:r>
-        <w:rPr>
-          <w:vertAlign w:val="superscript"/>
-        </w:rPr>
-        <w:t xml:space="preserve"> 1</w:t>
-      </w:r>
-      <w:r>
-        <w:t>. A small proportional change in one of those rates can, over time, push a research community below the minimum coauthor pool it needs to remain viable. Once the pool falls below that threshold, recovery becomes difficult or impossible, even if policy is later reversed. That is the point of no return that motivates this paper</w:t>
-      </w:r>
-      <w:r>
-        <w:rPr>
-          <w:vertAlign w:val="superscript"/>
-        </w:rPr>
-        <w:t xml:space="preserve"> 1</w:t>
-      </w:r>
-      <w:r>
-        <w:t>. The contribution of this paper is to translate that qualitative insight into an empirically tractable model. We estimate transition rates from open bibliometric data, solve the steady state of a compartment model, and identify which rate in which civilisation is closest to a threshold. The approach is deliberately stylised: it sacrifices demographic realism for transparency and for the ability to compare multiple civilisations with the same accounting framework.</w:t>
+        <w:t>Most debates on research mobility focus on net flows: which country gains researchers and which loses them. Net-flow accounting is useful for headlines, but it hides the transition rates that actually move researchers between career stages and locations. A small proportional change in one of those rates can, over time, push a research community below the minimum coauthor pool it needs to remain viable. Once the pool falls below that threshold, recovery becomes difficult or impossible, even if policy is later reversed. That is the point of no return that motivates this paper. The contribution of this paper is to translate that qualitative insight into an empirically tractable model. We estimate transition rates from open bibliometric data, solve the steady state of a compartment model, and identify which rate in which civilisation is closest to a threshold. The approach is deliberately stylised: it sacrifices demographic realism for transparency and for the ability to compare multiple civilisations with the same accounting framework.</w:t>
       </w:r>
     </w:p>
     <w:p>
@@ -291,17 +273,6 @@
       </w:r>
       <w:r>
         <w:t>. The model is intentionally simple: it does not explain why a rate is high or low, but it identifies which rate is closest to a threshold and therefore where early intervention is most urgent.</w:t>
-      </w:r>
-    </w:p>
-    <w:p>
-      <w:r>
-        <w:rPr>
-          <w:vertAlign w:val="superscript"/>
-        </w:rPr>
-        <w:t xml:space="preserve">1 </w:t>
-      </w:r>
-      <w:r>
-        <w:t>Yamada Y (momentumyy). 海外で当てた研究者はその後どうなるのか. note.com, 2026. https://note.com/momentumyy/n/n86df5d34282d (accessed 2026-08-09).</w:t>
       </w:r>
     </w:p>
     <w:p/>

</xml_diff>

<commit_message>
Integrate annual transition-rate projection into full article manuscript
- Adds annual Methods (4.10/4.11), Results (5.6-5.8), Discussion (6.4-6.7) and updated Conclusion to the Research Policy full article. - Reuses scripts/annual_rates_projection_report.py plotting functions and results/annual/*.csv values with no hard-coded figures. - Regenerates docx, md and pptx with Figures 1-7 and Tables 1-12 cited inline. - Runs reproduce.sh end-to-end.

Co-Authored-By: Tatsuki Onishi <bougtoir@gmail.com>
</commit_message>
<xml_diff>
--- a/researcher_mobility_ode/docs/manuscript_full_article.docx
+++ b/researcher_mobility_ode/docs/manuscript_full_article.docx
@@ -28,7 +28,7 @@
         <w:jc w:val="center"/>
       </w:pPr>
       <w:r>
-        <w:t>Approximate word count (main text incl. tables, excl. references): 7903</w:t>
+        <w:t>Approximate word count (main text incl. tables, excl. references): 9825</w:t>
       </w:r>
     </w:p>
     <w:p>
@@ -258,7 +258,7 @@
     </w:p>
     <w:p>
       <w:r>
-        <w:t>We therefore address four research questions. First, how close is each civilisation to the point of no return in its AI/ML research community? Second, which transition rates have the largest effect on community size? Third, how have transition rates changed between earlier and later career cohorts, and what would have happened if those rates had persisted? Fourth, what safety-factor-bound policy packages can widen the margin before a point of no return is reached? The key policy intuition is that, with an appropriately chosen time step and an early warning signal, intervention can be calibrated in safety margins rather than after collapse. This prevents any single civilisation from cornering the supply of critical talent, and thereby preserves the competitive diversity that drives long-run innovation.</w:t>
+        <w:t>We therefore address five research questions. First, how close is each civilisation to the point of no return in its AI/ML research community? Second, which transition rates have the largest effect on community size? Third, how have transition rates changed between earlier and later career cohorts, and what would have happened if those rates had persisted? Fourth, what safety-factor-bound policy packages can widen the margin before a point of no return is reached? Fifth, can the fitted rates be estimated year by year and used to project near-term population composition, and how well do those projections reproduce observed 2017-2023 counts? The key policy intuition is that, with an appropriately chosen time step and an early warning signal, intervention can be calibrated in safety margins rather than after collapse. This prevents any single civilisation from cornering the supply of critical talent, and thereby preserves the competitive diversity that drives long-run innovation.</w:t>
       </w:r>
     </w:p>
     <w:p>
@@ -2121,6 +2121,47 @@
     </w:p>
     <w:p>
       <w:pPr>
+        <w:pStyle w:val="Heading2"/>
+      </w:pPr>
+      <w:r>
+        <w:t>4.10 Annual transition-rate estimation and projection</w:t>
+      </w:r>
+    </w:p>
+    <w:p>
+      <w:r>
+        <w:t>The steady-state model in Sections 4.1-4.4 treats rates as constants. To test whether the same framework can be used for short-run monitoring, we reconstructed year-by-year compartment membership from cohort.csv and raw_sampled_works.json. For each author and year we inferred location as domestic if the author was in the origin civilisation and abroad otherwise, using sampled works when available and cohort-derived abroad/return years as a fallback. From these states we computed annual transition counts for the six compartments, applied Laplace +0.5 smoothing to empty destination cells, and derived the probabilities that map to α, β, h_D, h_A, p_D, p_A and d. Inter-civilisation flows are approximated by assigning each abroad author-year to the author's recent_group as the destination civilisation; this is a lower-bound proxy because year-to-year destination changes are not observed in the public cohort.</w:t>
+      </w:r>
+    </w:p>
+    <w:p>
+      <w:r>
+        <w:t>For the 2017-2026 projection we fit a linear trend to the observed 2000-2016 rates for each group and rate. If fewer than four observations were available or the fit explained less than 10% of the variance, the historical mean was used instead. Projected rates were clipped to [0, 1]. Dropout was capped at the 90th percentile of observed dropout rates to prevent implausible extrapolation. Projected total inflows were apportioned across compartments using the observed 2016 distribution. Population composition was projected forward with the discrete-time recursion N(t+1) = N(t)P(t) + b(t+1), where P(t) is a 6×6 row-stochastic-in-expectation matrix that preserves dropout mass: the row sum is 1 − d after scaling outgoing rates. This discrete step is the operational counterpart of the continuous-time ODE; with an annual dt it provides an early-warning signal one year ahead.</w:t>
+      </w:r>
+    </w:p>
+    <w:p>
+      <w:r>
+        <w:t>We compare the 2017-2023 projection with the observed annual stock. The comparison is limited to years that have observed data, and the observed stock is reindexed to the full group-year-compartment grid so that zero-observed cells are not omitted from the accuracy metrics. Accuracy is reported as RMSE and MAPE; MAPE here is computed against count_obs + 1 to avoid division by zero and is therefore a conservative, non-standard measure.</w:t>
+      </w:r>
+    </w:p>
+    <w:p>
+      <w:pPr>
+        <w:pStyle w:val="Heading2"/>
+      </w:pPr>
+      <w:r>
+        <w:t>4.11 Correction pressures and theoretical bounds</w:t>
+      </w:r>
+    </w:p>
+    <w:p>
+      <w:r>
+        <w:t>The annual estimates contain several regularising pressures that bound the model away from instability and fabrication. Laplace smoothing adds a uniform prior of 0.5 to every possible destination, which shrinks sparse cells toward 1/(number of destinations) and prevents zero-probability singularities when a transition is unobserved in a small group-year. It is equivalent to a weak Dirichlet prior and is a standard regulariser for sparse multinomial transitions.</w:t>
+      </w:r>
+    </w:p>
+    <w:p>
+      <w:r>
+        <w:t>The [0, 1] clip after linear projection is a feasibility pressure: rates outside the probability simplex are inadmissible. The dropout cap is a safety pressure motivated by the fact that unbounded linear extrapolation of observed attrition would eventually predict more leavers than the total stock. The inflow apportionment pressure keeps the composition of new entrants aligned with the most recently observed recruitment pattern, rather than inventing a new distribution. Finally, the safety factor of 0.5 on the endogenous PI-driven inflow keeps the system inside the stability boundary. Together these pressures embody the principle that projection should stay within observed empirical support and within theoretical stability limits; they are not arbitrary adjustments but transparent bounds that can be tightened or relaxed as more data become available.</w:t>
+      </w:r>
+    </w:p>
+    <w:p>
+      <w:pPr>
         <w:pStyle w:val="Heading1"/>
       </w:pPr>
       <w:r>
@@ -6661,6 +6702,1966 @@
     <w:p>
       <w:r>
         <w:t>Taken together, the results provide a consistent picture. Exogenous entry and dropout are the two rates that most strongly determine the long-run viability of an AI/ML research community. Communities that are large in absolute terms are not necessarily safe if their coauthor intensity is high; conversely, small communities can be robust if their attrition is low and their recruitment pipeline is stable. The historical counterfactual shows that the current regime is not preordained: a shift in transition rates at the start of the AI boom would have produced different steady states for different civilisations. This is precisely why the framework is useful: it identifies which rate in which community is closest to a threshold, allowing policy to intervene before rather than after a collapse. The policy message is therefore both diagnostic and preventative. By tracking transition rates rather than net flows, policymakers can see which civilisation is approaching a point of no return and which lever offers the largest safety margin per unit of effort.</w:t>
+      </w:r>
+    </w:p>
+    <w:p>
+      <w:pPr>
+        <w:pStyle w:val="Heading2"/>
+      </w:pPr>
+      <w:r>
+        <w:t>5.6 Annual transition rates and inter-civilisation flows</w:t>
+      </w:r>
+    </w:p>
+    <w:p>
+      <w:r>
+        <w:t>Figure 5 plots the observed 2000-2016 transition rates and the projected 2017-2026 rates for each civilisation. Rates are displayed by group and by transition type, so that the reader can see whether a particular transition is trending toward a boundary. Because the projections are linear trend fits regularised by the correction pressures described in Section 4.11, they are not forecasts of specific future events; they are the model's one-year-ahead extrapolation of the recent historical trajectory.</w:t>
+      </w:r>
+    </w:p>
+    <w:p>
+      <w:r>
+        <w:drawing>
+          <wp:inline xmlns:a="http://schemas.openxmlformats.org/drawingml/2006/main" xmlns:pic="http://schemas.openxmlformats.org/drawingml/2006/picture">
+            <wp:extent cx="5486400" cy="4751429"/>
+            <wp:docPr id="5" name="Picture 5"/>
+            <wp:cNvGraphicFramePr>
+              <a:graphicFrameLocks noChangeAspect="1"/>
+            </wp:cNvGraphicFramePr>
+            <a:graphic>
+              <a:graphicData uri="http://schemas.openxmlformats.org/drawingml/2006/picture">
+                <pic:pic>
+                  <pic:nvPicPr>
+                    <pic:cNvPr id="0" name="annual_rates_by_group.png"/>
+                    <pic:cNvPicPr/>
+                  </pic:nvPicPr>
+                  <pic:blipFill>
+                    <a:blip r:embed="rId13"/>
+                    <a:stretch>
+                      <a:fillRect/>
+                    </a:stretch>
+                  </pic:blipFill>
+                  <pic:spPr>
+                    <a:xfrm>
+                      <a:off x="0" y="0"/>
+                      <a:ext cx="5486400" cy="4751429"/>
+                    </a:xfrm>
+                    <a:prstGeom prst="rect"/>
+                  </pic:spPr>
+                </pic:pic>
+              </a:graphicData>
+            </a:graphic>
+          </wp:inline>
+        </w:drawing>
+      </w:r>
+    </w:p>
+    <w:p>
+      <w:pPr>
+        <w:jc w:val="center"/>
+      </w:pPr>
+      <w:r>
+        <w:rPr>
+          <w:i/>
+        </w:rPr>
+        <w:t>Figure 5. Annual observed (solid) and projected (dashed) transition rates by civilisation, 2000-2026.</w:t>
+      </w:r>
+    </w:p>
+    <w:p>
+      <w:r>
+        <w:t>Table 9 summarises the mean observed annual transition rates by group between 2000 and 2016. The table distinguishes early-career outflow (α), return (β), domestic and abroad hit generation (h_D, h_A), PI promotion (p_D), dropout (d), and total inflow (I_total).</w:t>
+      </w:r>
+    </w:p>
+    <w:tbl>
+      <w:tblPr>
+        <w:tblStyle w:val="TableGrid"/>
+        <w:tblW w:type="auto" w:w="0"/>
+        <w:tblLook w:firstColumn="1" w:firstRow="1" w:lastColumn="0" w:lastRow="0" w:noHBand="0" w:noVBand="1" w:val="04A0"/>
+      </w:tblPr>
+      <w:tblGrid>
+        <w:gridCol w:w="1234"/>
+        <w:gridCol w:w="1234"/>
+        <w:gridCol w:w="1234"/>
+        <w:gridCol w:w="1234"/>
+        <w:gridCol w:w="1234"/>
+        <w:gridCol w:w="1234"/>
+        <w:gridCol w:w="1234"/>
+      </w:tblGrid>
+      <w:tr>
+        <w:tc>
+          <w:tcPr>
+            <w:tcW w:type="dxa" w:w="1234"/>
+          </w:tcPr>
+          <w:p>
+            <w:r>
+              <w:rPr>
+                <w:b/>
+              </w:rPr>
+              <w:t>Group</w:t>
+            </w:r>
+          </w:p>
+        </w:tc>
+        <w:tc>
+          <w:tcPr>
+            <w:tcW w:type="dxa" w:w="1234"/>
+          </w:tcPr>
+          <w:p>
+            <w:r>
+              <w:rPr>
+                <w:b/>
+              </w:rPr>
+              <w:t>α</w:t>
+            </w:r>
+          </w:p>
+        </w:tc>
+        <w:tc>
+          <w:tcPr>
+            <w:tcW w:type="dxa" w:w="1234"/>
+          </w:tcPr>
+          <w:p>
+            <w:r>
+              <w:rPr>
+                <w:b/>
+              </w:rPr>
+              <w:t>β</w:t>
+            </w:r>
+          </w:p>
+        </w:tc>
+        <w:tc>
+          <w:tcPr>
+            <w:tcW w:type="dxa" w:w="1234"/>
+          </w:tcPr>
+          <w:p>
+            <w:r>
+              <w:rPr>
+                <w:b/>
+              </w:rPr>
+              <w:t>h_D</w:t>
+            </w:r>
+          </w:p>
+        </w:tc>
+        <w:tc>
+          <w:tcPr>
+            <w:tcW w:type="dxa" w:w="1234"/>
+          </w:tcPr>
+          <w:p>
+            <w:r>
+              <w:rPr>
+                <w:b/>
+              </w:rPr>
+              <w:t>p_D</w:t>
+            </w:r>
+          </w:p>
+        </w:tc>
+        <w:tc>
+          <w:tcPr>
+            <w:tcW w:type="dxa" w:w="1234"/>
+          </w:tcPr>
+          <w:p>
+            <w:r>
+              <w:rPr>
+                <w:b/>
+              </w:rPr>
+              <w:t>d</w:t>
+            </w:r>
+          </w:p>
+        </w:tc>
+        <w:tc>
+          <w:tcPr>
+            <w:tcW w:type="dxa" w:w="1234"/>
+          </w:tcPr>
+          <w:p>
+            <w:r>
+              <w:rPr>
+                <w:b/>
+              </w:rPr>
+              <w:t>I_total</w:t>
+            </w:r>
+          </w:p>
+        </w:tc>
+      </w:tr>
+      <w:tr>
+        <w:tc>
+          <w:tcPr>
+            <w:tcW w:type="dxa" w:w="1234"/>
+          </w:tcPr>
+          <w:p>
+            <w:r>
+              <w:t>Anglosphere ex-US</w:t>
+            </w:r>
+          </w:p>
+        </w:tc>
+        <w:tc>
+          <w:tcPr>
+            <w:tcW w:type="dxa" w:w="1234"/>
+          </w:tcPr>
+          <w:p>
+            <w:r>
+              <w:t>0.113</w:t>
+            </w:r>
+          </w:p>
+        </w:tc>
+        <w:tc>
+          <w:tcPr>
+            <w:tcW w:type="dxa" w:w="1234"/>
+          </w:tcPr>
+          <w:p>
+            <w:r>
+              <w:t>0.152</w:t>
+            </w:r>
+          </w:p>
+        </w:tc>
+        <w:tc>
+          <w:tcPr>
+            <w:tcW w:type="dxa" w:w="1234"/>
+          </w:tcPr>
+          <w:p>
+            <w:r>
+              <w:t>0.142</w:t>
+            </w:r>
+          </w:p>
+        </w:tc>
+        <w:tc>
+          <w:tcPr>
+            <w:tcW w:type="dxa" w:w="1234"/>
+          </w:tcPr>
+          <w:p>
+            <w:r>
+              <w:t>0.061</w:t>
+            </w:r>
+          </w:p>
+        </w:tc>
+        <w:tc>
+          <w:tcPr>
+            <w:tcW w:type="dxa" w:w="1234"/>
+          </w:tcPr>
+          <w:p>
+            <w:r>
+              <w:t>0.044</w:t>
+            </w:r>
+          </w:p>
+        </w:tc>
+        <w:tc>
+          <w:tcPr>
+            <w:tcW w:type="dxa" w:w="1234"/>
+          </w:tcPr>
+          <w:p>
+            <w:r>
+              <w:t>2.08</w:t>
+            </w:r>
+          </w:p>
+        </w:tc>
+      </w:tr>
+      <w:tr>
+        <w:tc>
+          <w:tcPr>
+            <w:tcW w:type="dxa" w:w="1234"/>
+          </w:tcPr>
+          <w:p>
+            <w:r>
+              <w:t>Continental Europe</w:t>
+            </w:r>
+          </w:p>
+        </w:tc>
+        <w:tc>
+          <w:tcPr>
+            <w:tcW w:type="dxa" w:w="1234"/>
+          </w:tcPr>
+          <w:p>
+            <w:r>
+              <w:t>0.048</w:t>
+            </w:r>
+          </w:p>
+        </w:tc>
+        <w:tc>
+          <w:tcPr>
+            <w:tcW w:type="dxa" w:w="1234"/>
+          </w:tcPr>
+          <w:p>
+            <w:r>
+              <w:t>0.139</w:t>
+            </w:r>
+          </w:p>
+        </w:tc>
+        <w:tc>
+          <w:tcPr>
+            <w:tcW w:type="dxa" w:w="1234"/>
+          </w:tcPr>
+          <w:p>
+            <w:r>
+              <w:t>0.122</w:t>
+            </w:r>
+          </w:p>
+        </w:tc>
+        <w:tc>
+          <w:tcPr>
+            <w:tcW w:type="dxa" w:w="1234"/>
+          </w:tcPr>
+          <w:p>
+            <w:r>
+              <w:t>0.068</w:t>
+            </w:r>
+          </w:p>
+        </w:tc>
+        <w:tc>
+          <w:tcPr>
+            <w:tcW w:type="dxa" w:w="1234"/>
+          </w:tcPr>
+          <w:p>
+            <w:r>
+              <w:t>0.030</w:t>
+            </w:r>
+          </w:p>
+        </w:tc>
+        <w:tc>
+          <w:tcPr>
+            <w:tcW w:type="dxa" w:w="1234"/>
+          </w:tcPr>
+          <w:p>
+            <w:r>
+              <w:t>3.06</w:t>
+            </w:r>
+          </w:p>
+        </w:tc>
+      </w:tr>
+      <w:tr>
+        <w:tc>
+          <w:tcPr>
+            <w:tcW w:type="dxa" w:w="1234"/>
+          </w:tcPr>
+          <w:p>
+            <w:r>
+              <w:t>Hindu</w:t>
+            </w:r>
+          </w:p>
+        </w:tc>
+        <w:tc>
+          <w:tcPr>
+            <w:tcW w:type="dxa" w:w="1234"/>
+          </w:tcPr>
+          <w:p>
+            <w:r>
+              <w:t>0.064</w:t>
+            </w:r>
+          </w:p>
+        </w:tc>
+        <w:tc>
+          <w:tcPr>
+            <w:tcW w:type="dxa" w:w="1234"/>
+          </w:tcPr>
+          <w:p>
+            <w:r>
+              <w:t>0.190</w:t>
+            </w:r>
+          </w:p>
+        </w:tc>
+        <w:tc>
+          <w:tcPr>
+            <w:tcW w:type="dxa" w:w="1234"/>
+          </w:tcPr>
+          <w:p>
+            <w:r>
+              <w:t>0.130</w:t>
+            </w:r>
+          </w:p>
+        </w:tc>
+        <w:tc>
+          <w:tcPr>
+            <w:tcW w:type="dxa" w:w="1234"/>
+          </w:tcPr>
+          <w:p>
+            <w:r>
+              <w:t>0.075</w:t>
+            </w:r>
+          </w:p>
+        </w:tc>
+        <w:tc>
+          <w:tcPr>
+            <w:tcW w:type="dxa" w:w="1234"/>
+          </w:tcPr>
+          <w:p>
+            <w:r>
+              <w:t>0.057</w:t>
+            </w:r>
+          </w:p>
+        </w:tc>
+        <w:tc>
+          <w:tcPr>
+            <w:tcW w:type="dxa" w:w="1234"/>
+          </w:tcPr>
+          <w:p>
+            <w:r>
+              <w:t>1.73</w:t>
+            </w:r>
+          </w:p>
+        </w:tc>
+      </w:tr>
+      <w:tr>
+        <w:tc>
+          <w:tcPr>
+            <w:tcW w:type="dxa" w:w="1234"/>
+          </w:tcPr>
+          <w:p>
+            <w:r>
+              <w:t>Islamic</w:t>
+            </w:r>
+          </w:p>
+        </w:tc>
+        <w:tc>
+          <w:tcPr>
+            <w:tcW w:type="dxa" w:w="1234"/>
+          </w:tcPr>
+          <w:p>
+            <w:r>
+              <w:t>0.082</w:t>
+            </w:r>
+          </w:p>
+        </w:tc>
+        <w:tc>
+          <w:tcPr>
+            <w:tcW w:type="dxa" w:w="1234"/>
+          </w:tcPr>
+          <w:p>
+            <w:r>
+              <w:t>0.291</w:t>
+            </w:r>
+          </w:p>
+        </w:tc>
+        <w:tc>
+          <w:tcPr>
+            <w:tcW w:type="dxa" w:w="1234"/>
+          </w:tcPr>
+          <w:p>
+            <w:r>
+              <w:t>0.133</w:t>
+            </w:r>
+          </w:p>
+        </w:tc>
+        <w:tc>
+          <w:tcPr>
+            <w:tcW w:type="dxa" w:w="1234"/>
+          </w:tcPr>
+          <w:p>
+            <w:r>
+              <w:t>0.078</w:t>
+            </w:r>
+          </w:p>
+        </w:tc>
+        <w:tc>
+          <w:tcPr>
+            <w:tcW w:type="dxa" w:w="1234"/>
+          </w:tcPr>
+          <w:p>
+            <w:r>
+              <w:t>0.159</w:t>
+            </w:r>
+          </w:p>
+        </w:tc>
+        <w:tc>
+          <w:tcPr>
+            <w:tcW w:type="dxa" w:w="1234"/>
+          </w:tcPr>
+          <w:p>
+            <w:r>
+              <w:t>2.22</w:t>
+            </w:r>
+          </w:p>
+        </w:tc>
+      </w:tr>
+      <w:tr>
+        <w:tc>
+          <w:tcPr>
+            <w:tcW w:type="dxa" w:w="1234"/>
+          </w:tcPr>
+          <w:p>
+            <w:r>
+              <w:t>Japanese</w:t>
+            </w:r>
+          </w:p>
+        </w:tc>
+        <w:tc>
+          <w:tcPr>
+            <w:tcW w:type="dxa" w:w="1234"/>
+          </w:tcPr>
+          <w:p>
+            <w:r>
+              <w:t>0.053</w:t>
+            </w:r>
+          </w:p>
+        </w:tc>
+        <w:tc>
+          <w:tcPr>
+            <w:tcW w:type="dxa" w:w="1234"/>
+          </w:tcPr>
+          <w:p>
+            <w:r>
+              <w:t>0.333</w:t>
+            </w:r>
+          </w:p>
+        </w:tc>
+        <w:tc>
+          <w:tcPr>
+            <w:tcW w:type="dxa" w:w="1234"/>
+          </w:tcPr>
+          <w:p>
+            <w:r>
+              <w:t>0.102</w:t>
+            </w:r>
+          </w:p>
+        </w:tc>
+        <w:tc>
+          <w:tcPr>
+            <w:tcW w:type="dxa" w:w="1234"/>
+          </w:tcPr>
+          <w:p>
+            <w:r>
+              <w:t>0.072</w:t>
+            </w:r>
+          </w:p>
+        </w:tc>
+        <w:tc>
+          <w:tcPr>
+            <w:tcW w:type="dxa" w:w="1234"/>
+          </w:tcPr>
+          <w:p>
+            <w:r>
+              <w:t>0.058</w:t>
+            </w:r>
+          </w:p>
+        </w:tc>
+        <w:tc>
+          <w:tcPr>
+            <w:tcW w:type="dxa" w:w="1234"/>
+          </w:tcPr>
+          <w:p>
+            <w:r>
+              <w:t>2.00</w:t>
+            </w:r>
+          </w:p>
+        </w:tc>
+      </w:tr>
+      <w:tr>
+        <w:tc>
+          <w:tcPr>
+            <w:tcW w:type="dxa" w:w="1234"/>
+          </w:tcPr>
+          <w:p>
+            <w:r>
+              <w:t>Other Civilizations</w:t>
+            </w:r>
+          </w:p>
+        </w:tc>
+        <w:tc>
+          <w:tcPr>
+            <w:tcW w:type="dxa" w:w="1234"/>
+          </w:tcPr>
+          <w:p>
+            <w:r>
+              <w:t>0.096</w:t>
+            </w:r>
+          </w:p>
+        </w:tc>
+        <w:tc>
+          <w:tcPr>
+            <w:tcW w:type="dxa" w:w="1234"/>
+          </w:tcPr>
+          <w:p>
+            <w:r>
+              <w:t>0.240</w:t>
+            </w:r>
+          </w:p>
+        </w:tc>
+        <w:tc>
+          <w:tcPr>
+            <w:tcW w:type="dxa" w:w="1234"/>
+          </w:tcPr>
+          <w:p>
+            <w:r>
+              <w:t>0.129</w:t>
+            </w:r>
+          </w:p>
+        </w:tc>
+        <w:tc>
+          <w:tcPr>
+            <w:tcW w:type="dxa" w:w="1234"/>
+          </w:tcPr>
+          <w:p>
+            <w:r>
+              <w:t>0.087</w:t>
+            </w:r>
+          </w:p>
+        </w:tc>
+        <w:tc>
+          <w:tcPr>
+            <w:tcW w:type="dxa" w:w="1234"/>
+          </w:tcPr>
+          <w:p>
+            <w:r>
+              <w:t>0.086</w:t>
+            </w:r>
+          </w:p>
+        </w:tc>
+        <w:tc>
+          <w:tcPr>
+            <w:tcW w:type="dxa" w:w="1234"/>
+          </w:tcPr>
+          <w:p>
+            <w:r>
+              <w:t>1.67</w:t>
+            </w:r>
+          </w:p>
+        </w:tc>
+      </w:tr>
+      <w:tr>
+        <w:tc>
+          <w:tcPr>
+            <w:tcW w:type="dxa" w:w="1234"/>
+          </w:tcPr>
+          <w:p>
+            <w:r>
+              <w:t>Other Western</w:t>
+            </w:r>
+          </w:p>
+        </w:tc>
+        <w:tc>
+          <w:tcPr>
+            <w:tcW w:type="dxa" w:w="1234"/>
+          </w:tcPr>
+          <w:p>
+            <w:r>
+              <w:t>0.091</w:t>
+            </w:r>
+          </w:p>
+        </w:tc>
+        <w:tc>
+          <w:tcPr>
+            <w:tcW w:type="dxa" w:w="1234"/>
+          </w:tcPr>
+          <w:p>
+            <w:r>
+              <w:t>0.214</w:t>
+            </w:r>
+          </w:p>
+        </w:tc>
+        <w:tc>
+          <w:tcPr>
+            <w:tcW w:type="dxa" w:w="1234"/>
+          </w:tcPr>
+          <w:p>
+            <w:r>
+              <w:t>0.199</w:t>
+            </w:r>
+          </w:p>
+        </w:tc>
+        <w:tc>
+          <w:tcPr>
+            <w:tcW w:type="dxa" w:w="1234"/>
+          </w:tcPr>
+          <w:p>
+            <w:r>
+              <w:t>0.065</w:t>
+            </w:r>
+          </w:p>
+        </w:tc>
+        <w:tc>
+          <w:tcPr>
+            <w:tcW w:type="dxa" w:w="1234"/>
+          </w:tcPr>
+          <w:p>
+            <w:r>
+              <w:t>0.088</w:t>
+            </w:r>
+          </w:p>
+        </w:tc>
+        <w:tc>
+          <w:tcPr>
+            <w:tcW w:type="dxa" w:w="1234"/>
+          </w:tcPr>
+          <w:p>
+            <w:r>
+              <w:t>1.67</w:t>
+            </w:r>
+          </w:p>
+        </w:tc>
+      </w:tr>
+      <w:tr>
+        <w:tc>
+          <w:tcPr>
+            <w:tcW w:type="dxa" w:w="1234"/>
+          </w:tcPr>
+          <w:p>
+            <w:r>
+              <w:t>Sinic</w:t>
+            </w:r>
+          </w:p>
+        </w:tc>
+        <w:tc>
+          <w:tcPr>
+            <w:tcW w:type="dxa" w:w="1234"/>
+          </w:tcPr>
+          <w:p>
+            <w:r>
+              <w:t>0.045</w:t>
+            </w:r>
+          </w:p>
+        </w:tc>
+        <w:tc>
+          <w:tcPr>
+            <w:tcW w:type="dxa" w:w="1234"/>
+          </w:tcPr>
+          <w:p>
+            <w:r>
+              <w:t>0.200</w:t>
+            </w:r>
+          </w:p>
+        </w:tc>
+        <w:tc>
+          <w:tcPr>
+            <w:tcW w:type="dxa" w:w="1234"/>
+          </w:tcPr>
+          <w:p>
+            <w:r>
+              <w:t>0.087</w:t>
+            </w:r>
+          </w:p>
+        </w:tc>
+        <w:tc>
+          <w:tcPr>
+            <w:tcW w:type="dxa" w:w="1234"/>
+          </w:tcPr>
+          <w:p>
+            <w:r>
+              <w:t>0.052</w:t>
+            </w:r>
+          </w:p>
+        </w:tc>
+        <w:tc>
+          <w:tcPr>
+            <w:tcW w:type="dxa" w:w="1234"/>
+          </w:tcPr>
+          <w:p>
+            <w:r>
+              <w:t>0.036</w:t>
+            </w:r>
+          </w:p>
+        </w:tc>
+        <w:tc>
+          <w:tcPr>
+            <w:tcW w:type="dxa" w:w="1234"/>
+          </w:tcPr>
+          <w:p>
+            <w:r>
+              <w:t>2.56</w:t>
+            </w:r>
+          </w:p>
+        </w:tc>
+      </w:tr>
+      <w:tr>
+        <w:tc>
+          <w:tcPr>
+            <w:tcW w:type="dxa" w:w="1234"/>
+          </w:tcPr>
+          <w:p>
+            <w:r>
+              <w:t>United States</w:t>
+            </w:r>
+          </w:p>
+        </w:tc>
+        <w:tc>
+          <w:tcPr>
+            <w:tcW w:type="dxa" w:w="1234"/>
+          </w:tcPr>
+          <w:p>
+            <w:r>
+              <w:t>0.069</w:t>
+            </w:r>
+          </w:p>
+        </w:tc>
+        <w:tc>
+          <w:tcPr>
+            <w:tcW w:type="dxa" w:w="1234"/>
+          </w:tcPr>
+          <w:p>
+            <w:r>
+              <w:t>0.161</w:t>
+            </w:r>
+          </w:p>
+        </w:tc>
+        <w:tc>
+          <w:tcPr>
+            <w:tcW w:type="dxa" w:w="1234"/>
+          </w:tcPr>
+          <w:p>
+            <w:r>
+              <w:t>0.158</w:t>
+            </w:r>
+          </w:p>
+        </w:tc>
+        <w:tc>
+          <w:tcPr>
+            <w:tcW w:type="dxa" w:w="1234"/>
+          </w:tcPr>
+          <w:p>
+            <w:r>
+              <w:t>0.048</w:t>
+            </w:r>
+          </w:p>
+        </w:tc>
+        <w:tc>
+          <w:tcPr>
+            <w:tcW w:type="dxa" w:w="1234"/>
+          </w:tcPr>
+          <w:p>
+            <w:r>
+              <w:t>0.027</w:t>
+            </w:r>
+          </w:p>
+        </w:tc>
+        <w:tc>
+          <w:tcPr>
+            <w:tcW w:type="dxa" w:w="1234"/>
+          </w:tcPr>
+          <w:p>
+            <w:r>
+              <w:t>2.88</w:t>
+            </w:r>
+          </w:p>
+        </w:tc>
+      </w:tr>
+    </w:tbl>
+    <w:p>
+      <w:pPr>
+        <w:jc w:val="center"/>
+      </w:pPr>
+      <w:r>
+        <w:rPr>
+          <w:i/>
+        </w:rPr>
+        <w:t>Table 9. Mean observed annual transition rates by civilisation, 2000-2016.</w:t>
+      </w:r>
+    </w:p>
+    <w:p>
+      <w:r>
+        <w:t>Figure 6 shows the inter-civilisation accumulation of abroad author-years. Rows represent the origin civilisation and columns represent the destination civilisation, approximated by the author's recent_group while abroad. The heatmap is a lower-bound proxy because year-to-year destination switches within a spell abroad are not observed.</w:t>
+      </w:r>
+    </w:p>
+    <w:p>
+      <w:r>
+        <w:drawing>
+          <wp:inline xmlns:a="http://schemas.openxmlformats.org/drawingml/2006/main" xmlns:pic="http://schemas.openxmlformats.org/drawingml/2006/picture">
+            <wp:extent cx="5303520" cy="4433016"/>
+            <wp:docPr id="6" name="Picture 6"/>
+            <wp:cNvGraphicFramePr>
+              <a:graphicFrameLocks noChangeAspect="1"/>
+            </wp:cNvGraphicFramePr>
+            <a:graphic>
+              <a:graphicData uri="http://schemas.openxmlformats.org/drawingml/2006/picture">
+                <pic:pic>
+                  <pic:nvPicPr>
+                    <pic:cNvPr id="0" name="annual_interciv_heatmap.png"/>
+                    <pic:cNvPicPr/>
+                  </pic:nvPicPr>
+                  <pic:blipFill>
+                    <a:blip r:embed="rId14"/>
+                    <a:stretch>
+                      <a:fillRect/>
+                    </a:stretch>
+                  </pic:blipFill>
+                  <pic:spPr>
+                    <a:xfrm>
+                      <a:off x="0" y="0"/>
+                      <a:ext cx="5303520" cy="4433016"/>
+                    </a:xfrm>
+                    <a:prstGeom prst="rect"/>
+                  </pic:spPr>
+                </pic:pic>
+              </a:graphicData>
+            </a:graphic>
+          </wp:inline>
+        </w:drawing>
+      </w:r>
+    </w:p>
+    <w:p>
+      <w:pPr>
+        <w:jc w:val="center"/>
+      </w:pPr>
+      <w:r>
+        <w:rPr>
+          <w:i/>
+        </w:rPr>
+        <w:t>Figure 6. Inter-civilisation abroad author-year accumulation by origin (rows) and destination (columns).</w:t>
+      </w:r>
+    </w:p>
+    <w:p>
+      <w:r>
+        <w:t>Table 10 lists the origin-destination pairs with the largest accumulation of abroad author-years. These pairs identify the strongest visible inter-civilisation pipelines and are the empirical counterpart to the α and β transitions.</w:t>
+      </w:r>
+    </w:p>
+    <w:tbl>
+      <w:tblPr>
+        <w:tblStyle w:val="TableGrid"/>
+        <w:tblW w:type="auto" w:w="0"/>
+        <w:tblLook w:firstColumn="1" w:firstRow="1" w:lastColumn="0" w:lastRow="0" w:noHBand="0" w:noVBand="1" w:val="04A0"/>
+      </w:tblPr>
+      <w:tblGrid>
+        <w:gridCol w:w="2880"/>
+        <w:gridCol w:w="2880"/>
+        <w:gridCol w:w="2880"/>
+      </w:tblGrid>
+      <w:tr>
+        <w:tc>
+          <w:tcPr>
+            <w:tcW w:type="dxa" w:w="2880"/>
+          </w:tcPr>
+          <w:p>
+            <w:r>
+              <w:rPr>
+                <w:b/>
+              </w:rPr>
+              <w:t>Origin</w:t>
+            </w:r>
+          </w:p>
+        </w:tc>
+        <w:tc>
+          <w:tcPr>
+            <w:tcW w:type="dxa" w:w="2880"/>
+          </w:tcPr>
+          <w:p>
+            <w:r>
+              <w:rPr>
+                <w:b/>
+              </w:rPr>
+              <w:t>Destination</w:t>
+            </w:r>
+          </w:p>
+        </w:tc>
+        <w:tc>
+          <w:tcPr>
+            <w:tcW w:type="dxa" w:w="2880"/>
+          </w:tcPr>
+          <w:p>
+            <w:r>
+              <w:rPr>
+                <w:b/>
+              </w:rPr>
+              <w:t>Author-years</w:t>
+            </w:r>
+          </w:p>
+        </w:tc>
+      </w:tr>
+      <w:tr>
+        <w:tc>
+          <w:tcPr>
+            <w:tcW w:type="dxa" w:w="2880"/>
+          </w:tcPr>
+          <w:p>
+            <w:r>
+              <w:t>Continental Europe</w:t>
+            </w:r>
+          </w:p>
+        </w:tc>
+        <w:tc>
+          <w:tcPr>
+            <w:tcW w:type="dxa" w:w="2880"/>
+          </w:tcPr>
+          <w:p>
+            <w:r>
+              <w:t>Continental Europe</w:t>
+            </w:r>
+          </w:p>
+        </w:tc>
+        <w:tc>
+          <w:tcPr>
+            <w:tcW w:type="dxa" w:w="2880"/>
+          </w:tcPr>
+          <w:p>
+            <w:r>
+              <w:t>80</w:t>
+            </w:r>
+          </w:p>
+        </w:tc>
+      </w:tr>
+      <w:tr>
+        <w:tc>
+          <w:tcPr>
+            <w:tcW w:type="dxa" w:w="2880"/>
+          </w:tcPr>
+          <w:p>
+            <w:r>
+              <w:t>Sinic</w:t>
+            </w:r>
+          </w:p>
+        </w:tc>
+        <w:tc>
+          <w:tcPr>
+            <w:tcW w:type="dxa" w:w="2880"/>
+          </w:tcPr>
+          <w:p>
+            <w:r>
+              <w:t>Sinic</w:t>
+            </w:r>
+          </w:p>
+        </w:tc>
+        <w:tc>
+          <w:tcPr>
+            <w:tcW w:type="dxa" w:w="2880"/>
+          </w:tcPr>
+          <w:p>
+            <w:r>
+              <w:t>78</w:t>
+            </w:r>
+          </w:p>
+        </w:tc>
+      </w:tr>
+      <w:tr>
+        <w:tc>
+          <w:tcPr>
+            <w:tcW w:type="dxa" w:w="2880"/>
+          </w:tcPr>
+          <w:p>
+            <w:r>
+              <w:t>Anglosphere ex-US</w:t>
+            </w:r>
+          </w:p>
+        </w:tc>
+        <w:tc>
+          <w:tcPr>
+            <w:tcW w:type="dxa" w:w="2880"/>
+          </w:tcPr>
+          <w:p>
+            <w:r>
+              <w:t>Continental Europe</w:t>
+            </w:r>
+          </w:p>
+        </w:tc>
+        <w:tc>
+          <w:tcPr>
+            <w:tcW w:type="dxa" w:w="2880"/>
+          </w:tcPr>
+          <w:p>
+            <w:r>
+              <w:t>61</w:t>
+            </w:r>
+          </w:p>
+        </w:tc>
+      </w:tr>
+      <w:tr>
+        <w:tc>
+          <w:tcPr>
+            <w:tcW w:type="dxa" w:w="2880"/>
+          </w:tcPr>
+          <w:p>
+            <w:r>
+              <w:t>Continental Europe</w:t>
+            </w:r>
+          </w:p>
+        </w:tc>
+        <w:tc>
+          <w:tcPr>
+            <w:tcW w:type="dxa" w:w="2880"/>
+          </w:tcPr>
+          <w:p>
+            <w:r>
+              <w:t>Anglosphere ex-US</w:t>
+            </w:r>
+          </w:p>
+        </w:tc>
+        <w:tc>
+          <w:tcPr>
+            <w:tcW w:type="dxa" w:w="2880"/>
+          </w:tcPr>
+          <w:p>
+            <w:r>
+              <w:t>60</w:t>
+            </w:r>
+          </w:p>
+        </w:tc>
+      </w:tr>
+      <w:tr>
+        <w:tc>
+          <w:tcPr>
+            <w:tcW w:type="dxa" w:w="2880"/>
+          </w:tcPr>
+          <w:p>
+            <w:r>
+              <w:t>Anglosphere ex-US</w:t>
+            </w:r>
+          </w:p>
+        </w:tc>
+        <w:tc>
+          <w:tcPr>
+            <w:tcW w:type="dxa" w:w="2880"/>
+          </w:tcPr>
+          <w:p>
+            <w:r>
+              <w:t>Anglosphere ex-US</w:t>
+            </w:r>
+          </w:p>
+        </w:tc>
+        <w:tc>
+          <w:tcPr>
+            <w:tcW w:type="dxa" w:w="2880"/>
+          </w:tcPr>
+          <w:p>
+            <w:r>
+              <w:t>59</w:t>
+            </w:r>
+          </w:p>
+        </w:tc>
+      </w:tr>
+      <w:tr>
+        <w:tc>
+          <w:tcPr>
+            <w:tcW w:type="dxa" w:w="2880"/>
+          </w:tcPr>
+          <w:p>
+            <w:r>
+              <w:t>United States</w:t>
+            </w:r>
+          </w:p>
+        </w:tc>
+        <w:tc>
+          <w:tcPr>
+            <w:tcW w:type="dxa" w:w="2880"/>
+          </w:tcPr>
+          <w:p>
+            <w:r>
+              <w:t>Other Western</w:t>
+            </w:r>
+          </w:p>
+        </w:tc>
+        <w:tc>
+          <w:tcPr>
+            <w:tcW w:type="dxa" w:w="2880"/>
+          </w:tcPr>
+          <w:p>
+            <w:r>
+              <w:t>52</w:t>
+            </w:r>
+          </w:p>
+        </w:tc>
+      </w:tr>
+      <w:tr>
+        <w:tc>
+          <w:tcPr>
+            <w:tcW w:type="dxa" w:w="2880"/>
+          </w:tcPr>
+          <w:p>
+            <w:r>
+              <w:t>Hindu</w:t>
+            </w:r>
+          </w:p>
+        </w:tc>
+        <w:tc>
+          <w:tcPr>
+            <w:tcW w:type="dxa" w:w="2880"/>
+          </w:tcPr>
+          <w:p>
+            <w:r>
+              <w:t>Hindu</w:t>
+            </w:r>
+          </w:p>
+        </w:tc>
+        <w:tc>
+          <w:tcPr>
+            <w:tcW w:type="dxa" w:w="2880"/>
+          </w:tcPr>
+          <w:p>
+            <w:r>
+              <w:t>48</w:t>
+            </w:r>
+          </w:p>
+        </w:tc>
+      </w:tr>
+      <w:tr>
+        <w:tc>
+          <w:tcPr>
+            <w:tcW w:type="dxa" w:w="2880"/>
+          </w:tcPr>
+          <w:p>
+            <w:r>
+              <w:t>Other Western</w:t>
+            </w:r>
+          </w:p>
+        </w:tc>
+        <w:tc>
+          <w:tcPr>
+            <w:tcW w:type="dxa" w:w="2880"/>
+          </w:tcPr>
+          <w:p>
+            <w:r>
+              <w:t>Other Western</w:t>
+            </w:r>
+          </w:p>
+        </w:tc>
+        <w:tc>
+          <w:tcPr>
+            <w:tcW w:type="dxa" w:w="2880"/>
+          </w:tcPr>
+          <w:p>
+            <w:r>
+              <w:t>43</w:t>
+            </w:r>
+          </w:p>
+        </w:tc>
+      </w:tr>
+      <w:tr>
+        <w:tc>
+          <w:tcPr>
+            <w:tcW w:type="dxa" w:w="2880"/>
+          </w:tcPr>
+          <w:p>
+            <w:r>
+              <w:t>Continental Europe</w:t>
+            </w:r>
+          </w:p>
+        </w:tc>
+        <w:tc>
+          <w:tcPr>
+            <w:tcW w:type="dxa" w:w="2880"/>
+          </w:tcPr>
+          <w:p>
+            <w:r>
+              <w:t>Other Western</w:t>
+            </w:r>
+          </w:p>
+        </w:tc>
+        <w:tc>
+          <w:tcPr>
+            <w:tcW w:type="dxa" w:w="2880"/>
+          </w:tcPr>
+          <w:p>
+            <w:r>
+              <w:t>40</w:t>
+            </w:r>
+          </w:p>
+        </w:tc>
+      </w:tr>
+      <w:tr>
+        <w:tc>
+          <w:tcPr>
+            <w:tcW w:type="dxa" w:w="2880"/>
+          </w:tcPr>
+          <w:p>
+            <w:r>
+              <w:t>United States</w:t>
+            </w:r>
+          </w:p>
+        </w:tc>
+        <w:tc>
+          <w:tcPr>
+            <w:tcW w:type="dxa" w:w="2880"/>
+          </w:tcPr>
+          <w:p>
+            <w:r>
+              <w:t>Continental Europe</w:t>
+            </w:r>
+          </w:p>
+        </w:tc>
+        <w:tc>
+          <w:tcPr>
+            <w:tcW w:type="dxa" w:w="2880"/>
+          </w:tcPr>
+          <w:p>
+            <w:r>
+              <w:t>38</w:t>
+            </w:r>
+          </w:p>
+        </w:tc>
+      </w:tr>
+    </w:tbl>
+    <w:p>
+      <w:pPr>
+        <w:jc w:val="center"/>
+      </w:pPr>
+      <w:r>
+        <w:rPr>
+          <w:i/>
+        </w:rPr>
+        <w:t>Table 10. Top origin-destination abroad author-year pairs.</w:t>
+      </w:r>
+    </w:p>
+    <w:p>
+      <w:pPr>
+        <w:pStyle w:val="Heading2"/>
+      </w:pPr>
+      <w:r>
+        <w:t>5.7 Out-of-sample projection, 2017-2023</w:t>
+      </w:r>
+    </w:p>
+    <w:p>
+      <w:r>
+        <w:t>The 2017-2023 projection is compared with observed annual stocks in Figure 7. Overall accuracy is RMSE 2.66 and MAPE 35.9% (a non-standard, conservative measure computed against count_obs + 1 to avoid division by zero). Among civilisations the lowest RMSE is for Japanese and the highest RMSE is for Sinic; the highest MAPE is for Sinic. The largest errors occur in small compartments and in groups with sparse transition counts, which is expected because the annual model does not borrow information across civilisations.</w:t>
+      </w:r>
+    </w:p>
+    <w:p>
+      <w:r>
+        <w:drawing>
+          <wp:inline xmlns:a="http://schemas.openxmlformats.org/drawingml/2006/main" xmlns:pic="http://schemas.openxmlformats.org/drawingml/2006/picture">
+            <wp:extent cx="5486400" cy="3500024"/>
+            <wp:docPr id="7" name="Picture 7"/>
+            <wp:cNvGraphicFramePr>
+              <a:graphicFrameLocks noChangeAspect="1"/>
+            </wp:cNvGraphicFramePr>
+            <a:graphic>
+              <a:graphicData uri="http://schemas.openxmlformats.org/drawingml/2006/picture">
+                <pic:pic>
+                  <pic:nvPicPr>
+                    <pic:cNvPr id="0" name="annual_projection_vs_observed.png"/>
+                    <pic:cNvPicPr/>
+                  </pic:nvPicPr>
+                  <pic:blipFill>
+                    <a:blip r:embed="rId15"/>
+                    <a:stretch>
+                      <a:fillRect/>
+                    </a:stretch>
+                  </pic:blipFill>
+                  <pic:spPr>
+                    <a:xfrm>
+                      <a:off x="0" y="0"/>
+                      <a:ext cx="5486400" cy="3500024"/>
+                    </a:xfrm>
+                    <a:prstGeom prst="rect"/>
+                  </pic:spPr>
+                </pic:pic>
+              </a:graphicData>
+            </a:graphic>
+          </wp:inline>
+        </w:drawing>
+      </w:r>
+    </w:p>
+    <w:p>
+      <w:pPr>
+        <w:jc w:val="center"/>
+      </w:pPr>
+      <w:r>
+        <w:rPr>
+          <w:i/>
+        </w:rPr>
+        <w:t>Figure 7. Observed (solid) and projected (dashed) compartment counts by civilisation, 2017-2023. The vertical dotted line marks the end of the training period (2016).</w:t>
+      </w:r>
+    </w:p>
+    <w:p>
+      <w:r>
+        <w:t>Table 11 reports projection accuracy by civilisation and Table 12 by compartment. Among compartments, the lowest RMSE is for A, while the highest RMSE is for H_D and the highest MAPE is for A. P_D and H_D show larger errors because small changes in PI and hit rates are amplified by the endogenous inflow term.</w:t>
+      </w:r>
+    </w:p>
+    <w:tbl>
+      <w:tblPr>
+        <w:tblStyle w:val="TableGrid"/>
+        <w:tblW w:type="auto" w:w="0"/>
+        <w:tblLook w:firstColumn="1" w:firstRow="1" w:lastColumn="0" w:lastRow="0" w:noHBand="0" w:noVBand="1" w:val="04A0"/>
+      </w:tblPr>
+      <w:tblGrid>
+        <w:gridCol w:w="2880"/>
+        <w:gridCol w:w="2880"/>
+        <w:gridCol w:w="2880"/>
+      </w:tblGrid>
+      <w:tr>
+        <w:tc>
+          <w:tcPr>
+            <w:tcW w:type="dxa" w:w="2880"/>
+          </w:tcPr>
+          <w:p>
+            <w:r>
+              <w:rPr>
+                <w:b/>
+              </w:rPr>
+              <w:t>Group</w:t>
+            </w:r>
+          </w:p>
+        </w:tc>
+        <w:tc>
+          <w:tcPr>
+            <w:tcW w:type="dxa" w:w="2880"/>
+          </w:tcPr>
+          <w:p>
+            <w:r>
+              <w:rPr>
+                <w:b/>
+              </w:rPr>
+              <w:t>RMSE</w:t>
+            </w:r>
+          </w:p>
+        </w:tc>
+        <w:tc>
+          <w:tcPr>
+            <w:tcW w:type="dxa" w:w="2880"/>
+          </w:tcPr>
+          <w:p>
+            <w:r>
+              <w:rPr>
+                <w:b/>
+              </w:rPr>
+              <w:t>MAPE</w:t>
+            </w:r>
+          </w:p>
+        </w:tc>
+      </w:tr>
+      <w:tr>
+        <w:tc>
+          <w:tcPr>
+            <w:tcW w:type="dxa" w:w="2880"/>
+          </w:tcPr>
+          <w:p>
+            <w:r>
+              <w:t>Anglosphere ex-US</w:t>
+            </w:r>
+          </w:p>
+        </w:tc>
+        <w:tc>
+          <w:tcPr>
+            <w:tcW w:type="dxa" w:w="2880"/>
+          </w:tcPr>
+          <w:p>
+            <w:r>
+              <w:t>1.79</w:t>
+            </w:r>
+          </w:p>
+        </w:tc>
+        <w:tc>
+          <w:tcPr>
+            <w:tcW w:type="dxa" w:w="2880"/>
+          </w:tcPr>
+          <w:p>
+            <w:r>
+              <w:t>24.5%</w:t>
+            </w:r>
+          </w:p>
+        </w:tc>
+      </w:tr>
+      <w:tr>
+        <w:tc>
+          <w:tcPr>
+            <w:tcW w:type="dxa" w:w="2880"/>
+          </w:tcPr>
+          <w:p>
+            <w:r>
+              <w:t>Continental Europe</w:t>
+            </w:r>
+          </w:p>
+        </w:tc>
+        <w:tc>
+          <w:tcPr>
+            <w:tcW w:type="dxa" w:w="2880"/>
+          </w:tcPr>
+          <w:p>
+            <w:r>
+              <w:t>2.12</w:t>
+            </w:r>
+          </w:p>
+        </w:tc>
+        <w:tc>
+          <w:tcPr>
+            <w:tcW w:type="dxa" w:w="2880"/>
+          </w:tcPr>
+          <w:p>
+            <w:r>
+              <w:t>28.5%</w:t>
+            </w:r>
+          </w:p>
+        </w:tc>
+      </w:tr>
+      <w:tr>
+        <w:tc>
+          <w:tcPr>
+            <w:tcW w:type="dxa" w:w="2880"/>
+          </w:tcPr>
+          <w:p>
+            <w:r>
+              <w:t>Hindu</w:t>
+            </w:r>
+          </w:p>
+        </w:tc>
+        <w:tc>
+          <w:tcPr>
+            <w:tcW w:type="dxa" w:w="2880"/>
+          </w:tcPr>
+          <w:p>
+            <w:r>
+              <w:t>1.56</w:t>
+            </w:r>
+          </w:p>
+        </w:tc>
+        <w:tc>
+          <w:tcPr>
+            <w:tcW w:type="dxa" w:w="2880"/>
+          </w:tcPr>
+          <w:p>
+            <w:r>
+              <w:t>30.5%</w:t>
+            </w:r>
+          </w:p>
+        </w:tc>
+      </w:tr>
+      <w:tr>
+        <w:tc>
+          <w:tcPr>
+            <w:tcW w:type="dxa" w:w="2880"/>
+          </w:tcPr>
+          <w:p>
+            <w:r>
+              <w:t>Islamic</w:t>
+            </w:r>
+          </w:p>
+        </w:tc>
+        <w:tc>
+          <w:tcPr>
+            <w:tcW w:type="dxa" w:w="2880"/>
+          </w:tcPr>
+          <w:p>
+            <w:r>
+              <w:t>3.05</w:t>
+            </w:r>
+          </w:p>
+        </w:tc>
+        <w:tc>
+          <w:tcPr>
+            <w:tcW w:type="dxa" w:w="2880"/>
+          </w:tcPr>
+          <w:p>
+            <w:r>
+              <w:t>48.0%</w:t>
+            </w:r>
+          </w:p>
+        </w:tc>
+      </w:tr>
+      <w:tr>
+        <w:tc>
+          <w:tcPr>
+            <w:tcW w:type="dxa" w:w="2880"/>
+          </w:tcPr>
+          <w:p>
+            <w:r>
+              <w:t>Japanese</w:t>
+            </w:r>
+          </w:p>
+        </w:tc>
+        <w:tc>
+          <w:tcPr>
+            <w:tcW w:type="dxa" w:w="2880"/>
+          </w:tcPr>
+          <w:p>
+            <w:r>
+              <w:t>1.23</w:t>
+            </w:r>
+          </w:p>
+        </w:tc>
+        <w:tc>
+          <w:tcPr>
+            <w:tcW w:type="dxa" w:w="2880"/>
+          </w:tcPr>
+          <w:p>
+            <w:r>
+              <w:t>32.3%</w:t>
+            </w:r>
+          </w:p>
+        </w:tc>
+      </w:tr>
+      <w:tr>
+        <w:tc>
+          <w:tcPr>
+            <w:tcW w:type="dxa" w:w="2880"/>
+          </w:tcPr>
+          <w:p>
+            <w:r>
+              <w:t>Other Civilizations</w:t>
+            </w:r>
+          </w:p>
+        </w:tc>
+        <w:tc>
+          <w:tcPr>
+            <w:tcW w:type="dxa" w:w="2880"/>
+          </w:tcPr>
+          <w:p>
+            <w:r>
+              <w:t>1.72</w:t>
+            </w:r>
+          </w:p>
+        </w:tc>
+        <w:tc>
+          <w:tcPr>
+            <w:tcW w:type="dxa" w:w="2880"/>
+          </w:tcPr>
+          <w:p>
+            <w:r>
+              <w:t>36.7%</w:t>
+            </w:r>
+          </w:p>
+        </w:tc>
+      </w:tr>
+      <w:tr>
+        <w:tc>
+          <w:tcPr>
+            <w:tcW w:type="dxa" w:w="2880"/>
+          </w:tcPr>
+          <w:p>
+            <w:r>
+              <w:t>Other Western</w:t>
+            </w:r>
+          </w:p>
+        </w:tc>
+        <w:tc>
+          <w:tcPr>
+            <w:tcW w:type="dxa" w:w="2880"/>
+          </w:tcPr>
+          <w:p>
+            <w:r>
+              <w:t>2.22</w:t>
+            </w:r>
+          </w:p>
+        </w:tc>
+        <w:tc>
+          <w:tcPr>
+            <w:tcW w:type="dxa" w:w="2880"/>
+          </w:tcPr>
+          <w:p>
+            <w:r>
+              <w:t>34.8%</w:t>
+            </w:r>
+          </w:p>
+        </w:tc>
+      </w:tr>
+      <w:tr>
+        <w:tc>
+          <w:tcPr>
+            <w:tcW w:type="dxa" w:w="2880"/>
+          </w:tcPr>
+          <w:p>
+            <w:r>
+              <w:t>Sinic</w:t>
+            </w:r>
+          </w:p>
+        </w:tc>
+        <w:tc>
+          <w:tcPr>
+            <w:tcW w:type="dxa" w:w="2880"/>
+          </w:tcPr>
+          <w:p>
+            <w:r>
+              <w:t>4.43</w:t>
+            </w:r>
+          </w:p>
+        </w:tc>
+        <w:tc>
+          <w:tcPr>
+            <w:tcW w:type="dxa" w:w="2880"/>
+          </w:tcPr>
+          <w:p>
+            <w:r>
+              <w:t>54.5%</w:t>
+            </w:r>
+          </w:p>
+        </w:tc>
+      </w:tr>
+      <w:tr>
+        <w:tc>
+          <w:tcPr>
+            <w:tcW w:type="dxa" w:w="2880"/>
+          </w:tcPr>
+          <w:p>
+            <w:r>
+              <w:t>United States</w:t>
+            </w:r>
+          </w:p>
+        </w:tc>
+        <w:tc>
+          <w:tcPr>
+            <w:tcW w:type="dxa" w:w="2880"/>
+          </w:tcPr>
+          <w:p>
+            <w:r>
+              <w:t>3.87</w:t>
+            </w:r>
+          </w:p>
+        </w:tc>
+        <w:tc>
+          <w:tcPr>
+            <w:tcW w:type="dxa" w:w="2880"/>
+          </w:tcPr>
+          <w:p>
+            <w:r>
+              <w:t>33.6%</w:t>
+            </w:r>
+          </w:p>
+        </w:tc>
+      </w:tr>
+    </w:tbl>
+    <w:p>
+      <w:pPr>
+        <w:jc w:val="center"/>
+      </w:pPr>
+      <w:r>
+        <w:rPr>
+          <w:i/>
+        </w:rPr>
+        <w:t>Table 11. Projection accuracy by civilisation, 2017-2023.</w:t>
+      </w:r>
+    </w:p>
+    <w:tbl>
+      <w:tblPr>
+        <w:tblStyle w:val="TableGrid"/>
+        <w:tblW w:type="auto" w:w="0"/>
+        <w:tblLook w:firstColumn="1" w:firstRow="1" w:lastColumn="0" w:lastRow="0" w:noHBand="0" w:noVBand="1" w:val="04A0"/>
+      </w:tblPr>
+      <w:tblGrid>
+        <w:gridCol w:w="2880"/>
+        <w:gridCol w:w="2880"/>
+        <w:gridCol w:w="2880"/>
+      </w:tblGrid>
+      <w:tr>
+        <w:tc>
+          <w:tcPr>
+            <w:tcW w:type="dxa" w:w="2880"/>
+          </w:tcPr>
+          <w:p>
+            <w:r>
+              <w:rPr>
+                <w:b/>
+              </w:rPr>
+              <w:t>Compartment</w:t>
+            </w:r>
+          </w:p>
+        </w:tc>
+        <w:tc>
+          <w:tcPr>
+            <w:tcW w:type="dxa" w:w="2880"/>
+          </w:tcPr>
+          <w:p>
+            <w:r>
+              <w:rPr>
+                <w:b/>
+              </w:rPr>
+              <w:t>RMSE</w:t>
+            </w:r>
+          </w:p>
+        </w:tc>
+        <w:tc>
+          <w:tcPr>
+            <w:tcW w:type="dxa" w:w="2880"/>
+          </w:tcPr>
+          <w:p>
+            <w:r>
+              <w:rPr>
+                <w:b/>
+              </w:rPr>
+              <w:t>MAPE</w:t>
+            </w:r>
+          </w:p>
+        </w:tc>
+      </w:tr>
+      <w:tr>
+        <w:tc>
+          <w:tcPr>
+            <w:tcW w:type="dxa" w:w="2880"/>
+          </w:tcPr>
+          <w:p>
+            <w:r>
+              <w:t>A</w:t>
+            </w:r>
+          </w:p>
+        </w:tc>
+        <w:tc>
+          <w:tcPr>
+            <w:tcW w:type="dxa" w:w="2880"/>
+          </w:tcPr>
+          <w:p>
+            <w:r>
+              <w:t>0.86</w:t>
+            </w:r>
+          </w:p>
+        </w:tc>
+        <w:tc>
+          <w:tcPr>
+            <w:tcW w:type="dxa" w:w="2880"/>
+          </w:tcPr>
+          <w:p>
+            <w:r>
+              <w:t>55.0%</w:t>
+            </w:r>
+          </w:p>
+        </w:tc>
+      </w:tr>
+      <w:tr>
+        <w:tc>
+          <w:tcPr>
+            <w:tcW w:type="dxa" w:w="2880"/>
+          </w:tcPr>
+          <w:p>
+            <w:r>
+              <w:t>D</w:t>
+            </w:r>
+          </w:p>
+        </w:tc>
+        <w:tc>
+          <w:tcPr>
+            <w:tcW w:type="dxa" w:w="2880"/>
+          </w:tcPr>
+          <w:p>
+            <w:r>
+              <w:t>1.51</w:t>
+            </w:r>
+          </w:p>
+        </w:tc>
+        <w:tc>
+          <w:tcPr>
+            <w:tcW w:type="dxa" w:w="2880"/>
+          </w:tcPr>
+          <w:p>
+            <w:r>
+              <w:t>21.1%</w:t>
+            </w:r>
+          </w:p>
+        </w:tc>
+      </w:tr>
+      <w:tr>
+        <w:tc>
+          <w:tcPr>
+            <w:tcW w:type="dxa" w:w="2880"/>
+          </w:tcPr>
+          <w:p>
+            <w:r>
+              <w:t>H_A</w:t>
+            </w:r>
+          </w:p>
+        </w:tc>
+        <w:tc>
+          <w:tcPr>
+            <w:tcW w:type="dxa" w:w="2880"/>
+          </w:tcPr>
+          <w:p>
+            <w:r>
+              <w:t>1.52</w:t>
+            </w:r>
+          </w:p>
+        </w:tc>
+        <w:tc>
+          <w:tcPr>
+            <w:tcW w:type="dxa" w:w="2880"/>
+          </w:tcPr>
+          <w:p>
+            <w:r>
+              <w:t>27.6%</w:t>
+            </w:r>
+          </w:p>
+        </w:tc>
+      </w:tr>
+      <w:tr>
+        <w:tc>
+          <w:tcPr>
+            <w:tcW w:type="dxa" w:w="2880"/>
+          </w:tcPr>
+          <w:p>
+            <w:r>
+              <w:t>H_D</w:t>
+            </w:r>
+          </w:p>
+        </w:tc>
+        <w:tc>
+          <w:tcPr>
+            <w:tcW w:type="dxa" w:w="2880"/>
+          </w:tcPr>
+          <w:p>
+            <w:r>
+              <w:t>4.68</w:t>
+            </w:r>
+          </w:p>
+        </w:tc>
+        <w:tc>
+          <w:tcPr>
+            <w:tcW w:type="dxa" w:w="2880"/>
+          </w:tcPr>
+          <w:p>
+            <w:r>
+              <w:t>32.3%</w:t>
+            </w:r>
+          </w:p>
+        </w:tc>
+      </w:tr>
+      <w:tr>
+        <w:tc>
+          <w:tcPr>
+            <w:tcW w:type="dxa" w:w="2880"/>
+          </w:tcPr>
+          <w:p>
+            <w:r>
+              <w:t>P_A</w:t>
+            </w:r>
+          </w:p>
+        </w:tc>
+        <w:tc>
+          <w:tcPr>
+            <w:tcW w:type="dxa" w:w="2880"/>
+          </w:tcPr>
+          <w:p>
+            <w:r>
+              <w:t>1.99</w:t>
+            </w:r>
+          </w:p>
+        </w:tc>
+        <w:tc>
+          <w:tcPr>
+            <w:tcW w:type="dxa" w:w="2880"/>
+          </w:tcPr>
+          <w:p>
+            <w:r>
+              <w:t>46.9%</w:t>
+            </w:r>
+          </w:p>
+        </w:tc>
+      </w:tr>
+      <w:tr>
+        <w:tc>
+          <w:tcPr>
+            <w:tcW w:type="dxa" w:w="2880"/>
+          </w:tcPr>
+          <w:p>
+            <w:r>
+              <w:t>P_D</w:t>
+            </w:r>
+          </w:p>
+        </w:tc>
+        <w:tc>
+          <w:tcPr>
+            <w:tcW w:type="dxa" w:w="2880"/>
+          </w:tcPr>
+          <w:p>
+            <w:r>
+              <w:t>3.33</w:t>
+            </w:r>
+          </w:p>
+        </w:tc>
+        <w:tc>
+          <w:tcPr>
+            <w:tcW w:type="dxa" w:w="2880"/>
+          </w:tcPr>
+          <w:p>
+            <w:r>
+              <w:t>32.7%</w:t>
+            </w:r>
+          </w:p>
+        </w:tc>
+      </w:tr>
+    </w:tbl>
+    <w:p>
+      <w:pPr>
+        <w:jc w:val="center"/>
+      </w:pPr>
+      <w:r>
+        <w:rPr>
+          <w:i/>
+        </w:rPr>
+        <w:t>Table 12. Projection accuracy by compartment, 2017-2023.</w:t>
+      </w:r>
+    </w:p>
+    <w:p>
+      <w:pPr>
+        <w:pStyle w:val="Heading2"/>
+      </w:pPr>
+      <w:r>
+        <w:t>5.8 Correction pressures in the annual model</w:t>
+      </w:r>
+    </w:p>
+    <w:p>
+      <w:r>
+        <w:t>The annual projection performs best where the correction pressures in Section 4.11 are binding. Laplace smoothing prevents empty cells from being treated as impossible transitions; the [0,1] clip and the dropout cap prevent the trend extrapolation from producing rates that are incompatible with a stochastic transition matrix; and the 2016 inflow apportionment keeps new-entrant composition close to the last observed regime. These pressures mean that the projection is not a purely mechanical forecast: it is a bounded extrapolation that stays within the empirical support of the 2000-2016 data and within the stability constraints of the compartment model.</w:t>
       </w:r>
     </w:p>
     <w:p>
@@ -6814,12 +8815,51 @@
         <w:pStyle w:val="Heading2"/>
       </w:pPr>
       <w:r>
-        <w:t>6.4 Limitations</w:t>
+        <w:t>6.4 Validation of correction pressures</w:t>
       </w:r>
     </w:p>
     <w:p>
       <w:r>
-        <w:t>Several limitations should be acknowledged. OpenAlex affiliation and country assignments are noisy, especially for researchers with multiple affiliations. The civilisation grouping is a coarse aggregation; within-group heterogeneity is substantial. The model is a steady-state ODE and does not capture short-term dynamics, cross-civilisation spillovers, or the non-linear effects of network externalities. The cohort sample is small; the absolute equilibrium numbers should be interpreted as model-implied stocks rather than as census counts. Authors with many publications are over-weighted relative to one-publication authors, so rate estimates reflect author-publication exposure rather than a uniformly representative sample of individuals. The endogenous inflow is capped at a safety factor of 0.5 relative to the critical reproduction rate; alternative values would shift equilibrium levels and should be reported in future sensitivity tables. Finally, the point-of-no-return threshold is a sufficient condition for collapse, not a necessary one: a community may decline for reasons outside the model even if T remains above M.</w:t>
+        <w:t>The correction pressures are not ad hoc adjustments; each maps to a known statistical or dynamical constraint. Laplace smoothing is equivalent to a weak Dirichlet prior on a multinomial transition vector; it guarantees that no cell has zero estimated probability and shrinks rare transitions toward the simplex centroid. The [0, 1] clip is a feasibility constraint on probabilities; the dropout cap is a cross-sectional constraint that prevents projected attrition from exceeding the observed stock; and the inflow apportionment constraint keeps the composition of new entrants equal to the last observed recruitment pattern. In the 2017-2023 projection these pressures reduced the sensitivity of the forecast to sparse cells and to short-run fluctuations in small groups. Quantitatively, the overall RMSE of {_fmt(annual_ctx.get('overall_rmse', float('nan')), 2)} and conservative MAPE of {_fmt(annual_ctx.get('overall_mape_pct', float('nan')), 1)}% are consistent with a model that is deliberately regularised rather than optimised for in-sample fit. The residual errors are concentrated in the smallest compartments, which is exactly where smoothing is most active and where future data will be most valuable.</w:t>
+      </w:r>
+    </w:p>
+    <w:p>
+      <w:pPr>
+        <w:pStyle w:val="Heading2"/>
+      </w:pPr>
+      <w:r>
+        <w:t>6.5 Intra-civilisation alternatives when inter-civilisation mobility cannot be controlled</w:t>
+      </w:r>
+    </w:p>
+    <w:p>
+      <w:r>
+        <w:t>If a civilisation cannot control outflows to, or inflows from, other jurisdictions—whether because of visa regimes, salary differentials, language advantages, or targeted recruitment—it can still preserve its research community by acting on the intra-civilisation levers identified in the annual model. The annual rates show that the domestic active pool T = D + H_D + P_D responds most strongly to the dropout rate d, the domestic hit rate h_D, and the PI promotion rate p_D. Policies that reduce early-career attrition, expand domestic postdoctoral positions, or accelerate independent-lab formation therefore become defensive substitutes when inter-civilisation poaching cannot be regulated. This is the practical meaning of civilisational-diversity preservation under sovereignty constraints: even without controlling the border of talent, a community can increase the internal reproduction of active researchers. The ODE safety factor of 0.5 on endogenous PI inflow is a conservative bound that prevents over-optimism about this substitution effect; more ambitious domestic growth would require corresponding evidence that the extra PIs can be absorbed without simply raising dropout.</w:t>
+      </w:r>
+    </w:p>
+    <w:p>
+      <w:pPr>
+        <w:pStyle w:val="Heading2"/>
+      </w:pPr>
+      <w:r>
+        <w:t>6.6 Annual updating as an early-warning layer</w:t>
+      </w:r>
+    </w:p>
+    <w:p>
+      <w:r>
+        <w:t>The 2017-2023 projection demonstrates that the framework can be rerun annually with a one-year time step. Each new year of OpenAlex data updates the observed transition rates, the fitted trends, and the distance to the minimum viable coauthor threshold. Because the model is regularised by the correction pressures, the one-year-ahead projection is not easily derailed by a single noisy observation. Instead, successive years reveal whether a particular transition rate is drifting toward a boundary. That drift is the early-warning signal. Policymakers can then intervene before the active pool falls below M, using the rate-specific elasticities in Table 3 to prioritise the smallest proportional change that restores a safety margin. This is the operational mechanism for avoiding technology monopoly and oligopoly dead ends: by keeping every major research community above its minimum viable coauthor pool, annual monitoring sustains the competitive diversity that underpins long-run technological progress. The framework is therefore not a prediction that a particular civilisation will collapse; it is a tool for ensuring that no single civilisation reaches a point where its collapse becomes self-sustaining.</w:t>
+      </w:r>
+    </w:p>
+    <w:p>
+      <w:pPr>
+        <w:pStyle w:val="Heading2"/>
+      </w:pPr>
+      <w:r>
+        <w:t>6.7 Limitations</w:t>
+      </w:r>
+    </w:p>
+    <w:p>
+      <w:r>
+        <w:t>Several limitations should be acknowledged. OpenAlex affiliation and country assignments are noisy, especially for researchers with multiple affiliations. The civilisation grouping is a coarse aggregation; within-group heterogeneity is substantial. The annual model relies on a discrete approximation of the continuous-time ODE and does not capture within-year events or cross-civilisation spillovers. Inter-civilisation flows are approximated by the author's recent_group while abroad, which misses year-to-year destination switching. The cohort sample is small; the absolute equilibrium numbers should be interpreted as model-implied stocks rather than as census counts. Authors with many publications are over-weighted relative to one-publication authors, so rate estimates reflect author-publication exposure rather than a uniformly representative sample of individuals. The endogenous inflow is capped at a safety factor of 0.5 relative to the critical reproduction rate; alternative values would shift equilibrium levels and should be reported in future sensitivity tables. Finally, the point-of-no-return threshold is a sufficient condition for collapse, not a necessary one: a community may decline for reasons outside the model even if T remains above M.</w:t>
       </w:r>
     </w:p>
     <w:p>
@@ -6843,6 +8883,11 @@
     <w:p>
       <w:r>
         <w:t>We have proposed and implemented a transition-rate framework for assessing how close AI/ML research communities are to a point of no return. The model converts OpenAlex publication records into civilisation-specific transition rates and solves for the equilibrium active researcher pool. All groups remain above their minimum viable coauthor threshold in the fitted model, but the distance to that threshold varies by an order of magnitude and is most sensitive to exogenous entry and dropout. Dropout is the dominant negative lever (active-pool elasticity -2.32 to -2.01), and a simulated reduction is the single most efficient model-implied response for every civilisation. However, the closest point of no return is exogenous entry for all groups in the active-pool analysis, which means that policies which sustain the pipeline of new researchers are first-order defences. The historical counterfactual and the bootstrap intervals remind us that the future is not determined by current rates; transition rates can change, and policy can be directed at the most fragile lever before a collapse.</w:t>
+      </w:r>
+    </w:p>
+    <w:p>
+      <w:r>
+        <w:t>The annual projection layer adds an operational dimension to this conclusion. By estimating year-by-year transition rates and projecting one year ahead, the model turns the steady-state diagnostic into an early-warning dashboard. A one-year time step is short enough to detect drift before the active pool approaches the minimum viable threshold, and the correction pressures keep the projection within empirical and theoretical bounds. When inter-civilisation mobility cannot be controlled, the same framework points to intra-civilisation levers—reducing dropout, raising domestic hit rates, and accelerating PI promotion—that preserve T = D + H_D + P_D. These two layers, steady-state and annual, together provide a coherent basis for early, safety-factor-bound intervention.</w:t>
       </w:r>
     </w:p>
     <w:p>

</xml_diff>

<commit_message>
fix: placeholders, wording, highlights, and citation-bracket notation in full-article manuscript; regenerate docx/md/pptx
Co-Authored-By: Tatsuki Onishi <bougtoir@gmail.com>
</commit_message>
<xml_diff>
--- a/researcher_mobility_ode/docs/manuscript_full_article.docx
+++ b/researcher_mobility_ode/docs/manuscript_full_article.docx
@@ -28,7 +28,7 @@
         <w:jc w:val="center"/>
       </w:pPr>
       <w:r>
-        <w:t>Approximate word count (main text incl. tables, excl. references): 9825</w:t>
+        <w:t>Approximate word count (main text incl. tables, excl. references): 9829</w:t>
       </w:r>
     </w:p>
     <w:p>
@@ -54,7 +54,7 @@
     </w:p>
     <w:p>
       <w:r>
-        <w:t>Artificial intelligence (AI) and machine learning (ML) research is increasingly concentrated in a few regions, raising the risk that smaller research communities fall below a minimum viable coauthor pool and cannot recover. We model each civilisation as a six-compartment system of domestic and abroad early-career, high-impact, and principal-investigator researchers, and estimate transition rates from OpenAlex Artificial Intelligence works (subfield 1702). The minimum viable coauthor threshold is defined as M = k × c_bar, where c_bar is the mean number of authors per work and k is the median number of distinct last-author groups observed per recent year. Across 9 groups, equilibrium domestic active pools remain above their thresholds, but the closest point of no return is observed for the Other Civilizations group, where a proportional change of 0.75 in I0 (critical factor 0.25×) would drive the active pool to its threshold. A simulated reduction in dropout yields the largest margin gain per unit proportional change in every group, making it the most sensitive transition lever in the model. Historical and saturating-inflow counterfactuals show that the model is most sensitive to exogenous entry and attrition. These results provide a quantitative framework for early, safety-factor-bound policy scenarios that preserve civilisational diversity in AI/ML research.</w:t>
+        <w:t>Artificial intelligence (AI) and machine learning (ML) research is increasingly concentrated in a few regions, raising the risk that smaller research communities fall below a minimum viable coauthor pool and cannot recover. We model each civilisation as a six-compartment system of domestic and abroad early-career, high-impact, and principal-investigator researchers, and estimate transition rates from OpenAlex Artificial Intelligence works (subfield 1702). The minimum viable coauthor threshold is defined as M = k × c_bar, where c_bar is the mean number of authors per work and k is the median number of distinct last-author groups observed per recent year. Across 9 groups, equilibrium domestic active pools remain above their thresholds, but the closest point of no return is observed for the Other Civilizations group, where I0 must be multiplied by 0.246× its current value (a 75% proportional change) to drive the active pool to its threshold. A simulated reduction in dropout yields the largest margin gain per unit proportional change in every group, making it the most sensitive transition lever in the model. Historical and saturating-inflow counterfactuals show that the model is most sensitive to exogenous entry and attrition. These results provide a quantitative framework for early, safety-factor-bound policy scenarios that preserve civilisational diversity in AI/ML research.</w:t>
       </w:r>
     </w:p>
     <w:p>
@@ -89,7 +89,7 @@
         <w:pStyle w:val="ListBullet"/>
       </w:pPr>
       <w:r>
-        <w:t>Closest point of no return for the active pool is Other Civilizations via I0 (critical factor 0.25×).</w:t>
+        <w:t>Closest point of no return: Other Civilizations via I0 (factor 0.25×).</w:t>
       </w:r>
     </w:p>
     <w:p>
@@ -97,7 +97,7 @@
         <w:pStyle w:val="ListBullet"/>
       </w:pPr>
       <w:r>
-        <w:t>Simulated dropout reduction yields the largest margin gain per unit proportional change across all groups.</w:t>
+        <w:t>Dropout reduction gives the largest margin gain per 10% change across all groups.</w:t>
       </w:r>
     </w:p>
     <w:p>
@@ -2134,7 +2134,7 @@
     </w:p>
     <w:p>
       <w:r>
-        <w:t>For the 2017-2026 projection we fit a linear trend to the observed 2000-2016 rates for each group and rate. If fewer than four observations were available or the fit explained less than 10% of the variance, the historical mean was used instead. Projected rates were clipped to [0, 1]. Dropout was capped at the 90th percentile of observed dropout rates to prevent implausible extrapolation. Projected total inflows were apportioned across compartments using the observed 2016 distribution. Population composition was projected forward with the discrete-time recursion N(t+1) = N(t)P(t) + b(t+1), where P(t) is a 6×6 row-stochastic-in-expectation matrix that preserves dropout mass: the row sum is 1 − d after scaling outgoing rates. This discrete step is the operational counterpart of the continuous-time ODE; with an annual dt it provides an early-warning signal one year ahead.</w:t>
+        <w:t>For the 2017-2026 projection we fit a linear trend to the observed 2000-2016 rates for each group and rate. If fewer than four observations were available or the fit explained less than 10% of the variance, the historical mean was used instead. Projected rates were clipped to values between 0 and 1. Dropout was capped at the 90th percentile of observed dropout rates to prevent implausible extrapolation. Projected total inflows were apportioned across compartments using the observed 2016 distribution. Population composition was projected forward with the discrete-time recursion N(t+1) = N(t)P(t) + b(t+1), where P(t) is a 6×6 row-stochastic-in-expectation matrix that preserves dropout mass: the row sum is 1 − d after scaling outgoing rates. This discrete step is the operational counterpart of the continuous-time ODE; with an annual dt it provides an early-warning signal one year ahead.</w:t>
       </w:r>
     </w:p>
     <w:p>
@@ -2157,7 +2157,7 @@
     </w:p>
     <w:p>
       <w:r>
-        <w:t>The [0, 1] clip after linear projection is a feasibility pressure: rates outside the probability simplex are inadmissible. The dropout cap is a safety pressure motivated by the fact that unbounded linear extrapolation of observed attrition would eventually predict more leavers than the total stock. The inflow apportionment pressure keeps the composition of new entrants aligned with the most recently observed recruitment pattern, rather than inventing a new distribution. Finally, the safety factor of 0.5 on the endogenous PI-driven inflow keeps the system inside the stability boundary. Together these pressures embody the principle that projection should stay within observed empirical support and within theoretical stability limits; they are not arbitrary adjustments but transparent bounds that can be tightened or relaxed as more data become available.</w:t>
+        <w:t>Clipping projected rates to values between 0 and 1 is a feasibility pressure: rates outside the probability simplex are inadmissible. The dropout cap is a safety pressure motivated by the fact that unbounded linear extrapolation of observed attrition would eventually predict more leavers than the total stock. The inflow apportionment pressure keeps the composition of new entrants aligned with the most recently observed recruitment pattern, rather than inventing a new distribution. Finally, the safety factor of 0.5 on the endogenous PI-driven inflow keeps the system inside the stability boundary. Together these pressures embody the principle that projection should stay within observed empirical support and within theoretical stability limits; they are not arbitrary adjustments but transparent bounds that can be tightened or relaxed as more data become available.</w:t>
       </w:r>
     </w:p>
     <w:p>
@@ -3872,7 +3872,7 @@
     </w:p>
     <w:p>
       <w:r>
-        <w:t>Table 4 reports, for each group, the single rate that reaches the active-pool threshold with the smallest proportional change. The Other Civilizations group is the most fragile: a proportional change of 0.75 in I0 (critical factor 0.25×) would drive the active pool to its minimum viable threshold. For the active researcher pool, I0 is the closest point-of-no-return lever for the active researcher pool in every group. This is consistent with a recruitment-driven view of scientific communities: if the pipeline of new researchers shuts or slows, the active pool eventually falls below the minimum viable coauthor pool regardless of how efficient return or promotion becomes. A global retention programme that reduces dropout would benefit all groups, but the most vulnerable groups may also need an expansion of the exogenous entry rate.</w:t>
+        <w:t>Table 4 reports, for each group, the single rate that reaches the active-pool threshold with the smallest proportional change. The Other Civilizations group is the most fragile: I0 must be multiplied by 0.246× its current value (a 75% proportional change) to drive the active pool to its minimum viable threshold. I0 is the closest point-of-no-return lever for the active researcher pool in every group. This is consistent with a recruitment-driven view of scientific communities: if the pipeline of new researchers shuts or slows, the active pool eventually falls below the minimum viable coauthor pool regardless of how efficient return or promotion becomes. A global retention programme that reduces dropout would benefit all groups, but the most vulnerable groups may also need an expansion of the exogenous entry rate.</w:t>
       </w:r>
     </w:p>
     <w:tbl>
@@ -8661,7 +8661,7 @@
     </w:p>
     <w:p>
       <w:r>
-        <w:t>The annual projection performs best where the correction pressures in Section 4.11 are binding. Laplace smoothing prevents empty cells from being treated as impossible transitions; the [0,1] clip and the dropout cap prevent the trend extrapolation from producing rates that are incompatible with a stochastic transition matrix; and the 2016 inflow apportionment keeps new-entrant composition close to the last observed regime. These pressures mean that the projection is not a purely mechanical forecast: it is a bounded extrapolation that stays within the empirical support of the 2000-2016 data and within the stability constraints of the compartment model.</w:t>
+        <w:t>The annual projection performs best where the correction pressures in Section 4.11 are binding. Laplace smoothing prevents empty cells from being treated as impossible transitions; the unit-interval clip and the dropout cap prevent the trend extrapolation from producing rates that are incompatible with a stochastic transition matrix; and the 2016 inflow apportionment keeps new-entrant composition close to the last observed regime. These pressures mean that the projection is not a purely mechanical forecast: it is a bounded extrapolation that stays within the empirical support of the 2000-2016 data and within the stability constraints of the compartment model.</w:t>
       </w:r>
     </w:p>
     <w:p>
@@ -8820,7 +8820,7 @@
     </w:p>
     <w:p>
       <w:r>
-        <w:t>The correction pressures are not ad hoc adjustments; each maps to a known statistical or dynamical constraint. Laplace smoothing is equivalent to a weak Dirichlet prior on a multinomial transition vector; it guarantees that no cell has zero estimated probability and shrinks rare transitions toward the simplex centroid. The [0, 1] clip is a feasibility constraint on probabilities; the dropout cap is a cross-sectional constraint that prevents projected attrition from exceeding the observed stock; and the inflow apportionment constraint keeps the composition of new entrants equal to the last observed recruitment pattern. In the 2017-2023 projection these pressures reduced the sensitivity of the forecast to sparse cells and to short-run fluctuations in small groups. Quantitatively, the overall RMSE of {_fmt(annual_ctx.get('overall_rmse', float('nan')), 2)} and conservative MAPE of {_fmt(annual_ctx.get('overall_mape_pct', float('nan')), 1)}% are consistent with a model that is deliberately regularised rather than optimised for in-sample fit. The residual errors are concentrated in the smallest compartments, which is exactly where smoothing is most active and where future data will be most valuable.</w:t>
+        <w:t>The correction pressures are not ad hoc adjustments; each maps to a known statistical or dynamical constraint. Laplace smoothing is equivalent to a weak Dirichlet prior on a multinomial transition vector; it guarantees that no cell has zero estimated probability and shrinks rare transitions toward the simplex centroid. Clipping projected rates to values between 0 and 1 is a feasibility constraint on probabilities; the dropout cap is a cross-sectional constraint that prevents projected attrition from exceeding the observed stock; and the inflow apportionment constraint keeps the composition of new entrants equal to the last observed recruitment pattern. In the 2017-2023 projection these pressures reduced the sensitivity of the forecast to sparse cells and to short-run fluctuations in small groups. Quantitatively, the overall RMSE of 2.66 and conservative MAPE of 35.9% are consistent with a model that is deliberately regularised rather than optimised for in-sample fit. The residual errors are concentrated in the smallest compartments, which is exactly where smoothing is most active and where future data will be most valuable.</w:t>
       </w:r>
     </w:p>
     <w:p>

</xml_diff>

<commit_message>
fix: clarify PNR proximity wording as percentage reduction/increase in abstract and Table 4
Co-Authored-By: Tatsuki Onishi <bougtoir@gmail.com>
</commit_message>
<xml_diff>
--- a/researcher_mobility_ode/docs/manuscript_full_article.docx
+++ b/researcher_mobility_ode/docs/manuscript_full_article.docx
@@ -28,7 +28,7 @@
         <w:jc w:val="center"/>
       </w:pPr>
       <w:r>
-        <w:t>Approximate word count (main text incl. tables, excl. references): 9829</w:t>
+        <w:t>Approximate word count (main text incl. tables, excl. references): 9831</w:t>
       </w:r>
     </w:p>
     <w:p>
@@ -54,7 +54,7 @@
     </w:p>
     <w:p>
       <w:r>
-        <w:t>Artificial intelligence (AI) and machine learning (ML) research is increasingly concentrated in a few regions, raising the risk that smaller research communities fall below a minimum viable coauthor pool and cannot recover. We model each civilisation as a six-compartment system of domestic and abroad early-career, high-impact, and principal-investigator researchers, and estimate transition rates from OpenAlex Artificial Intelligence works (subfield 1702). The minimum viable coauthor threshold is defined as M = k × c_bar, where c_bar is the mean number of authors per work and k is the median number of distinct last-author groups observed per recent year. Across 9 groups, equilibrium domestic active pools remain above their thresholds, but the closest point of no return is observed for the Other Civilizations group, where I0 must be multiplied by 0.246× its current value (a 75% proportional change) to drive the active pool to its threshold. A simulated reduction in dropout yields the largest margin gain per unit proportional change in every group, making it the most sensitive transition lever in the model. Historical and saturating-inflow counterfactuals show that the model is most sensitive to exogenous entry and attrition. These results provide a quantitative framework for early, safety-factor-bound policy scenarios that preserve civilisational diversity in AI/ML research.</w:t>
+        <w:t>Artificial intelligence (AI) and machine learning (ML) research is increasingly concentrated in a few regions, raising the risk that smaller research communities fall below a minimum viable coauthor pool and cannot recover. We model each civilisation as a six-compartment system of domestic and abroad early-career, high-impact, and principal-investigator researchers, and estimate transition rates from OpenAlex Artificial Intelligence works (subfield 1702). The minimum viable coauthor threshold is defined as M = k × c_bar, where c_bar is the mean number of authors per work and k is the median number of distinct last-author groups observed per recent year. Across 9 groups, equilibrium domestic active pools remain above their thresholds, but the closest point of no return is observed for the Other Civilizations group, where I0 must be multiplied by 0.246× its current value (equivalent to a 75% proportional reduction) to drive the active pool to its threshold. A simulated reduction in dropout yields the largest margin gain per unit proportional change in every group, making it the most sensitive transition lever in the model. Historical and saturating-inflow counterfactuals show that the model is most sensitive to exogenous entry and attrition. These results provide a quantitative framework for early, safety-factor-bound policy scenarios that preserve civilisational diversity in AI/ML research.</w:t>
       </w:r>
     </w:p>
     <w:p>
@@ -3872,7 +3872,7 @@
     </w:p>
     <w:p>
       <w:r>
-        <w:t>Table 4 reports, for each group, the single rate that reaches the active-pool threshold with the smallest proportional change. The Other Civilizations group is the most fragile: I0 must be multiplied by 0.246× its current value (a 75% proportional change) to drive the active pool to its minimum viable threshold. I0 is the closest point-of-no-return lever for the active researcher pool in every group. This is consistent with a recruitment-driven view of scientific communities: if the pipeline of new researchers shuts or slows, the active pool eventually falls below the minimum viable coauthor pool regardless of how efficient return or promotion becomes. A global retention programme that reduces dropout would benefit all groups, but the most vulnerable groups may also need an expansion of the exogenous entry rate.</w:t>
+        <w:t>Table 4 reports, for each group, the single rate that reaches the active-pool threshold with the smallest proportional change. The Other Civilizations group is the most fragile: I0 must be multiplied by 0.246× its current value (equivalent to a 75% proportional reduction) to drive the active pool to its minimum viable threshold. I0 is the closest point-of-no-return lever for the active researcher pool in every group. This is consistent with a recruitment-driven view of scientific communities: if the pipeline of new researchers shuts or slows, the active pool eventually falls below the minimum viable coauthor pool regardless of how efficient return or promotion becomes. A global retention programme that reduces dropout would benefit all groups, but the most vulnerable groups may also need an expansion of the exogenous entry rate.</w:t>
       </w:r>
     </w:p>
     <w:tbl>

</xml_diff>

<commit_message>
fix: clarify PNR proximity wording as percentage reduction/increase
Co-Authored-By: Tatsuki Onishi <bougtoir@gmail.com>
</commit_message>
<xml_diff>
--- a/researcher_mobility_ode/docs/manuscript_full_article.docx
+++ b/researcher_mobility_ode/docs/manuscript_full_article.docx
@@ -28,7 +28,7 @@
         <w:jc w:val="center"/>
       </w:pPr>
       <w:r>
-        <w:t>Approximate word count (main text incl. tables, excl. references): 9829</w:t>
+        <w:t>Approximate word count (main text incl. tables, excl. references): 9831</w:t>
       </w:r>
     </w:p>
     <w:p>
@@ -54,7 +54,7 @@
     </w:p>
     <w:p>
       <w:r>
-        <w:t>Artificial intelligence (AI) and machine learning (ML) research is increasingly concentrated in a few regions, raising the risk that smaller research communities fall below a minimum viable coauthor pool and cannot recover. We model each civilisation as a six-compartment system of domestic and abroad early-career, high-impact, and principal-investigator researchers, and estimate transition rates from OpenAlex Artificial Intelligence works (subfield 1702). The minimum viable coauthor threshold is defined as M = k × c_bar, where c_bar is the mean number of authors per work and k is the median number of distinct last-author groups observed per recent year. Across 9 groups, equilibrium domestic active pools remain above their thresholds, but the closest point of no return is observed for the Other Civilizations group, where I0 must be multiplied by 0.246× its current value (a 75% proportional change) to drive the active pool to its threshold. A simulated reduction in dropout yields the largest margin gain per unit proportional change in every group, making it the most sensitive transition lever in the model. Historical and saturating-inflow counterfactuals show that the model is most sensitive to exogenous entry and attrition. These results provide a quantitative framework for early, safety-factor-bound policy scenarios that preserve civilisational diversity in AI/ML research.</w:t>
+        <w:t>Artificial intelligence (AI) and machine learning (ML) research is increasingly concentrated in a few regions, raising the risk that smaller research communities fall below a minimum viable coauthor pool and cannot recover. We model each civilisation as a six-compartment system of domestic and abroad early-career, high-impact, and principal-investigator researchers, and estimate transition rates from OpenAlex Artificial Intelligence works (subfield 1702). The minimum viable coauthor threshold is defined as M = k × c_bar, where c_bar is the mean number of authors per work and k is the median number of distinct last-author groups observed per recent year. Across 9 groups, equilibrium domestic active pools remain above their thresholds, but the closest point of no return is observed for the Other Civilizations group, where I0 must be multiplied by 0.246× its current value (equivalent to a 75% proportional reduction) to drive the active pool to its threshold. A simulated reduction in dropout yields the largest margin gain per unit proportional change in every group, making it the most sensitive transition lever in the model. Historical and saturating-inflow counterfactuals show that the model is most sensitive to exogenous entry and attrition. These results provide a quantitative framework for early, safety-factor-bound policy scenarios that preserve civilisational diversity in AI/ML research.</w:t>
       </w:r>
     </w:p>
     <w:p>
@@ -3872,7 +3872,7 @@
     </w:p>
     <w:p>
       <w:r>
-        <w:t>Table 4 reports, for each group, the single rate that reaches the active-pool threshold with the smallest proportional change. The Other Civilizations group is the most fragile: I0 must be multiplied by 0.246× its current value (a 75% proportional change) to drive the active pool to its minimum viable threshold. I0 is the closest point-of-no-return lever for the active researcher pool in every group. This is consistent with a recruitment-driven view of scientific communities: if the pipeline of new researchers shuts or slows, the active pool eventually falls below the minimum viable coauthor pool regardless of how efficient return or promotion becomes. A global retention programme that reduces dropout would benefit all groups, but the most vulnerable groups may also need an expansion of the exogenous entry rate.</w:t>
+        <w:t>Table 4 reports, for each group, the single rate that reaches the active-pool threshold with the smallest proportional change. The Other Civilizations group is the most fragile: I0 must be multiplied by 0.246× its current value (equivalent to a 75% proportional reduction) to drive the active pool to its minimum viable threshold. I0 is the closest point-of-no-return lever for the active researcher pool in every group. This is consistent with a recruitment-driven view of scientific communities: if the pipeline of new researchers shuts or slows, the active pool eventually falls below the minimum viable coauthor pool regardless of how efficient return or promotion becomes. A global retention programme that reduces dropout would benefit all groups, but the most vulnerable groups may also need an expansion of the exogenous entry rate.</w:t>
       </w:r>
     </w:p>
     <w:tbl>

</xml_diff>

<commit_message>
Make safety factor in manuscript dynamic from equilibrium CSV; regenerate docx/md/pptx
Co-Authored-By: Tatsuki Onishi <bougtoir@gmail.com>
</commit_message>
<xml_diff>
--- a/researcher_mobility_ode/docs/manuscript_full_article.docx
+++ b/researcher_mobility_ode/docs/manuscript_full_article.docx
@@ -28,7 +28,7 @@
         <w:jc w:val="center"/>
       </w:pPr>
       <w:r>
-        <w:t>Approximate word count (main text incl. tables, excl. references): 9831</w:t>
+        <w:t>Approximate word count (main text incl. tables, excl. references): 9840</w:t>
       </w:r>
     </w:p>
     <w:p>
@@ -1896,7 +1896,7 @@
         </m:sSub>
       </m:oMath>
       <w:r>
-        <w:t xml:space="preserve">, with r capped at half the stability-critical value (safety factor 0.5). A saturating alternative, </w:t>
+        <w:t xml:space="preserve">, with r capped at 0.50× the stability-critical value (safety factor 0.50). A saturating alternative, </w:t>
       </w:r>
       <m:oMath>
         <m:func>
@@ -2157,7 +2157,7 @@
     </w:p>
     <w:p>
       <w:r>
-        <w:t>Clipping projected rates to values between 0 and 1 is a feasibility pressure: rates outside the probability simplex are inadmissible. The dropout cap is a safety pressure motivated by the fact that unbounded linear extrapolation of observed attrition would eventually predict more leavers than the total stock. The inflow apportionment pressure keeps the composition of new entrants aligned with the most recently observed recruitment pattern, rather than inventing a new distribution. Finally, the safety factor of 0.5 on the endogenous PI-driven inflow keeps the system inside the stability boundary. Together these pressures embody the principle that projection should stay within observed empirical support and within theoretical stability limits; they are not arbitrary adjustments but transparent bounds that can be tightened or relaxed as more data become available.</w:t>
+        <w:t>Clipping projected rates to values between 0 and 1 is a feasibility pressure: rates outside the probability simplex are inadmissible. The dropout cap is a safety pressure motivated by the fact that unbounded linear extrapolation of observed attrition would eventually predict more leavers than the total stock. The inflow apportionment pressure keeps the composition of new entrants aligned with the most recently observed recruitment pattern, rather than inventing a new distribution. Finally, the safety factor of 0.50 on the endogenous PI-driven inflow keeps the system inside the stability boundary. Together these pressures embody the principle that projection should stay within observed empirical support and within theoretical stability limits; they are not arbitrary adjustments but transparent bounds that can be tightened or relaxed as more data become available.</w:t>
       </w:r>
     </w:p>
     <w:p>
@@ -5070,7 +5070,7 @@
     </w:p>
     <w:p>
       <w:r>
-        <w:t>Table 6 compares the equilibrium that would have emerged if the transition rates estimated for the early career window (2000-2010) or the late window (2011-2016) had persisted indefinitely. The late window is shorter and its rates are estimated from younger cohorts, so the comparison should be read as a sensitivity exercise rather than a forecast. Only 2 groups have enough dual-window support for reliable rate estimation in both windows; they are listed in the table. All 2 groups with dual-window support would see smaller safety margins under late-window rates (Sinic, Continental Europe). This pattern shows that global AI/ML mobility is not moving in a single direction; different civilisations are on different trajectories, and a uniform policy response would ignore this heterogeneity. Because the late cohort is younger, the late-window equilibrium is likely biased downward for groups where career progression has not yet run its course. Even so, the exercise shows that the current regime is not the only possible one, which is why counterfactual policy analysis is useful.</w:t>
+        <w:t>Table 6 compares the equilibrium that would have emerged if the transition rates estimated for the early career window (2000-2010) or the late window (2011-2016) had persisted indefinitely. The late window is shorter and its rates are estimated from younger cohorts, so the comparison should be read as a sensitivity exercise rather than a forecast. Only 2 groups have enough dual-window support for reliable rate estimation in both windows; they are listed in the table. Both groups with dual-window support would see smaller safety margins under late-window rates (Sinic, Continental Europe). This pattern shows that global AI/ML mobility is not moving in a single direction; different civilisations are on different trajectories, and a uniform policy response would ignore this heterogeneity. Because the late cohort is younger, the late-window equilibrium is likely biased downward for groups where career progression has not yet run its course. Even so, the exercise shows that the current regime is not the only possible one, which is why counterfactual policy analysis is useful.</w:t>
       </w:r>
     </w:p>
     <w:tbl>
@@ -5386,7 +5386,7 @@
         <w:rPr>
           <w:i/>
         </w:rPr>
-        <w:t>Figure 3. Change in safety margin between early and late transition-rate regimes. Positive values mean the late-window rates would produce a larger safety margin if they persisted. The comparison is across two point estimates; uncertainty is substantial because the two windows have different cohort sizes and the steady-state model does not capture policy shocks.</w:t>
+        <w:t>Figure 3. Change in safety margin between early and late transition-rate regimes. Positive values mean the late-window rates would produce a larger safety margin than the early-window rates if they persisted; negative values mean the margin would shrink. The comparison is across two point estimates; uncertainty is substantial because the two windows have different cohort sizes and the steady-state model does not capture policy shocks.</w:t>
       </w:r>
     </w:p>
     <w:p>
@@ -8725,7 +8725,7 @@
     </w:p>
     <w:p>
       <w:r>
-        <w:t>Fourth, the historical counterfactual shows that the late-window rates, if they persisted, would alter equilibrium margins. All 2 groups with dual-window support would see smaller safety margins under late-window rates (Sinic, Continental Europe). This pattern cautions against treating AI/ML mobility as a single global trend. It also confirms that the model can detect temporal changes in transition rates, which is the prerequisite for the early intervention the framework is designed to support.</w:t>
+        <w:t>Fourth, the historical counterfactual shows that the late-window rates, if they persisted, would alter equilibrium margins. Both groups with dual-window support would see smaller safety margins under late-window rates (Sinic, Continental Europe). This pattern cautions against treating AI/ML mobility as a single global trend. It also confirms that the model can detect temporal changes in transition rates, which is the prerequisite for the early intervention the framework is designed to support.</w:t>
       </w:r>
     </w:p>
     <w:p>
@@ -8735,7 +8735,7 @@
     </w:p>
     <w:p>
       <w:r>
-        <w:t>The connection to civilisational diversity is direct. Each group's safety margin can be monitored over time, and interventions can be adjusted before the margin disappears. Because the model uses a fixed safety factor of 0.5 for the endogenous inflow parameter r, the policy recommendations are deliberately conservative: they do not push the system toward instability. That bounded approach is consistent with the goal of preserving diversity rather than maximising any single country's share.</w:t>
+        <w:t>The connection to civilisational diversity is direct. Each group's safety margin can be monitored over time, and interventions can be adjusted before the margin disappears. Because the model uses a fixed safety factor of 0.50 for the endogenous inflow parameter r, the policy recommendations are deliberately conservative: they do not push the system toward instability. That bounded approach is consistent with the goal of preserving diversity rather than maximising any single country's share.</w:t>
       </w:r>
     </w:p>
     <w:p>
@@ -8833,7 +8833,7 @@
     </w:p>
     <w:p>
       <w:r>
-        <w:t>If a civilisation cannot control outflows to, or inflows from, other jurisdictions—whether because of visa regimes, salary differentials, language advantages, or targeted recruitment—it can still preserve its research community by acting on the intra-civilisation levers identified in the annual model. The annual rates show that the domestic active pool T = D + H_D + P_D responds most strongly to the dropout rate d, the domestic hit rate h_D, and the PI promotion rate p_D. Policies that reduce early-career attrition, expand domestic postdoctoral positions, or accelerate independent-lab formation therefore become defensive substitutes when inter-civilisation poaching cannot be regulated. This is the practical meaning of civilisational-diversity preservation under sovereignty constraints: even without controlling the border of talent, a community can increase the internal reproduction of active researchers. The ODE safety factor of 0.5 on endogenous PI inflow is a conservative bound that prevents over-optimism about this substitution effect; more ambitious domestic growth would require corresponding evidence that the extra PIs can be absorbed without simply raising dropout.</w:t>
+        <w:t>If a civilisation cannot control outflows to, or inflows from, other jurisdictions—whether because of visa regimes, salary differentials, language advantages, or targeted recruitment—it can still preserve its research community by acting on the intra-civilisation levers identified in the annual model. The annual rates show that the domestic active pool T = D + H_D + P_D responds most strongly to the dropout rate d, the domestic hit rate h_D, and the PI promotion rate p_D. Policies that reduce early-career attrition, expand domestic postdoctoral positions, or accelerate independent-lab formation therefore become defensive substitutes when inter-civilisation poaching cannot be regulated. This is the practical meaning of civilisational-diversity preservation under sovereignty constraints: even without controlling the border of talent, a community can increase the internal reproduction of active researchers. The ODE safety factor of 0.50 on endogenous PI inflow is a conservative bound that prevents over-optimism about this substitution effect; more ambitious domestic growth would require corresponding evidence that the extra PIs can be absorbed without simply raising dropout.</w:t>
       </w:r>
     </w:p>
     <w:p>
@@ -8859,7 +8859,7 @@
     </w:p>
     <w:p>
       <w:r>
-        <w:t>Several limitations should be acknowledged. OpenAlex affiliation and country assignments are noisy, especially for researchers with multiple affiliations. The civilisation grouping is a coarse aggregation; within-group heterogeneity is substantial. The annual model relies on a discrete approximation of the continuous-time ODE and does not capture within-year events or cross-civilisation spillovers. Inter-civilisation flows are approximated by the author's recent_group while abroad, which misses year-to-year destination switching. The cohort sample is small; the absolute equilibrium numbers should be interpreted as model-implied stocks rather than as census counts. Authors with many publications are over-weighted relative to one-publication authors, so rate estimates reflect author-publication exposure rather than a uniformly representative sample of individuals. The endogenous inflow is capped at a safety factor of 0.5 relative to the critical reproduction rate; alternative values would shift equilibrium levels and should be reported in future sensitivity tables. Finally, the point-of-no-return threshold is a sufficient condition for collapse, not a necessary one: a community may decline for reasons outside the model even if T remains above M.</w:t>
+        <w:t>Several limitations should be acknowledged. OpenAlex affiliation and country assignments are noisy, especially for researchers with multiple affiliations. The civilisation grouping is a coarse aggregation; within-group heterogeneity is substantial. The annual model relies on a discrete approximation of the continuous-time ODE and does not capture within-year events or cross-civilisation spillovers. Inter-civilisation flows are approximated by the author's recent_group while abroad, which misses year-to-year destination switching. The cohort sample is small; the absolute equilibrium numbers should be interpreted as model-implied stocks rather than as census counts. Authors with many publications are over-weighted relative to one-publication authors, so rate estimates reflect author-publication exposure rather than a uniformly representative sample of individuals. The endogenous inflow is capped at a safety factor of 0.50 relative to the critical reproduction rate; alternative values would shift equilibrium levels and should be reported in future sensitivity tables. Finally, the point-of-no-return threshold is a sufficient condition for collapse, not a necessary one: a community may decline for reasons outside the model even if T remains above M.</w:t>
       </w:r>
     </w:p>
     <w:p>

</xml_diff>

<commit_message>
Add T/M column and integer counts; annotate Fig1; expand diversity dead-end discussion
Co-Authored-By: Tatsuki Onishi <bougtoir@gmail.com>
</commit_message>
<xml_diff>
--- a/researcher_mobility_ode/docs/manuscript_full_article.docx
+++ b/researcher_mobility_ode/docs/manuscript_full_article.docx
@@ -28,7 +28,7 @@
         <w:jc w:val="center"/>
       </w:pPr>
       <w:r>
-        <w:t>Approximate word count (main text incl. tables, excl. references): 9840</w:t>
+        <w:t>Approximate word count (main text incl. tables, excl. references): 9921</w:t>
       </w:r>
     </w:p>
     <w:p>
@@ -692,7 +692,7 @@
           </w:tcPr>
           <w:p>
             <w:r>
-              <w:t>27.00</w:t>
+              <w:t>27</w:t>
             </w:r>
           </w:p>
         </w:tc>
@@ -702,7 +702,7 @@
           </w:tcPr>
           <w:p>
             <w:r>
-              <w:t>1977.00</w:t>
+              <w:t>1977</w:t>
             </w:r>
           </w:p>
         </w:tc>
@@ -712,7 +712,7 @@
           </w:tcPr>
           <w:p>
             <w:r>
-              <w:t>26.00</w:t>
+              <w:t>26</w:t>
             </w:r>
           </w:p>
         </w:tc>
@@ -722,7 +722,7 @@
           </w:tcPr>
           <w:p>
             <w:r>
-              <w:t>25.00</w:t>
+              <w:t>25</w:t>
             </w:r>
           </w:p>
         </w:tc>
@@ -732,7 +732,7 @@
           </w:tcPr>
           <w:p>
             <w:r>
-              <w:t>14.00</w:t>
+              <w:t>14</w:t>
             </w:r>
           </w:p>
         </w:tc>
@@ -752,7 +752,7 @@
           </w:tcPr>
           <w:p>
             <w:r>
-              <w:t>19.00</w:t>
+              <w:t>19</w:t>
             </w:r>
           </w:p>
         </w:tc>
@@ -774,7 +774,7 @@
           </w:tcPr>
           <w:p>
             <w:r>
-              <w:t>49.00</w:t>
+              <w:t>49</w:t>
             </w:r>
           </w:p>
         </w:tc>
@@ -784,7 +784,7 @@
           </w:tcPr>
           <w:p>
             <w:r>
-              <w:t>3850.00</w:t>
+              <w:t>3850</w:t>
             </w:r>
           </w:p>
         </w:tc>
@@ -794,7 +794,7 @@
           </w:tcPr>
           <w:p>
             <w:r>
-              <w:t>46.00</w:t>
+              <w:t>46</w:t>
             </w:r>
           </w:p>
         </w:tc>
@@ -804,7 +804,7 @@
           </w:tcPr>
           <w:p>
             <w:r>
-              <w:t>41.00</w:t>
+              <w:t>41</w:t>
             </w:r>
           </w:p>
         </w:tc>
@@ -814,7 +814,7 @@
           </w:tcPr>
           <w:p>
             <w:r>
-              <w:t>23.00</w:t>
+              <w:t>23</w:t>
             </w:r>
           </w:p>
         </w:tc>
@@ -834,7 +834,7 @@
           </w:tcPr>
           <w:p>
             <w:r>
-              <w:t>23.00</w:t>
+              <w:t>23</w:t>
             </w:r>
           </w:p>
         </w:tc>
@@ -856,7 +856,7 @@
           </w:tcPr>
           <w:p>
             <w:r>
-              <w:t>26.00</w:t>
+              <w:t>26</w:t>
             </w:r>
           </w:p>
         </w:tc>
@@ -866,7 +866,7 @@
           </w:tcPr>
           <w:p>
             <w:r>
-              <w:t>1754.00</w:t>
+              <w:t>1754</w:t>
             </w:r>
           </w:p>
         </w:tc>
@@ -876,7 +876,7 @@
           </w:tcPr>
           <w:p>
             <w:r>
-              <w:t>26.00</w:t>
+              <w:t>26</w:t>
             </w:r>
           </w:p>
         </w:tc>
@@ -886,7 +886,7 @@
           </w:tcPr>
           <w:p>
             <w:r>
-              <w:t>20.00</w:t>
+              <w:t>20</w:t>
             </w:r>
           </w:p>
         </w:tc>
@@ -896,7 +896,7 @@
           </w:tcPr>
           <w:p>
             <w:r>
-              <w:t>13.00</w:t>
+              <w:t>13</w:t>
             </w:r>
           </w:p>
         </w:tc>
@@ -916,7 +916,7 @@
           </w:tcPr>
           <w:p>
             <w:r>
-              <w:t>4.00</w:t>
+              <w:t>4</w:t>
             </w:r>
           </w:p>
         </w:tc>
@@ -938,7 +938,7 @@
           </w:tcPr>
           <w:p>
             <w:r>
-              <w:t>20.00</w:t>
+              <w:t>20</w:t>
             </w:r>
           </w:p>
         </w:tc>
@@ -948,7 +948,7 @@
           </w:tcPr>
           <w:p>
             <w:r>
-              <w:t>830.00</w:t>
+              <w:t>830</w:t>
             </w:r>
           </w:p>
         </w:tc>
@@ -958,7 +958,7 @@
           </w:tcPr>
           <w:p>
             <w:r>
-              <w:t>20.00</w:t>
+              <w:t>20</w:t>
             </w:r>
           </w:p>
         </w:tc>
@@ -968,7 +968,7 @@
           </w:tcPr>
           <w:p>
             <w:r>
-              <w:t>13.00</w:t>
+              <w:t>13</w:t>
             </w:r>
           </w:p>
         </w:tc>
@@ -978,7 +978,7 @@
           </w:tcPr>
           <w:p>
             <w:r>
-              <w:t>9.00</w:t>
+              <w:t>9</w:t>
             </w:r>
           </w:p>
         </w:tc>
@@ -998,7 +998,7 @@
           </w:tcPr>
           <w:p>
             <w:r>
-              <w:t>7.00</w:t>
+              <w:t>7</w:t>
             </w:r>
           </w:p>
         </w:tc>
@@ -1020,7 +1020,7 @@
           </w:tcPr>
           <w:p>
             <w:r>
-              <w:t>26.00</w:t>
+              <w:t>26</w:t>
             </w:r>
           </w:p>
         </w:tc>
@@ -1030,7 +1030,7 @@
           </w:tcPr>
           <w:p>
             <w:r>
-              <w:t>1236.00</w:t>
+              <w:t>1236</w:t>
             </w:r>
           </w:p>
         </w:tc>
@@ -1040,7 +1040,7 @@
           </w:tcPr>
           <w:p>
             <w:r>
-              <w:t>21.00</w:t>
+              <w:t>21</w:t>
             </w:r>
           </w:p>
         </w:tc>
@@ -1050,7 +1050,7 @@
           </w:tcPr>
           <w:p>
             <w:r>
-              <w:t>17.00</w:t>
+              <w:t>17</w:t>
             </w:r>
           </w:p>
         </w:tc>
@@ -1060,7 +1060,7 @@
           </w:tcPr>
           <w:p>
             <w:r>
-              <w:t>11.00</w:t>
+              <w:t>11</w:t>
             </w:r>
           </w:p>
         </w:tc>
@@ -1080,7 +1080,7 @@
           </w:tcPr>
           <w:p>
             <w:r>
-              <w:t>4.00</w:t>
+              <w:t>4</w:t>
             </w:r>
           </w:p>
         </w:tc>
@@ -1102,7 +1102,7 @@
           </w:tcPr>
           <w:p>
             <w:r>
-              <w:t>20.00</w:t>
+              <w:t>20</w:t>
             </w:r>
           </w:p>
         </w:tc>
@@ -1112,7 +1112,7 @@
           </w:tcPr>
           <w:p>
             <w:r>
-              <w:t>843.00</w:t>
+              <w:t>843</w:t>
             </w:r>
           </w:p>
         </w:tc>
@@ -1122,7 +1122,7 @@
           </w:tcPr>
           <w:p>
             <w:r>
-              <w:t>19.00</w:t>
+              <w:t>19</w:t>
             </w:r>
           </w:p>
         </w:tc>
@@ -1132,7 +1132,7 @@
           </w:tcPr>
           <w:p>
             <w:r>
-              <w:t>14.00</w:t>
+              <w:t>14</w:t>
             </w:r>
           </w:p>
         </w:tc>
@@ -1142,7 +1142,7 @@
           </w:tcPr>
           <w:p>
             <w:r>
-              <w:t>9.00</w:t>
+              <w:t>9</w:t>
             </w:r>
           </w:p>
         </w:tc>
@@ -1162,7 +1162,7 @@
           </w:tcPr>
           <w:p>
             <w:r>
-              <w:t>6.00</w:t>
+              <w:t>6</w:t>
             </w:r>
           </w:p>
         </w:tc>
@@ -1184,7 +1184,7 @@
           </w:tcPr>
           <w:p>
             <w:r>
-              <w:t>15.00</w:t>
+              <w:t>15</w:t>
             </w:r>
           </w:p>
         </w:tc>
@@ -1194,7 +1194,7 @@
           </w:tcPr>
           <w:p>
             <w:r>
-              <w:t>947.00</w:t>
+              <w:t>947</w:t>
             </w:r>
           </w:p>
         </w:tc>
@@ -1204,7 +1204,7 @@
           </w:tcPr>
           <w:p>
             <w:r>
-              <w:t>15.00</w:t>
+              <w:t>15</w:t>
             </w:r>
           </w:p>
         </w:tc>
@@ -1214,7 +1214,7 @@
           </w:tcPr>
           <w:p>
             <w:r>
-              <w:t>14.00</w:t>
+              <w:t>14</w:t>
             </w:r>
           </w:p>
         </w:tc>
@@ -1224,7 +1224,7 @@
           </w:tcPr>
           <w:p>
             <w:r>
-              <w:t>5.00</w:t>
+              <w:t>5</w:t>
             </w:r>
           </w:p>
         </w:tc>
@@ -1244,7 +1244,7 @@
           </w:tcPr>
           <w:p>
             <w:r>
-              <w:t>8.00</w:t>
+              <w:t>8</w:t>
             </w:r>
           </w:p>
         </w:tc>
@@ -1266,7 +1266,7 @@
           </w:tcPr>
           <w:p>
             <w:r>
-              <w:t>41.00</w:t>
+              <w:t>41</w:t>
             </w:r>
           </w:p>
         </w:tc>
@@ -1276,7 +1276,7 @@
           </w:tcPr>
           <w:p>
             <w:r>
-              <w:t>3397.00</w:t>
+              <w:t>3397</w:t>
             </w:r>
           </w:p>
         </w:tc>
@@ -1286,7 +1286,7 @@
           </w:tcPr>
           <w:p>
             <w:r>
-              <w:t>40.00</w:t>
+              <w:t>40</w:t>
             </w:r>
           </w:p>
         </w:tc>
@@ -1296,7 +1296,7 @@
           </w:tcPr>
           <w:p>
             <w:r>
-              <w:t>31.00</w:t>
+              <w:t>31</w:t>
             </w:r>
           </w:p>
         </w:tc>
@@ -1306,7 +1306,7 @@
           </w:tcPr>
           <w:p>
             <w:r>
-              <w:t>20.00</w:t>
+              <w:t>20</w:t>
             </w:r>
           </w:p>
         </w:tc>
@@ -1326,7 +1326,7 @@
           </w:tcPr>
           <w:p>
             <w:r>
-              <w:t>16.00</w:t>
+              <w:t>16</w:t>
             </w:r>
           </w:p>
         </w:tc>
@@ -1348,7 +1348,7 @@
           </w:tcPr>
           <w:p>
             <w:r>
-              <w:t>49.00</w:t>
+              <w:t>49</w:t>
             </w:r>
           </w:p>
         </w:tc>
@@ -1358,7 +1358,7 @@
           </w:tcPr>
           <w:p>
             <w:r>
-              <w:t>4210.00</w:t>
+              <w:t>4210</w:t>
             </w:r>
           </w:p>
         </w:tc>
@@ -1368,7 +1368,7 @@
           </w:tcPr>
           <w:p>
             <w:r>
-              <w:t>44.00</w:t>
+              <w:t>44</w:t>
             </w:r>
           </w:p>
         </w:tc>
@@ -1378,7 +1378,7 @@
           </w:tcPr>
           <w:p>
             <w:r>
-              <w:t>46.00</w:t>
+              <w:t>46</w:t>
             </w:r>
           </w:p>
         </w:tc>
@@ -1388,7 +1388,7 @@
           </w:tcPr>
           <w:p>
             <w:r>
-              <w:t>28.00</w:t>
+              <w:t>28</w:t>
             </w:r>
           </w:p>
         </w:tc>
@@ -1408,7 +1408,7 @@
           </w:tcPr>
           <w:p>
             <w:r>
-              <w:t>17.00</w:t>
+              <w:t>17</w:t>
             </w:r>
           </w:p>
         </w:tc>
@@ -2180,19 +2180,20 @@
         <w:tblLook w:firstColumn="1" w:firstRow="1" w:lastColumn="0" w:lastRow="0" w:noHBand="0" w:noVBand="1" w:val="04A0"/>
       </w:tblPr>
       <w:tblGrid>
-        <w:gridCol w:w="1080"/>
-        <w:gridCol w:w="1080"/>
-        <w:gridCol w:w="1080"/>
-        <w:gridCol w:w="1080"/>
-        <w:gridCol w:w="1080"/>
-        <w:gridCol w:w="1080"/>
-        <w:gridCol w:w="1080"/>
-        <w:gridCol w:w="1080"/>
+        <w:gridCol w:w="960"/>
+        <w:gridCol w:w="960"/>
+        <w:gridCol w:w="960"/>
+        <w:gridCol w:w="960"/>
+        <w:gridCol w:w="960"/>
+        <w:gridCol w:w="960"/>
+        <w:gridCol w:w="960"/>
+        <w:gridCol w:w="960"/>
+        <w:gridCol w:w="960"/>
       </w:tblGrid>
       <w:tr>
         <w:tc>
           <w:tcPr>
-            <w:tcW w:type="dxa" w:w="1080"/>
+            <w:tcW w:type="dxa" w:w="960"/>
           </w:tcPr>
           <w:p>
             <w:r>
@@ -2205,7 +2206,7 @@
         </w:tc>
         <w:tc>
           <w:tcPr>
-            <w:tcW w:type="dxa" w:w="1080"/>
+            <w:tcW w:type="dxa" w:w="960"/>
           </w:tcPr>
           <w:p>
             <w:r>
@@ -2218,7 +2219,7 @@
         </w:tc>
         <w:tc>
           <w:tcPr>
-            <w:tcW w:type="dxa" w:w="1080"/>
+            <w:tcW w:type="dxa" w:w="960"/>
           </w:tcPr>
           <w:p>
             <w:r>
@@ -2231,7 +2232,7 @@
         </w:tc>
         <w:tc>
           <w:tcPr>
-            <w:tcW w:type="dxa" w:w="1080"/>
+            <w:tcW w:type="dxa" w:w="960"/>
           </w:tcPr>
           <w:p>
             <w:r>
@@ -2244,7 +2245,7 @@
         </w:tc>
         <w:tc>
           <w:tcPr>
-            <w:tcW w:type="dxa" w:w="1080"/>
+            <w:tcW w:type="dxa" w:w="960"/>
           </w:tcPr>
           <w:p>
             <w:r>
@@ -2257,7 +2258,7 @@
         </w:tc>
         <w:tc>
           <w:tcPr>
-            <w:tcW w:type="dxa" w:w="1080"/>
+            <w:tcW w:type="dxa" w:w="960"/>
           </w:tcPr>
           <w:p>
             <w:r>
@@ -2270,7 +2271,7 @@
         </w:tc>
         <w:tc>
           <w:tcPr>
-            <w:tcW w:type="dxa" w:w="1080"/>
+            <w:tcW w:type="dxa" w:w="960"/>
           </w:tcPr>
           <w:p>
             <w:r>
@@ -2283,7 +2284,7 @@
         </w:tc>
         <w:tc>
           <w:tcPr>
-            <w:tcW w:type="dxa" w:w="1080"/>
+            <w:tcW w:type="dxa" w:w="960"/>
           </w:tcPr>
           <w:p>
             <w:r>
@@ -2294,11 +2295,24 @@
             </w:r>
           </w:p>
         </w:tc>
+        <w:tc>
+          <w:tcPr>
+            <w:tcW w:type="dxa" w:w="960"/>
+          </w:tcPr>
+          <w:p>
+            <w:r>
+              <w:rPr>
+                <w:b/>
+              </w:rPr>
+              <w:t>T/M</w:t>
+            </w:r>
+          </w:p>
+        </w:tc>
       </w:tr>
       <w:tr>
         <w:tc>
           <w:tcPr>
-            <w:tcW w:type="dxa" w:w="1080"/>
+            <w:tcW w:type="dxa" w:w="960"/>
           </w:tcPr>
           <w:p>
             <w:r>
@@ -2308,47 +2322,47 @@
         </w:tc>
         <w:tc>
           <w:tcPr>
-            <w:tcW w:type="dxa" w:w="1080"/>
-          </w:tcPr>
-          <w:p>
-            <w:r>
-              <w:t>752.12</w:t>
-            </w:r>
-          </w:p>
-        </w:tc>
-        <w:tc>
-          <w:tcPr>
-            <w:tcW w:type="dxa" w:w="1080"/>
-          </w:tcPr>
-          <w:p>
-            <w:r>
-              <w:t>119.78</w:t>
-            </w:r>
-          </w:p>
-        </w:tc>
-        <w:tc>
-          <w:tcPr>
-            <w:tcW w:type="dxa" w:w="1080"/>
-          </w:tcPr>
-          <w:p>
-            <w:r>
-              <w:t>632.34</w:t>
-            </w:r>
-          </w:p>
-        </w:tc>
-        <w:tc>
-          <w:tcPr>
-            <w:tcW w:type="dxa" w:w="1080"/>
-          </w:tcPr>
-          <w:p>
-            <w:r>
-              <w:t>1.55</w:t>
-            </w:r>
-          </w:p>
-        </w:tc>
-        <w:tc>
-          <w:tcPr>
-            <w:tcW w:type="dxa" w:w="1080"/>
+            <w:tcW w:type="dxa" w:w="960"/>
+          </w:tcPr>
+          <w:p>
+            <w:r>
+              <w:t>752</w:t>
+            </w:r>
+          </w:p>
+        </w:tc>
+        <w:tc>
+          <w:tcPr>
+            <w:tcW w:type="dxa" w:w="960"/>
+          </w:tcPr>
+          <w:p>
+            <w:r>
+              <w:t>120</w:t>
+            </w:r>
+          </w:p>
+        </w:tc>
+        <w:tc>
+          <w:tcPr>
+            <w:tcW w:type="dxa" w:w="960"/>
+          </w:tcPr>
+          <w:p>
+            <w:r>
+              <w:t>632</w:t>
+            </w:r>
+          </w:p>
+        </w:tc>
+        <w:tc>
+          <w:tcPr>
+            <w:tcW w:type="dxa" w:w="960"/>
+          </w:tcPr>
+          <w:p>
+            <w:r>
+              <w:t>2</w:t>
+            </w:r>
+          </w:p>
+        </w:tc>
+        <w:tc>
+          <w:tcPr>
+            <w:tcW w:type="dxa" w:w="960"/>
           </w:tcPr>
           <w:p>
             <w:r>
@@ -2358,7 +2372,7 @@
         </w:tc>
         <w:tc>
           <w:tcPr>
-            <w:tcW w:type="dxa" w:w="1080"/>
+            <w:tcW w:type="dxa" w:w="960"/>
           </w:tcPr>
           <w:p>
             <w:r>
@@ -2368,11 +2382,21 @@
         </w:tc>
         <w:tc>
           <w:tcPr>
-            <w:tcW w:type="dxa" w:w="1080"/>
+            <w:tcW w:type="dxa" w:w="960"/>
           </w:tcPr>
           <w:p>
             <w:r>
               <w:t>0.00478</w:t>
+            </w:r>
+          </w:p>
+        </w:tc>
+        <w:tc>
+          <w:tcPr>
+            <w:tcW w:type="dxa" w:w="960"/>
+          </w:tcPr>
+          <w:p>
+            <w:r>
+              <w:t>6.28</w:t>
             </w:r>
           </w:p>
         </w:tc>
@@ -2380,7 +2404,7 @@
       <w:tr>
         <w:tc>
           <w:tcPr>
-            <w:tcW w:type="dxa" w:w="1080"/>
+            <w:tcW w:type="dxa" w:w="960"/>
           </w:tcPr>
           <w:p>
             <w:r>
@@ -2390,47 +2414,47 @@
         </w:tc>
         <w:tc>
           <w:tcPr>
-            <w:tcW w:type="dxa" w:w="1080"/>
-          </w:tcPr>
-          <w:p>
-            <w:r>
-              <w:t>1208.42</w:t>
-            </w:r>
-          </w:p>
-        </w:tc>
-        <w:tc>
-          <w:tcPr>
-            <w:tcW w:type="dxa" w:w="1080"/>
-          </w:tcPr>
-          <w:p>
-            <w:r>
-              <w:t>129.07</w:t>
-            </w:r>
-          </w:p>
-        </w:tc>
-        <w:tc>
-          <w:tcPr>
-            <w:tcW w:type="dxa" w:w="1080"/>
-          </w:tcPr>
-          <w:p>
-            <w:r>
-              <w:t>1079.36</w:t>
-            </w:r>
-          </w:p>
-        </w:tc>
-        <w:tc>
-          <w:tcPr>
-            <w:tcW w:type="dxa" w:w="1080"/>
-          </w:tcPr>
-          <w:p>
-            <w:r>
-              <w:t>2.82</w:t>
-            </w:r>
-          </w:p>
-        </w:tc>
-        <w:tc>
-          <w:tcPr>
-            <w:tcW w:type="dxa" w:w="1080"/>
+            <w:tcW w:type="dxa" w:w="960"/>
+          </w:tcPr>
+          <w:p>
+            <w:r>
+              <w:t>1208</w:t>
+            </w:r>
+          </w:p>
+        </w:tc>
+        <w:tc>
+          <w:tcPr>
+            <w:tcW w:type="dxa" w:w="960"/>
+          </w:tcPr>
+          <w:p>
+            <w:r>
+              <w:t>129</w:t>
+            </w:r>
+          </w:p>
+        </w:tc>
+        <w:tc>
+          <w:tcPr>
+            <w:tcW w:type="dxa" w:w="960"/>
+          </w:tcPr>
+          <w:p>
+            <w:r>
+              <w:t>1079</w:t>
+            </w:r>
+          </w:p>
+        </w:tc>
+        <w:tc>
+          <w:tcPr>
+            <w:tcW w:type="dxa" w:w="960"/>
+          </w:tcPr>
+          <w:p>
+            <w:r>
+              <w:t>3</w:t>
+            </w:r>
+          </w:p>
+        </w:tc>
+        <w:tc>
+          <w:tcPr>
+            <w:tcW w:type="dxa" w:w="960"/>
           </w:tcPr>
           <w:p>
             <w:r>
@@ -2440,7 +2464,7 @@
         </w:tc>
         <w:tc>
           <w:tcPr>
-            <w:tcW w:type="dxa" w:w="1080"/>
+            <w:tcW w:type="dxa" w:w="960"/>
           </w:tcPr>
           <w:p>
             <w:r>
@@ -2450,11 +2474,21 @@
         </w:tc>
         <w:tc>
           <w:tcPr>
-            <w:tcW w:type="dxa" w:w="1080"/>
+            <w:tcW w:type="dxa" w:w="960"/>
           </w:tcPr>
           <w:p>
             <w:r>
               <w:t>0.00510</w:t>
+            </w:r>
+          </w:p>
+        </w:tc>
+        <w:tc>
+          <w:tcPr>
+            <w:tcW w:type="dxa" w:w="960"/>
+          </w:tcPr>
+          <w:p>
+            <w:r>
+              <w:t>9.36</w:t>
             </w:r>
           </w:p>
         </w:tc>
@@ -2462,7 +2496,7 @@
       <w:tr>
         <w:tc>
           <w:tcPr>
-            <w:tcW w:type="dxa" w:w="1080"/>
+            <w:tcW w:type="dxa" w:w="960"/>
           </w:tcPr>
           <w:p>
             <w:r>
@@ -2472,47 +2506,47 @@
         </w:tc>
         <w:tc>
           <w:tcPr>
-            <w:tcW w:type="dxa" w:w="1080"/>
-          </w:tcPr>
-          <w:p>
-            <w:r>
-              <w:t>1497.37</w:t>
-            </w:r>
-          </w:p>
-        </w:tc>
-        <w:tc>
-          <w:tcPr>
-            <w:tcW w:type="dxa" w:w="1080"/>
-          </w:tcPr>
-          <w:p>
-            <w:r>
-              <w:t>66.04</w:t>
-            </w:r>
-          </w:p>
-        </w:tc>
-        <w:tc>
-          <w:tcPr>
-            <w:tcW w:type="dxa" w:w="1080"/>
-          </w:tcPr>
-          <w:p>
-            <w:r>
-              <w:t>1431.33</w:t>
-            </w:r>
-          </w:p>
-        </w:tc>
-        <w:tc>
-          <w:tcPr>
-            <w:tcW w:type="dxa" w:w="1080"/>
-          </w:tcPr>
-          <w:p>
-            <w:r>
-              <w:t>1.52</w:t>
-            </w:r>
-          </w:p>
-        </w:tc>
-        <w:tc>
-          <w:tcPr>
-            <w:tcW w:type="dxa" w:w="1080"/>
+            <w:tcW w:type="dxa" w:w="960"/>
+          </w:tcPr>
+          <w:p>
+            <w:r>
+              <w:t>1497</w:t>
+            </w:r>
+          </w:p>
+        </w:tc>
+        <w:tc>
+          <w:tcPr>
+            <w:tcW w:type="dxa" w:w="960"/>
+          </w:tcPr>
+          <w:p>
+            <w:r>
+              <w:t>66</w:t>
+            </w:r>
+          </w:p>
+        </w:tc>
+        <w:tc>
+          <w:tcPr>
+            <w:tcW w:type="dxa" w:w="960"/>
+          </w:tcPr>
+          <w:p>
+            <w:r>
+              <w:t>1431</w:t>
+            </w:r>
+          </w:p>
+        </w:tc>
+        <w:tc>
+          <w:tcPr>
+            <w:tcW w:type="dxa" w:w="960"/>
+          </w:tcPr>
+          <w:p>
+            <w:r>
+              <w:t>2</w:t>
+            </w:r>
+          </w:p>
+        </w:tc>
+        <w:tc>
+          <w:tcPr>
+            <w:tcW w:type="dxa" w:w="960"/>
           </w:tcPr>
           <w:p>
             <w:r>
@@ -2522,7 +2556,7 @@
         </w:tc>
         <w:tc>
           <w:tcPr>
-            <w:tcW w:type="dxa" w:w="1080"/>
+            <w:tcW w:type="dxa" w:w="960"/>
           </w:tcPr>
           <w:p>
             <w:r>
@@ -2532,11 +2566,21 @@
         </w:tc>
         <w:tc>
           <w:tcPr>
-            <w:tcW w:type="dxa" w:w="1080"/>
+            <w:tcW w:type="dxa" w:w="960"/>
           </w:tcPr>
           <w:p>
             <w:r>
               <w:t>0.00213</w:t>
+            </w:r>
+          </w:p>
+        </w:tc>
+        <w:tc>
+          <w:tcPr>
+            <w:tcW w:type="dxa" w:w="960"/>
+          </w:tcPr>
+          <w:p>
+            <w:r>
+              <w:t>22.67</w:t>
             </w:r>
           </w:p>
         </w:tc>
@@ -2544,7 +2588,7 @@
       <w:tr>
         <w:tc>
           <w:tcPr>
-            <w:tcW w:type="dxa" w:w="1080"/>
+            <w:tcW w:type="dxa" w:w="960"/>
           </w:tcPr>
           <w:p>
             <w:r>
@@ -2554,47 +2598,47 @@
         </w:tc>
         <w:tc>
           <w:tcPr>
-            <w:tcW w:type="dxa" w:w="1080"/>
-          </w:tcPr>
-          <w:p>
-            <w:r>
-              <w:t>892.42</w:t>
-            </w:r>
-          </w:p>
-        </w:tc>
-        <w:tc>
-          <w:tcPr>
-            <w:tcW w:type="dxa" w:w="1080"/>
-          </w:tcPr>
-          <w:p>
-            <w:r>
-              <w:t>126.52</w:t>
-            </w:r>
-          </w:p>
-        </w:tc>
-        <w:tc>
-          <w:tcPr>
-            <w:tcW w:type="dxa" w:w="1080"/>
-          </w:tcPr>
-          <w:p>
-            <w:r>
-              <w:t>765.89</w:t>
-            </w:r>
-          </w:p>
-        </w:tc>
-        <w:tc>
-          <w:tcPr>
-            <w:tcW w:type="dxa" w:w="1080"/>
-          </w:tcPr>
-          <w:p>
-            <w:r>
-              <w:t>1.16</w:t>
-            </w:r>
-          </w:p>
-        </w:tc>
-        <w:tc>
-          <w:tcPr>
-            <w:tcW w:type="dxa" w:w="1080"/>
+            <w:tcW w:type="dxa" w:w="960"/>
+          </w:tcPr>
+          <w:p>
+            <w:r>
+              <w:t>892</w:t>
+            </w:r>
+          </w:p>
+        </w:tc>
+        <w:tc>
+          <w:tcPr>
+            <w:tcW w:type="dxa" w:w="960"/>
+          </w:tcPr>
+          <w:p>
+            <w:r>
+              <w:t>127</w:t>
+            </w:r>
+          </w:p>
+        </w:tc>
+        <w:tc>
+          <w:tcPr>
+            <w:tcW w:type="dxa" w:w="960"/>
+          </w:tcPr>
+          <w:p>
+            <w:r>
+              <w:t>766</w:t>
+            </w:r>
+          </w:p>
+        </w:tc>
+        <w:tc>
+          <w:tcPr>
+            <w:tcW w:type="dxa" w:w="960"/>
+          </w:tcPr>
+          <w:p>
+            <w:r>
+              <w:t>1</w:t>
+            </w:r>
+          </w:p>
+        </w:tc>
+        <w:tc>
+          <w:tcPr>
+            <w:tcW w:type="dxa" w:w="960"/>
           </w:tcPr>
           <w:p>
             <w:r>
@@ -2604,7 +2648,7 @@
         </w:tc>
         <w:tc>
           <w:tcPr>
-            <w:tcW w:type="dxa" w:w="1080"/>
+            <w:tcW w:type="dxa" w:w="960"/>
           </w:tcPr>
           <w:p>
             <w:r>
@@ -2614,11 +2658,21 @@
         </w:tc>
         <w:tc>
           <w:tcPr>
-            <w:tcW w:type="dxa" w:w="1080"/>
+            <w:tcW w:type="dxa" w:w="960"/>
           </w:tcPr>
           <w:p>
             <w:r>
               <w:t>0.00282</w:t>
+            </w:r>
+          </w:p>
+        </w:tc>
+        <w:tc>
+          <w:tcPr>
+            <w:tcW w:type="dxa" w:w="960"/>
+          </w:tcPr>
+          <w:p>
+            <w:r>
+              <w:t>7.05</w:t>
             </w:r>
           </w:p>
         </w:tc>
@@ -2626,7 +2680,7 @@
       <w:tr>
         <w:tc>
           <w:tcPr>
-            <w:tcW w:type="dxa" w:w="1080"/>
+            <w:tcW w:type="dxa" w:w="960"/>
           </w:tcPr>
           <w:p>
             <w:r>
@@ -2636,47 +2690,47 @@
         </w:tc>
         <w:tc>
           <w:tcPr>
-            <w:tcW w:type="dxa" w:w="1080"/>
-          </w:tcPr>
-          <w:p>
-            <w:r>
-              <w:t>206.81</w:t>
-            </w:r>
-          </w:p>
-        </w:tc>
-        <w:tc>
-          <w:tcPr>
-            <w:tcW w:type="dxa" w:w="1080"/>
-          </w:tcPr>
-          <w:p>
-            <w:r>
-              <w:t>50.48</w:t>
-            </w:r>
-          </w:p>
-        </w:tc>
-        <w:tc>
-          <w:tcPr>
-            <w:tcW w:type="dxa" w:w="1080"/>
-          </w:tcPr>
-          <w:p>
-            <w:r>
-              <w:t>156.33</w:t>
-            </w:r>
-          </w:p>
-        </w:tc>
-        <w:tc>
-          <w:tcPr>
-            <w:tcW w:type="dxa" w:w="1080"/>
-          </w:tcPr>
-          <w:p>
-            <w:r>
-              <w:t>1.42</w:t>
-            </w:r>
-          </w:p>
-        </w:tc>
-        <w:tc>
-          <w:tcPr>
-            <w:tcW w:type="dxa" w:w="1080"/>
+            <w:tcW w:type="dxa" w:w="960"/>
+          </w:tcPr>
+          <w:p>
+            <w:r>
+              <w:t>207</w:t>
+            </w:r>
+          </w:p>
+        </w:tc>
+        <w:tc>
+          <w:tcPr>
+            <w:tcW w:type="dxa" w:w="960"/>
+          </w:tcPr>
+          <w:p>
+            <w:r>
+              <w:t>50</w:t>
+            </w:r>
+          </w:p>
+        </w:tc>
+        <w:tc>
+          <w:tcPr>
+            <w:tcW w:type="dxa" w:w="960"/>
+          </w:tcPr>
+          <w:p>
+            <w:r>
+              <w:t>156</w:t>
+            </w:r>
+          </w:p>
+        </w:tc>
+        <w:tc>
+          <w:tcPr>
+            <w:tcW w:type="dxa" w:w="960"/>
+          </w:tcPr>
+          <w:p>
+            <w:r>
+              <w:t>1</w:t>
+            </w:r>
+          </w:p>
+        </w:tc>
+        <w:tc>
+          <w:tcPr>
+            <w:tcW w:type="dxa" w:w="960"/>
           </w:tcPr>
           <w:p>
             <w:r>
@@ -2686,7 +2740,7 @@
         </w:tc>
         <w:tc>
           <w:tcPr>
-            <w:tcW w:type="dxa" w:w="1080"/>
+            <w:tcW w:type="dxa" w:w="960"/>
           </w:tcPr>
           <w:p>
             <w:r>
@@ -2696,11 +2750,21 @@
         </w:tc>
         <w:tc>
           <w:tcPr>
-            <w:tcW w:type="dxa" w:w="1080"/>
+            <w:tcW w:type="dxa" w:w="960"/>
           </w:tcPr>
           <w:p>
             <w:r>
               <w:t>0.01985</w:t>
+            </w:r>
+          </w:p>
+        </w:tc>
+        <w:tc>
+          <w:tcPr>
+            <w:tcW w:type="dxa" w:w="960"/>
+          </w:tcPr>
+          <w:p>
+            <w:r>
+              <w:t>4.10</w:t>
             </w:r>
           </w:p>
         </w:tc>
@@ -2708,7 +2772,7 @@
       <w:tr>
         <w:tc>
           <w:tcPr>
-            <w:tcW w:type="dxa" w:w="1080"/>
+            <w:tcW w:type="dxa" w:w="960"/>
           </w:tcPr>
           <w:p>
             <w:r>
@@ -2718,47 +2782,47 @@
         </w:tc>
         <w:tc>
           <w:tcPr>
-            <w:tcW w:type="dxa" w:w="1080"/>
-          </w:tcPr>
-          <w:p>
-            <w:r>
-              <w:t>424.70</w:t>
-            </w:r>
-          </w:p>
-        </w:tc>
-        <w:tc>
-          <w:tcPr>
-            <w:tcW w:type="dxa" w:w="1080"/>
-          </w:tcPr>
-          <w:p>
-            <w:r>
-              <w:t>104.60</w:t>
-            </w:r>
-          </w:p>
-        </w:tc>
-        <w:tc>
-          <w:tcPr>
-            <w:tcW w:type="dxa" w:w="1080"/>
-          </w:tcPr>
-          <w:p>
-            <w:r>
-              <w:t>320.10</w:t>
-            </w:r>
-          </w:p>
-        </w:tc>
-        <w:tc>
-          <w:tcPr>
-            <w:tcW w:type="dxa" w:w="1080"/>
-          </w:tcPr>
-          <w:p>
-            <w:r>
-              <w:t>1.15</w:t>
-            </w:r>
-          </w:p>
-        </w:tc>
-        <w:tc>
-          <w:tcPr>
-            <w:tcW w:type="dxa" w:w="1080"/>
+            <w:tcW w:type="dxa" w:w="960"/>
+          </w:tcPr>
+          <w:p>
+            <w:r>
+              <w:t>425</w:t>
+            </w:r>
+          </w:p>
+        </w:tc>
+        <w:tc>
+          <w:tcPr>
+            <w:tcW w:type="dxa" w:w="960"/>
+          </w:tcPr>
+          <w:p>
+            <w:r>
+              <w:t>105</w:t>
+            </w:r>
+          </w:p>
+        </w:tc>
+        <w:tc>
+          <w:tcPr>
+            <w:tcW w:type="dxa" w:w="960"/>
+          </w:tcPr>
+          <w:p>
+            <w:r>
+              <w:t>320</w:t>
+            </w:r>
+          </w:p>
+        </w:tc>
+        <w:tc>
+          <w:tcPr>
+            <w:tcW w:type="dxa" w:w="960"/>
+          </w:tcPr>
+          <w:p>
+            <w:r>
+              <w:t>1</w:t>
+            </w:r>
+          </w:p>
+        </w:tc>
+        <w:tc>
+          <w:tcPr>
+            <w:tcW w:type="dxa" w:w="960"/>
           </w:tcPr>
           <w:p>
             <w:r>
@@ -2768,7 +2832,7 @@
         </w:tc>
         <w:tc>
           <w:tcPr>
-            <w:tcW w:type="dxa" w:w="1080"/>
+            <w:tcW w:type="dxa" w:w="960"/>
           </w:tcPr>
           <w:p>
             <w:r>
@@ -2778,11 +2842,21 @@
         </w:tc>
         <w:tc>
           <w:tcPr>
-            <w:tcW w:type="dxa" w:w="1080"/>
+            <w:tcW w:type="dxa" w:w="960"/>
           </w:tcPr>
           <w:p>
             <w:r>
               <w:t>0.00620</w:t>
+            </w:r>
+          </w:p>
+        </w:tc>
+        <w:tc>
+          <w:tcPr>
+            <w:tcW w:type="dxa" w:w="960"/>
+          </w:tcPr>
+          <w:p>
+            <w:r>
+              <w:t>4.06</w:t>
             </w:r>
           </w:p>
         </w:tc>
@@ -2790,7 +2864,7 @@
       <w:tr>
         <w:tc>
           <w:tcPr>
-            <w:tcW w:type="dxa" w:w="1080"/>
+            <w:tcW w:type="dxa" w:w="960"/>
           </w:tcPr>
           <w:p>
             <w:r>
@@ -2800,47 +2874,47 @@
         </w:tc>
         <w:tc>
           <w:tcPr>
-            <w:tcW w:type="dxa" w:w="1080"/>
-          </w:tcPr>
-          <w:p>
-            <w:r>
-              <w:t>513.12</w:t>
-            </w:r>
-          </w:p>
-        </w:tc>
-        <w:tc>
-          <w:tcPr>
-            <w:tcW w:type="dxa" w:w="1080"/>
-          </w:tcPr>
-          <w:p>
-            <w:r>
-              <w:t>57.17</w:t>
-            </w:r>
-          </w:p>
-        </w:tc>
-        <w:tc>
-          <w:tcPr>
-            <w:tcW w:type="dxa" w:w="1080"/>
-          </w:tcPr>
-          <w:p>
-            <w:r>
-              <w:t>455.95</w:t>
-            </w:r>
-          </w:p>
-        </w:tc>
-        <w:tc>
-          <w:tcPr>
-            <w:tcW w:type="dxa" w:w="1080"/>
-          </w:tcPr>
-          <w:p>
-            <w:r>
-              <w:t>0.87</w:t>
-            </w:r>
-          </w:p>
-        </w:tc>
-        <w:tc>
-          <w:tcPr>
-            <w:tcW w:type="dxa" w:w="1080"/>
+            <w:tcW w:type="dxa" w:w="960"/>
+          </w:tcPr>
+          <w:p>
+            <w:r>
+              <w:t>513</w:t>
+            </w:r>
+          </w:p>
+        </w:tc>
+        <w:tc>
+          <w:tcPr>
+            <w:tcW w:type="dxa" w:w="960"/>
+          </w:tcPr>
+          <w:p>
+            <w:r>
+              <w:t>57</w:t>
+            </w:r>
+          </w:p>
+        </w:tc>
+        <w:tc>
+          <w:tcPr>
+            <w:tcW w:type="dxa" w:w="960"/>
+          </w:tcPr>
+          <w:p>
+            <w:r>
+              <w:t>456</w:t>
+            </w:r>
+          </w:p>
+        </w:tc>
+        <w:tc>
+          <w:tcPr>
+            <w:tcW w:type="dxa" w:w="960"/>
+          </w:tcPr>
+          <w:p>
+            <w:r>
+              <w:t>1</w:t>
+            </w:r>
+          </w:p>
+        </w:tc>
+        <w:tc>
+          <w:tcPr>
+            <w:tcW w:type="dxa" w:w="960"/>
           </w:tcPr>
           <w:p>
             <w:r>
@@ -2850,7 +2924,7 @@
         </w:tc>
         <w:tc>
           <w:tcPr>
-            <w:tcW w:type="dxa" w:w="1080"/>
+            <w:tcW w:type="dxa" w:w="960"/>
           </w:tcPr>
           <w:p>
             <w:r>
@@ -2860,11 +2934,21 @@
         </w:tc>
         <w:tc>
           <w:tcPr>
-            <w:tcW w:type="dxa" w:w="1080"/>
+            <w:tcW w:type="dxa" w:w="960"/>
           </w:tcPr>
           <w:p>
             <w:r>
               <w:t>0.00400</w:t>
+            </w:r>
+          </w:p>
+        </w:tc>
+        <w:tc>
+          <w:tcPr>
+            <w:tcW w:type="dxa" w:w="960"/>
+          </w:tcPr>
+          <w:p>
+            <w:r>
+              <w:t>8.98</w:t>
             </w:r>
           </w:p>
         </w:tc>
@@ -2872,7 +2956,7 @@
       <w:tr>
         <w:tc>
           <w:tcPr>
-            <w:tcW w:type="dxa" w:w="1080"/>
+            <w:tcW w:type="dxa" w:w="960"/>
           </w:tcPr>
           <w:p>
             <w:r>
@@ -2882,47 +2966,47 @@
         </w:tc>
         <w:tc>
           <w:tcPr>
-            <w:tcW w:type="dxa" w:w="1080"/>
-          </w:tcPr>
-          <w:p>
-            <w:r>
-              <w:t>1783.64</w:t>
-            </w:r>
-          </w:p>
-        </w:tc>
-        <w:tc>
-          <w:tcPr>
-            <w:tcW w:type="dxa" w:w="1080"/>
-          </w:tcPr>
-          <w:p>
-            <w:r>
-              <w:t>112.34</w:t>
-            </w:r>
-          </w:p>
-        </w:tc>
-        <w:tc>
-          <w:tcPr>
-            <w:tcW w:type="dxa" w:w="1080"/>
-          </w:tcPr>
-          <w:p>
-            <w:r>
-              <w:t>1671.29</w:t>
-            </w:r>
-          </w:p>
-        </w:tc>
-        <w:tc>
-          <w:tcPr>
-            <w:tcW w:type="dxa" w:w="1080"/>
-          </w:tcPr>
-          <w:p>
-            <w:r>
-              <w:t>2.38</w:t>
-            </w:r>
-          </w:p>
-        </w:tc>
-        <w:tc>
-          <w:tcPr>
-            <w:tcW w:type="dxa" w:w="1080"/>
+            <w:tcW w:type="dxa" w:w="960"/>
+          </w:tcPr>
+          <w:p>
+            <w:r>
+              <w:t>1784</w:t>
+            </w:r>
+          </w:p>
+        </w:tc>
+        <w:tc>
+          <w:tcPr>
+            <w:tcW w:type="dxa" w:w="960"/>
+          </w:tcPr>
+          <w:p>
+            <w:r>
+              <w:t>112</w:t>
+            </w:r>
+          </w:p>
+        </w:tc>
+        <w:tc>
+          <w:tcPr>
+            <w:tcW w:type="dxa" w:w="960"/>
+          </w:tcPr>
+          <w:p>
+            <w:r>
+              <w:t>1671</w:t>
+            </w:r>
+          </w:p>
+        </w:tc>
+        <w:tc>
+          <w:tcPr>
+            <w:tcW w:type="dxa" w:w="960"/>
+          </w:tcPr>
+          <w:p>
+            <w:r>
+              <w:t>2</w:t>
+            </w:r>
+          </w:p>
+        </w:tc>
+        <w:tc>
+          <w:tcPr>
+            <w:tcW w:type="dxa" w:w="960"/>
           </w:tcPr>
           <w:p>
             <w:r>
@@ -2932,7 +3016,7 @@
         </w:tc>
         <w:tc>
           <w:tcPr>
-            <w:tcW w:type="dxa" w:w="1080"/>
+            <w:tcW w:type="dxa" w:w="960"/>
           </w:tcPr>
           <w:p>
             <w:r>
@@ -2942,11 +3026,21 @@
         </w:tc>
         <w:tc>
           <w:tcPr>
-            <w:tcW w:type="dxa" w:w="1080"/>
+            <w:tcW w:type="dxa" w:w="960"/>
           </w:tcPr>
           <w:p>
             <w:r>
               <w:t>0.00281</w:t>
+            </w:r>
+          </w:p>
+        </w:tc>
+        <w:tc>
+          <w:tcPr>
+            <w:tcW w:type="dxa" w:w="960"/>
+          </w:tcPr>
+          <w:p>
+            <w:r>
+              <w:t>15.88</w:t>
             </w:r>
           </w:p>
         </w:tc>
@@ -2954,7 +3048,7 @@
       <w:tr>
         <w:tc>
           <w:tcPr>
-            <w:tcW w:type="dxa" w:w="1080"/>
+            <w:tcW w:type="dxa" w:w="960"/>
           </w:tcPr>
           <w:p>
             <w:r>
@@ -2964,47 +3058,47 @@
         </w:tc>
         <w:tc>
           <w:tcPr>
-            <w:tcW w:type="dxa" w:w="1080"/>
-          </w:tcPr>
-          <w:p>
-            <w:r>
-              <w:t>770.21</w:t>
-            </w:r>
-          </w:p>
-        </w:tc>
-        <w:tc>
-          <w:tcPr>
-            <w:tcW w:type="dxa" w:w="1080"/>
-          </w:tcPr>
-          <w:p>
-            <w:r>
-              <w:t>132.49</w:t>
-            </w:r>
-          </w:p>
-        </w:tc>
-        <w:tc>
-          <w:tcPr>
-            <w:tcW w:type="dxa" w:w="1080"/>
-          </w:tcPr>
-          <w:p>
-            <w:r>
-              <w:t>637.71</w:t>
-            </w:r>
-          </w:p>
-        </w:tc>
-        <w:tc>
-          <w:tcPr>
-            <w:tcW w:type="dxa" w:w="1080"/>
-          </w:tcPr>
-          <w:p>
-            <w:r>
-              <w:t>2.77</w:t>
-            </w:r>
-          </w:p>
-        </w:tc>
-        <w:tc>
-          <w:tcPr>
-            <w:tcW w:type="dxa" w:w="1080"/>
+            <w:tcW w:type="dxa" w:w="960"/>
+          </w:tcPr>
+          <w:p>
+            <w:r>
+              <w:t>770</w:t>
+            </w:r>
+          </w:p>
+        </w:tc>
+        <w:tc>
+          <w:tcPr>
+            <w:tcW w:type="dxa" w:w="960"/>
+          </w:tcPr>
+          <w:p>
+            <w:r>
+              <w:t>132</w:t>
+            </w:r>
+          </w:p>
+        </w:tc>
+        <w:tc>
+          <w:tcPr>
+            <w:tcW w:type="dxa" w:w="960"/>
+          </w:tcPr>
+          <w:p>
+            <w:r>
+              <w:t>638</w:t>
+            </w:r>
+          </w:p>
+        </w:tc>
+        <w:tc>
+          <w:tcPr>
+            <w:tcW w:type="dxa" w:w="960"/>
+          </w:tcPr>
+          <w:p>
+            <w:r>
+              <w:t>3</w:t>
+            </w:r>
+          </w:p>
+        </w:tc>
+        <w:tc>
+          <w:tcPr>
+            <w:tcW w:type="dxa" w:w="960"/>
           </w:tcPr>
           <w:p>
             <w:r>
@@ -3014,7 +3108,7 @@
         </w:tc>
         <w:tc>
           <w:tcPr>
-            <w:tcW w:type="dxa" w:w="1080"/>
+            <w:tcW w:type="dxa" w:w="960"/>
           </w:tcPr>
           <w:p>
             <w:r>
@@ -3024,11 +3118,21 @@
         </w:tc>
         <w:tc>
           <w:tcPr>
-            <w:tcW w:type="dxa" w:w="1080"/>
+            <w:tcW w:type="dxa" w:w="960"/>
           </w:tcPr>
           <w:p>
             <w:r>
               <w:t>0.00808</w:t>
+            </w:r>
+          </w:p>
+        </w:tc>
+        <w:tc>
+          <w:tcPr>
+            <w:tcW w:type="dxa" w:w="960"/>
+          </w:tcPr>
+          <w:p>
+            <w:r>
+              <w:t>5.81</w:t>
             </w:r>
           </w:p>
         </w:tc>
@@ -3054,7 +3158,7 @@
       <w:r>
         <w:drawing>
           <wp:inline xmlns:a="http://schemas.openxmlformats.org/drawingml/2006/main" xmlns:pic="http://schemas.openxmlformats.org/drawingml/2006/picture">
-            <wp:extent cx="5303520" cy="2651760"/>
+            <wp:extent cx="5303520" cy="2916936"/>
             <wp:docPr id="1" name="Picture 1"/>
             <wp:cNvGraphicFramePr>
               <a:graphicFrameLocks noChangeAspect="1"/>
@@ -3075,7 +3179,7 @@
                   <pic:spPr>
                     <a:xfrm>
                       <a:off x="0" y="0"/>
-                      <a:ext cx="5303520" cy="2651760"/>
+                      <a:ext cx="5303520" cy="2916936"/>
                     </a:xfrm>
                     <a:prstGeom prst="rect"/>
                   </pic:spPr>
@@ -4687,7 +4791,7 @@
           </w:tcPr>
           <w:p>
             <w:r>
-              <w:t>752.12</w:t>
+              <w:t>752</w:t>
             </w:r>
           </w:p>
         </w:tc>
@@ -4697,7 +4801,7 @@
           </w:tcPr>
           <w:p>
             <w:r>
-              <w:t>411.20</w:t>
+              <w:t>411</w:t>
             </w:r>
           </w:p>
         </w:tc>
@@ -4729,7 +4833,7 @@
           </w:tcPr>
           <w:p>
             <w:r>
-              <w:t>1208.42</w:t>
+              <w:t>1208</w:t>
             </w:r>
           </w:p>
         </w:tc>
@@ -4739,7 +4843,7 @@
           </w:tcPr>
           <w:p>
             <w:r>
-              <w:t>659.04</w:t>
+              <w:t>659</w:t>
             </w:r>
           </w:p>
         </w:tc>
@@ -4771,7 +4875,7 @@
           </w:tcPr>
           <w:p>
             <w:r>
-              <w:t>1497.37</w:t>
+              <w:t>1497</w:t>
             </w:r>
           </w:p>
         </w:tc>
@@ -4781,7 +4885,7 @@
           </w:tcPr>
           <w:p>
             <w:r>
-              <w:t>781.23</w:t>
+              <w:t>781</w:t>
             </w:r>
           </w:p>
         </w:tc>
@@ -4813,7 +4917,7 @@
           </w:tcPr>
           <w:p>
             <w:r>
-              <w:t>892.42</w:t>
+              <w:t>892</w:t>
             </w:r>
           </w:p>
         </w:tc>
@@ -4823,7 +4927,7 @@
           </w:tcPr>
           <w:p>
             <w:r>
-              <w:t>469.06</w:t>
+              <w:t>469</w:t>
             </w:r>
           </w:p>
         </w:tc>
@@ -4855,7 +4959,7 @@
           </w:tcPr>
           <w:p>
             <w:r>
-              <w:t>206.81</w:t>
+              <w:t>207</w:t>
             </w:r>
           </w:p>
         </w:tc>
@@ -4865,7 +4969,7 @@
           </w:tcPr>
           <w:p>
             <w:r>
-              <w:t>129.35</w:t>
+              <w:t>129</w:t>
             </w:r>
           </w:p>
         </w:tc>
@@ -4897,7 +5001,7 @@
           </w:tcPr>
           <w:p>
             <w:r>
-              <w:t>424.70</w:t>
+              <w:t>425</w:t>
             </w:r>
           </w:p>
         </w:tc>
@@ -4907,7 +5011,7 @@
           </w:tcPr>
           <w:p>
             <w:r>
-              <w:t>234.34</w:t>
+              <w:t>234</w:t>
             </w:r>
           </w:p>
         </w:tc>
@@ -4939,7 +5043,7 @@
           </w:tcPr>
           <w:p>
             <w:r>
-              <w:t>513.12</w:t>
+              <w:t>513</w:t>
             </w:r>
           </w:p>
         </w:tc>
@@ -4949,7 +5053,7 @@
           </w:tcPr>
           <w:p>
             <w:r>
-              <w:t>270.32</w:t>
+              <w:t>270</w:t>
             </w:r>
           </w:p>
         </w:tc>
@@ -4981,7 +5085,7 @@
           </w:tcPr>
           <w:p>
             <w:r>
-              <w:t>1783.64</w:t>
+              <w:t>1784</w:t>
             </w:r>
           </w:p>
         </w:tc>
@@ -4991,7 +5095,7 @@
           </w:tcPr>
           <w:p>
             <w:r>
-              <w:t>940.82</w:t>
+              <w:t>941</w:t>
             </w:r>
           </w:p>
         </w:tc>
@@ -5023,7 +5127,7 @@
           </w:tcPr>
           <w:p>
             <w:r>
-              <w:t>770.21</w:t>
+              <w:t>770</w:t>
             </w:r>
           </w:p>
         </w:tc>
@@ -5033,7 +5137,7 @@
           </w:tcPr>
           <w:p>
             <w:r>
-              <w:t>445.87</w:t>
+              <w:t>446</w:t>
             </w:r>
           </w:p>
         </w:tc>
@@ -5198,7 +5302,7 @@
           </w:tcPr>
           <w:p>
             <w:r>
-              <w:t>1117.0</w:t>
+              <w:t>1117</w:t>
             </w:r>
           </w:p>
         </w:tc>
@@ -5208,7 +5312,7 @@
           </w:tcPr>
           <w:p>
             <w:r>
-              <w:t>791.3</w:t>
+              <w:t>791</w:t>
             </w:r>
           </w:p>
         </w:tc>
@@ -5228,7 +5332,7 @@
           </w:tcPr>
           <w:p>
             <w:r>
-              <w:t>987.9</w:t>
+              <w:t>988</w:t>
             </w:r>
           </w:p>
         </w:tc>
@@ -5238,7 +5342,7 @@
           </w:tcPr>
           <w:p>
             <w:r>
-              <w:t>662.2</w:t>
+              <w:t>662</w:t>
             </w:r>
           </w:p>
         </w:tc>
@@ -5270,7 +5374,7 @@
           </w:tcPr>
           <w:p>
             <w:r>
-              <w:t>1392.6</w:t>
+              <w:t>1393</w:t>
             </w:r>
           </w:p>
         </w:tc>
@@ -5280,7 +5384,7 @@
           </w:tcPr>
           <w:p>
             <w:r>
-              <w:t>936.4</w:t>
+              <w:t>936</w:t>
             </w:r>
           </w:p>
         </w:tc>
@@ -5300,7 +5404,7 @@
           </w:tcPr>
           <w:p>
             <w:r>
-              <w:t>1280.3</w:t>
+              <w:t>1280</w:t>
             </w:r>
           </w:p>
         </w:tc>
@@ -5310,7 +5414,7 @@
           </w:tcPr>
           <w:p>
             <w:r>
-              <w:t>824.1</w:t>
+              <w:t>824</w:t>
             </w:r>
           </w:p>
         </w:tc>
@@ -5543,7 +5647,7 @@
           </w:tcPr>
           <w:p>
             <w:r>
-              <w:t>88.9</w:t>
+              <w:t>89</w:t>
             </w:r>
           </w:p>
         </w:tc>
@@ -5605,7 +5709,7 @@
           </w:tcPr>
           <w:p>
             <w:r>
-              <w:t>141.0</w:t>
+              <w:t>141</w:t>
             </w:r>
           </w:p>
         </w:tc>
@@ -5667,7 +5771,7 @@
           </w:tcPr>
           <w:p>
             <w:r>
-              <w:t>168.3</w:t>
+              <w:t>168</w:t>
             </w:r>
           </w:p>
         </w:tc>
@@ -5729,7 +5833,7 @@
           </w:tcPr>
           <w:p>
             <w:r>
-              <w:t>101.2</w:t>
+              <w:t>101</w:t>
             </w:r>
           </w:p>
         </w:tc>
@@ -5791,7 +5895,7 @@
           </w:tcPr>
           <w:p>
             <w:r>
-              <w:t>25.8</w:t>
+              <w:t>26</w:t>
             </w:r>
           </w:p>
         </w:tc>
@@ -5853,7 +5957,7 @@
           </w:tcPr>
           <w:p>
             <w:r>
-              <w:t>49.4</w:t>
+              <w:t>49</w:t>
             </w:r>
           </w:p>
         </w:tc>
@@ -5915,7 +6019,7 @@
           </w:tcPr>
           <w:p>
             <w:r>
-              <w:t>58.3</w:t>
+              <w:t>58</w:t>
             </w:r>
           </w:p>
         </w:tc>
@@ -5977,7 +6081,7 @@
           </w:tcPr>
           <w:p>
             <w:r>
-              <w:t>202.6</w:t>
+              <w:t>203</w:t>
             </w:r>
           </w:p>
         </w:tc>
@@ -6039,7 +6143,7 @@
           </w:tcPr>
           <w:p>
             <w:r>
-              <w:t>92.0</w:t>
+              <w:t>92</w:t>
             </w:r>
           </w:p>
         </w:tc>
@@ -8762,7 +8866,7 @@
         <w:t xml:space="preserve"> [13]</w:t>
       </w:r>
       <w:r>
-        <w:t>. A monocentric or tight-oligopoly structure in AI/ML may produce short-run efficiency gains through scale and agglomeration, but it also raises the risk of methodological lock-in, selection bias in training data, and reduced error correction. Recent work on multi-university teams shows that geographically dispersed collaborations can retain high impact, which suggests that distributing capacity across civilisations need not sacrifice quality</w:t>
+        <w:t>. A monocentric or tight-oligopoly structure in AI/ML may produce short-run efficiency gains through scale and agglomeration, but it also raises the risk of methodological lock-in, selection bias in training data, and reduced error correction. It is also an evolutionary dead end: it narrows the menu of innovation options, removes healthy competitors whose alternative approaches keep the field honest, and concentrates problem selection under a single institutional and methodological line. When one civilisation or a small oligopoly sets the dominant research agenda, problems that do not fit its priorities, languages, or institutional incentives are less likely to be addressed, leaving important scientific and social needs unresolved. Recent work on multi-university teams shows that geographically dispersed collaborations can retain high impact, which suggests that distributing capacity across civilisations need not sacrifice quality</w:t>
       </w:r>
       <w:r>
         <w:rPr>

</xml_diff>

<commit_message>
Update title to SHIGA acronym and add title references in Discussion
Co-Authored-By: Tatsuki Onishi <bougtoir@gmail.com>
</commit_message>
<xml_diff>
--- a/researcher_mobility_ode/docs/manuscript_full_article.docx
+++ b/researcher_mobility_ode/docs/manuscript_full_article.docx
@@ -12,7 +12,7 @@
           <w:b/>
           <w:sz w:val="32"/>
         </w:rPr>
-        <w:t>Quantifying the Point of No Return in Global AI/ML Research Communities</w:t>
+        <w:t>Sustaining Heterogeneity: Interventions, Global AI/ML Researcher Mobility, and a Transition-Rate Framework (SHIGA)</w:t>
       </w:r>
     </w:p>
     <w:p>
@@ -28,7 +28,7 @@
         <w:jc w:val="center"/>
       </w:pPr>
       <w:r>
-        <w:t>Approximate word count (main text incl. tables, excl. references): 9921</w:t>
+        <w:t>Approximate word count (main text incl. tables, excl. references): 9970</w:t>
       </w:r>
     </w:p>
     <w:p>
@@ -8906,7 +8906,7 @@
         <w:t xml:space="preserve"> [15]</w:t>
       </w:r>
       <w:r>
-        <w:t>. If the dt of policy response is short enough, the model can be updated annually and divergence caught early, before any single civilisation approaches a point of no return. This is the mechanism through which technology monopoly, hegemonic concentration and oligopoly dead-ends can be avoided: by keeping every major research community above its minimum viable coauthor pool, the framework sustains the competitive diversity that underpins long-run technological progress. The framework is therefore not a prediction that a particular civilisation will collapse. It is a tool for ensuring that no single civilisation reaches a point where its collapse becomes self-sustaining, and that the global AI/ML system retains the diversity required for continued innovation.</w:t>
+        <w:t>. If the dt of policy response is short enough, the model can be updated annually and divergence caught early, before any single civilisation approaches a point of no return. This is the mechanism through which technology monopoly, hegemonic concentration and oligopoly dead-ends can be avoided: by keeping every major research community above its minimum viable coauthor pool, the framework sustains the competitive diversity that underpins long-run technological progress. The framework is therefore not a prediction that a particular civilisation will collapse. It is a tool for ensuring that no single civilisation reaches a point where its collapse becomes self-sustaining, and that the global AI/ML system retains the diversity required for continued innovation. This is the purpose of the title (SHIGA): to sustain civilisational diversity through interventions in global AI/ML researcher mobility and a transition-rate framework.</w:t>
       </w:r>
     </w:p>
     <w:p>
@@ -8950,7 +8950,7 @@
     </w:p>
     <w:p>
       <w:r>
-        <w:t>The 2017-2023 projection demonstrates that the framework can be rerun annually with a one-year time step. Each new year of OpenAlex data updates the observed transition rates, the fitted trends, and the distance to the minimum viable coauthor threshold. Because the model is regularised by the correction pressures, the one-year-ahead projection is not easily derailed by a single noisy observation. Instead, successive years reveal whether a particular transition rate is drifting toward a boundary. That drift is the early-warning signal. Policymakers can then intervene before the active pool falls below M, using the rate-specific elasticities in Table 3 to prioritise the smallest proportional change that restores a safety margin. This is the operational mechanism for avoiding technology monopoly and oligopoly dead ends: by keeping every major research community above its minimum viable coauthor pool, annual monitoring sustains the competitive diversity that underpins long-run technological progress. The framework is therefore not a prediction that a particular civilisation will collapse; it is a tool for ensuring that no single civilisation reaches a point where its collapse becomes self-sustaining.</w:t>
+        <w:t>The 2017-2023 projection demonstrates that the framework can be rerun annually with a one-year time step. Each new year of OpenAlex data updates the observed transition rates, the fitted trends, and the distance to the minimum viable coauthor threshold. Because the model is regularised by the correction pressures, the one-year-ahead projection is not easily derailed by a single noisy observation. Instead, successive years reveal whether a particular transition rate is drifting toward a boundary. That drift is the early-warning signal. Policymakers can then intervene before the active pool falls below M, using the rate-specific elasticities in Table 3 to prioritise the smallest proportional change that restores a safety margin. This is the operational mechanism for avoiding technology monopoly and oligopoly dead ends: by keeping every major research community above its minimum viable coauthor pool, annual monitoring sustains the competitive diversity that underpins long-run technological progress. The framework is therefore not a prediction that a particular civilisation will collapse; it is a tool for ensuring that no single civilisation reaches a point where its collapse becomes self-sustaining. The title (SHIGA) therefore encapsulates the practical goal: keeping the global AI/ML system heterogeneous enough that no single centre of power can monopolise the technological frontier.</w:t>
       </w:r>
     </w:p>
     <w:p>

</xml_diff>

<commit_message>
Introduce SHIGA acronym and Shiga University affiliation in Discussion; remove from title
Co-Authored-By: Tatsuki Onishi <bougtoir@gmail.com>
</commit_message>
<xml_diff>
--- a/researcher_mobility_ode/docs/manuscript_full_article.docx
+++ b/researcher_mobility_ode/docs/manuscript_full_article.docx
@@ -12,7 +12,7 @@
           <w:b/>
           <w:sz w:val="32"/>
         </w:rPr>
-        <w:t>Sustaining Heterogeneity: Interventions, Global AI/ML Researcher Mobility, and a Transition-Rate Framework (SHIGA)</w:t>
+        <w:t>Sustaining Heterogeneity through Interventions in Global AI/ML Researcher Mobility: A Transition-Rate Framework</w:t>
       </w:r>
     </w:p>
     <w:p>
@@ -28,7 +28,7 @@
         <w:jc w:val="center"/>
       </w:pPr>
       <w:r>
-        <w:t>Approximate word count (main text incl. tables, excl. references): 9970</w:t>
+        <w:t>Approximate word count (main text incl. tables, excl. references): 9996</w:t>
       </w:r>
     </w:p>
     <w:p>
@@ -8906,7 +8906,7 @@
         <w:t xml:space="preserve"> [15]</w:t>
       </w:r>
       <w:r>
-        <w:t>. If the dt of policy response is short enough, the model can be updated annually and divergence caught early, before any single civilisation approaches a point of no return. This is the mechanism through which technology monopoly, hegemonic concentration and oligopoly dead-ends can be avoided: by keeping every major research community above its minimum viable coauthor pool, the framework sustains the competitive diversity that underpins long-run technological progress. The framework is therefore not a prediction that a particular civilisation will collapse. It is a tool for ensuring that no single civilisation reaches a point where its collapse becomes self-sustaining, and that the global AI/ML system retains the diversity required for continued innovation. This is the purpose of the title (SHIGA): to sustain civilisational diversity through interventions in global AI/ML researcher mobility and a transition-rate framework.</w:t>
+        <w:t>. If the dt of policy response is short enough, the model can be updated annually and divergence caught early, before any single civilisation approaches a point of no return. This is the mechanism through which technology monopoly, hegemonic concentration and oligopoly dead-ends can be avoided: by keeping every major research community above its minimum viable coauthor pool, the framework sustains the competitive diversity that underpins long-run technological progress. The framework is therefore not a prediction that a particular civilisation will collapse. It is a tool for ensuring that no single civilisation reaches a point where its collapse becomes self-sustaining, and that the global AI/ML system retains the diversity required for continued innovation. This is precisely what Sustaining Heterogeneity through Interventions in Global AI/ML Researcher Mobility: A Transition-Rate Framework sets out to do: sustain civilisational diversity through interventions in global AI/ML researcher mobility. We introduce the acronym SHIGA here; it is formed from the title and also reflects the research base at Shiga University.</w:t>
       </w:r>
     </w:p>
     <w:p>
@@ -8950,7 +8950,7 @@
     </w:p>
     <w:p>
       <w:r>
-        <w:t>The 2017-2023 projection demonstrates that the framework can be rerun annually with a one-year time step. Each new year of OpenAlex data updates the observed transition rates, the fitted trends, and the distance to the minimum viable coauthor threshold. Because the model is regularised by the correction pressures, the one-year-ahead projection is not easily derailed by a single noisy observation. Instead, successive years reveal whether a particular transition rate is drifting toward a boundary. That drift is the early-warning signal. Policymakers can then intervene before the active pool falls below M, using the rate-specific elasticities in Table 3 to prioritise the smallest proportional change that restores a safety margin. This is the operational mechanism for avoiding technology monopoly and oligopoly dead ends: by keeping every major research community above its minimum viable coauthor pool, annual monitoring sustains the competitive diversity that underpins long-run technological progress. The framework is therefore not a prediction that a particular civilisation will collapse; it is a tool for ensuring that no single civilisation reaches a point where its collapse becomes self-sustaining. The title (SHIGA) therefore encapsulates the practical goal: keeping the global AI/ML system heterogeneous enough that no single centre of power can monopolise the technological frontier.</w:t>
+        <w:t>The 2017-2023 projection demonstrates that the framework can be rerun annually with a one-year time step. Each new year of OpenAlex data updates the observed transition rates, the fitted trends, and the distance to the minimum viable coauthor threshold. Because the model is regularised by the correction pressures, the one-year-ahead projection is not easily derailed by a single noisy observation. Instead, successive years reveal whether a particular transition rate is drifting toward a boundary. That drift is the early-warning signal. Policymakers can then intervene before the active pool falls below M, using the rate-specific elasticities in Table 3 to prioritise the smallest proportional change that restores a safety margin. This is the operational mechanism for avoiding technology monopoly and oligopoly dead ends: by keeping every major research community above its minimum viable coauthor pool, annual monitoring sustains the competitive diversity that underpins long-run technological progress. The framework is therefore not a prediction that a particular civilisation will collapse; it is a tool for ensuring that no single civilisation reaches a point where its collapse becomes self-sustaining. SHIGA therefore encapsulates the practical goal: keeping the global AI/ML system heterogeneous enough that no single centre of power can monopolise the technological frontier.</w:t>
       </w:r>
     </w:p>
     <w:p>

</xml_diff>

<commit_message>
Add Japan compartment/PNR figures, mirror fig3, unify fig5/7 titles, integrate into full article
Co-Authored-By: Tatsuki Onishi <bougtoir@gmail.com>
</commit_message>
<xml_diff>
--- a/researcher_mobility_ode/docs/manuscript_full_article.docx
+++ b/researcher_mobility_ode/docs/manuscript_full_article.docx
@@ -28,7 +28,7 @@
         <w:jc w:val="center"/>
       </w:pPr>
       <w:r>
-        <w:t>Approximate word count (main text incl. tables, excl. references): 9996</w:t>
+        <w:t>Approximate word count (main text incl. tables, excl. references): 10596</w:t>
       </w:r>
     </w:p>
     <w:p>
@@ -6865,7 +6865,7 @@
         <w:rPr>
           <w:i/>
         </w:rPr>
-        <w:t>Figure 5. Annual observed (solid) and projected (dashed) transition rates by civilisation, 2000-2026.</w:t>
+        <w:t>Figure 5. Observed (solid) and projected (dashed) transition rates by civilisation, 2000-2026.</w:t>
       </w:r>
     </w:p>
     <w:p>
@@ -8766,6 +8766,126 @@
     <w:p>
       <w:r>
         <w:t>The annual projection performs best where the correction pressures in Section 4.11 are binding. Laplace smoothing prevents empty cells from being treated as impossible transitions; the unit-interval clip and the dropout cap prevent the trend extrapolation from producing rates that are incompatible with a stochastic transition matrix; and the 2016 inflow apportionment keeps new-entrant composition close to the last observed regime. These pressures mean that the projection is not a purely mechanical forecast: it is a bounded extrapolation that stays within the empirical support of the 2000-2016 data and within the stability constraints of the compartment model.</w:t>
+      </w:r>
+    </w:p>
+    <w:p>
+      <w:pPr>
+        <w:pStyle w:val="Heading2"/>
+      </w:pPr>
+      <w:r>
+        <w:t>5.9 Japan-specific compartment and transition-rate ladder</w:t>
+      </w:r>
+    </w:p>
+    <w:p>
+      <w:r>
+        <w:t>Figure 8 places the Japanese AI/ML research community in the compartment model. The fitted equilibrium is T=207 active researchers (D=20, H_D=44, P_D=143) against a minimum viable threshold of M=50, so the safety ratio T/M is 4.10. The right-hand ladder compares Japan's six transition rates with those of the other civilisations. Japan's closest point of no return is the exogenous entry rate I0: if I0 were reduced to 24.4% of its current level, the active pool would reach the minimum viable threshold. In the fitted rates, early-career outflow (α=0.033) and domestic PI promotion (p_D=0.042) are comparatively low, while return from abroad (β=0.110) and domestic hit generation (h_D=0.109) are moderate. The small absolute size of the abroad PI compartment (P_A) shows that few Japanese researchers who leave eventually become PIs abroad, which makes the domestic pipeline the critical margin.</w:t>
+      </w:r>
+    </w:p>
+    <w:p>
+      <w:r>
+        <w:drawing>
+          <wp:inline xmlns:a="http://schemas.openxmlformats.org/drawingml/2006/main" xmlns:pic="http://schemas.openxmlformats.org/drawingml/2006/picture">
+            <wp:extent cx="5486400" cy="3026204"/>
+            <wp:docPr id="8" name="Picture 8"/>
+            <wp:cNvGraphicFramePr>
+              <a:graphicFrameLocks noChangeAspect="1"/>
+            </wp:cNvGraphicFramePr>
+            <a:graphic>
+              <a:graphicData uri="http://schemas.openxmlformats.org/drawingml/2006/picture">
+                <pic:pic>
+                  <pic:nvPicPr>
+                    <pic:cNvPr id="0" name="fig8_japan_compartment_flow.png"/>
+                    <pic:cNvPicPr/>
+                  </pic:nvPicPr>
+                  <pic:blipFill>
+                    <a:blip r:embed="rId16"/>
+                    <a:stretch>
+                      <a:fillRect/>
+                    </a:stretch>
+                  </pic:blipFill>
+                  <pic:spPr>
+                    <a:xfrm>
+                      <a:off x="0" y="0"/>
+                      <a:ext cx="5486400" cy="3026204"/>
+                    </a:xfrm>
+                    <a:prstGeom prst="rect"/>
+                  </pic:spPr>
+                </pic:pic>
+              </a:graphicData>
+            </a:graphic>
+          </wp:inline>
+        </w:drawing>
+      </w:r>
+    </w:p>
+    <w:p>
+      <w:pPr>
+        <w:jc w:val="center"/>
+      </w:pPr>
+      <w:r>
+        <w:rPr>
+          <w:i/>
+        </w:rPr>
+        <w:t>Figure 8. The Japanese AI/ML research community in the six-compartment model, with a cross-civilisation ladder of fitted transition rates. Japan is highlighted in the right-hand panel; longer bars represent higher estimated rates.</w:t>
+      </w:r>
+    </w:p>
+    <w:p>
+      <w:pPr>
+        <w:pStyle w:val="Heading2"/>
+      </w:pPr>
+      <w:r>
+        <w:t>5.10 A combined model-evaluation view: T/M and PNR proximity</w:t>
+      </w:r>
+    </w:p>
+    <w:p>
+      <w:r>
+        <w:t>Figure 9 combines the long-run safety ratio T/M with the closest point-of-no-return proximity for each civilisation. A point in the lower-left corner has both a low equilibrium buffer and a small proportional change needed to reach the threshold, so it is the most fragile combination. Japan sits in this region alongside the 'Other Civilizations' group, even though its T/M ratio is above one. This dual view is useful as a model-evaluation metric: a civilisation can have a T/M ratio that looks comfortable but still be close to its PNR because the PNR depends on the proportional change in the most sensitive rate, not only on the level of T.</w:t>
+      </w:r>
+    </w:p>
+    <w:p>
+      <w:r>
+        <w:drawing>
+          <wp:inline xmlns:a="http://schemas.openxmlformats.org/drawingml/2006/main" xmlns:pic="http://schemas.openxmlformats.org/drawingml/2006/picture">
+            <wp:extent cx="5303520" cy="4124960"/>
+            <wp:docPr id="9" name="Picture 9"/>
+            <wp:cNvGraphicFramePr>
+              <a:graphicFrameLocks noChangeAspect="1"/>
+            </wp:cNvGraphicFramePr>
+            <a:graphic>
+              <a:graphicData uri="http://schemas.openxmlformats.org/drawingml/2006/picture">
+                <pic:pic>
+                  <pic:nvPicPr>
+                    <pic:cNvPr id="0" name="fig9_tm_pnr_scatter.png"/>
+                    <pic:cNvPicPr/>
+                  </pic:nvPicPr>
+                  <pic:blipFill>
+                    <a:blip r:embed="rId17"/>
+                    <a:stretch>
+                      <a:fillRect/>
+                    </a:stretch>
+                  </pic:blipFill>
+                  <pic:spPr>
+                    <a:xfrm>
+                      <a:off x="0" y="0"/>
+                      <a:ext cx="5303520" cy="4124960"/>
+                    </a:xfrm>
+                    <a:prstGeom prst="rect"/>
+                  </pic:spPr>
+                </pic:pic>
+              </a:graphicData>
+            </a:graphic>
+          </wp:inline>
+        </w:drawing>
+      </w:r>
+    </w:p>
+    <w:p>
+      <w:pPr>
+        <w:jc w:val="center"/>
+      </w:pPr>
+      <w:r>
+        <w:rPr>
+          <w:i/>
+        </w:rPr>
+        <w:t>Figure 9. Equilibrium safety ratio (T/M) versus closest point-of-no-return proximity for all civilisations. Japan is shown in red.</w:t>
       </w:r>
     </w:p>
     <w:p>
@@ -8876,6 +8996,58 @@
       </w:r>
       <w:r>
         <w:t>. By quantifying the safety margin for each research community, the framework makes it possible to argue for support of smaller communities on positive, innovation-systems grounds. Preserving multiple centres of AI/ML research is not a matter of slowing the frontier; it is a matter of ensuring that the frontier is not defined by a single set of institutions, languages, or problems.</w:t>
+      </w:r>
+    </w:p>
+    <w:p>
+      <w:r>
+        <w:t>Japan is the clearest example among the large civilisations. Its fitted active-pool margin is T=207 researchers, with M=50 (T/M=4.10). Figure 8 (reproduced below) shows that Japan's closest point of no return is the exogenous entry rate I0: if I0 fell to 24.4% of its current level, the active pool would reach the minimum viable threshold. The same figure shows that Japan's early-career outflow α (0.033) and domestic PI promotion p_D (0.042) are comparatively low, while return from abroad β (0.110) and domestic hit generation h_D (0.109) are moderate. These numbers translate directly into policy levers. α can be reduced by expanding postdoctoral fellowships and junior-faculty positions that keep promising researchers in the domestic pipeline; β can be raised through return grants, dual appointments, and recognition of overseas experience in domestic hiring. h_D responds to doctoral and postdoctoral training expansion, including the 2026 AI for Science (SPREAD) programme if it is used to create independent labs with their own budgets rather than merely increasing headcount. p_D depends on tenure-track conversion, startup packages, and project-based PI status for mid-career researchers. d, the dropout rate to L, can be lowered through childcare support, dual-career accommodation, and stable non-tenure research tracks. Finally, I0 captures the pure exogenous entry flow and can be supported by research-master pipelines, undergraduate research programmes, and early doctoral fellowships. Weakening the Japanese civilisation would not be neutral for the rest of the world: it would remove a distinct institutional lineage, reduce the pool of non-Anglophone problem framings, and leave a range of health, ageing, robotics, and materials problems under-addressed. Maintaining Japan as a viable AI/ML civilisation is therefore in the global interest, not only in Japan's national interest.</w:t>
+      </w:r>
+    </w:p>
+    <w:p>
+      <w:r>
+        <w:drawing>
+          <wp:inline xmlns:a="http://schemas.openxmlformats.org/drawingml/2006/main" xmlns:pic="http://schemas.openxmlformats.org/drawingml/2006/picture">
+            <wp:extent cx="4572000" cy="2521837"/>
+            <wp:docPr id="10" name="Picture 10"/>
+            <wp:cNvGraphicFramePr>
+              <a:graphicFrameLocks noChangeAspect="1"/>
+            </wp:cNvGraphicFramePr>
+            <a:graphic>
+              <a:graphicData uri="http://schemas.openxmlformats.org/drawingml/2006/picture">
+                <pic:pic>
+                  <pic:nvPicPr>
+                    <pic:cNvPr id="0" name="fig8_japan_compartment_flow.png"/>
+                    <pic:cNvPicPr/>
+                  </pic:nvPicPr>
+                  <pic:blipFill>
+                    <a:blip r:embed="rId16"/>
+                    <a:stretch>
+                      <a:fillRect/>
+                    </a:stretch>
+                  </pic:blipFill>
+                  <pic:spPr>
+                    <a:xfrm>
+                      <a:off x="0" y="0"/>
+                      <a:ext cx="4572000" cy="2521837"/>
+                    </a:xfrm>
+                    <a:prstGeom prst="rect"/>
+                  </pic:spPr>
+                </pic:pic>
+              </a:graphicData>
+            </a:graphic>
+          </wp:inline>
+        </w:drawing>
+      </w:r>
+    </w:p>
+    <w:p>
+      <w:pPr>
+        <w:jc w:val="center"/>
+      </w:pPr>
+      <w:r>
+        <w:rPr>
+          <w:i/>
+        </w:rPr>
+        <w:t>Figure 8 (reproduced). Japan in the six-compartment model, with cross-civilisation transition-rate ladders.</w:t>
       </w:r>
     </w:p>
     <w:p>

</xml_diff>

<commit_message>
fix(reviewer-audit): address points A-H for full-article manuscript
- A: renumber markdown subsections continuously and update in-text references.
- B: strengthen MAPE interpretation in Abstract, Results and Discussion.
- C: add multi-lever policy package summary to RQ4/Results.
- D: add 'in the fitted model' caveat to Abstract causal wording.
- E: soften Figure 6 inter-civilisation flow caption with proxy/lower-bound note.
- F: keep 'Hindu' name and add 'India and nearby South Asian countries' definition in Introduction.
- G: increase Figure 4 to 600 dpi with tight bounding box.
- H: unify 'point of no return' to PNR after Abstract/Introduction definitions.
- Also correct docx Methods text to match code (1.5x 90th percentile; training-period first-compartment inflow apportionment).

Co-Authored-By: Tatsuki Onishi <bougtoir@gmail.com>
</commit_message>
<xml_diff>
--- a/researcher_mobility_ode/docs/manuscript_full_article.docx
+++ b/researcher_mobility_ode/docs/manuscript_full_article.docx
@@ -28,7 +28,7 @@
         <w:jc w:val="center"/>
       </w:pPr>
       <w:r>
-        <w:t>Approximate word count (main text incl. tables, excl. references): 10596</w:t>
+        <w:t>Approximate word count (main text incl. tables, excl. references): 10754</w:t>
       </w:r>
     </w:p>
     <w:p>
@@ -54,7 +54,7 @@
     </w:p>
     <w:p>
       <w:r>
-        <w:t>Artificial intelligence (AI) and machine learning (ML) research is increasingly concentrated in a few regions, raising the risk that smaller research communities fall below a minimum viable coauthor pool and cannot recover. We model each civilisation as a six-compartment system of domestic and abroad early-career, high-impact, and principal-investigator researchers, and estimate transition rates from OpenAlex Artificial Intelligence works (subfield 1702). The minimum viable coauthor threshold is defined as M = k × c_bar, where c_bar is the mean number of authors per work and k is the median number of distinct last-author groups observed per recent year. Across 9 groups, equilibrium domestic active pools remain above their thresholds, but the closest point of no return is observed for the Other Civilizations group, where I0 must be multiplied by 0.246× its current value (equivalent to a 75% proportional reduction) to drive the active pool to its threshold. A simulated reduction in dropout yields the largest margin gain per unit proportional change in every group, making it the most sensitive transition lever in the model. Historical and saturating-inflow counterfactuals show that the model is most sensitive to exogenous entry and attrition. These results provide a quantitative framework for early, safety-factor-bound policy scenarios that preserve civilisational diversity in AI/ML research.</w:t>
+        <w:t>Artificial intelligence (AI) and machine learning (ML) research is increasingly concentrated in a few regions, raising the risk that smaller research communities fall below a minimum viable coauthor pool and cannot recover. We model each civilisation as a six-compartment system of domestic and abroad early-career, high-impact, and principal-investigator researchers, and estimate transition rates from OpenAlex Artificial Intelligence works (subfield 1702). The minimum viable coauthor threshold is defined as M = k × c_bar, where c_bar is the mean number of authors per work and k is the median number of distinct last-author groups observed per recent year. Across 9 groups, equilibrium domestic active pools remain above their thresholds, but the closest point of no return (PNR) is observed for the Other Civilizations group, where I0 must be multiplied by 0.246× its current value (equivalent to a 75% proportional reduction) to drive the active pool to its threshold. A simulated reduction in dropout yields the largest margin gain per unit proportional change in every group in the fitted model. The 2017-2023 out-of-sample projection records RMSE 3.35 and a conservative, non-standard MAPE of 42.5% (computed against count_obs + 1 to avoid division by zero). That level of error is expected because the projection is designed as an early-warning indicator of directional drift and threshold crossing, not as a precise population forecast. Historical and saturating-inflow counterfactuals show that the model is most sensitive to exogenous entry and attrition. These results provide a quantitative framework for early, safety-factor-bound policy scenarios that preserve civilisational diversity in AI/ML research.</w:t>
       </w:r>
     </w:p>
     <w:p>
@@ -65,7 +65,7 @@
         <w:t xml:space="preserve">Keywords: </w:t>
       </w:r>
       <w:r>
-        <w:t>researcher mobility; artificial intelligence; civilisation grouping; ordinary differential equations; point of no return; innovation studies</w:t>
+        <w:t>researcher mobility; artificial intelligence; civilisation grouping; ordinary differential equations; PNR; innovation studies</w:t>
       </w:r>
     </w:p>
     <w:p>
@@ -89,7 +89,7 @@
         <w:pStyle w:val="ListBullet"/>
       </w:pPr>
       <w:r>
-        <w:t>Closest point of no return: Other Civilizations via I0 (factor 0.246×).</w:t>
+        <w:t>Closest PNR: Other Civilizations via I0 (factor 0.246×).</w:t>
       </w:r>
     </w:p>
     <w:p>
@@ -97,7 +97,7 @@
         <w:pStyle w:val="ListBullet"/>
       </w:pPr>
       <w:r>
-        <w:t>Dropout reduction gives the largest margin gain per 10% change across all groups.</w:t>
+        <w:t>Dropout reduction gives the largest margin gain per 10% change across all groups in the fitted model.</w:t>
       </w:r>
     </w:p>
     <w:p>
@@ -175,7 +175,7 @@
     </w:p>
     <w:p>
       <w:r>
-        <w:t>Most debates on research mobility focus on net flows: which country gains researchers and which loses them. Net-flow accounting is useful for headlines, but it hides the transition rates that actually move researchers between career stages and locations. A small proportional change in one of those rates can, over time, push a research community below the minimum coauthor pool it needs to remain viable. Once the pool falls below that threshold, recovery becomes difficult or impossible, even if policy is later reversed. That is the point of no return that motivates this paper. The contribution of this paper is to translate that qualitative insight into an empirically tractable model. We estimate transition rates from open bibliometric data, solve the steady state of a compartment model, and identify which rate in which civilisation is closest to a threshold. The approach is deliberately stylised: it sacrifices demographic realism for transparency and for the ability to compare multiple civilisations with the same accounting framework.</w:t>
+        <w:t>Most debates on research mobility focus on net flows: which country gains researchers and which loses them. Net-flow accounting is useful for headlines, but it hides the transition rates that actually move researchers between career stages and locations. A small proportional change in one of those rates can, over time, push a research community below the minimum coauthor pool it needs to remain viable. Once the pool falls below that threshold, recovery becomes difficult or impossible, even if policy is later reversed. That is the point of no return (PNR) that motivates this paper. The contribution of this paper is to translate that qualitative insight into an empirically tractable model. We estimate transition rates from open bibliometric data, solve the steady state of a compartment model, and identify which rate in which civilisation is closest to a threshold. The approach is deliberately stylised: it sacrifices demographic realism for transparency and for the ability to compare multiple civilisations with the same accounting framework.</w:t>
       </w:r>
     </w:p>
     <w:p>
@@ -230,7 +230,7 @@
         <w:t xml:space="preserve"> [4]</w:t>
       </w:r>
       <w:r>
-        <w:t>. We adapt Huntington's nine civilisations for AI/ML mobility by keeping the United States, China (Sinic), India (Hindu), Japan, and the Islamic world as distinct groups, splitting the Western bloc into the United States, Anglosphere excluding the United States, Continental Europe and Other Western, and merging the smaller Latin American, Orthodox and African communities into Other Civilizations. This grouping reflects the empirical size and mobility patterns observed in the data rather than a normative claim about civilisational identity.</w:t>
+        <w:t>. We adapt Huntington's nine civilisations for AI/ML mobility by keeping the United States, China (Sinic), India and nearby South Asian countries (Hindu), Japan, and the Islamic world as distinct groups, splitting the Western bloc into the United States, Anglosphere excluding the United States, Continental Europe and Other Western, and merging the smaller Latin American, Orthodox and African communities into Other Civilizations. This grouping reflects the empirical size and mobility patterns observed in the data rather than a normative claim about civilisational identity.</w:t>
       </w:r>
     </w:p>
     <w:p>
@@ -253,12 +253,12 @@
         <w:t xml:space="preserve"> [5]</w:t>
       </w:r>
       <w:r>
-        <w:t>. If transition rates can be observed with enough temporal resolution, policy can intervene before a community reaches the point of no return. Early, proportionate interventions can prevent the emergence of a monopoly or oligopoly without requiring large ex post rescues.</w:t>
+        <w:t>. If transition rates can be observed with enough temporal resolution, policy can intervene before a community reaches the PNR. Early, proportionate interventions can prevent the emergence of a monopoly or oligopoly without requiring large ex post rescues.</w:t>
       </w:r>
     </w:p>
     <w:p>
       <w:r>
-        <w:t>We therefore address five research questions. First, how close is each civilisation to the point of no return in its AI/ML research community? Second, which transition rates have the largest effect on community size? Third, how have transition rates changed between earlier and later career cohorts, and what would have happened if those rates had persisted? Fourth, what safety-factor-bound policy packages can widen the margin before a point of no return is reached? Fifth, can the fitted rates be estimated year by year and used to project near-term population composition, and how well do those projections reproduce observed 2017-2023 counts? The key policy intuition is that, with an appropriately chosen time step and an early warning signal, intervention can be calibrated in safety margins rather than after collapse. This prevents any single civilisation from cornering the supply of critical talent, and thereby preserves the competitive diversity that drives long-run innovation.</w:t>
+        <w:t>We therefore address five research questions. First, how close is each civilisation to the PNR in its AI/ML research community? Second, which transition rates have the largest effect on community size? Third, how have transition rates changed between earlier and later career cohorts, and what would have happened if those rates had persisted? Fourth, what safety-factor-bound single-lever and multi-lever policy scenarios can widen the margin before a PNR is reached? Fifth, can the fitted rates be estimated year by year and used to project near-term population composition, and how well do those projections reproduce observed 2017-2023 counts? The key policy intuition is that, with an appropriately chosen time step and an early warning signal, intervention can be calibrated in safety margins rather than after collapse. This prevents any single civilisation from cornering the supply of critical talent, and thereby preserves the competitive diversity that drives long-run innovation.</w:t>
       </w:r>
     </w:p>
     <w:p>
@@ -364,7 +364,7 @@
     </w:p>
     <w:p>
       <w:r>
-        <w:t>This framing generates four testable hypotheses. H1: Across all groups, the equilibrium active pool exceeds the minimum viable threshold, but the distance to the threshold varies widely. H2: Dropout is the transition rate with the largest negative effect, because attrition removes researchers from every compartment. H3: The largest positive transition lever is principal-investigator promotion (p_D), followed by domestic hit generation (h_D). H4: Smaller civilisations, and those with older cohort structures, sit closer to their point of no return.</w:t>
+        <w:t>This framing generates four testable hypotheses. H1: Across all groups, the equilibrium active pool exceeds the minimum viable threshold, but the distance to the threshold varies widely. H2: Dropout is the transition rate with the largest negative effect, because attrition removes researchers from every compartment. H3: The largest positive transition lever is principal-investigator promotion (p_D), followed by domestic hit generation (h_D). H4: Smaller civilisations, and those with older cohort structures, sit closer to their PNR.</w:t>
       </w:r>
     </w:p>
     <w:p>
@@ -444,7 +444,7 @@
         <w:t xml:space="preserve"> [10]</w:t>
       </w:r>
       <w:r>
-        <w:t>. We borrow that intuition and apply it to a research community. A field needs a minimum number of active researchers to produce work, train successors, and maintain peer review and conference communities. Below that threshold, positive feedback loops weaken: fewer researchers produce fewer students, fewer students produce fewer researchers, and the community enters a downward spiral. This is the point of no return.</w:t>
+        <w:t>. We borrow that intuition and apply it to a research community. A field needs a minimum number of active researchers to produce work, train successors, and maintain peer review and conference communities. Below that threshold, positive feedback loops weaken: fewer researchers produce fewer students, fewer students produce fewer researchers, and the community enters a downward spiral. This is the PNR.</w:t>
       </w:r>
     </w:p>
     <w:p>
@@ -2090,7 +2090,7 @@
     </w:p>
     <w:p>
       <w:r>
-        <w:t>We assess robustness in three ways. First, we replace the linear PI-driven inflow with a saturating recruitment function that imposes diminishing returns to additional PIs. Second, we vary the cohort-split year for the historical counterfactual. Third, we examine the effect of the safety factor on the endogenous inflow parameter r, keeping the system within a bounded stability region. Across these checks the qualitative ranking of rates and the identity of the closest point of no return remain stable, although the absolute equilibrium levels shift.</w:t>
+        <w:t>We assess robustness in three ways. First, we replace the linear PI-driven inflow with a saturating recruitment function that imposes diminishing returns to additional PIs. Second, we vary the cohort-split year for the historical counterfactual. Third, we examine the effect of the safety factor on the endogenous inflow parameter r, keeping the system within a bounded stability region. Across these checks the qualitative ranking of rates and the identity of the closest PNR remain stable, although the absolute equilibrium levels shift.</w:t>
       </w:r>
     </w:p>
     <w:p>
@@ -2134,7 +2134,7 @@
     </w:p>
     <w:p>
       <w:r>
-        <w:t>For the 2017-2026 projection we fit a linear trend to the observed 2000-2016 rates for each group and rate. If fewer than four observations were available or the fit explained less than 10% of the variance, the historical mean was used instead. Projected rates were clipped to values between 0 and 1. Dropout was capped at the 90th percentile of observed dropout rates to prevent implausible extrapolation. Projected total inflows were apportioned across compartments using the observed 2016 distribution. Population composition was projected forward with the discrete-time recursion N(t+1) = N(t)P(t) + b(t+1), where P(t) is a 6×6 row-stochastic-in-expectation matrix that preserves dropout mass: the row sum is 1 − d after scaling outgoing rates. This discrete step is the operational counterpart of the continuous-time ODE; with an annual dt it provides an early-warning signal one year ahead.</w:t>
+        <w:t>For the 2017-2026 projection we fit a linear trend to the observed 2000-2016 rates for each group and rate. If fewer than four observations were available or the fit explained less than 10% of the variance, the historical mean was used instead. Projected rates were clipped to values between 0 and 1. Dropout was capped at 1.5 times the 90th percentile of observed dropout rates in the training window to prevent implausible extrapolation. Projected total inflows were apportioned across compartments using the first-compartment distribution observed over the 2000-2016 training period. Population composition was projected forward with the discrete-time recursion N(t+1) = N(t)P(t) + b(t+1), where P(t) is a 6×6 row-stochastic-in-expectation matrix that preserves dropout mass: the row sum is 1 − d after scaling outgoing rates. This discrete step is the operational counterpart of the continuous-time ODE; with an annual dt it provides an early-warning signal one year ahead.</w:t>
       </w:r>
     </w:p>
     <w:p>
@@ -2170,7 +2170,7 @@
     </w:p>
     <w:p>
       <w:r>
-        <w:t>Table 2 reports the equilibrium domestic active pool T, the minimum viable threshold M, and the endogenous inflow parameters for the 9 groups. All groups remain above their threshold under the fitted model, but margins differ by an order of magnitude. The Sinic, Hindu, Continental Europe groups show the largest equilibrium active pools, reflecting large cohorts and relatively low coauthor-intensity thresholds. The Japanese group has the smallest equilibrium active pool, and Japanese has the narrowest safety margin, although both still exceed their minimum viable coauthor pool. The ratio T/M is a summary resilience indicator, but absolute margin is the more direct measure of proximity to the point of no return.</w:t>
+        <w:t>Table 2 reports the equilibrium domestic active pool T, the minimum viable threshold M, and the endogenous inflow parameters for the 9 groups. All groups remain above their threshold under the fitted model, but margins differ by an order of magnitude. The Sinic, Hindu, Continental Europe groups show the largest equilibrium active pools, reflecting large cohorts and relatively low coauthor-intensity thresholds. The Japanese group has the smallest equilibrium active pool, and Japanese has the narrowest safety margin, although both still exceed their minimum viable coauthor pool. The ratio T/M is a summary resilience indicator, but absolute margin is the more direct measure of proximity to the PNR.</w:t>
       </w:r>
     </w:p>
     <w:tbl>
@@ -4640,7 +4640,7 @@
         <w:rPr>
           <w:i/>
         </w:rPr>
-        <w:t>Table 4. Closest point of no return for the active researcher pool by group.</w:t>
+        <w:t>Table 4. Closest PNR for the active researcher pool by group.</w:t>
       </w:r>
     </w:p>
     <w:p>
@@ -6171,6 +6171,11 @@
       </w:r>
     </w:p>
     <w:p>
+      <w:r>
+        <w:t>We also evaluated multi-lever policy packages for the three smallest-margin groups. The package with the largest margin gain in each group was: Japanese (return_plus_retention: +27 active researchers); Other Civilizations (return_plus_retention: +50 active researchers); Other Western (return_plus_retention: +59 active researchers). These packages combine dropout reduction with return or PI-pipeline levers, showing that the framework can compare multi-lever interventions as well as single-rate perturbations.</w:t>
+      </w:r>
+    </w:p>
+    <w:p>
       <w:pPr>
         <w:pStyle w:val="Heading2"/>
       </w:pPr>
@@ -6180,7 +6185,7 @@
     </w:p>
     <w:p>
       <w:r>
-        <w:t>Table 8 reports bootstrap 95% confidence intervals for the equilibrium active pool T and the domestic PI pool P_D. The intervals are wide, reflecting the small cohort sample and the extrapolation from individual careers to long-run steady states. For some groups the upper bound is an order of magnitude larger than the lower bound, indicating that the equilibrium is sensitive to resampling variation in the transition rates. This uncertainty should be interpreted as a warning against over-interpreting point estimates and as a reason to view the point-of-no-return distances as indicative rather than precise thresholds. Despite the width, the lower bounds for most groups remain above the minimum viable threshold, which supports the qualitative conclusion that all groups are currently above the point of no return. For the smallest groups the lower bound is closer to M, reinforcing the need for continued monitoring and for policy buffers.</w:t>
+        <w:t>Table 8 reports bootstrap 95% confidence intervals for the equilibrium active pool T and the domestic PI pool P_D. The intervals are wide, reflecting the small cohort sample and the extrapolation from individual careers to long-run steady states. For some groups the upper bound is an order of magnitude larger than the lower bound, indicating that the equilibrium is sensitive to resampling variation in the transition rates. This uncertainty should be interpreted as a warning against over-interpreting point estimates and as a reason to view the point-of-no-return distances as indicative rather than precise thresholds. Despite the width, the lower bounds for most groups remain above the minimum viable threshold, which supports the qualitative conclusion that all groups are currently above the PNR. For the smallest groups the lower bound is closer to M, reinforcing the need for continued monitoring and for policy buffers.</w:t>
       </w:r>
     </w:p>
     <w:tbl>
@@ -6752,7 +6757,7 @@
       <w:r>
         <w:drawing>
           <wp:inline xmlns:a="http://schemas.openxmlformats.org/drawingml/2006/main" xmlns:pic="http://schemas.openxmlformats.org/drawingml/2006/picture">
-            <wp:extent cx="5303520" cy="2946400"/>
+            <wp:extent cx="5303520" cy="2906011"/>
             <wp:docPr id="4" name="Picture 4"/>
             <wp:cNvGraphicFramePr>
               <a:graphicFrameLocks noChangeAspect="1"/>
@@ -6773,7 +6778,7 @@
                   <pic:spPr>
                     <a:xfrm>
                       <a:off x="0" y="0"/>
-                      <a:ext cx="5303520" cy="2946400"/>
+                      <a:ext cx="5303520" cy="2906011"/>
                     </a:xfrm>
                     <a:prstGeom prst="rect"/>
                   </pic:spPr>
@@ -6805,7 +6810,7 @@
     </w:p>
     <w:p>
       <w:r>
-        <w:t>Taken together, the results provide a consistent picture. Exogenous entry and dropout are the two rates that most strongly determine the long-run viability of an AI/ML research community. Communities that are large in absolute terms are not necessarily safe if their coauthor intensity is high; conversely, small communities can be robust if their attrition is low and their recruitment pipeline is stable. The historical counterfactual shows that the current regime is not preordained: a shift in transition rates at the start of the AI boom would have produced different steady states for different civilisations. This is precisely why the framework is useful: it identifies which rate in which community is closest to a threshold, allowing policy to intervene before rather than after a collapse. The policy message is therefore both diagnostic and preventative. By tracking transition rates rather than net flows, policymakers can see which civilisation is approaching a point of no return and which lever offers the largest safety margin per unit of effort.</w:t>
+        <w:t>Taken together, the results provide a consistent picture. Exogenous entry and dropout are the two rates that most strongly determine the long-run viability of an AI/ML research community. Communities that are large in absolute terms are not necessarily safe if their coauthor intensity is high; conversely, small communities can be robust if their attrition is low and their recruitment pipeline is stable. The historical counterfactual shows that the current regime is not preordained: a shift in transition rates at the start of the AI boom would have produced different steady states for different civilisations. This is precisely why the framework is useful: it identifies which rate in which community is closest to a threshold, allowing policy to intervene before rather than after a collapse. The policy message is therefore both diagnostic and preventative. By tracking transition rates rather than net flows, policymakers can see which civilisation is approaching a PNR and which lever offers the largest safety margin per unit of effort.</w:t>
       </w:r>
     </w:p>
     <w:p>
@@ -7690,7 +7695,7 @@
         <w:rPr>
           <w:i/>
         </w:rPr>
-        <w:t>Figure 6. Inter-civilisation abroad author-year accumulation by origin (rows) and destination (columns).</w:t>
+        <w:t>Figure 6. Inter-civilisation abroad author-year accumulation by origin (rows) and destination (columns) (lower-bound proxy; year-to-year destination switches within a spell abroad are not observed).</w:t>
       </w:r>
     </w:p>
     <w:p>
@@ -8092,7 +8097,7 @@
     </w:p>
     <w:p>
       <w:r>
-        <w:t>The 2017-2023 projection is compared with observed annual stocks in Figure 7. Overall accuracy is RMSE 3.35 and MAPE 42.5% (a non-standard, conservative measure computed against count_obs + 1 to avoid division by zero). Among civilisations the lowest RMSE is for Japanese and the highest RMSE is for Sinic; the highest MAPE is for Sinic. The largest errors occur in small compartments and in groups with sparse transition counts, which is expected because the annual model does not borrow information across civilisations.</w:t>
+        <w:t>The 2017-2023 projection is compared with observed annual stocks in Figure 7. Overall accuracy is RMSE 3.35 and MAPE 42.5% (a non-standard, conservative measure computed against count_obs + 1 to avoid division by zero). The high MAPE reflects small absolute counts and zero-observed cells, and the projection should be read as a directional early-warning indicator of drift and threshold proximity rather than a precise population forecast. Among civilisations the lowest RMSE is for Japanese and the highest RMSE is for Sinic; the highest MAPE is for Sinic. The largest errors occur in small compartments and in groups with sparse transition counts, which is expected because the annual model does not borrow information across civilisations.</w:t>
       </w:r>
     </w:p>
     <w:p>
@@ -8778,7 +8783,7 @@
     </w:p>
     <w:p>
       <w:r>
-        <w:t>Figure 8 places the Japanese AI/ML research community in the compartment model. The fitted equilibrium is T=207 active researchers (D=20, H_D=44, P_D=143) against a minimum viable threshold of M=50, so the safety ratio T/M is 4.10. The right-hand ladder compares Japan's six transition rates with those of the other civilisations. Japan's closest point of no return is the exogenous entry rate I0: if I0 were reduced to 24.4% of its current level, the active pool would reach the minimum viable threshold. In the fitted rates, early-career outflow (α=0.033) and domestic PI promotion (p_D=0.042) are comparatively low, while return from abroad (β=0.110) and domestic hit generation (h_D=0.109) are moderate. The small absolute size of the abroad PI compartment (P_A) shows that few Japanese researchers who leave eventually become PIs abroad, which makes the domestic pipeline the critical margin.</w:t>
+        <w:t>Figure 8 places the Japanese AI/ML research community in the compartment model. The fitted equilibrium is T=207 active researchers (D=20, H_D=44, P_D=143) against a minimum viable threshold of M=50, so the safety ratio T/M is 4.10. The right-hand ladder compares Japan's six transition rates with those of the other civilisations. Japan's closest PNR is the exogenous entry rate I0: if I0 were reduced to 24.4% of its current level, the active pool would reach the minimum viable threshold. In the fitted rates, early-career outflow (α=0.033) and domestic PI promotion (p_D=0.042) are comparatively low, while return from abroad (β=0.110) and domestic hit generation (h_D=0.109) are moderate. The small absolute size of the abroad PI compartment (P_A) shows that few Japanese researchers who leave eventually become PIs abroad, which makes the domestic pipeline the critical margin.</w:t>
       </w:r>
     </w:p>
     <w:p>
@@ -8934,7 +8939,7 @@
         <w:t xml:space="preserve"> [1]</w:t>
       </w:r>
       <w:r>
-        <w:t>. Policies that sustain that pipeline, such as doctoral funding, visa routes for early-career researchers, and stable junior positions, are therefore first-order defences against a point of no return.</w:t>
+        <w:t>. Policies that sustain that pipeline, such as doctoral funding, visa routes for early-career researchers, and stable junior positions, are therefore first-order defences against a PNR.</w:t>
       </w:r>
     </w:p>
     <w:p>
@@ -9000,7 +9005,7 @@
     </w:p>
     <w:p>
       <w:r>
-        <w:t>Japan is the clearest example among the large civilisations. Its fitted active-pool margin is T=207 researchers, with M=50 (T/M=4.10). Figure 8 (reproduced below) shows that Japan's closest point of no return is the exogenous entry rate I0: if I0 fell to 24.4% of its current level, the active pool would reach the minimum viable threshold. The same figure shows that Japan's early-career outflow α (0.033) and domestic PI promotion p_D (0.042) are comparatively low, while return from abroad β (0.110) and domestic hit generation h_D (0.109) are moderate. These numbers translate directly into policy levers. α can be reduced by expanding postdoctoral fellowships and junior-faculty positions that keep promising researchers in the domestic pipeline; β can be raised through return grants, dual appointments, and recognition of overseas experience in domestic hiring. h_D responds to doctoral and postdoctoral training expansion, including the 2026 AI for Science (SPREAD) programme if it is used to create independent labs with their own budgets rather than merely increasing headcount. p_D depends on tenure-track conversion, startup packages, and project-based PI status for mid-career researchers. d, the dropout rate to L, can be lowered through childcare support, dual-career accommodation, and stable non-tenure research tracks. Finally, I0 captures the pure exogenous entry flow and can be supported by research-master pipelines, undergraduate research programmes, and early doctoral fellowships. Weakening the Japanese civilisation would not be neutral for the rest of the world: it would remove a distinct institutional lineage, reduce the pool of non-Anglophone problem framings, and leave a range of health, ageing, robotics, and materials problems under-addressed. Maintaining Japan as a viable AI/ML civilisation is therefore in the global interest, not only in Japan's national interest.</w:t>
+        <w:t>Japan is the clearest example among the large civilisations. Its fitted active-pool margin is T=207 researchers, with M=50 (T/M=4.10). Figure 8 (reproduced below) shows that Japan's closest PNR is the exogenous entry rate I0: if I0 fell to 24.4% of its current level, the active pool would reach the minimum viable threshold. The same figure shows that Japan's early-career outflow α (0.033) and domestic PI promotion p_D (0.042) are comparatively low, while return from abroad β (0.110) and domestic hit generation h_D (0.109) are moderate. These numbers translate directly into policy levers. α can be reduced by expanding postdoctoral fellowships and junior-faculty positions that keep promising researchers in the domestic pipeline; β can be raised through return grants, dual appointments, and recognition of overseas experience in domestic hiring. h_D responds to doctoral and postdoctoral training expansion, including the 2026 AI for Science (SPREAD) programme if it is used to create independent labs with their own budgets rather than merely increasing headcount. p_D depends on tenure-track conversion, startup packages, and project-based PI status for mid-career researchers. d, the dropout rate to L, can be lowered through childcare support, dual-career accommodation, and stable non-tenure research tracks. Finally, I0 captures the pure exogenous entry flow and can be supported by research-master pipelines, undergraduate research programmes, and early doctoral fellowships. Weakening the Japanese civilisation would not be neutral for the rest of the world: it would remove a distinct institutional lineage, reduce the pool of non-Anglophone problem framings, and leave a range of health, ageing, robotics, and materials problems under-addressed. Maintaining Japan as a viable AI/ML civilisation is therefore in the global interest, not only in Japan's national interest.</w:t>
       </w:r>
     </w:p>
     <w:p>
@@ -9060,7 +9065,7 @@
     </w:p>
     <w:p>
       <w:r>
-        <w:t>The policy implications can be read as an early-warning architecture. A single dashboard that tracks the fitted transition rates, their bootstrap uncertainty, and the distance to M for each civilisation would allow policymakers to detect divergence before a community enters an irreversible decline. Interventions can then be calibrated to maintain a minimum safety margin rather than to maximise any one stock. This is the operational meaning of early intervention: not a forecast that a particular collapse will occur, but a structured way to keep the system away from a point of no return. It also frames high-skilled mobility as a strategic competition among jurisdictions for talent</w:t>
+        <w:t>The policy implications can be read as an early-warning architecture. A single dashboard that tracks the fitted transition rates, their bootstrap uncertainty, and the distance to M for each civilisation would allow policymakers to detect divergence before a community enters an irreversible decline. Interventions can then be calibrated to maintain a minimum safety margin rather than to maximise any one stock. This is the operational meaning of early intervention: not a forecast that a particular collapse will occur, but a structured way to keep the system away from a PNR. It also frames high-skilled mobility as a strategic competition among jurisdictions for talent</w:t>
       </w:r>
       <w:r>
         <w:rPr>
@@ -9078,7 +9083,7 @@
         <w:t xml:space="preserve"> [15]</w:t>
       </w:r>
       <w:r>
-        <w:t>. If the dt of policy response is short enough, the model can be updated annually and divergence caught early, before any single civilisation approaches a point of no return. This is the mechanism through which technology monopoly, hegemonic concentration and oligopoly dead-ends can be avoided: by keeping every major research community above its minimum viable coauthor pool, the framework sustains the competitive diversity that underpins long-run technological progress. The framework is therefore not a prediction that a particular civilisation will collapse. It is a tool for ensuring that no single civilisation reaches a point where its collapse becomes self-sustaining, and that the global AI/ML system retains the diversity required for continued innovation. This is precisely what Sustaining Heterogeneity through Interventions in Global AI/ML Researcher Mobility: A Transition-Rate Framework sets out to do: sustain civilisational diversity through interventions in global AI/ML researcher mobility. We introduce the acronym SHIGA here; it is formed from the title and also reflects the research base at Shiga University.</w:t>
+        <w:t>. If the dt of policy response is short enough, the model can be updated annually and divergence caught early, before any single civilisation approaches a PNR. This is the mechanism through which technology monopoly, hegemonic concentration and oligopoly dead-ends can be avoided: by keeping every major research community above its minimum viable coauthor pool, the framework sustains the competitive diversity that underpins long-run technological progress. The framework is therefore not a prediction that a particular civilisation will collapse. It is a tool for ensuring that no single civilisation reaches a point where its collapse becomes self-sustaining, and that the global AI/ML system retains the diversity required for continued innovation. This is precisely what Sustaining Heterogeneity through Interventions in Global AI/ML Researcher Mobility: A Transition-Rate Framework sets out to do: sustain civilisational diversity through interventions in global AI/ML researcher mobility. We introduce the acronym SHIGA here; it is formed from the title and also reflects the research base at Shiga University.</w:t>
       </w:r>
     </w:p>
     <w:p>
@@ -9096,7 +9101,7 @@
     </w:p>
     <w:p>
       <w:r>
-        <w:t>The correction pressures are not ad hoc adjustments; each maps to a known statistical or dynamical constraint. Laplace smoothing is equivalent to a weak Dirichlet prior on a multinomial transition vector; it guarantees that no cell has zero estimated probability and shrinks rare transitions toward the simplex centroid. Clipping projected rates to values between 0 and 1 is a feasibility constraint on probabilities; the dropout cap is a cross-sectional constraint that prevents projected attrition from exceeding the observed stock; and the inflow apportionment constraint keeps the composition of new entrants equal to the last observed recruitment pattern. In the 2017-2023 projection these pressures reduced the sensitivity of the forecast to sparse cells and to short-run fluctuations in small groups. Quantitatively, the overall RMSE of 3.35 and conservative MAPE of 42.5% are consistent with a model that is deliberately regularised rather than optimised for in-sample fit. The residual errors are concentrated in the smallest compartments, which is exactly where smoothing is most active and where future data will be most valuable.</w:t>
+        <w:t>The correction pressures are not ad hoc adjustments; each maps to a known statistical or dynamical constraint. Laplace smoothing is equivalent to a weak Dirichlet prior on a multinomial transition vector; it guarantees that no cell has zero estimated probability and shrinks rare transitions toward the simplex centroid. Clipping projected rates to values between 0 and 1 is a feasibility constraint on probabilities; the dropout cap is a cross-sectional constraint that prevents projected attrition from exceeding the observed stock; and the inflow apportionment constraint keeps the composition of new entrants equal to the last observed recruitment pattern. In the 2017-2023 projection these pressures reduced the sensitivity of the forecast to sparse cells and to short-run fluctuations in small groups. Quantitatively, the overall RMSE of 3.35 and conservative MAPE of 42.5% are consistent with a model that is deliberately regularised rather than optimised for in-sample fit. The high MAPE is driven by sparse compartments and zero-observed cells; the projection is therefore appropriate for monitoring directional drift and proximity to the PNR, not for precise count forecasting. The residual errors are concentrated in the smallest compartments, which is exactly where smoothing is most active and where future data will be most valuable.</w:t>
       </w:r>
     </w:p>
     <w:p>
@@ -9158,7 +9163,7 @@
     </w:p>
     <w:p>
       <w:r>
-        <w:t>We have proposed and implemented a transition-rate framework for assessing how close AI/ML research communities are to a point of no return. The model converts OpenAlex publication records into civilisation-specific transition rates and solves for the equilibrium active researcher pool. All groups remain above their minimum viable coauthor threshold in the fitted model, but the distance to that threshold varies by an order of magnitude and is most sensitive to exogenous entry and dropout. Dropout is the dominant negative lever (active-pool elasticity -2.32 to -2.01), and a simulated reduction is the single most efficient model-implied response for every civilisation. However, the closest point of no return is exogenous entry for all groups in the active-pool analysis, which means that policies which sustain the pipeline of new researchers are first-order defences. The historical counterfactual and the bootstrap intervals remind us that the future is not determined by current rates; transition rates can change, and policy can be directed at the most fragile lever before a collapse.</w:t>
+        <w:t>We have proposed and implemented a transition-rate framework for assessing how close AI/ML research communities are to a PNR. The model converts OpenAlex publication records into civilisation-specific transition rates and solves for the equilibrium active researcher pool. All groups remain above their minimum viable coauthor threshold in the fitted model, but the distance to that threshold varies by an order of magnitude and is most sensitive to exogenous entry and dropout. Dropout is the dominant negative lever (active-pool elasticity -2.32 to -2.01), and a simulated reduction is the single most efficient model-implied response for every civilisation. However, the closest PNR is exogenous entry for all groups in the active-pool analysis, which means that policies which sustain the pipeline of new researchers are first-order defences. The historical counterfactual and the bootstrap intervals remind us that the future is not determined by current rates; transition rates can change, and policy can be directed at the most fragile lever before a collapse.</w:t>
       </w:r>
     </w:p>
     <w:p>

</xml_diff>

<commit_message>
doc(6.7): add China/Taiwan grouping caveat as a limitation example
Co-Authored-By: Tatsuki Onishi <bougtoir@gmail.com>
</commit_message>
<xml_diff>
--- a/researcher_mobility_ode/docs/manuscript_full_article.docx
+++ b/researcher_mobility_ode/docs/manuscript_full_article.docx
@@ -28,7 +28,7 @@
         <w:jc w:val="center"/>
       </w:pPr>
       <w:r>
-        <w:t>Approximate word count (main text incl. tables, excl. references): 10754</w:t>
+        <w:t>Approximate word count (main text incl. tables, excl. references): 10809</w:t>
       </w:r>
     </w:p>
     <w:p>
@@ -9140,7 +9140,7 @@
     </w:p>
     <w:p>
       <w:r>
-        <w:t>Several limitations should be acknowledged. OpenAlex affiliation and country assignments are noisy, especially for researchers with multiple affiliations. The civilisation grouping is a coarse aggregation; within-group heterogeneity is substantial. The annual model relies on a discrete approximation of the continuous-time ODE and does not capture within-year events or cross-civilisation spillovers. Inter-civilisation flows are approximated by the author's recent_group while abroad, which misses year-to-year destination switching. The cohort sample is small; the absolute equilibrium numbers should be interpreted as model-implied stocks rather than as census counts. Authors with many publications are over-weighted relative to one-publication authors, so rate estimates reflect author-publication exposure rather than a uniformly representative sample of individuals. The endogenous inflow is capped at a safety factor of 0.50 relative to the critical reproduction rate; alternative values would shift equilibrium levels and should be reported in future sensitivity tables. Finally, the point-of-no-return threshold is a sufficient condition for collapse, not a necessary one: a community may decline for reasons outside the model even if T remains above M.</w:t>
+        <w:t>Several limitations should be acknowledged. OpenAlex affiliation and country assignments are noisy, especially for researchers with multiple affiliations. The civilisation grouping is a coarse aggregation; within-group heterogeneity is substantial. The annual model relies on a discrete approximation of the continuous-time ODE and does not capture within-year events or cross-civilisation spillovers. Inter-civilisation flows are approximated by the author's recent_group while abroad, which misses year-to-year destination switching. The civilisation label is a pragmatic aggregation of publication-affiliation patterns and does not resolve contested cultural or political boundaries; for example, China and Taiwan share cultural and historical ties but currently operate as separate research arenas in the OpenAlex country metadata, and this distinction is treated as an empirical classification rather than a normative claim. The cohort sample is small; the absolute equilibrium numbers should be interpreted as model-implied stocks rather than as census counts. Authors with many publications are over-weighted relative to one-publication authors, so rate estimates reflect author-publication exposure rather than a uniformly representative sample of individuals. The endogenous inflow is capped at a safety factor of 0.50 relative to the critical reproduction rate; alternative values would shift equilibrium levels and should be reported in future sensitivity tables. Finally, the point-of-no-return threshold is a sufficient condition for collapse, not a necessary one: a community may decline for reasons outside the model even if T remains above M.</w:t>
       </w:r>
     </w:p>
     <w:p>

</xml_diff>

<commit_message>
doc(6.7): neutralise civilisation-boundary limitation note (China/Taiwan example)
Co-Authored-By: Tatsuki Onishi <bougtoir@gmail.com>
</commit_message>
<xml_diff>
--- a/researcher_mobility_ode/docs/manuscript_full_article.docx
+++ b/researcher_mobility_ode/docs/manuscript_full_article.docx
@@ -28,7 +28,7 @@
         <w:jc w:val="center"/>
       </w:pPr>
       <w:r>
-        <w:t>Approximate word count (main text incl. tables, excl. references): 10809</w:t>
+        <w:t>Approximate word count (main text incl. tables, excl. references): 10822</w:t>
       </w:r>
     </w:p>
     <w:p>
@@ -9140,7 +9140,7 @@
     </w:p>
     <w:p>
       <w:r>
-        <w:t>Several limitations should be acknowledged. OpenAlex affiliation and country assignments are noisy, especially for researchers with multiple affiliations. The civilisation grouping is a coarse aggregation; within-group heterogeneity is substantial. The annual model relies on a discrete approximation of the continuous-time ODE and does not capture within-year events or cross-civilisation spillovers. Inter-civilisation flows are approximated by the author's recent_group while abroad, which misses year-to-year destination switching. The civilisation label is a pragmatic aggregation of publication-affiliation patterns and does not resolve contested cultural or political boundaries; for example, China and Taiwan share cultural and historical ties but currently operate as separate research arenas in the OpenAlex country metadata, and this distinction is treated as an empirical classification rather than a normative claim. The cohort sample is small; the absolute equilibrium numbers should be interpreted as model-implied stocks rather than as census counts. Authors with many publications are over-weighted relative to one-publication authors, so rate estimates reflect author-publication exposure rather than a uniformly representative sample of individuals. The endogenous inflow is capped at a safety factor of 0.50 relative to the critical reproduction rate; alternative values would shift equilibrium levels and should be reported in future sensitivity tables. Finally, the point-of-no-return threshold is a sufficient condition for collapse, not a necessary one: a community may decline for reasons outside the model even if T remains above M.</w:t>
+        <w:t>Several limitations should be acknowledged. OpenAlex affiliation and country assignments are noisy, especially for researchers with multiple affiliations. The civilisation grouping is a coarse aggregation; within-group heterogeneity is substantial. The annual model relies on a discrete approximation of the continuous-time ODE and does not capture within-year events or cross-civilisation spillovers. Inter-civilisation flows are approximated by the author's recent_group while abroad, which misses year-to-year destination switching. The civilisation label is a pragmatic aggregation of publication-affiliation patterns. Historical civilisational boundaries do not necessarily coincide with contemporary political or value-based boundaries; for example, the Sinic grouping reflects current OpenAlex country metadata and does not resolve the cultural and historical ties between mainland China and Taiwan, which currently appear as separate research arenas. This is treated as an empirical limitation of the classification, not as a normative claim.The cohort sample is small; the absolute equilibrium numbers should be interpreted as model-implied stocks rather than as census counts. Authors with many publications are over-weighted relative to one-publication authors, so rate estimates reflect author-publication exposure rather than a uniformly representative sample of individuals. The endogenous inflow is capped at a safety factor of 0.50 relative to the critical reproduction rate; alternative values would shift equilibrium levels and should be reported in future sensitivity tables. Finally, the point-of-no-return threshold is a sufficient condition for collapse, not a necessary one: a community may decline for reasons outside the model even if T remains above M.</w:t>
       </w:r>
     </w:p>
     <w:p>

</xml_diff>

<commit_message>
doc(6.7): clarify that historical vs contemporary boundary mapping of idea diversity is unresolved
Co-Authored-By: Tatsuki Onishi <bougtoir@gmail.com>
</commit_message>
<xml_diff>
--- a/researcher_mobility_ode/docs/manuscript_full_article.docx
+++ b/researcher_mobility_ode/docs/manuscript_full_article.docx
@@ -28,7 +28,7 @@
         <w:jc w:val="center"/>
       </w:pPr>
       <w:r>
-        <w:t>Approximate word count (main text incl. tables, excl. references): 10822</w:t>
+        <w:t>Approximate word count (main text incl. tables, excl. references): 10847</w:t>
       </w:r>
     </w:p>
     <w:p>
@@ -9140,7 +9140,7 @@
     </w:p>
     <w:p>
       <w:r>
-        <w:t>Several limitations should be acknowledged. OpenAlex affiliation and country assignments are noisy, especially for researchers with multiple affiliations. The civilisation grouping is a coarse aggregation; within-group heterogeneity is substantial. The annual model relies on a discrete approximation of the continuous-time ODE and does not capture within-year events or cross-civilisation spillovers. Inter-civilisation flows are approximated by the author's recent_group while abroad, which misses year-to-year destination switching. The civilisation label is a pragmatic aggregation of publication-affiliation patterns. Historical civilisational boundaries do not necessarily coincide with contemporary political or value-based boundaries; for example, the Sinic grouping reflects current OpenAlex country metadata and does not resolve the cultural and historical ties between mainland China and Taiwan, which currently appear as separate research arenas. This is treated as an empirical limitation of the classification, not as a normative claim.The cohort sample is small; the absolute equilibrium numbers should be interpreted as model-implied stocks rather than as census counts. Authors with many publications are over-weighted relative to one-publication authors, so rate estimates reflect author-publication exposure rather than a uniformly representative sample of individuals. The endogenous inflow is capped at a safety factor of 0.50 relative to the critical reproduction rate; alternative values would shift equilibrium levels and should be reported in future sensitivity tables. Finally, the point-of-no-return threshold is a sufficient condition for collapse, not a necessary one: a community may decline for reasons outside the model even if T remains above M.</w:t>
+        <w:t>Several limitations should be acknowledged. OpenAlex affiliation and country assignments are noisy, especially for researchers with multiple affiliations. The civilisation grouping is a coarse aggregation; within-group heterogeneity is substantial. The annual model relies on a discrete approximation of the continuous-time ODE and does not capture within-year events or cross-civilisation spillovers. Inter-civilisation flows are approximated by the author's recent_group while abroad, which misses year-to-year destination switching. The civilisation label is a pragmatic aggregation of publication-affiliation patterns. Historical civilisational boundaries do not necessarily coincide with contemporary political or value-based boundaries, and this study cannot determine whether the diversity of research ideas maps more closely onto historical civilisational groupings or onto current political and value communities; for example, the Sinic grouping reflects current OpenAlex country metadata and does not resolve the cultural and historical ties between mainland China and Taiwan, which currently appear as separate research arenas. This is treated as an empirical limitation of the classification, not as a normative claim.The cohort sample is small; the absolute equilibrium numbers should be interpreted as model-implied stocks rather than as census counts. Authors with many publications are over-weighted relative to one-publication authors, so rate estimates reflect author-publication exposure rather than a uniformly representative sample of individuals. The endogenous inflow is capped at a safety factor of 0.50 relative to the critical reproduction rate; alternative values would shift equilibrium levels and should be reported in future sensitivity tables. Finally, the point-of-no-return threshold is a sufficient condition for collapse, not a necessary one: a community may decline for reasons outside the model even if T remains above M.</w:t>
       </w:r>
     </w:p>
     <w:p>

</xml_diff>

<commit_message>
fix(3.x): align cohort inclusion and variable thresholds with extraction code (>=10 works, PI>=6 authors, 6/8-year windows)
Co-Authored-By: Tatsuki Onishi <bougtoir@gmail.com>
</commit_message>
<xml_diff>
--- a/researcher_mobility_ode/docs/manuscript_full_article.docx
+++ b/researcher_mobility_ode/docs/manuscript_full_article.docx
@@ -28,7 +28,7 @@
         <w:jc w:val="center"/>
       </w:pPr>
       <w:r>
-        <w:t>Approximate word count (main text incl. tables, excl. references): 10847</w:t>
+        <w:t>Approximate word count (main text incl. tables, excl. references): 10985</w:t>
       </w:r>
     </w:p>
     <w:p>
@@ -497,7 +497,7 @@
         <w:t xml:space="preserve"> [6]</w:t>
       </w:r>
       <w:r>
-        <w:t>. OpenAlex provides open, CC0 bibliographic metadata including authors, affiliations, countries, publication dates, venues and citation links. We built author histories by following each author's sequence of works and affiliations, assigning them to a country for each work and then to a civilisation by the modal country of their recorded affiliations. An author is treated as active if they have at least one AI/ML work in the observation window and as a principal investigator (PI) if they appear as the last author of at least one work, a standard proxy for seniority in empirical science</w:t>
+        <w:t>. OpenAlex provides open, CC0 bibliographic metadata including authors, affiliations, countries, publication dates, venues and citation links. We built author histories by following each author's sequence of works and affiliations, assigning them to a country for each work and then to a civilisation by the modal country of their recorded affiliations. The cohort is restricted to authors whose career-start year (first observed AI/ML publication year) is between 2000 and 2016 and who have at least ten AI/ML works in the 2000-2023 window. An author is treated as active if they have at least one AI/ML work in 2020-2023, and as having dropped out otherwise. An author is classified as a principal investigator (PI) if their first last-author paper has at least six authors, a standard bibliometric proxy for seniority in empirical science</w:t>
       </w:r>
       <w:r>
         <w:rPr>
@@ -506,7 +506,7 @@
         <w:t xml:space="preserve"> [3]</w:t>
       </w:r>
       <w:r>
-        <w:t>. A 'hit' work is defined as one whose citation count places it in the top 10% of AI/ML works in the same publication year. The final groups are: United States, Anglosphere ex-US, Continental Europe, Sinic, Japanese, Hindu, Islamic, Other Western, and Other Civilizations.</w:t>
+        <w:t>. A 'hit' work is a non-last-author paper whose citation count places it in the top 10% of AI/ML works in the same publication year, observed within the first eight career years. The abroad flag is set if the author is affiliated with a non-origin civilisation within the first six career years. The final groups are: United States, Anglosphere ex-US, Continental Europe, Sinic, Japanese, Hindu, Islamic, Other Western, and Other Civilizations.</w:t>
       </w:r>
     </w:p>
     <w:p>
@@ -532,7 +532,7 @@
     </w:p>
     <w:p>
       <w:r>
-        <w:t>The cohort is restricted to authors with at least two AI/ML works and a non-missing career-start year between 2000 and 2016. The career-start year is the first observed AI/ML publication year. Authors with exclusively unknown affiliations or with all affiliations outside the mapped countries are excluded. For each author we record the country of the majority of their affiliations and the civilisation to which that country maps. Works with more than 100 authors are excluded to avoid distorting coauthor counts. The final sample is small relative to the global AI/ML workforce because the objective is to build a reproducible pipeline and demonstrate the transition-rate framework, not to provide a complete census.</w:t>
+        <w:t>Authors enter the cohort if their first observed AI/ML publication year is between 2000 and 2016 and they have at least ten AI/ML works in the 2000-2023 observation window. The career-start year is the first observed AI/ML publication year. Authors with exclusively unknown affiliations or with all affiliations outside the mapped countries are excluded. For each author we record the country of the majority of their affiliations and the civilisation to which that country maps. An author is active if they have at least one AI/ML work in 2020-2023; otherwise they are recorded as having dropped out. A hit is a non-last-author paper in the top 10% of AI/ML citations for its publication year, observed within the first eight career years. A PI is an author whose first last-author paper has at least six authors. The abroad flag is set if the author appears in a non-origin civilisation within the first six career years. The final sample is small relative to the global AI/ML workforce because the objective is to build a reproducible pipeline and demonstrate the transition-rate framework, not to provide a complete census.</w:t>
       </w:r>
     </w:p>
     <w:p>

</xml_diff>

<commit_message>
fix(manuscript): remove duplicate Figure 8 and unify abbreviation introductions
- Define all abbreviations (AI/ML, PI, PNR, ODE, I0, r, RMSE, MAPE) with full spelling followed by abbreviation in parentheses at first use in Abstract and main text.

- Remove the duplicated Figure 8 image/caption from the Discussion.

- Regenerate manuscript_full_article.md, .docx, _figures.pptx, and _submission.zip.

Co-Authored-By: Tatsuki Onishi <bougtoir@gmail.com>
</commit_message>
<xml_diff>
--- a/researcher_mobility_ode/docs/manuscript_full_article.docx
+++ b/researcher_mobility_ode/docs/manuscript_full_article.docx
@@ -28,7 +28,7 @@
         <w:jc w:val="center"/>
       </w:pPr>
       <w:r>
-        <w:t>Approximate word count (main text incl. tables, excl. references): 11096</w:t>
+        <w:t>Approximate word count (main text incl. tables, excl. references): 11108</w:t>
       </w:r>
     </w:p>
     <w:p>
@@ -54,7 +54,7 @@
     </w:p>
     <w:p>
       <w:r>
-        <w:t>Artificial intelligence (AI) and machine learning (ML) research is increasingly concentrated in a few regions, raising the risk that smaller research communities fall below a minimum viable coauthor pool and cannot recover. We model each civilisation as a six-compartment system of domestic and abroad early-career, high-impact, and principal-investigator researchers, and estimate transition rates from OpenAlex Artificial Intelligence works (subfield 1702). The minimum viable coauthor threshold is defined as M = k × c_bar, where c_bar is the mean number of authors per work and k is the median number of distinct last-author groups observed per recent year. Across 9 groups, equilibrium domestic active pools remain above their thresholds, but the closest point of no return (PNR) is observed for the Other Western group, where I0 must be multiplied by 0.345× its current value (equivalent to a 65% proportional reduction) to drive the active pool to its threshold. A simulated reduction in dropout yields the largest margin gain per unit proportional change in every group in the fitted model. The 2017-2023 out-of-sample projection records RMSE 12822.49 and a conservative, non-standard MAPE of 159.6% (computed against count_obs + 1 to avoid division by zero). That level of error is expected because the projection is designed as an early-warning indicator of directional drift and threshold crossing, not as a precise population forecast. Historical and saturating-inflow counterfactuals show that the model is most sensitive to exogenous entry and attrition. These results provide a quantitative framework for early, safety-factor-bound policy scenarios that preserve civilisational diversity in AI/ML research.</w:t>
+        <w:t>Artificial intelligence (AI) and machine learning (ML) research is increasingly concentrated in a few regions, raising the risk that smaller research communities fall below a minimum viable coauthor pool and cannot recover. We model each civilisation as a six-compartment system of domestic and abroad early-career, high-impact, and principal-investigator (PI) researchers, and estimate transition rates from OpenAlex Artificial Intelligence works (subfield 1702). The minimum viable coauthor threshold is defined as M = k × c_bar, where c_bar is the mean number of authors per work and k is the median number of distinct last-author groups observed per recent year. Across 9 groups, equilibrium domestic active pools remain above their thresholds, but the closest point of no return (PNR) is observed for the Other Western group, where the exogenous entry rate (I0) must be multiplied by 0.345× its current value (equivalent to a 65% proportional reduction) to drive the active pool to its threshold. A simulated reduction in dropout yields the largest margin gain per unit proportional change in every group in the fitted model. The 2017-2023 out-of-sample projection records root mean square error (RMSE) 12822.49 and a conservative, non-standard mean absolute percentage error (MAPE) of 159.6% (computed against count_obs + 1 to avoid division by zero). That level of error is expected because the projection is designed as an early-warning indicator of directional drift and threshold crossing, not as a precise population forecast. Historical and saturating-inflow counterfactuals show that the model is most sensitive to exogenous entry and attrition. These results provide a quantitative framework for early, safety-factor-bound policy scenarios that preserve civilisational diversity in AI/ML research.</w:t>
       </w:r>
     </w:p>
     <w:p>
@@ -180,7 +180,7 @@
     </w:p>
     <w:p>
       <w:r>
-        <w:t>Artificial intelligence and machine learning have become the archetypal general-purpose technologies of the current era</w:t>
+        <w:t>Artificial intelligence (AI) and machine learning (ML) have become the archetypal general-purpose technologies of the current era</w:t>
       </w:r>
       <w:r>
         <w:rPr>
@@ -189,7 +189,7 @@
         <w:t xml:space="preserve"> [1]</w:t>
       </w:r>
       <w:r>
-        <w:t>, and their development depends on a relatively small, highly mobile workforce of doctoral and post-doctoral researchers, principal investigators, and research engineers</w:t>
+        <w:t>, and their development depends on a relatively small, highly mobile workforce of doctoral and post-doctoral researchers, principal investigators (PIs), and research engineers</w:t>
       </w:r>
       <w:r>
         <w:rPr>
@@ -263,7 +263,7 @@
     </w:p>
     <w:p>
       <w:r>
-        <w:t>The contribution is a reproducible, data-driven transition-rate model that links OpenAlex publication records to a system of ordinary differential equations</w:t>
+        <w:t>The contribution is a reproducible, data-driven transition-rate model that links OpenAlex publication records to a system of ordinary differential equations (ODEs)</w:t>
       </w:r>
       <w:r>
         <w:rPr>
@@ -1896,7 +1896,7 @@
         </m:sSub>
       </m:oMath>
       <w:r>
-        <w:t xml:space="preserve">, with r capped at 0.31× the stability-critical value (safety factor 0.31). A saturating alternative, </w:t>
+        <w:t xml:space="preserve">, where I_0 is the exogenous entry rate, r is the PI reproduction rate, and r is capped at 0.31× the stability-critical value (safety factor 0.31). A saturating alternative, </w:t>
       </w:r>
       <m:oMath>
         <m:func>
@@ -2139,7 +2139,7 @@
     </w:p>
     <w:p>
       <w:r>
-        <w:t>We compare the 2017-2023 projection with the observed annual stock. The comparison is limited to years that have observed data, and the observed stock is reindexed to the full group-year-compartment grid so that zero-observed cells are not omitted from the accuracy metrics. Accuracy is reported as RMSE and MAPE; MAPE here is computed against count_obs + 1 to avoid division by zero and is therefore a conservative, non-standard measure.</w:t>
+        <w:t>We compare the 2017-2023 projection with the observed annual stock. The comparison is limited to years that have observed data, and the observed stock is reindexed to the full group-year-compartment grid so that zero-observed cells are not omitted from the accuracy metrics. Accuracy is reported as root mean square error (RMSE) and mean absolute percentage error (MAPE); MAPE here is computed against count_obs + 1 to avoid division by zero and is therefore a conservative, non-standard measure.</w:t>
       </w:r>
     </w:p>
     <w:p>
@@ -9509,54 +9509,7 @@
     </w:p>
     <w:p>
       <w:r>
-        <w:t>Japan is the clearest example among the large civilisations. Its fitted active-pool margin is T=29041 researchers, with M=1793 (T/M=16.20). Figure 8 (reproduced below) shows that Japan's closest PNR is the exogenous entry rate I0: if I0 fell to 6.2% of its current level, the active pool would reach the minimum viable threshold. The same figure shows that Japan's early-career outflow α (0.028) and domestic PI promotion p_D (0.050) are comparatively low, while return from abroad β (0.028) and domestic hit generation h_D (0.031) are moderate. These numbers translate directly into policy levers. α can be reduced by expanding postdoctoral fellowships and junior-faculty positions that keep promising researchers in the domestic pipeline; β can be raised through return grants, dual appointments, and recognition of overseas experience in domestic hiring. h_D responds to doctoral and postdoctoral training expansion, including the 2026 AI for Science (SPREAD) programme if it is used to create independent labs with their own budgets rather than merely increasing headcount. p_D depends on tenure-track conversion, startup packages, and project-based PI status for mid-career researchers. d, the dropout rate to L, can be lowered through childcare support, dual-career accommodation, and stable non-tenure research tracks. Finally, I0 captures the pure exogenous entry flow and can be supported by research-master pipelines, undergraduate research programmes, and early doctoral fellowships. Weakening the Japanese civilisation would not be neutral for the rest of the world: it would remove a distinct institutional lineage, reduce the pool of non-Anglophone problem framings, and leave a range of health, ageing, robotics, and materials problems under-addressed. Maintaining Japan as a viable AI/ML civilisation is therefore in the global interest, not only in Japan's national interest.</w:t>
-      </w:r>
-    </w:p>
-    <w:p>
-      <w:r>
-        <w:drawing>
-          <wp:inline xmlns:a="http://schemas.openxmlformats.org/drawingml/2006/main" xmlns:pic="http://schemas.openxmlformats.org/drawingml/2006/picture">
-            <wp:extent cx="4572000" cy="2521837"/>
-            <wp:docPr id="10" name="Picture 10"/>
-            <wp:cNvGraphicFramePr>
-              <a:graphicFrameLocks noChangeAspect="1"/>
-            </wp:cNvGraphicFramePr>
-            <a:graphic>
-              <a:graphicData uri="http://schemas.openxmlformats.org/drawingml/2006/picture">
-                <pic:pic>
-                  <pic:nvPicPr>
-                    <pic:cNvPr id="0" name="fig8_japan_compartment_flow.png"/>
-                    <pic:cNvPicPr/>
-                  </pic:nvPicPr>
-                  <pic:blipFill>
-                    <a:blip r:embed="rId16"/>
-                    <a:stretch>
-                      <a:fillRect/>
-                    </a:stretch>
-                  </pic:blipFill>
-                  <pic:spPr>
-                    <a:xfrm>
-                      <a:off x="0" y="0"/>
-                      <a:ext cx="4572000" cy="2521837"/>
-                    </a:xfrm>
-                    <a:prstGeom prst="rect"/>
-                  </pic:spPr>
-                </pic:pic>
-              </a:graphicData>
-            </a:graphic>
-          </wp:inline>
-        </w:drawing>
-      </w:r>
-    </w:p>
-    <w:p>
-      <w:pPr>
-        <w:jc w:val="center"/>
-      </w:pPr>
-      <w:r>
-        <w:rPr>
-          <w:i/>
-        </w:rPr>
-        <w:t>Figure 8 (reproduced). Japan in the six-compartment model, with cross-civilisation transition-rate ladders.</w:t>
+        <w:t>Japan is the clearest example among the large civilisations. Its fitted active-pool margin is T=29041 researchers, with M=1793 (T/M=16.20). As Figure 8 shows, Japan's closest PNR is the exogenous entry rate I0: if I0 fell to 6.2% of its current level, the active pool would reach the minimum viable threshold. The same figure shows that Japan's early-career outflow α (0.028) and domestic PI promotion p_D (0.050) are comparatively low, while return from abroad β (0.028) and domestic hit generation h_D (0.031) are moderate. These numbers translate directly into policy levers. α can be reduced by expanding postdoctoral fellowships and junior-faculty positions that keep promising researchers in the domestic pipeline; β can be raised through return grants, dual appointments, and recognition of overseas experience in domestic hiring. h_D responds to doctoral and postdoctoral training expansion, including the 2026 AI for Science (SPREAD) programme if it is used to create independent labs with their own budgets rather than merely increasing headcount. p_D depends on tenure-track conversion, startup packages, and project-based PI status for mid-career researchers. d, the dropout rate to L, can be lowered through childcare support, dual-career accommodation, and stable non-tenure research tracks. Finally, I0 captures the pure exogenous entry flow and can be supported by research-master pipelines, undergraduate research programmes, and early doctoral fellowships. Weakening the Japanese civilisation would not be neutral for the rest of the world: it would remove a distinct institutional lineage, reduce the pool of non-Anglophone problem framings, and leave a range of health, ageing, robotics, and materials problems under-addressed. Maintaining Japan as a viable AI/ML civilisation is therefore in the global interest, not only in Japan's national interest.</w:t>
       </w:r>
     </w:p>
     <w:p>

</xml_diff>

<commit_message>
fix(manuscript): unify docx/md builder, reduce word count under 10k, add blinded and supplementary variants, fix section numbering and PNR reframing
Co-Authored-By: Tatsuki Onishi <bougtoir@gmail.com>
</commit_message>
<xml_diff>
--- a/researcher_mobility_ode/docs/manuscript_full_article.docx
+++ b/researcher_mobility_ode/docs/manuscript_full_article.docx
@@ -28,7 +28,7 @@
         <w:jc w:val="center"/>
       </w:pPr>
       <w:r>
-        <w:t>Approximate word count (main text incl. tables, excl. references): 11120</w:t>
+        <w:t>Approximate word count (main text incl. tables, excl. references): 9689</w:t>
       </w:r>
     </w:p>
     <w:p>
@@ -36,7 +36,7 @@
         <w:jc w:val="center"/>
       </w:pPr>
       <w:r>
-        <w:t>Corresponding author: [To be completed / removed for double-blind review]</w:t>
+        <w:t>Corresponding author: [To be completed]</w:t>
       </w:r>
     </w:p>
     <w:p>
@@ -110,7 +110,7 @@
     </w:p>
     <w:p>
       <w:r>
-        <w:t>This study uses publication metadata from the OpenAlex API (subfield 1702, Artificial Intelligence; 2000–2023). The extraction and analysis code, the country-to-civilisation mapping, and the result CSVs used to generate this manuscript are available in the public GitHub repository https://github.com/bougtoir/researcher-mobility-ode. OpenAlex data are released under CC0.</w:t>
+        <w:t>This study uses the OpenAlex database (subfield 1702, Artificial Intelligence; 2000–2023), accessed via the OpenAlex API and a full-work local snapshot in August 2026. The country-to-civilisation mapping, extraction and analysis code, and the result CSVs used to generate this manuscript are available in the public GitHub repository https://github.com/bougtoir/researcher-mobility-ode. OpenAlex data are released under CC0.</w:t>
       </w:r>
     </w:p>
     <w:p>
@@ -129,7 +129,7 @@
         <w:t xml:space="preserve">Funding: </w:t>
       </w:r>
       <w:r>
-        <w:t>[To be completed / removed for double-blind review]</w:t>
+        <w:t>[To be completed]</w:t>
       </w:r>
     </w:p>
     <w:p>
@@ -140,7 +140,7 @@
         <w:t xml:space="preserve">Competing interests: </w:t>
       </w:r>
       <w:r>
-        <w:t>[To be completed / removed for double-blind review]</w:t>
+        <w:t>[To be completed]</w:t>
       </w:r>
     </w:p>
     <w:p>
@@ -151,7 +151,18 @@
         <w:t xml:space="preserve">Author contributions: </w:t>
       </w:r>
       <w:r>
-        <w:t>[To be completed / removed for double-blind review]</w:t>
+        <w:t>[To be completed]</w:t>
+      </w:r>
+    </w:p>
+    <w:p>
+      <w:r>
+        <w:rPr>
+          <w:b/>
+        </w:rPr>
+        <w:t xml:space="preserve">Declaration of generative AI in scientific writing: </w:t>
+      </w:r>
+      <w:r>
+        <w:t>During the preparation of this work the authors used AI-assisted tools to draft, code, and revise the manuscript. All claims, data, and interpretations were reviewed and approved by the authors.</w:t>
       </w:r>
     </w:p>
     <w:p>
@@ -475,6 +486,33 @@
         <w:t xml:space="preserve"> [4]</w:t>
       </w:r>
       <w:r>
+        <w:t>. It also draws on the innovation-systems literature, in which technological trajectories are shaped by sectoral and national systems of innovation</w:t>
+      </w:r>
+      <w:r>
+        <w:rPr>
+          <w:vertAlign w:val="superscript"/>
+        </w:rPr>
+        <w:t xml:space="preserve"> [13]</w:t>
+      </w:r>
+      <w:r>
+        <w:rPr>
+          <w:vertAlign w:val="superscript"/>
+        </w:rPr>
+        <w:t xml:space="preserve"> [14]</w:t>
+      </w:r>
+      <w:r>
+        <w:rPr>
+          <w:vertAlign w:val="superscript"/>
+        </w:rPr>
+        <w:t xml:space="preserve"> [15]</w:t>
+      </w:r>
+      <w:r>
+        <w:rPr>
+          <w:vertAlign w:val="superscript"/>
+        </w:rPr>
+        <w:t xml:space="preserve"> [16]</w:t>
+      </w:r>
+      <w:r>
         <w:t>. The result is a framework that can be updated as new data arrive and can compare the fragility of different research communities using a common metric. Because it is built on open bibliometric data and transparent transition rates, the model can be replicated and extended by other researchers and by policymakers who need a common language for discussing mobility and capacity.</w:t>
       </w:r>
     </w:p>
@@ -532,7 +570,7 @@
     </w:p>
     <w:p>
       <w:r>
-        <w:t>Authors enter the cohort if their first observed AI/ML publication year is between 2000 and 2016 and they have at least two AI/ML works in the 2000-2023 observation window. The career-start year is the first observed AI/ML publication year. Authors with exclusively unknown affiliations or with all affiliations outside the mapped countries are excluded. For each author we record the country of the majority of their affiliations and the civilisation to which that country maps. An author is active if they have at least one AI/ML work in 2020-2023; otherwise they are recorded as having dropped out. A hit is a paper in the top 10% of AI/ML citations for its publication year, observed within the first eight career years, regardless of the author's position. A PI is an author whose first last-author paper appears during the observation window; single-authored papers are treated as last-author papers. The abroad flag is set if the author appears in a non-origin civilisation within the first six career years. The final sample is small relative to the global AI/ML workforce because the objective is to build a reproducible pipeline and demonstrate the transition-rate framework, not to provide a complete census.</w:t>
+        <w:t>Authors enter the cohort if their first observed AI/ML publication year is between 2000 and 2016 and they have at least two AI/ML works in the 2000-2023 observation window. The career-start year is the first observed AI/ML publication year. Authors with exclusively unknown affiliations or with all affiliations outside the mapped countries are excluded. For each author we record the country of the majority of their affiliations and the civilisation to which that country maps. An author is active if they have at least one AI/ML work in 2020-2023; otherwise they are recorded as having dropped out. A hit is a paper in the top 10% of AI/ML citations for its publication year, observed within the first eight career years, regardless of the author's position. A PI is an author whose first last-author paper appears during the observation window; single-authored papers are treated as last-author papers. The abroad flag is set if the author appears in a non-origin civilisation within the first six career years. The final cohort of 723,647 authors is a model-implied sample extracted from OpenAlex; the objective is to build a reproducible pipeline and demonstrate the transition-rate framework, not to provide a definitive census.</w:t>
       </w:r>
     </w:p>
     <w:p>
@@ -550,7 +588,7 @@
     </w:p>
     <w:p>
       <w:r>
-        <w:t>Table 1 reports the size and composition of the extracted cohort. The Sinic and Continental Europe groups contribute the largest number of works, followed by the United States and the Anglosphere ex-US. The Japanese and Other Western groups are the smallest in terms of author counts. The cohort is a reproducible pilot extraction; absolute counts are small because the goal is to build and demonstrate the transition-rate framework rather than to provide a definitive census of global AI/ML researchers. Consequently, the absolute equilibrium numbers should be interpreted as model-implied stocks rather than population totals, and the bootstrap intervals reported below give a more honest picture of the uncertainty around those stocks. The relative sizes are nevertheless informative. A civilisation with a small cohort but a low coauthor intensity can be more resilient than a larger civilisation with a high coauthor intensity, because the former needs fewer distinct PI groups to sustain its output. This is why the minimum viable coauthor threshold and the equilibrium active pool must be compared jointly.</w:t>
+        <w:t>Table 1 reports the size and composition of the extracted cohort. The Sinic and Continental Europe groups contribute the largest number of works, followed by the United States and the Anglosphere ex-US. The Japanese and Other Western groups are the smallest in terms of author counts. The cohort of 723,647 authors is a model-implied sample extracted from the OpenAlex snapshot; absolute counts should be interpreted as model-implied stocks rather than population totals, and the bootstrap intervals reported below give a more honest picture of the uncertainty around those stocks. The relative sizes are nevertheless informative. A civilisation with a small cohort but a low coauthor intensity can be more resilient than a larger civilisation with a high coauthor intensity, because the former needs fewer distinct PI groups to sustain its output. This is why the minimum viable coauthor threshold and the equilibrium active pool must be compared jointly.</w:t>
       </w:r>
     </w:p>
     <w:tbl>
@@ -2059,59 +2097,7 @@
         <w:pStyle w:val="Heading2"/>
       </w:pPr>
       <w:r>
-        <w:t>4.5 Historical counterfactual design</w:t>
-      </w:r>
-    </w:p>
-    <w:p>
-      <w:r>
-        <w:t>To examine whether transition rates have changed over the past two decades we split the cohort at career-start year 2010. The early window (career start 2000-2010) captures researchers whose careers were largely established before the most recent AI boom, while the late window (2011-2016) captures researchers who entered during the boom but have a shorter career span over which to estimate rates. For each window we re-estimate all transition rates and solve for the steady-state active pool. Comparing the two equilibria reveals how sensitive the long-run margin is to the observed regime, not a prediction of the actual future, because the late cohort is younger and its rates are noisier.</w:t>
-      </w:r>
-    </w:p>
-    <w:p>
-      <w:pPr>
-        <w:pStyle w:val="Heading2"/>
-      </w:pPr>
-      <w:r>
-        <w:t>4.6 Bootstrap uncertainty</w:t>
-      </w:r>
-    </w:p>
-    <w:p>
-      <w:r>
-        <w:t>We resample authors with replacement within each group to obtain 200 bootstrap replicates. For each replicate we recompute the transition rates and solve the steady-state model, recording T and P_D. The 2.5th and 97.5th percentiles of the bootstrap distribution provide 95% confidence intervals. Because the model is non-linear and the equilibrium depends on ratios of rates, the bootstrap distribution is often skewed; we report medians and percentile intervals rather than standard errors.</w:t>
-      </w:r>
-    </w:p>
-    <w:p>
-      <w:pPr>
-        <w:pStyle w:val="Heading2"/>
-      </w:pPr>
-      <w:r>
-        <w:t>4.7 Robustness checks</w:t>
-      </w:r>
-    </w:p>
-    <w:p>
-      <w:r>
-        <w:t>We assess robustness in three ways. First, we replace the linear PI-driven inflow with a saturating recruitment function that imposes diminishing returns to additional PIs. Second, we vary the cohort-split year for the historical counterfactual. Third, we examine the effect of the safety factor on the endogenous inflow parameter r, keeping the system within a bounded stability region. Across these checks the qualitative ranking of rates and the identity of the closest PNR remain stable, although the absolute equilibrium levels shift.</w:t>
-      </w:r>
-    </w:p>
-    <w:p>
-      <w:pPr>
-        <w:pStyle w:val="Heading2"/>
-      </w:pPr>
-      <w:r>
-        <w:t>4.8 Relationship to existing indicators</w:t>
-      </w:r>
-    </w:p>
-    <w:p>
-      <w:r>
-        <w:t>The model differs from conventional net-flow or stock indicators in three ways. First, a net inflow may hide a rise in the total number of researchers abroad relative to the domestic PI stock. Second, stocks such as total AI/ML publications say little about whether the domestic pipeline can sustain itself. Third, indices of international collaboration do not distinguish between temporary mobility and permanent brain drain. The transition-rate view makes each of these processes explicit and provides a stock-and-flow language that is closer to policy instruments such as doctoral funding, retention grants and diaspora networks.</w:t>
-      </w:r>
-    </w:p>
-    <w:p>
-      <w:pPr>
-        <w:pStyle w:val="Heading2"/>
-      </w:pPr>
-      <w:r>
-        <w:t>4.9 Limitations</w:t>
+        <w:t>4.5 Limitations</w:t>
       </w:r>
     </w:p>
     <w:p>
@@ -2124,12 +2110,12 @@
         <w:pStyle w:val="Heading2"/>
       </w:pPr>
       <w:r>
-        <w:t>4.10 Annual transition-rate estimation and projection</w:t>
+        <w:t>4.6 Annual transition-rate estimation and projection</w:t>
       </w:r>
     </w:p>
     <w:p>
       <w:r>
-        <w:t>The steady-state model in Sections 4.1-4.4 treats rates as constants. To test whether the same framework can be used for short-run monitoring, we reconstructed year-by-year compartment membership from cohort.csv and raw_sampled_works.json. For each author and year we inferred location as domestic if the author was in the origin civilisation and abroad otherwise, using sampled works when available and cohort-derived abroad/return years as a fallback. From these states we computed annual transition counts for the six compartments, applied Laplace +0.5 smoothing to empty destination cells, and derived the probabilities that map to α, β, h_D, h_A, p_D, p_A and d. Inter-civilisation flows are approximated by assigning each abroad author-year to the author's recent_group as the destination civilisation; this is a lower-bound proxy because year-to-year destination changes are not observed in the public cohort.</w:t>
+        <w:t>The steady-state model in Sections 4.1-4.4 treats rates as constants. To test whether the same framework can be used for short-run monitoring, we reconstructed year-by-year compartment membership from the cohort data. For each author and year we inferred location as domestic if the author was in the origin civilisation and abroad otherwise. From these states we computed annual transition counts for the six compartments, applied Laplace +0.5 smoothing to empty destination cells, and derived the probabilities that map to α, β, h_D, h_A, p_D, p_A and d. Inter-civilisation flows are approximated by assigning each abroad author-year to the author's recent_group as the destination civilisation.</w:t>
       </w:r>
     </w:p>
     <w:p>
@@ -2147,7 +2133,7 @@
         <w:pStyle w:val="Heading2"/>
       </w:pPr>
       <w:r>
-        <w:t>4.11 Correction pressures and theoretical bounds</w:t>
+        <w:t>4.7 Correction pressures and theoretical bounds</w:t>
       </w:r>
     </w:p>
     <w:p>
@@ -7327,7 +7313,7 @@
     </w:p>
     <w:p>
       <w:r>
-        <w:t>Figure 5 plots the observed 2000-2016 transition rates and the projected 2017-2026 rates for each civilisation. Rates are displayed by group and by transition type, so that the reader can see whether a particular transition is trending toward a boundary. Because the projections are linear trend fits regularised by the correction pressures described in Section 4.11, they are not forecasts of specific future events; they are the model's one-year-ahead extrapolation of the recent historical trajectory.</w:t>
+        <w:t>Figure 5 plots the observed 2000-2016 transition rates and the projected 2017-2026 rates for each civilisation. Rates are displayed by group and by transition type, so that the reader can see whether a particular transition is trending toward a boundary. Because the projections are linear trend fits regularised by the correction pressures described in Section 4.7, they are not forecasts of specific future events; they are the model's one-year-ahead extrapolation of the recent historical trajectory.</w:t>
       </w:r>
     </w:p>
     <w:p>
@@ -8653,615 +8639,7 @@
     </w:p>
     <w:p>
       <w:r>
-        <w:t>Table 11 reports projection accuracy by civilisation and Table 12 by compartment. Among compartments, the lowest RMSE is for H_A, while the highest RMSE is for D and the highest MAPE is for D. P_D and H_D show larger errors because small changes in PI and hit rates are amplified by the endogenous inflow term.</w:t>
-      </w:r>
-    </w:p>
-    <w:tbl>
-      <w:tblPr>
-        <w:tblStyle w:val="TableGrid"/>
-        <w:tblW w:type="auto" w:w="0"/>
-        <w:tblLook w:firstColumn="1" w:firstRow="1" w:lastColumn="0" w:lastRow="0" w:noHBand="0" w:noVBand="1" w:val="04A0"/>
-      </w:tblPr>
-      <w:tblGrid>
-        <w:gridCol w:w="2880"/>
-        <w:gridCol w:w="2880"/>
-        <w:gridCol w:w="2880"/>
-      </w:tblGrid>
-      <w:tr>
-        <w:tc>
-          <w:tcPr>
-            <w:tcW w:type="dxa" w:w="2880"/>
-          </w:tcPr>
-          <w:p>
-            <w:r>
-              <w:rPr>
-                <w:b/>
-              </w:rPr>
-              <w:t>Group</w:t>
-            </w:r>
-          </w:p>
-        </w:tc>
-        <w:tc>
-          <w:tcPr>
-            <w:tcW w:type="dxa" w:w="2880"/>
-          </w:tcPr>
-          <w:p>
-            <w:r>
-              <w:rPr>
-                <w:b/>
-              </w:rPr>
-              <w:t>RMSE</w:t>
-            </w:r>
-          </w:p>
-        </w:tc>
-        <w:tc>
-          <w:tcPr>
-            <w:tcW w:type="dxa" w:w="2880"/>
-          </w:tcPr>
-          <w:p>
-            <w:r>
-              <w:rPr>
-                <w:b/>
-              </w:rPr>
-              <w:t>MAPE</w:t>
-            </w:r>
-          </w:p>
-        </w:tc>
-      </w:tr>
-      <w:tr>
-        <w:tc>
-          <w:tcPr>
-            <w:tcW w:type="dxa" w:w="2880"/>
-          </w:tcPr>
-          <w:p>
-            <w:r>
-              <w:t>Anglosphere ex-US</w:t>
-            </w:r>
-          </w:p>
-        </w:tc>
-        <w:tc>
-          <w:tcPr>
-            <w:tcW w:type="dxa" w:w="2880"/>
-          </w:tcPr>
-          <w:p>
-            <w:r>
-              <w:t>5045.95</w:t>
-            </w:r>
-          </w:p>
-        </w:tc>
-        <w:tc>
-          <w:tcPr>
-            <w:tcW w:type="dxa" w:w="2880"/>
-          </w:tcPr>
-          <w:p>
-            <w:r>
-              <w:t>117.0%</w:t>
-            </w:r>
-          </w:p>
-        </w:tc>
-      </w:tr>
-      <w:tr>
-        <w:tc>
-          <w:tcPr>
-            <w:tcW w:type="dxa" w:w="2880"/>
-          </w:tcPr>
-          <w:p>
-            <w:r>
-              <w:t>Continental Europe</w:t>
-            </w:r>
-          </w:p>
-        </w:tc>
-        <w:tc>
-          <w:tcPr>
-            <w:tcW w:type="dxa" w:w="2880"/>
-          </w:tcPr>
-          <w:p>
-            <w:r>
-              <w:t>16427.90</w:t>
-            </w:r>
-          </w:p>
-        </w:tc>
-        <w:tc>
-          <w:tcPr>
-            <w:tcW w:type="dxa" w:w="2880"/>
-          </w:tcPr>
-          <w:p>
-            <w:r>
-              <w:t>137.3%</w:t>
-            </w:r>
-          </w:p>
-        </w:tc>
-      </w:tr>
-      <w:tr>
-        <w:tc>
-          <w:tcPr>
-            <w:tcW w:type="dxa" w:w="2880"/>
-          </w:tcPr>
-          <w:p>
-            <w:r>
-              <w:t>Hindu</w:t>
-            </w:r>
-          </w:p>
-        </w:tc>
-        <w:tc>
-          <w:tcPr>
-            <w:tcW w:type="dxa" w:w="2880"/>
-          </w:tcPr>
-          <w:p>
-            <w:r>
-              <w:t>8871.05</w:t>
-            </w:r>
-          </w:p>
-        </w:tc>
-        <w:tc>
-          <w:tcPr>
-            <w:tcW w:type="dxa" w:w="2880"/>
-          </w:tcPr>
-          <w:p>
-            <w:r>
-              <w:t>223.3%</w:t>
-            </w:r>
-          </w:p>
-        </w:tc>
-      </w:tr>
-      <w:tr>
-        <w:tc>
-          <w:tcPr>
-            <w:tcW w:type="dxa" w:w="2880"/>
-          </w:tcPr>
-          <w:p>
-            <w:r>
-              <w:t>Islamic</w:t>
-            </w:r>
-          </w:p>
-        </w:tc>
-        <w:tc>
-          <w:tcPr>
-            <w:tcW w:type="dxa" w:w="2880"/>
-          </w:tcPr>
-          <w:p>
-            <w:r>
-              <w:t>18803.07</w:t>
-            </w:r>
-          </w:p>
-        </w:tc>
-        <w:tc>
-          <w:tcPr>
-            <w:tcW w:type="dxa" w:w="2880"/>
-          </w:tcPr>
-          <w:p>
-            <w:r>
-              <w:t>307.7%</w:t>
-            </w:r>
-          </w:p>
-        </w:tc>
-      </w:tr>
-      <w:tr>
-        <w:tc>
-          <w:tcPr>
-            <w:tcW w:type="dxa" w:w="2880"/>
-          </w:tcPr>
-          <w:p>
-            <w:r>
-              <w:t>Japanese</w:t>
-            </w:r>
-          </w:p>
-        </w:tc>
-        <w:tc>
-          <w:tcPr>
-            <w:tcW w:type="dxa" w:w="2880"/>
-          </w:tcPr>
-          <w:p>
-            <w:r>
-              <w:t>2487.82</w:t>
-            </w:r>
-          </w:p>
-        </w:tc>
-        <w:tc>
-          <w:tcPr>
-            <w:tcW w:type="dxa" w:w="2880"/>
-          </w:tcPr>
-          <w:p>
-            <w:r>
-              <w:t>106.6%</w:t>
-            </w:r>
-          </w:p>
-        </w:tc>
-      </w:tr>
-      <w:tr>
-        <w:tc>
-          <w:tcPr>
-            <w:tcW w:type="dxa" w:w="2880"/>
-          </w:tcPr>
-          <w:p>
-            <w:r>
-              <w:t>Other Civilizations</w:t>
-            </w:r>
-          </w:p>
-        </w:tc>
-        <w:tc>
-          <w:tcPr>
-            <w:tcW w:type="dxa" w:w="2880"/>
-          </w:tcPr>
-          <w:p>
-            <w:r>
-              <w:t>7835.00</w:t>
-            </w:r>
-          </w:p>
-        </w:tc>
-        <w:tc>
-          <w:tcPr>
-            <w:tcW w:type="dxa" w:w="2880"/>
-          </w:tcPr>
-          <w:p>
-            <w:r>
-              <w:t>167.1%</w:t>
-            </w:r>
-          </w:p>
-        </w:tc>
-      </w:tr>
-      <w:tr>
-        <w:tc>
-          <w:tcPr>
-            <w:tcW w:type="dxa" w:w="2880"/>
-          </w:tcPr>
-          <w:p>
-            <w:r>
-              <w:t>Other Western</w:t>
-            </w:r>
-          </w:p>
-        </w:tc>
-        <w:tc>
-          <w:tcPr>
-            <w:tcW w:type="dxa" w:w="2880"/>
-          </w:tcPr>
-          <w:p>
-            <w:r>
-              <w:t>351.16</w:t>
-            </w:r>
-          </w:p>
-        </w:tc>
-        <w:tc>
-          <w:tcPr>
-            <w:tcW w:type="dxa" w:w="2880"/>
-          </w:tcPr>
-          <w:p>
-            <w:r>
-              <w:t>131.6%</w:t>
-            </w:r>
-          </w:p>
-        </w:tc>
-      </w:tr>
-      <w:tr>
-        <w:tc>
-          <w:tcPr>
-            <w:tcW w:type="dxa" w:w="2880"/>
-          </w:tcPr>
-          <w:p>
-            <w:r>
-              <w:t>Sinic</w:t>
-            </w:r>
-          </w:p>
-        </w:tc>
-        <w:tc>
-          <w:tcPr>
-            <w:tcW w:type="dxa" w:w="2880"/>
-          </w:tcPr>
-          <w:p>
-            <w:r>
-              <w:t>24182.04</w:t>
-            </w:r>
-          </w:p>
-        </w:tc>
-        <w:tc>
-          <w:tcPr>
-            <w:tcW w:type="dxa" w:w="2880"/>
-          </w:tcPr>
-          <w:p>
-            <w:r>
-              <w:t>160.1%</w:t>
-            </w:r>
-          </w:p>
-        </w:tc>
-      </w:tr>
-      <w:tr>
-        <w:tc>
-          <w:tcPr>
-            <w:tcW w:type="dxa" w:w="2880"/>
-          </w:tcPr>
-          <w:p>
-            <w:r>
-              <w:t>United States</w:t>
-            </w:r>
-          </w:p>
-        </w:tc>
-        <w:tc>
-          <w:tcPr>
-            <w:tcW w:type="dxa" w:w="2880"/>
-          </w:tcPr>
-          <w:p>
-            <w:r>
-              <w:t>10293.03</w:t>
-            </w:r>
-          </w:p>
-        </w:tc>
-        <w:tc>
-          <w:tcPr>
-            <w:tcW w:type="dxa" w:w="2880"/>
-          </w:tcPr>
-          <w:p>
-            <w:r>
-              <w:t>106.9%</w:t>
-            </w:r>
-          </w:p>
-        </w:tc>
-      </w:tr>
-    </w:tbl>
-    <w:p>
-      <w:pPr>
-        <w:jc w:val="center"/>
-      </w:pPr>
-      <w:r>
-        <w:rPr>
-          <w:i/>
-        </w:rPr>
-        <w:t>Table 11. Projection accuracy by civilisation, 2017-2023.</w:t>
-      </w:r>
-    </w:p>
-    <w:tbl>
-      <w:tblPr>
-        <w:tblStyle w:val="TableGrid"/>
-        <w:tblW w:type="auto" w:w="0"/>
-        <w:tblLook w:firstColumn="1" w:firstRow="1" w:lastColumn="0" w:lastRow="0" w:noHBand="0" w:noVBand="1" w:val="04A0"/>
-      </w:tblPr>
-      <w:tblGrid>
-        <w:gridCol w:w="2880"/>
-        <w:gridCol w:w="2880"/>
-        <w:gridCol w:w="2880"/>
-      </w:tblGrid>
-      <w:tr>
-        <w:tc>
-          <w:tcPr>
-            <w:tcW w:type="dxa" w:w="2880"/>
-          </w:tcPr>
-          <w:p>
-            <w:r>
-              <w:rPr>
-                <w:b/>
-              </w:rPr>
-              <w:t>Compartment</w:t>
-            </w:r>
-          </w:p>
-        </w:tc>
-        <w:tc>
-          <w:tcPr>
-            <w:tcW w:type="dxa" w:w="2880"/>
-          </w:tcPr>
-          <w:p>
-            <w:r>
-              <w:rPr>
-                <w:b/>
-              </w:rPr>
-              <w:t>RMSE</w:t>
-            </w:r>
-          </w:p>
-        </w:tc>
-        <w:tc>
-          <w:tcPr>
-            <w:tcW w:type="dxa" w:w="2880"/>
-          </w:tcPr>
-          <w:p>
-            <w:r>
-              <w:rPr>
-                <w:b/>
-              </w:rPr>
-              <w:t>MAPE</w:t>
-            </w:r>
-          </w:p>
-        </w:tc>
-      </w:tr>
-      <w:tr>
-        <w:tc>
-          <w:tcPr>
-            <w:tcW w:type="dxa" w:w="2880"/>
-          </w:tcPr>
-          <w:p>
-            <w:r>
-              <w:t>A</w:t>
-            </w:r>
-          </w:p>
-        </w:tc>
-        <w:tc>
-          <w:tcPr>
-            <w:tcW w:type="dxa" w:w="2880"/>
-          </w:tcPr>
-          <w:p>
-            <w:r>
-              <w:t>1043.17</w:t>
-            </w:r>
-          </w:p>
-        </w:tc>
-        <w:tc>
-          <w:tcPr>
-            <w:tcW w:type="dxa" w:w="2880"/>
-          </w:tcPr>
-          <w:p>
-            <w:r>
-              <w:t>275.6%</w:t>
-            </w:r>
-          </w:p>
-        </w:tc>
-      </w:tr>
-      <w:tr>
-        <w:tc>
-          <w:tcPr>
-            <w:tcW w:type="dxa" w:w="2880"/>
-          </w:tcPr>
-          <w:p>
-            <w:r>
-              <w:t>D</w:t>
-            </w:r>
-          </w:p>
-        </w:tc>
-        <w:tc>
-          <w:tcPr>
-            <w:tcW w:type="dxa" w:w="2880"/>
-          </w:tcPr>
-          <w:p>
-            <w:r>
-              <w:t>23067.25</w:t>
-            </w:r>
-          </w:p>
-        </w:tc>
-        <w:tc>
-          <w:tcPr>
-            <w:tcW w:type="dxa" w:w="2880"/>
-          </w:tcPr>
-          <w:p>
-            <w:r>
-              <w:t>311.6%</w:t>
-            </w:r>
-          </w:p>
-        </w:tc>
-      </w:tr>
-      <w:tr>
-        <w:tc>
-          <w:tcPr>
-            <w:tcW w:type="dxa" w:w="2880"/>
-          </w:tcPr>
-          <w:p>
-            <w:r>
-              <w:t>H_A</w:t>
-            </w:r>
-          </w:p>
-        </w:tc>
-        <w:tc>
-          <w:tcPr>
-            <w:tcW w:type="dxa" w:w="2880"/>
-          </w:tcPr>
-          <w:p>
-            <w:r>
-              <w:t>552.28</w:t>
-            </w:r>
-          </w:p>
-        </w:tc>
-        <w:tc>
-          <w:tcPr>
-            <w:tcW w:type="dxa" w:w="2880"/>
-          </w:tcPr>
-          <w:p>
-            <w:r>
-              <w:t>69.8%</w:t>
-            </w:r>
-          </w:p>
-        </w:tc>
-      </w:tr>
-      <w:tr>
-        <w:tc>
-          <w:tcPr>
-            <w:tcW w:type="dxa" w:w="2880"/>
-          </w:tcPr>
-          <w:p>
-            <w:r>
-              <w:t>H_D</w:t>
-            </w:r>
-          </w:p>
-        </w:tc>
-        <w:tc>
-          <w:tcPr>
-            <w:tcW w:type="dxa" w:w="2880"/>
-          </w:tcPr>
-          <w:p>
-            <w:r>
-              <w:t>10318.58</w:t>
-            </w:r>
-          </w:p>
-        </w:tc>
-        <w:tc>
-          <w:tcPr>
-            <w:tcW w:type="dxa" w:w="2880"/>
-          </w:tcPr>
-          <w:p>
-            <w:r>
-              <w:t>211.2%</w:t>
-            </w:r>
-          </w:p>
-        </w:tc>
-      </w:tr>
-      <w:tr>
-        <w:tc>
-          <w:tcPr>
-            <w:tcW w:type="dxa" w:w="2880"/>
-          </w:tcPr>
-          <w:p>
-            <w:r>
-              <w:t>P_A</w:t>
-            </w:r>
-          </w:p>
-        </w:tc>
-        <w:tc>
-          <w:tcPr>
-            <w:tcW w:type="dxa" w:w="2880"/>
-          </w:tcPr>
-          <w:p>
-            <w:r>
-              <w:t>2056.79</w:t>
-            </w:r>
-          </w:p>
-        </w:tc>
-        <w:tc>
-          <w:tcPr>
-            <w:tcW w:type="dxa" w:w="2880"/>
-          </w:tcPr>
-          <w:p>
-            <w:r>
-              <w:t>46.7%</w:t>
-            </w:r>
-          </w:p>
-        </w:tc>
-      </w:tr>
-      <w:tr>
-        <w:tc>
-          <w:tcPr>
-            <w:tcW w:type="dxa" w:w="2880"/>
-          </w:tcPr>
-          <w:p>
-            <w:r>
-              <w:t>P_D</w:t>
-            </w:r>
-          </w:p>
-        </w:tc>
-        <w:tc>
-          <w:tcPr>
-            <w:tcW w:type="dxa" w:w="2880"/>
-          </w:tcPr>
-          <w:p>
-            <w:r>
-              <w:t>18613.86</w:t>
-            </w:r>
-          </w:p>
-        </w:tc>
-        <w:tc>
-          <w:tcPr>
-            <w:tcW w:type="dxa" w:w="2880"/>
-          </w:tcPr>
-          <w:p>
-            <w:r>
-              <w:t>56.8%</w:t>
-            </w:r>
-          </w:p>
-        </w:tc>
-      </w:tr>
-    </w:tbl>
-    <w:p>
-      <w:pPr>
-        <w:jc w:val="center"/>
-      </w:pPr>
-      <w:r>
-        <w:rPr>
-          <w:i/>
-        </w:rPr>
-        <w:t>Table 12. Projection accuracy by compartment, 2017-2023.</w:t>
+        <w:t>Detailed projection accuracy by civilisation and by compartment is reported in Supplementary Material (Supplementary Tables 1 and 2). Among compartments, the lowest RMSE is for H_A, while the highest RMSE is for D and the highest MAPE is for D. P_D and H_D show larger errors because small changes in PI and hit rates are amplified by the endogenous inflow term.</w:t>
       </w:r>
     </w:p>
     <w:p>
@@ -9274,7 +8652,7 @@
     </w:p>
     <w:p>
       <w:r>
-        <w:t>The annual projection performs best where the correction pressures in Section 4.11 are binding. Laplace smoothing prevents empty cells from being treated as impossible transitions; the unit-interval clip and the dropout cap prevent the trend extrapolation from producing rates that are incompatible with a stochastic transition matrix; and the 2016 inflow apportionment keeps new-entrant composition close to the last observed regime. These pressures mean that the projection is not a purely mechanical forecast: it is a bounded extrapolation that stays within the empirical support of the 2000-2016 data and within the stability constraints of the compartment model.</w:t>
+        <w:t>The annual projection performs best where the correction pressures in Section 4.7 are binding. Laplace smoothing prevents empty cells from being treated as impossible transitions; the unit-interval clip and the dropout cap prevent the trend extrapolation from producing rates that are incompatible with a stochastic transition matrix; and the 2016 inflow apportionment keeps new-entrant composition close to the last observed regime. These pressures mean that the projection is not a purely mechanical forecast: it is a bounded extrapolation that stays within the empirical support of the 2000-2016 data and within the stability constraints of the compartment model.</w:t>
       </w:r>
     </w:p>
     <w:p>
@@ -9492,7 +8870,7 @@
         <w:rPr>
           <w:vertAlign w:val="superscript"/>
         </w:rPr>
-        <w:t xml:space="preserve"> [13]</w:t>
+        <w:t xml:space="preserve"> [17]</w:t>
       </w:r>
       <w:r>
         <w:t>. A monocentric or tight-oligopoly structure in AI/ML may produce short-run efficiency gains through scale and agglomeration, but it also raises the risk of methodological lock-in, selection bias in training data, and reduced error correction. It is also an evolutionary dead end: it narrows the menu of innovation options, removes healthy competitors whose alternative approaches keep the field honest, and concentrates problem selection under a single institutional and methodological line. When one civilisation or a small oligopoly sets the dominant research agenda, problems that do not fit its priorities, languages, or institutional incentives are less likely to be addressed, leaving important scientific and social needs unresolved. Recent work on multi-university teams shows that geographically dispersed collaborations can retain high impact, which suggests that distributing capacity across civilisations need not sacrifice quality</w:t>
@@ -9517,7 +8895,7 @@
         <w:pStyle w:val="Heading2"/>
       </w:pPr>
       <w:r>
-        <w:t>6.3 Policy implications and early warning</w:t>
+        <w:t>6.3 Policy and management implications, and early warning</w:t>
       </w:r>
     </w:p>
     <w:p>
@@ -9528,7 +8906,7 @@
         <w:rPr>
           <w:vertAlign w:val="superscript"/>
         </w:rPr>
-        <w:t xml:space="preserve"> [14]</w:t>
+        <w:t xml:space="preserve"> [18]</w:t>
       </w:r>
       <w:r>
         <w:t>, in which the central question is not only who wins the current round but whether the global system retains enough diversity for future rounds</w:t>
@@ -9537,10 +8915,239 @@
         <w:rPr>
           <w:vertAlign w:val="superscript"/>
         </w:rPr>
-        <w:t xml:space="preserve"> [15]</w:t>
+        <w:t xml:space="preserve"> [19]</w:t>
       </w:r>
       <w:r>
-        <w:t>. If the dt of policy response is short enough, the model can be updated annually and divergence caught early, before any single civilisation approaches a PNR. This is the mechanism through which technology monopoly, hegemonic concentration and oligopoly dead-ends can be avoided: by keeping every major research community above its minimum viable coauthor pool, the framework sustains the competitive diversity that underpins long-run technological progress. The framework is therefore not a prediction that a particular civilisation will collapse. It is a tool for ensuring that no single civilisation reaches a point where its collapse becomes self-sustaining, and that the global AI/ML system retains the diversity required for continued innovation. This is precisely what Sustaining Heterogeneity through Interventions in Global AI/ML Researcher Mobility: A Transition-Rate Framework sets out to do: sustain civilisational diversity through interventions in global AI/ML researcher mobility. We introduce the acronym SHIGA here; it is formed from the title and also reflects the research base at Shiga University.</w:t>
+        <w:t>. If the dt of policy response is short enough, the model can be updated annually and divergence caught early, before any single civilisation approaches a PNR. This is the mechanism through which technology monopoly, hegemonic concentration and oligopoly dead-ends can be avoided: by keeping every major research community above its minimum viable coauthor pool, the framework sustains the competitive diversity that underpins long-run technological progress. The framework is therefore not a prediction that a particular civilisation will collapse. It is a tool for ensuring that no single civilisation reaches a point where its collapse becomes self-sustaining, and that the global AI/ML system retains the diversity required for continued innovation. This is precisely what Sustaining Heterogeneity through Interventions in Global AI/ML Researcher Mobility: A Transition-Rate Framework sets out to do: sustain civilisational diversity through interventions in global AI/ML researcher mobility. We introduce the acronym SHIGA here, formed from the title and reflecting the research base at Shiga University.</w:t>
+      </w:r>
+    </w:p>
+    <w:p>
+      <w:r>
+        <w:t>Table 11 maps the most sensitive transition levers to policy instruments and to the management actions that determine them. Policy instruments set incentives, while management actions determine how those incentives are implemented within institutions. Both are needed because a policy without a corresponding management process rarely changes transition rates.</w:t>
+      </w:r>
+    </w:p>
+    <w:tbl>
+      <w:tblPr>
+        <w:tblStyle w:val="TableGrid"/>
+        <w:tblW w:type="auto" w:w="0"/>
+        <w:tblLook w:firstColumn="1" w:firstRow="1" w:lastColumn="0" w:lastRow="0" w:noHBand="0" w:noVBand="1" w:val="04A0"/>
+      </w:tblPr>
+      <w:tblGrid>
+        <w:gridCol w:w="2880"/>
+        <w:gridCol w:w="2880"/>
+        <w:gridCol w:w="2880"/>
+      </w:tblGrid>
+      <w:tr>
+        <w:tc>
+          <w:tcPr>
+            <w:tcW w:type="dxa" w:w="2880"/>
+          </w:tcPr>
+          <w:p>
+            <w:r>
+              <w:rPr>
+                <w:b/>
+              </w:rPr>
+              <w:t>Lever</w:t>
+            </w:r>
+          </w:p>
+        </w:tc>
+        <w:tc>
+          <w:tcPr>
+            <w:tcW w:type="dxa" w:w="2880"/>
+          </w:tcPr>
+          <w:p>
+            <w:r>
+              <w:rPr>
+                <w:b/>
+              </w:rPr>
+              <w:t>Policy instrument</w:t>
+            </w:r>
+          </w:p>
+        </w:tc>
+        <w:tc>
+          <w:tcPr>
+            <w:tcW w:type="dxa" w:w="2880"/>
+          </w:tcPr>
+          <w:p>
+            <w:r>
+              <w:rPr>
+                <w:b/>
+              </w:rPr>
+              <w:t>Management action</w:t>
+            </w:r>
+          </w:p>
+        </w:tc>
+      </w:tr>
+      <w:tr>
+        <w:tc>
+          <w:tcPr>
+            <w:tcW w:type="dxa" w:w="2880"/>
+          </w:tcPr>
+          <w:p>
+            <w:r>
+              <w:t>Dropout (d)</w:t>
+            </w:r>
+          </w:p>
+        </w:tc>
+        <w:tc>
+          <w:tcPr>
+            <w:tcW w:type="dxa" w:w="2880"/>
+          </w:tcPr>
+          <w:p>
+            <w:r>
+              <w:t>Early-career fellowships, childcare and dual-career support, stable non-tenure tracks</w:t>
+            </w:r>
+          </w:p>
+        </w:tc>
+        <w:tc>
+          <w:tcPr>
+            <w:tcW w:type="dxa" w:w="2880"/>
+          </w:tcPr>
+          <w:p>
+            <w:r>
+              <w:t>Retain researchers in the domestic pipeline beyond the first career years</w:t>
+            </w:r>
+          </w:p>
+        </w:tc>
+      </w:tr>
+      <w:tr>
+        <w:tc>
+          <w:tcPr>
+            <w:tcW w:type="dxa" w:w="2880"/>
+          </w:tcPr>
+          <w:p>
+            <w:r>
+              <w:t>Exogenous entry (I0)</w:t>
+            </w:r>
+          </w:p>
+        </w:tc>
+        <w:tc>
+          <w:tcPr>
+            <w:tcW w:type="dxa" w:w="2880"/>
+          </w:tcPr>
+          <w:p>
+            <w:r>
+              <w:t>Research-master and undergraduate pipelines, doctoral fellowships, recruitment visas</w:t>
+            </w:r>
+          </w:p>
+        </w:tc>
+        <w:tc>
+          <w:tcPr>
+            <w:tcW w:type="dxa" w:w="2880"/>
+          </w:tcPr>
+          <w:p>
+            <w:r>
+              <w:t>Widen the base of incoming researchers before they select a field or location</w:t>
+            </w:r>
+          </w:p>
+        </w:tc>
+      </w:tr>
+      <w:tr>
+        <w:tc>
+          <w:tcPr>
+            <w:tcW w:type="dxa" w:w="2880"/>
+          </w:tcPr>
+          <w:p>
+            <w:r>
+              <w:t>Return from abroad (β)</w:t>
+            </w:r>
+          </w:p>
+        </w:tc>
+        <w:tc>
+          <w:tcPr>
+            <w:tcW w:type="dxa" w:w="2880"/>
+          </w:tcPr>
+          <w:p>
+            <w:r>
+              <w:t>Return grants, diaspora networks, dual appointments, overseas-experience recognition</w:t>
+            </w:r>
+          </w:p>
+        </w:tc>
+        <w:tc>
+          <w:tcPr>
+            <w:tcW w:type="dxa" w:w="2880"/>
+          </w:tcPr>
+          <w:p>
+            <w:r>
+              <w:t>Encourage mobile researchers to re-establish domestic research groups</w:t>
+            </w:r>
+          </w:p>
+        </w:tc>
+      </w:tr>
+      <w:tr>
+        <w:tc>
+          <w:tcPr>
+            <w:tcW w:type="dxa" w:w="2880"/>
+          </w:tcPr>
+          <w:p>
+            <w:r>
+              <w:t>Domestic hit generation (h_D)</w:t>
+            </w:r>
+          </w:p>
+        </w:tc>
+        <w:tc>
+          <w:tcPr>
+            <w:tcW w:type="dxa" w:w="2880"/>
+          </w:tcPr>
+          <w:p>
+            <w:r>
+              <w:t>Independent-lab programmes (e.g. SPREAD-style), doctoral/postdoctoral training, compute access</w:t>
+            </w:r>
+          </w:p>
+        </w:tc>
+        <w:tc>
+          <w:tcPr>
+            <w:tcW w:type="dxa" w:w="2880"/>
+          </w:tcPr>
+          <w:p>
+            <w:r>
+              <w:t>Translate junior capacity into visible, high-impact work and independent research lines</w:t>
+            </w:r>
+          </w:p>
+        </w:tc>
+      </w:tr>
+      <w:tr>
+        <w:tc>
+          <w:tcPr>
+            <w:tcW w:type="dxa" w:w="2880"/>
+          </w:tcPr>
+          <w:p>
+            <w:r>
+              <w:t>PI promotion (p_D)</w:t>
+            </w:r>
+          </w:p>
+        </w:tc>
+        <w:tc>
+          <w:tcPr>
+            <w:tcW w:type="dxa" w:w="2880"/>
+          </w:tcPr>
+          <w:p>
+            <w:r>
+              <w:t>Tenure-track conversion, startup packages, project-based PI status</w:t>
+            </w:r>
+          </w:p>
+        </w:tc>
+        <w:tc>
+          <w:tcPr>
+            <w:tcW w:type="dxa" w:w="2880"/>
+          </w:tcPr>
+          <w:p>
+            <w:r>
+              <w:t>Create durable principal-investigator positions that train the next cohort</w:t>
+            </w:r>
+          </w:p>
+        </w:tc>
+      </w:tr>
+    </w:tbl>
+    <w:p>
+      <w:pPr>
+        <w:jc w:val="center"/>
+      </w:pPr>
+      <w:r>
+        <w:rPr>
+          <w:i/>
+        </w:rPr>
+        <w:t>Table 11. Transition levers, policy instruments, and management actions.</w:t>
       </w:r>
     </w:p>
     <w:p>
@@ -9716,17 +9323,37 @@
     </w:p>
     <w:p>
       <w:r>
-        <w:t>13. Freeman R B, Huang W. Collaboration: Strength in diversity. Nature. 2014;513(7518):305. https://doi.org/10.1038/513305a</w:t>
+        <w:t>13. Nelson R R, Winter S G. An Evolutionary Theory of Economic Change. Cambridge, MA: Harvard University Press, 1982.</w:t>
       </w:r>
     </w:p>
     <w:p>
       <w:r>
-        <w:t>14. Shachar A. The Race for Talent: Highly Skilled Migrants and Competitive Immigration Regimes. NYU Law Rev. 2006;81(1):148-206.</w:t>
+        <w:t>14. Dosi G. Technological paradigms and technological trajectories: a suggested interpretation of the determinants and directions of technical change. Res Policy. 1982;11(3):147-162.</w:t>
       </w:r>
     </w:p>
     <w:p>
       <w:r>
-        <w:t>15. Kerr W R. Global Talent and U.S. Immigration Policy. Harvard Business School Working Paper No. 20-107, 2020. https://www.hbs.edu/ris/Publication%20Files/20-107_0967f1ab-1d23-4d54-b5a1-c884234d9b31.pdf</w:t>
+        <w:t>15. Lundvall B-Å. National Systems of Innovation: Toward a Theory of Innovation and Interactive Learning. London: Anthem Press, 1992.</w:t>
+      </w:r>
+    </w:p>
+    <w:p>
+      <w:r>
+        <w:t>16. Malerba F. Sectoral systems of innovation and production. Res Policy. 2002;31(2):247-264.</w:t>
+      </w:r>
+    </w:p>
+    <w:p>
+      <w:r>
+        <w:t>17. Freeman R B, Huang W. Collaboration: Strength in diversity. Nature. 2014;513(7518):305. https://doi.org/10.1038/513305a</w:t>
+      </w:r>
+    </w:p>
+    <w:p>
+      <w:r>
+        <w:t>18. Shachar A. The Race for Talent: Highly Skilled Migrants and Competitive Immigration Regimes. NYU Law Rev. 2006;81(1):148-206.</w:t>
+      </w:r>
+    </w:p>
+    <w:p>
+      <w:r>
+        <w:t>19. Kerr W R. Global Talent and U.S. Immigration Policy. Harvard Business School Working Paper No. 20-107, 2020. https://www.hbs.edu/ris/Publication%20Files/20-107_0967f1ab-1d23-4d54-b5a1-c884234d9b31.pdf</w:t>
       </w:r>
     </w:p>
     <w:sectPr>

</xml_diff>

<commit_message>
Refactor manuscript: trim Sections 5.1/5.8/6.4, unify docx/md source, fix small-sample wording, anonymize blinded variant
Co-Authored-By: Tatsuki Onishi <bougtoir@gmail.com>
</commit_message>
<xml_diff>
--- a/researcher_mobility_ode/docs/manuscript_full_article.docx
+++ b/researcher_mobility_ode/docs/manuscript_full_article.docx
@@ -28,7 +28,7 @@
         <w:jc w:val="center"/>
       </w:pPr>
       <w:r>
-        <w:t>Approximate word count (main text incl. tables, excl. references): 9689</w:t>
+        <w:t>Approximate word count (main text incl. tables, excl. references): 9307</w:t>
       </w:r>
     </w:p>
     <w:p>
@@ -54,7 +54,7 @@
     </w:p>
     <w:p>
       <w:r>
-        <w:t>Artificial intelligence (AI) and machine learning (ML) research is increasingly concentrated in a few regions, raising the risk that smaller research communities fall below a minimum viable coauthor pool and cannot recover. We model each civilisation as a six-compartment system of domestic and abroad early-career, high-impact, and principal-investigator (PI) researchers, and estimate transition rates from OpenAlex Artificial Intelligence works (subfield 1702). The minimum viable coauthor threshold is defined as M = k × c_bar, where c_bar is the mean number of authors per work and k is the median number of distinct last-author groups observed per recent year. Across 9 groups, equilibrium domestic active pools remain above their thresholds, but the closest point of no return (PNR) is observed for the Other Western group, where the exogenous entry rate (I0) must be multiplied by 0.332× its current value (equivalent to a 67% proportional reduction) to drive the active pool to its threshold. A simulated reduction in dropout yields the largest margin gain per unit proportional change in every group in the fitted model. The 2017-2023 out-of-sample projection records root mean square error (RMSE) 12849.58 and a conservative, non-standard mean absolute percentage error (MAPE) of 162.0% (computed against count_obs + 1 to avoid division by zero). That level of error is expected because the projection is designed as an early-warning indicator of directional drift and threshold crossing, not as a precise population forecast. Historical and saturating-inflow counterfactuals show that the model is most sensitive to exogenous entry and attrition. These results provide a quantitative framework for early, safety-factor-bound policy scenarios that preserve civilisational diversity in AI/ML research.</w:t>
+        <w:t>Artificial intelligence (AI) and machine learning (ML) research is increasingly concentrated in a few regions, raising the risk that smaller research communities fall below a minimum viable coauthor pool and cannot recover. We model each civilisation as a six-compartment system of domestic and abroad early-career, high-impact, and principal-investigator (PI) researchers, and estimate transition rates from OpenAlex Artificial Intelligence works (subfield 1702). The minimum viable coauthor threshold is defined as M = k × c_bar, where c_bar is the mean number of authors per work and k is the median number of distinct last-author groups observed per recent year. Across 9 groups, equilibrium domestic active pools remain above their thresholds, but the closest point of no return (PNR) is observed for the Other Western group, where the exogenous entry rate (I0) must be multiplied by 0.332× its current value (equivalent to a 67% proportional reduction) to drive the active pool to its threshold. A simulated reduction in dropout yields the largest margin gain per unit proportional change in every group in the fitted model. The 2017-2023 out-of-sample projection records root mean square error (RMSE) 12849.58 and a conservative, non-standard mean absolute percentage error (MAPE) of 162.0% (computed against count_obs + 1 to avoid division by zero). That level of error is expected because the projection is designed as an early-warning indicator of directional drift and threshold crossing, not as a precise population forecast. Historical counterfactuals and bootstrap uncertainty show that the model is most sensitive to exogenous entry and attrition. These results provide a quantitative framework for early, safety-factor-bound policy scenarios that preserve civilisational diversity in AI/ML research.</w:t>
       </w:r>
     </w:p>
     <w:p>
@@ -4691,7 +4691,7 @@
     </w:p>
     <w:p>
       <w:r>
-        <w:t>Replacing linear inflow with a saturating form lowers equilibrium pools because each additional PI adds fewer entrants. Table 5 compares linear and saturating equilibrium T values. The saturating model is important because the observed r is often close to the stability boundary, and an unchecked linear inflow can produce explosive growth. Across groups, the saturating variant predicts equilibrium pools that are -0-0% lower than the linear variant, underscoring the sensitivity of long-run projections to the functional form of inflow. This sensitivity does not overturn the ranking of groups, but it shows that absolute equilibrium levels should be treated with caution. The saturating model is the preferred interpretation for policy because it acknowledges that recruitment cannot scale linearly with the number of PIs indefinitely.</w:t>
+        <w:t>We also test a saturating recruitment function in which each additional PI adds fewer entrants. With the capacity parameter calibrated to observed PI stocks, the saturating equilibrium is below 0.001% for every group at the displayed precision, so the linear safety-factor bound remains the operative constraint. Table 5 reports the fitted epsilon values; the near-zero differences show that the results are not driven by unbounded linear growth, but they do not rule out stronger saturation at higher PI densities.</w:t>
       </w:r>
     </w:p>
     <w:tbl>
@@ -6675,7 +6675,7 @@
     </w:p>
     <w:p>
       <w:r>
-        <w:t>Table 8 reports bootstrap 95% confidence intervals for the equilibrium active pool T and the domestic PI pool P_D. The intervals are wide, reflecting the small cohort sample and the extrapolation from individual careers to long-run steady states. For some groups the upper bound is an order of magnitude larger than the lower bound, indicating that the equilibrium is sensitive to resampling variation in the transition rates. This uncertainty should be interpreted as a warning against over-interpreting point estimates and as a reason to view the point-of-no-return distances as indicative rather than precise thresholds. Despite the width, the lower bounds for most groups remain above the minimum viable threshold, which supports the qualitative conclusion that all groups are currently above the PNR. For the smallest groups the lower bound is closer to M, reinforcing the need for continued monitoring and for policy buffers.</w:t>
+        <w:t>Table 8 reports bootstrap 95% confidence intervals for the equilibrium active pool T and the domestic PI pool P_D. The intervals are wide, reflecting the model-implied cohort scale and the extrapolation from observed author-career exposure to long-run steady states. For some groups the upper bound is an order of magnitude larger than the lower bound, indicating that the equilibrium is sensitive to resampling variation in the transition rates. This uncertainty should be interpreted as a warning against over-interpreting point estimates and as a reason to view the point-of-no-return distances as indicative rather than precise thresholds. Despite the width, the lower bounds for most groups remain above the minimum viable threshold, which supports the qualitative conclusion that all groups are currently above the PNR. For the smallest groups the lower bound is closer to M, reinforcing the need for continued monitoring and for policy buffers.</w:t>
       </w:r>
     </w:p>
     <w:tbl>
@@ -8647,20 +8647,7 @@
         <w:pStyle w:val="Heading2"/>
       </w:pPr>
       <w:r>
-        <w:t>5.8 Correction pressures in the annual model</w:t>
-      </w:r>
-    </w:p>
-    <w:p>
-      <w:r>
-        <w:t>The annual projection performs best where the correction pressures in Section 4.7 are binding. Laplace smoothing prevents empty cells from being treated as impossible transitions; the unit-interval clip and the dropout cap prevent the trend extrapolation from producing rates that are incompatible with a stochastic transition matrix; and the 2016 inflow apportionment keeps new-entrant composition close to the last observed regime. These pressures mean that the projection is not a purely mechanical forecast: it is a bounded extrapolation that stays within the empirical support of the 2000-2016 data and within the stability constraints of the compartment model.</w:t>
-      </w:r>
-    </w:p>
-    <w:p>
-      <w:pPr>
-        <w:pStyle w:val="Heading2"/>
-      </w:pPr>
-      <w:r>
-        <w:t>5.9 Japan-specific compartment and transition-rate ladder</w:t>
+        <w:t>5.8 Japan-specific compartment and transition-rate ladder</w:t>
       </w:r>
     </w:p>
     <w:p>
@@ -8720,7 +8707,7 @@
         <w:pStyle w:val="Heading2"/>
       </w:pPr>
       <w:r>
-        <w:t>5.10 A combined model-evaluation view: T/M and PNR proximity</w:t>
+        <w:t>5.9 A combined model-evaluation view: T/M and PNR proximity</w:t>
       </w:r>
     </w:p>
     <w:p>
@@ -9160,20 +9147,7 @@
         <w:pStyle w:val="Heading2"/>
       </w:pPr>
       <w:r>
-        <w:t>6.4 Validation of correction pressures</w:t>
-      </w:r>
-    </w:p>
-    <w:p>
-      <w:r>
-        <w:t>The correction pressures are not ad hoc adjustments; each maps to a known statistical or dynamical constraint. Laplace smoothing is equivalent to a weak Dirichlet prior on a multinomial transition vector; it guarantees that no cell has zero estimated probability and shrinks rare transitions toward the simplex centroid. Clipping projected rates to values between 0 and 1 is a feasibility constraint on probabilities; the dropout cap is a cross-sectional constraint that prevents projected attrition from exceeding the observed stock; and the inflow apportionment constraint keeps the composition of new entrants equal to the last observed recruitment pattern. In the 2017-2023 projection these pressures reduced the sensitivity of the forecast to sparse cells and to short-run fluctuations in small groups. Quantitatively, the overall RMSE of 12849.58 and conservative MAPE of 162.0% are consistent with a model that is deliberately regularised rather than optimised for in-sample fit. The high MAPE is driven by sparse compartments and zero-observed cells; the projection is therefore appropriate for monitoring directional drift and proximity to the PNR, not for precise count forecasting. The residual errors are concentrated in the smallest compartments, which is exactly where smoothing is most active and where future data will be most valuable.</w:t>
-      </w:r>
-    </w:p>
-    <w:p>
-      <w:pPr>
-        <w:pStyle w:val="Heading2"/>
-      </w:pPr>
-      <w:r>
-        <w:t>6.5 Intra-civilisation alternatives when inter-civilisation mobility cannot be controlled</w:t>
+        <w:t>6.4 Intra-civilisation alternatives when inter-civilisation mobility cannot be controlled</w:t>
       </w:r>
     </w:p>
     <w:p>
@@ -9186,7 +9160,7 @@
         <w:pStyle w:val="Heading2"/>
       </w:pPr>
       <w:r>
-        <w:t>6.6 Annual updating as an early-warning layer</w:t>
+        <w:t>6.5 Annual updating as an early-warning layer</w:t>
       </w:r>
     </w:p>
     <w:p>
@@ -9199,12 +9173,12 @@
         <w:pStyle w:val="Heading2"/>
       </w:pPr>
       <w:r>
-        <w:t>6.7 Limitations</w:t>
+        <w:t>6.6 Limitations</w:t>
       </w:r>
     </w:p>
     <w:p>
       <w:r>
-        <w:t>Several limitations should be acknowledged. OpenAlex affiliation and country assignments are noisy, especially for researchers with multiple affiliations. The civilisation grouping is a coarse aggregation; within-group heterogeneity is substantial. The annual model relies on a discrete approximation of the continuous-time ODE and does not capture within-year events or cross-civilisation spillovers. Inter-civilisation flows are approximated by the author's recent_group while abroad, which misses year-to-year destination switching. The civilisation label is a pragmatic aggregation of publication-affiliation patterns. Historical civilisational boundaries do not necessarily coincide with contemporary political or value-based boundaries, and this study cannot determine whether the diversity of research ideas maps more closely onto historical civilisational groupings or onto current political and value communities; for example, the Sinic grouping reflects current OpenAlex country metadata and does not resolve the cultural and historical ties between mainland China and Taiwan, which currently appear as separate research arenas. This is treated as an empirical limitation of the classification, not as a normative claim.The cohort sample is small; the absolute equilibrium numbers should be interpreted as model-implied stocks rather than as census counts. Authors with many publications are over-weighted relative to one-publication authors, so rate estimates reflect author-publication exposure rather than a uniformly representative sample of individuals. The endogenous inflow is capped at a safety factor of 0.40 relative to the critical reproduction rate; alternative values would shift equilibrium levels and should be reported in future sensitivity tables. Finally, the point-of-no-return threshold is a sufficient condition for collapse, not a necessary one: a community may decline for reasons outside the model even if T remains above M.</w:t>
+        <w:t>Several limitations should be acknowledged. OpenAlex affiliation and country assignments are noisy, especially for researchers with multiple affiliations. The civilisation grouping is a coarse aggregation; within-group heterogeneity is substantial. The annual model relies on a discrete approximation of the continuous-time ODE and does not capture within-year events or cross-civilisation spillovers. Inter-civilisation flows are approximated by the author's recent_group while abroad, which misses year-to-year destination switching. The civilisation label is a pragmatic aggregation of publication-affiliation patterns. Historical civilisational boundaries do not necessarily coincide with contemporary political or value-based boundaries, and this study cannot determine whether the diversity of research ideas maps more closely onto historical civilisational groupings or onto current political and value communities; for example, the Sinic grouping reflects current OpenAlex country metadata and does not resolve the cultural and historical ties between mainland China and Taiwan, which currently appear as separate research arenas. This is treated as an empirical limitation of the classification, not as a normative claim. The cohort is a model-implied sample extracted from OpenAlex; absolute equilibrium numbers should be interpreted as model-implied stocks rather than census counts. Authors with many publications are over-weighted relative to less prolific authors, so rate estimates reflect author-publication exposure rather than a uniformly representative sample of individuals. The endogenous inflow is capped at a safety factor of 0.40 relative to the critical reproduction rate; alternative values would shift equilibrium levels and should be reported in future sensitivity tables. Finally, the point-of-no-return threshold is a sufficient condition for collapse, not a necessary one: a community may decline for reasons outside the model even if T remains above M.</w:t>
       </w:r>
     </w:p>
     <w:p>
@@ -9214,7 +9188,7 @@
     </w:p>
     <w:p>
       <w:r>
-        <w:t>From a security-studies perspective, the framework is intentionally non-adversarial. It does not model deliberate recruitment campaigns, technology transfer, or strategic denial. Instead, it treats mobility as an aggregate transition process and asks when a community becomes unable to reproduce itself. That baseline is useful because it shows where defensive, capacity-building policies can be most efficient, but it does not replace classified or diplomatic assessments of technology competition. Future work could add a strategic layer by distinguishing between civilian and defence-relevant AI/ML pipelines, or by modelling the effects of targeted recruitment on specific subfields.</w:t>
+        <w:t>From a security-studies perspective, the framework is intentionally non-adversarial: it treats mobility as an aggregate transition process and asks when a community becomes unable to reproduce itself, without modelling deliberate recruitment campaigns, technology transfer, or strategic denial. Future work could add a strategic layer by distinguishing civilian from defence-relevant AI/ML pipelines, or by modelling targeted recruitment in specific subfields.</w:t>
       </w:r>
     </w:p>
     <w:p>

</xml_diff>

<commit_message>
Reviewer report fixes: abstract/highlight length, safety-factor wording, PI-pool PNR threshold, declarations placeholders, innovation framing, Japan illustrative case, snapshot date
Co-Authored-By: Tatsuki Onishi <bougtoir@gmail.com>
</commit_message>
<xml_diff>
--- a/researcher_mobility_ode/docs/manuscript_full_article.docx
+++ b/researcher_mobility_ode/docs/manuscript_full_article.docx
@@ -28,7 +28,7 @@
         <w:jc w:val="center"/>
       </w:pPr>
       <w:r>
-        <w:t>Approximate word count (main text incl. tables, excl. references): 9372</w:t>
+        <w:t>Approximate word count (main text incl. tables, excl. references): 9676</w:t>
       </w:r>
     </w:p>
     <w:p>
@@ -36,7 +36,7 @@
         <w:jc w:val="center"/>
       </w:pPr>
       <w:r>
-        <w:t>Corresponding author: [To be completed]</w:t>
+        <w:t>Corresponding author: [To be completed at submission]</w:t>
       </w:r>
     </w:p>
     <w:p>
@@ -54,7 +54,7 @@
     </w:p>
     <w:p>
       <w:r>
-        <w:t>Artificial intelligence (AI) and machine learning (ML) research is increasingly concentrated in a few regions, raising the risk that smaller research communities fall below a minimum viable coauthor pool and cannot recover. We model each civilisation as a six-compartment system of domestic and abroad early-career, high-impact, and principal-investigator (PI) researchers, and estimate transition rates from OpenAlex Artificial Intelligence works (subfield 1702). The minimum viable coauthor threshold is defined as M = k × c_bar, where c_bar is the mean number of authors per work and k is the median number of distinct last-author groups observed per recent year. Across 9 groups, equilibrium domestic active pools remain above their thresholds, but the closest point of no return (PNR) is observed for the Other Western group, where the exogenous entry rate (I0) must be multiplied by 0.332× its current value (equivalent to a 67% proportional reduction) to drive the active pool to its threshold. A simulated reduction in dropout yields the largest margin gain per unit proportional change in every group in the fitted model. The 2017-2023 out-of-sample projection records root mean square error (RMSE) 10187.43 and a conservative, non-standard mean absolute percentage error (MAPE) of 130.4% (computed against count_obs + 1 to avoid division by zero). That level of error is expected because the projection is designed as an early-warning indicator of directional drift and threshold crossing, not as a precise population forecast. Historical counterfactuals and bootstrap uncertainty show that the model is most sensitive to exogenous entry and attrition. These results provide a quantitative framework for early, safety-factor-bound policy scenarios that preserve civilisational diversity in AI/ML research.</w:t>
+        <w:t>Artificial intelligence (AI) and machine learning (ML) research is increasingly concentrated, raising the risk that smaller communities fall below a minimum viable coauthor pool. We model each civilisation as a six-compartment system of domestic and abroad early-career, high-impact, and principal-investigator (PI) researchers, and estimate transition rates from OpenAlex AI/ML data (subfield 1702). The minimum viable threshold is M = k × c_bar, where c_bar is the mean authors per work and k is the median number of distinct last-author groups per year. Across 9 groups, equilibrium active pools remain above their thresholds, but the closest point of no return (PNR) is observed for the Other Western group, where the exogenous entry rate (I0) must be multiplied by 0.332× (a 67% proportional reduction) to drive the active pool to its threshold. A simulated reduction in dropout yields the largest margin gain in every group in the fitted model. The 2017-2023 projection has RMSE 10187.43 and a conservative, non-standard MAPE of 130.4% (count_obs + 1 denominator). The high error is expected because the projection is an early-warning indicator of directional drift, not a precise forecast. Historical counterfactuals and bootstrap uncertainty show that the model is most sensitive to exogenous entry and attrition. These results provide a quantitative framework for early, safety-factor-bound policy scenarios that preserve civilisational diversity in AI/ML research.</w:t>
       </w:r>
     </w:p>
     <w:p>
@@ -97,7 +97,7 @@
         <w:pStyle w:val="ListBullet"/>
       </w:pPr>
       <w:r>
-        <w:t>Dropout reduction gives the largest margin gain per 10% change across all groups in the fitted model.</w:t>
+        <w:t>Dropout reduction yields the largest margin gain across all groups.</w:t>
       </w:r>
     </w:p>
     <w:p>
@@ -129,7 +129,7 @@
         <w:t xml:space="preserve">Funding: </w:t>
       </w:r>
       <w:r>
-        <w:t>[To be completed]</w:t>
+        <w:t>[To be completed by the authors at submission.]</w:t>
       </w:r>
     </w:p>
     <w:p>
@@ -140,7 +140,7 @@
         <w:t xml:space="preserve">Competing interests: </w:t>
       </w:r>
       <w:r>
-        <w:t>[To be completed]</w:t>
+        <w:t>[To be completed by the authors at submission.]</w:t>
       </w:r>
     </w:p>
     <w:p>
@@ -151,7 +151,7 @@
         <w:t xml:space="preserve">Author contributions: </w:t>
       </w:r>
       <w:r>
-        <w:t>[To be completed]</w:t>
+        <w:t>[To be completed by the authors at submission.]</w:t>
       </w:r>
     </w:p>
     <w:p>
@@ -513,7 +513,7 @@
         <w:t xml:space="preserve"> [16]</w:t>
       </w:r>
       <w:r>
-        <w:t>. The result is a framework that can be updated as new data arrive and can compare the fragility of different research communities using a common metric. Because it is built on open bibliometric data and transparent transition rates, the model can be replicated and extended by other researchers and by policymakers who need a common language for discussing mobility and capacity.</w:t>
+        <w:t>. In that view, technological change is path-dependent and distributed: routines, organisations and institutions co-evolve, so the loss of a research community is not merely a decline in headcount but a reduction in the variety from which future trajectories can be generated. The PNR is therefore an innovation-systems problem: once a community falls below the minimum scale needed to sustain distinct research programmes, the path-dependent process of search and selection that produces new trajectories is impaired. The result is a framework that can be updated as new data arrive and can compare the fragility of different research communities using a common metric. Because it is built on open bibliometric data and transparent transition rates, the model can be replicated and extended by other researchers and by policymakers who need a common language for discussing mobility and capacity.</w:t>
       </w:r>
     </w:p>
     <w:p>
@@ -557,7 +557,7 @@
     </w:p>
     <w:p>
       <w:r>
-        <w:t>The grouping follows Huntington's civilisation taxonomy but is adjusted for sample-size and mobility reality in AI/ML. The United States is separated from the broader Anglosphere because it is the dominant destination for AI/ML researchers and because its higher-education and funding systems differ systematically from those of other English-speaking countries. Continental Europe is kept distinct from the Anglosphere because intra-European mobility and EU research funding create a separate mobility bloc. Latin American, Orthodox and sub-Saharan African countries are merged into Other Civilizations because their AI/ML author counts in the sample are too small to estimate stable transition rates separately. This aggregation is a pragmatic modelling choice and does not imply that these communities are culturally homogeneous.</w:t>
+        <w:t>The grouping follows Huntington's civilisation taxonomy but is adjusted for sample-size and mobility reality in AI/ML. The United States is separated from the broader Anglosphere because it is the dominant destination for AI/ML researchers and because its higher-education and funding systems differ systematically from those of other English-speaking countries. Continental Europe is kept distinct from the Anglosphere because intra-European mobility and EU research funding create a separate mobility bloc. Latin American, Orthodox and sub-Saharan African countries are merged into Other Civilizations because their AI/ML author counts in the sample are too small to estimate stable transition rates separately. These civilisation labels are operational categories based on observed publication-affiliation patterns; they are not normative claims about cultural or political identity, and they are reported in full in Supplementary Material.</w:t>
       </w:r>
     </w:p>
     <w:p>
@@ -1934,7 +1934,7 @@
         </m:sSub>
       </m:oMath>
       <w:r>
-        <w:t xml:space="preserve">, where I_0 is the exogenous entry rate, r is the PI reproduction rate, and r is capped at 0.40× the stability-critical value (safety factor 0.40). A saturating alternative, </w:t>
+        <w:t xml:space="preserve">, where I_0 is the exogenous entry rate, r is the PI reproduction rate, and r is capped at 0.50× the stability-critical value (safety factor 0.50); the most constrained fitted group realises 0.40×. A saturating alternative, </w:t>
       </w:r>
       <m:oMath>
         <m:func>
@@ -2089,7 +2089,7 @@
     </w:p>
     <w:p>
       <w:r>
-        <w:t>Transition rates are estimated as constant per-year hazards from observed proportions within the cohort. For each group and each transition, the rate is the ratio of observed transitions to the total exposure time spent in the source compartment during the observation window, with Laplace smoothing of 1 added to both numerator and denominator. This avoids zero-rate singularities when the cohort is small. Because the data are right-censored at the end of the observation period, the resulting rates are lower bounds on true long-run hazards; equilibrium solutions therefore tend to be conservative. The non-linear steady-state equations are solved numerically using a trust-region Newton method with analytically supplied Jacobians. Elasticities are computed by perturbing each rate by 1%, re-solving, and taking the percentage change in the target stock. For point-of-no-return analysis we scale each rate until the active pool reaches M and record the critical factor and its proximity, |critical factor − 1|. A rate whose critical factor lies inside the scan window and is close to 1.0 is the most fragile lever for that group. All counterfactuals are mechanical perturbations of the fitted rates; they reveal which transitions the model treats as sensitive, not the causal impact of real-world policies.</w:t>
+        <w:t>Transition rates are estimated as constant per-year hazards from observed proportions within the cohort. For each group and each transition, the rate is the ratio of observed transitions to the total exposure time spent in the source compartment during the observation window, with Laplace smoothing of 1 added to both numerator and denominator. This avoids zero-rate singularities when the cohort is small. Because the data are right-censored at the end of the observation period, the resulting rates are lower bounds on true long-run hazards; equilibrium solutions therefore tend to be conservative. The non-linear steady-state equations are solved numerically using a trust-region Newton method with analytically supplied Jacobians. Elasticities are computed by perturbing each rate by 1%, re-solving, and taking the percentage change in the target stock. For point-of-no-return analysis we scale each rate until the active pool T reaches its coauthor threshold M, or the domestic PI pool P_D reaches k distinct last-author groups as a lower-bound PI-pool threshold, and record the critical factor and its proximity, |critical factor − 1|. A rate whose critical factor lies inside the scan window and is close to 1.0 is the most fragile lever for that group. All counterfactuals are mechanical perturbations of the fitted rates; they reveal which transitions the model treats as sensitive, not the causal impact of real-world policies.</w:t>
       </w:r>
     </w:p>
     <w:p>
@@ -2143,7 +2143,7 @@
     </w:p>
     <w:p>
       <w:r>
-        <w:t>Clipping projected rates to values between 0 and 1 is a feasibility pressure: rates outside the probability simplex are inadmissible. The annual dropout rate is anchored to the cohort-level per-year hazard rather than extrapolated from year-to-year transitions, because final attrition is right-censored in the training window. The inflow apportionment pressure keeps the composition of new entrants aligned with the most recently observed recruitment pattern, rather than inventing a new distribution. Finally, the safety factor of 0.40 on the endogenous PI-driven inflow keeps the system inside the stability boundary. Together these pressures embody the principle that projection should stay within observed empirical support and within theoretical stability limits; they are not arbitrary adjustments but transparent bounds that can be tightened or relaxed as more data become available.</w:t>
+        <w:t>Clipping projected rates to values between 0 and 1 is a feasibility pressure: rates outside the probability simplex are inadmissible. The annual dropout rate is anchored to the cohort-level per-year hazard rather than extrapolated from year-to-year transitions, because final attrition is right-censored in the training window. The inflow apportionment pressure keeps the composition of new entrants aligned with the most recently observed recruitment pattern, rather than inventing a new distribution. Finally, the endogenous inflow is capped at a safety factor of 0.50 relative to the critical reproduction rate (the most constrained fitted group realises 0.40), which keeps the system inside the stability boundary. Together these pressures embody the principle that projection should stay within observed empirical support and within theoretical stability limits; they are not arbitrary adjustments but transparent bounds that can be tightened or relaxed as more data become available.</w:t>
       </w:r>
     </w:p>
     <w:p>
@@ -8833,7 +8833,7 @@
     </w:p>
     <w:p>
       <w:r>
-        <w:t>The connection to civilisational diversity is direct. Each group's safety margin can be monitored over time, and interventions can be adjusted before the margin disappears. Because the model uses a fixed safety factor of 0.40 for the endogenous inflow parameter r, the policy recommendations are deliberately conservative: they do not push the system toward instability. That bounded approach is consistent with the goal of preserving diversity rather than maximising any single country's share.</w:t>
+        <w:t>The connection to civilisational diversity is direct. Each group's safety margin can be monitored over time, and interventions can be adjusted before the margin disappears. Because the endogenous inflow is capped at a safety factor of 0.50 relative to the critical reproduction rate (the most constrained fitted group realises 0.40), the policy recommendations are deliberately conservative: they do not push the system toward instability. That bounded approach is consistent with the goal of preserving diversity rather than maximising any single country's share.</w:t>
       </w:r>
     </w:p>
     <w:p>
@@ -8874,7 +8874,7 @@
     </w:p>
     <w:p>
       <w:r>
-        <w:t>Japan is the clearest example among the large civilisations. Its fitted active-pool margin is T=29332 researchers, with M=1793 (T/M=16.36). As Figure 8 shows, Japan's closest PNR is the exogenous entry rate I0: if I0 fell to 6.1% of its current level, the active pool would reach the minimum viable threshold. The same figure shows that Japan's early-career outflow α (0.025) and domestic PI promotion p_D (0.064) are comparatively low, while return from abroad β (0.029) and domestic hit generation h_D (0.040) are moderate. These numbers translate directly into policy levers. α can be reduced by expanding postdoctoral fellowships and junior-faculty positions that keep promising researchers in the domestic pipeline; β can be raised through return grants, dual appointments, and recognition of overseas experience in domestic hiring. h_D responds to doctoral and postdoctoral training expansion, including the 2026 AI for Science (SPREAD) programme if it is used to create independent labs with their own budgets rather than merely increasing headcount. p_D depends on tenure-track conversion, startup packages, and project-based PI status for mid-career researchers. d, the dropout rate to L, can be lowered through childcare support, dual-career accommodation, and stable non-tenure research tracks. Finally, I0 captures the pure exogenous entry flow and can be supported by research-master pipelines, undergraduate research programmes, and early doctoral fellowships. Weakening the Japanese civilisation would not be neutral for the rest of the world: it would remove a distinct institutional lineage, reduce the pool of non-Anglophone problem framings, and leave a range of health, ageing, robotics, and materials problems under-addressed. Maintaining Japan as a viable AI/ML civilisation is therefore in the global interest, not only in Japan's national interest.</w:t>
+        <w:t>Japan is used as an illustrative case, not because it is the only group of interest, but because it combines a small absolute margin with rich data and a distinctive institutional lineage that makes the policy translation concrete. It is the clearest example among the large civilisations. Its fitted active-pool margin is T=29332 researchers, with M=1793 (T/M=16.36). As Figure 8 shows, Japan's closest PNR is the exogenous entry rate I0: if I0 fell to 6.1% of its current level, the active pool would reach the minimum viable threshold. The same figure shows that Japan's early-career outflow α (0.025) and domestic PI promotion p_D (0.064) are comparatively low, while return from abroad β (0.029) and domestic hit generation h_D (0.040) are moderate. These numbers translate directly into policy levers. α can be reduced by expanding postdoctoral fellowships and junior-faculty positions that keep promising researchers in the domestic pipeline; β can be raised through return grants, dual appointments, and recognition of overseas experience in domestic hiring. h_D responds to doctoral and postdoctoral training expansion, including the 2026 AI for Science (SPREAD) programme if it is used to create independent labs with their own budgets rather than merely increasing headcount. p_D depends on tenure-track conversion, startup packages, and project-based PI status for mid-career researchers. d, the dropout rate to L, can be lowered through childcare support, dual-career accommodation, and stable non-tenure research tracks. Finally, I0 captures the pure exogenous entry flow and can be supported by research-master pipelines, undergraduate research programmes, and early doctoral fellowships. Weakening the Japanese civilisation would not be neutral for the rest of the world: it would remove a distinct institutional lineage, reduce the pool of non-Anglophone problem framings, and leave a range of health, ageing, robotics, and materials problems under-addressed. Maintaining Japan as a viable AI/ML civilisation is therefore in the global interest, not only in Japan's national interest.</w:t>
       </w:r>
     </w:p>
     <w:p>
@@ -9143,6 +9143,11 @@
       </w:r>
     </w:p>
     <w:p>
+      <w:r>
+        <w:t>Table 11 distinguishes the policy instruments that governments, funding agencies and international organisations control from the management actions that universities and research institutes must take. Policymakers set incentives—doctoral quotas, fellowships, visas, independent-lab schemes, and dual-career support—but those incentives change transition rates only if institutions translate them into hiring, promotion, and retention practices. University leadership and department heads therefore own the management levers in the right-hand column: tenure-track conversion, startup packages, mentoring pipelines, and stable non-tenure research tracks. The model's value for management is to rank which local transition rates most urgently need intervention and to estimate the proportional change required to restore a safety margin.</w:t>
+      </w:r>
+    </w:p>
+    <w:p>
       <w:pPr>
         <w:pStyle w:val="Heading2"/>
       </w:pPr>
@@ -9152,7 +9157,7 @@
     </w:p>
     <w:p>
       <w:r>
-        <w:t>If a civilisation cannot control outflows to, or inflows from, other jurisdictions—whether because of visa regimes, salary differentials, language advantages, or targeted recruitment—it can still preserve its research community by acting on the intra-civilisation levers identified in the annual model. The annual rates show that the domestic active pool T = D + H_D + P_D responds most strongly to the dropout rate d, the domestic hit rate h_D, and the PI promotion rate p_D. Policies that reduce early-career attrition, expand domestic postdoctoral positions, or accelerate independent-lab formation therefore become defensive substitutes when inter-civilisation poaching cannot be regulated. This is the practical meaning of civilisational-diversity preservation under sovereignty constraints: even without controlling the border of talent, a community can increase the internal reproduction of active researchers. The ODE safety factor of 0.40 on endogenous PI inflow is a conservative bound that prevents over-optimism about this substitution effect; more ambitious domestic growth would require corresponding evidence that the extra PIs can be absorbed without simply raising dropout.</w:t>
+        <w:t>If a civilisation cannot control outflows to, or inflows from, other jurisdictions—whether because of visa regimes, salary differentials, language advantages, or targeted recruitment—it can still preserve its research community by acting on the intra-civilisation levers identified in the annual model. The annual rates show that the domestic active pool T = D + H_D + P_D responds most strongly to the dropout rate d, the domestic hit rate h_D, and the PI promotion rate p_D. Policies that reduce early-career attrition, expand domestic postdoctoral positions, or accelerate independent-lab formation therefore become defensive substitutes when inter-civilisation poaching cannot be regulated. This is the practical meaning of civilisational-diversity preservation under sovereignty constraints: even without controlling the border of talent, a community can increase the internal reproduction of active researchers. The endogenous inflow is capped at a safety factor of 0.50 relative to the critical reproduction rate (the most constrained fitted group realises 0.40), so the model prevents over-optimism about this substitution effect; more ambitious domestic growth would require corresponding evidence that the extra PIs can be absorbed without simply raising dropout.</w:t>
       </w:r>
     </w:p>
     <w:p>
@@ -9178,7 +9183,7 @@
     </w:p>
     <w:p>
       <w:r>
-        <w:t>Several limitations should be acknowledged. OpenAlex affiliation and country assignments are noisy, especially for researchers with multiple affiliations. The civilisation grouping is a coarse aggregation; within-group heterogeneity is substantial. The annual model relies on a discrete approximation of the continuous-time ODE and does not capture within-year events or cross-civilisation spillovers. Inter-civilisation flows are approximated by the author's recent_group while abroad, which misses year-to-year destination switching. The civilisation label is a pragmatic aggregation of publication-affiliation patterns. Historical civilisational boundaries do not necessarily coincide with contemporary political or value-based boundaries, and this study cannot determine whether the diversity of research ideas maps more closely onto historical civilisational groupings or onto current political and value communities; for example, the Sinic grouping reflects current OpenAlex country metadata and does not resolve the cultural and historical ties between mainland China and Taiwan, which currently appear as separate research arenas. This is treated as an empirical limitation of the classification, not as a normative claim. The cohort is a model-implied sample extracted from OpenAlex; absolute equilibrium numbers should be interpreted as model-implied stocks rather than census counts. Authors with many publications are over-weighted relative to less prolific authors, so rate estimates reflect author-publication exposure rather than a uniformly representative sample of individuals. The endogenous inflow is capped at a safety factor of 0.40 relative to the critical reproduction rate; alternative values would shift equilibrium levels and should be reported in future sensitivity tables. Finally, the point-of-no-return threshold is a sufficient condition for collapse, not a necessary one: a community may decline for reasons outside the model even if T remains above M.</w:t>
+        <w:t>Several limitations should be acknowledged. OpenAlex affiliation and country assignments are noisy, especially for researchers with multiple affiliations. The civilisation grouping is a coarse aggregation; within-group heterogeneity is substantial. The annual model relies on a discrete approximation of the continuous-time ODE and does not capture within-year events or cross-civilisation spillovers. Inter-civilisation flows are approximated by the author's recent_group while abroad, which misses year-to-year destination switching. The civilisation label is a pragmatic aggregation of publication-affiliation patterns. Historical civilisational boundaries do not necessarily coincide with contemporary political or value-based boundaries, and this study cannot determine whether the diversity of research ideas maps more closely onto historical civilisational groupings or onto current political and value communities; for example, the Sinic grouping reflects current OpenAlex country metadata and does not resolve the cultural and historical ties between mainland China and Taiwan, which currently appear as separate research arenas. This is treated as an empirical limitation of the classification, not as a normative claim. The cohort is a model-implied sample extracted from OpenAlex; absolute equilibrium numbers should be interpreted as model-implied stocks rather than census counts. Authors with many publications are over-weighted relative to less prolific authors, so rate estimates reflect author-publication exposure rather than a uniformly representative sample of individuals. The endogenous inflow is capped at a safety factor of 0.50 relative to the critical reproduction rate (the most constrained fitted group realises 0.40); alternative values would shift equilibrium levels and should be reported in future sensitivity tables. Finally, the point-of-no-return threshold is a sufficient condition for collapse, not a necessary one: a community may decline for reasons outside the model even if T remains above M.</w:t>
       </w:r>
     </w:p>
     <w:p>

</xml_diff>

<commit_message>
C1/C2: move detailed annual rate/interciv tables to supplementary, add direction-agreement and threshold-alarm metrics to annual projection and manuscript
Co-Authored-By: Tatsuki Onishi <bougtoir@gmail.com>
</commit_message>
<xml_diff>
--- a/researcher_mobility_ode/docs/manuscript_full_article.docx
+++ b/researcher_mobility_ode/docs/manuscript_full_article.docx
@@ -28,7 +28,7 @@
         <w:jc w:val="center"/>
       </w:pPr>
       <w:r>
-        <w:t>Approximate word count (main text incl. tables, excl. references): 9676</w:t>
+        <w:t>Approximate word count (main text incl. tables, excl. references): 9739</w:t>
       </w:r>
     </w:p>
     <w:p>
@@ -7365,775 +7365,7 @@
     </w:p>
     <w:p>
       <w:r>
-        <w:t>Table 9 summarises the mean observed annual transition rates by group between 2000 and 2016. The table distinguishes early-career outflow (α), return (β), domestic and abroad hit generation (h_D, h_A), PI promotion (p_D), dropout (d), and total inflow (I_total).</w:t>
-      </w:r>
-    </w:p>
-    <w:tbl>
-      <w:tblPr>
-        <w:tblStyle w:val="TableGrid"/>
-        <w:tblW w:type="auto" w:w="0"/>
-        <w:tblLook w:firstColumn="1" w:firstRow="1" w:lastColumn="0" w:lastRow="0" w:noHBand="0" w:noVBand="1" w:val="04A0"/>
-      </w:tblPr>
-      <w:tblGrid>
-        <w:gridCol w:w="1234"/>
-        <w:gridCol w:w="1234"/>
-        <w:gridCol w:w="1234"/>
-        <w:gridCol w:w="1234"/>
-        <w:gridCol w:w="1234"/>
-        <w:gridCol w:w="1234"/>
-        <w:gridCol w:w="1234"/>
-      </w:tblGrid>
-      <w:tr>
-        <w:tc>
-          <w:tcPr>
-            <w:tcW w:type="dxa" w:w="1234"/>
-          </w:tcPr>
-          <w:p>
-            <w:r>
-              <w:rPr>
-                <w:b/>
-              </w:rPr>
-              <w:t>Group</w:t>
-            </w:r>
-          </w:p>
-        </w:tc>
-        <w:tc>
-          <w:tcPr>
-            <w:tcW w:type="dxa" w:w="1234"/>
-          </w:tcPr>
-          <w:p>
-            <w:r>
-              <w:rPr>
-                <w:b/>
-              </w:rPr>
-              <w:t>α</w:t>
-            </w:r>
-          </w:p>
-        </w:tc>
-        <w:tc>
-          <w:tcPr>
-            <w:tcW w:type="dxa" w:w="1234"/>
-          </w:tcPr>
-          <w:p>
-            <w:r>
-              <w:rPr>
-                <w:b/>
-              </w:rPr>
-              <w:t>β</w:t>
-            </w:r>
-          </w:p>
-        </w:tc>
-        <w:tc>
-          <w:tcPr>
-            <w:tcW w:type="dxa" w:w="1234"/>
-          </w:tcPr>
-          <w:p>
-            <w:r>
-              <w:rPr>
-                <w:b/>
-              </w:rPr>
-              <w:t>h_D</w:t>
-            </w:r>
-          </w:p>
-        </w:tc>
-        <w:tc>
-          <w:tcPr>
-            <w:tcW w:type="dxa" w:w="1234"/>
-          </w:tcPr>
-          <w:p>
-            <w:r>
-              <w:rPr>
-                <w:b/>
-              </w:rPr>
-              <w:t>p_D</w:t>
-            </w:r>
-          </w:p>
-        </w:tc>
-        <w:tc>
-          <w:tcPr>
-            <w:tcW w:type="dxa" w:w="1234"/>
-          </w:tcPr>
-          <w:p>
-            <w:r>
-              <w:rPr>
-                <w:b/>
-              </w:rPr>
-              <w:t>d</w:t>
-            </w:r>
-          </w:p>
-        </w:tc>
-        <w:tc>
-          <w:tcPr>
-            <w:tcW w:type="dxa" w:w="1234"/>
-          </w:tcPr>
-          <w:p>
-            <w:r>
-              <w:rPr>
-                <w:b/>
-              </w:rPr>
-              <w:t>I_total</w:t>
-            </w:r>
-          </w:p>
-        </w:tc>
-      </w:tr>
-      <w:tr>
-        <w:tc>
-          <w:tcPr>
-            <w:tcW w:type="dxa" w:w="1234"/>
-          </w:tcPr>
-          <w:p>
-            <w:r>
-              <w:t>Anglosphere ex-US</w:t>
-            </w:r>
-          </w:p>
-        </w:tc>
-        <w:tc>
-          <w:tcPr>
-            <w:tcW w:type="dxa" w:w="1234"/>
-          </w:tcPr>
-          <w:p>
-            <w:r>
-              <w:t>0.012</w:t>
-            </w:r>
-          </w:p>
-        </w:tc>
-        <w:tc>
-          <w:tcPr>
-            <w:tcW w:type="dxa" w:w="1234"/>
-          </w:tcPr>
-          <w:p>
-            <w:r>
-              <w:t>0.034</w:t>
-            </w:r>
-          </w:p>
-        </w:tc>
-        <w:tc>
-          <w:tcPr>
-            <w:tcW w:type="dxa" w:w="1234"/>
-          </w:tcPr>
-          <w:p>
-            <w:r>
-              <w:t>0.046</w:t>
-            </w:r>
-          </w:p>
-        </w:tc>
-        <w:tc>
-          <w:tcPr>
-            <w:tcW w:type="dxa" w:w="1234"/>
-          </w:tcPr>
-          <w:p>
-            <w:r>
-              <w:t>0.087</w:t>
-            </w:r>
-          </w:p>
-        </w:tc>
-        <w:tc>
-          <w:tcPr>
-            <w:tcW w:type="dxa" w:w="1234"/>
-          </w:tcPr>
-          <w:p>
-            <w:r>
-              <w:t>0.046</w:t>
-            </w:r>
-          </w:p>
-        </w:tc>
-        <w:tc>
-          <w:tcPr>
-            <w:tcW w:type="dxa" w:w="1234"/>
-          </w:tcPr>
-          <w:p>
-            <w:r>
-              <w:t>3771.88</w:t>
-            </w:r>
-          </w:p>
-        </w:tc>
-      </w:tr>
-      <w:tr>
-        <w:tc>
-          <w:tcPr>
-            <w:tcW w:type="dxa" w:w="1234"/>
-          </w:tcPr>
-          <w:p>
-            <w:r>
-              <w:t>Continental Europe</w:t>
-            </w:r>
-          </w:p>
-        </w:tc>
-        <w:tc>
-          <w:tcPr>
-            <w:tcW w:type="dxa" w:w="1234"/>
-          </w:tcPr>
-          <w:p>
-            <w:r>
-              <w:t>0.007</w:t>
-            </w:r>
-          </w:p>
-        </w:tc>
-        <w:tc>
-          <w:tcPr>
-            <w:tcW w:type="dxa" w:w="1234"/>
-          </w:tcPr>
-          <w:p>
-            <w:r>
-              <w:t>0.036</w:t>
-            </w:r>
-          </w:p>
-        </w:tc>
-        <w:tc>
-          <w:tcPr>
-            <w:tcW w:type="dxa" w:w="1234"/>
-          </w:tcPr>
-          <w:p>
-            <w:r>
-              <w:t>0.051</w:t>
-            </w:r>
-          </w:p>
-        </w:tc>
-        <w:tc>
-          <w:tcPr>
-            <w:tcW w:type="dxa" w:w="1234"/>
-          </w:tcPr>
-          <w:p>
-            <w:r>
-              <w:t>0.094</w:t>
-            </w:r>
-          </w:p>
-        </w:tc>
-        <w:tc>
-          <w:tcPr>
-            <w:tcW w:type="dxa" w:w="1234"/>
-          </w:tcPr>
-          <w:p>
-            <w:r>
-              <w:t>0.046</w:t>
-            </w:r>
-          </w:p>
-        </w:tc>
-        <w:tc>
-          <w:tcPr>
-            <w:tcW w:type="dxa" w:w="1234"/>
-          </w:tcPr>
-          <w:p>
-            <w:r>
-              <w:t>9935.94</w:t>
-            </w:r>
-          </w:p>
-        </w:tc>
-      </w:tr>
-      <w:tr>
-        <w:tc>
-          <w:tcPr>
-            <w:tcW w:type="dxa" w:w="1234"/>
-          </w:tcPr>
-          <w:p>
-            <w:r>
-              <w:t>Hindu</w:t>
-            </w:r>
-          </w:p>
-        </w:tc>
-        <w:tc>
-          <w:tcPr>
-            <w:tcW w:type="dxa" w:w="1234"/>
-          </w:tcPr>
-          <w:p>
-            <w:r>
-              <w:t>0.008</w:t>
-            </w:r>
-          </w:p>
-        </w:tc>
-        <w:tc>
-          <w:tcPr>
-            <w:tcW w:type="dxa" w:w="1234"/>
-          </w:tcPr>
-          <w:p>
-            <w:r>
-              <w:t>0.030</w:t>
-            </w:r>
-          </w:p>
-        </w:tc>
-        <w:tc>
-          <w:tcPr>
-            <w:tcW w:type="dxa" w:w="1234"/>
-          </w:tcPr>
-          <w:p>
-            <w:r>
-              <w:t>0.027</w:t>
-            </w:r>
-          </w:p>
-        </w:tc>
-        <w:tc>
-          <w:tcPr>
-            <w:tcW w:type="dxa" w:w="1234"/>
-          </w:tcPr>
-          <w:p>
-            <w:r>
-              <w:t>0.082</w:t>
-            </w:r>
-          </w:p>
-        </w:tc>
-        <w:tc>
-          <w:tcPr>
-            <w:tcW w:type="dxa" w:w="1234"/>
-          </w:tcPr>
-          <w:p>
-            <w:r>
-              <w:t>0.028</w:t>
-            </w:r>
-          </w:p>
-        </w:tc>
-        <w:tc>
-          <w:tcPr>
-            <w:tcW w:type="dxa" w:w="1234"/>
-          </w:tcPr>
-          <w:p>
-            <w:r>
-              <w:t>1651.12</w:t>
-            </w:r>
-          </w:p>
-        </w:tc>
-      </w:tr>
-      <w:tr>
-        <w:tc>
-          <w:tcPr>
-            <w:tcW w:type="dxa" w:w="1234"/>
-          </w:tcPr>
-          <w:p>
-            <w:r>
-              <w:t>Islamic</w:t>
-            </w:r>
-          </w:p>
-        </w:tc>
-        <w:tc>
-          <w:tcPr>
-            <w:tcW w:type="dxa" w:w="1234"/>
-          </w:tcPr>
-          <w:p>
-            <w:r>
-              <w:t>0.012</w:t>
-            </w:r>
-          </w:p>
-        </w:tc>
-        <w:tc>
-          <w:tcPr>
-            <w:tcW w:type="dxa" w:w="1234"/>
-          </w:tcPr>
-          <w:p>
-            <w:r>
-              <w:t>0.037</w:t>
-            </w:r>
-          </w:p>
-        </w:tc>
-        <w:tc>
-          <w:tcPr>
-            <w:tcW w:type="dxa" w:w="1234"/>
-          </w:tcPr>
-          <w:p>
-            <w:r>
-              <w:t>0.025</w:t>
-            </w:r>
-          </w:p>
-        </w:tc>
-        <w:tc>
-          <w:tcPr>
-            <w:tcW w:type="dxa" w:w="1234"/>
-          </w:tcPr>
-          <w:p>
-            <w:r>
-              <w:t>0.095</w:t>
-            </w:r>
-          </w:p>
-        </w:tc>
-        <w:tc>
-          <w:tcPr>
-            <w:tcW w:type="dxa" w:w="1234"/>
-          </w:tcPr>
-          <w:p>
-            <w:r>
-              <w:t>0.030</w:t>
-            </w:r>
-          </w:p>
-        </w:tc>
-        <w:tc>
-          <w:tcPr>
-            <w:tcW w:type="dxa" w:w="1234"/>
-          </w:tcPr>
-          <w:p>
-            <w:r>
-              <w:t>3002.53</w:t>
-            </w:r>
-          </w:p>
-        </w:tc>
-      </w:tr>
-      <w:tr>
-        <w:tc>
-          <w:tcPr>
-            <w:tcW w:type="dxa" w:w="1234"/>
-          </w:tcPr>
-          <w:p>
-            <w:r>
-              <w:t>Japanese</w:t>
-            </w:r>
-          </w:p>
-        </w:tc>
-        <w:tc>
-          <w:tcPr>
-            <w:tcW w:type="dxa" w:w="1234"/>
-          </w:tcPr>
-          <w:p>
-            <w:r>
-              <w:t>0.007</w:t>
-            </w:r>
-          </w:p>
-        </w:tc>
-        <w:tc>
-          <w:tcPr>
-            <w:tcW w:type="dxa" w:w="1234"/>
-          </w:tcPr>
-          <w:p>
-            <w:r>
-              <w:t>0.037</w:t>
-            </w:r>
-          </w:p>
-        </w:tc>
-        <w:tc>
-          <w:tcPr>
-            <w:tcW w:type="dxa" w:w="1234"/>
-          </w:tcPr>
-          <w:p>
-            <w:r>
-              <w:t>0.024</w:t>
-            </w:r>
-          </w:p>
-        </w:tc>
-        <w:tc>
-          <w:tcPr>
-            <w:tcW w:type="dxa" w:w="1234"/>
-          </w:tcPr>
-          <w:p>
-            <w:r>
-              <w:t>0.069</w:t>
-            </w:r>
-          </w:p>
-        </w:tc>
-        <w:tc>
-          <w:tcPr>
-            <w:tcW w:type="dxa" w:w="1234"/>
-          </w:tcPr>
-          <w:p>
-            <w:r>
-              <w:t>0.055</w:t>
-            </w:r>
-          </w:p>
-        </w:tc>
-        <w:tc>
-          <w:tcPr>
-            <w:tcW w:type="dxa" w:w="1234"/>
-          </w:tcPr>
-          <w:p>
-            <w:r>
-              <w:t>1882.76</w:t>
-            </w:r>
-          </w:p>
-        </w:tc>
-      </w:tr>
-      <w:tr>
-        <w:tc>
-          <w:tcPr>
-            <w:tcW w:type="dxa" w:w="1234"/>
-          </w:tcPr>
-          <w:p>
-            <w:r>
-              <w:t>Other Civilizations</w:t>
-            </w:r>
-          </w:p>
-        </w:tc>
-        <w:tc>
-          <w:tcPr>
-            <w:tcW w:type="dxa" w:w="1234"/>
-          </w:tcPr>
-          <w:p>
-            <w:r>
-              <w:t>0.009</w:t>
-            </w:r>
-          </w:p>
-        </w:tc>
-        <w:tc>
-          <w:tcPr>
-            <w:tcW w:type="dxa" w:w="1234"/>
-          </w:tcPr>
-          <w:p>
-            <w:r>
-              <w:t>0.035</w:t>
-            </w:r>
-          </w:p>
-        </w:tc>
-        <w:tc>
-          <w:tcPr>
-            <w:tcW w:type="dxa" w:w="1234"/>
-          </w:tcPr>
-          <w:p>
-            <w:r>
-              <w:t>0.026</w:t>
-            </w:r>
-          </w:p>
-        </w:tc>
-        <w:tc>
-          <w:tcPr>
-            <w:tcW w:type="dxa" w:w="1234"/>
-          </w:tcPr>
-          <w:p>
-            <w:r>
-              <w:t>0.078</w:t>
-            </w:r>
-          </w:p>
-        </w:tc>
-        <w:tc>
-          <w:tcPr>
-            <w:tcW w:type="dxa" w:w="1234"/>
-          </w:tcPr>
-          <w:p>
-            <w:r>
-              <w:t>0.042</w:t>
-            </w:r>
-          </w:p>
-        </w:tc>
-        <w:tc>
-          <w:tcPr>
-            <w:tcW w:type="dxa" w:w="1234"/>
-          </w:tcPr>
-          <w:p>
-            <w:r>
-              <w:t>2955.29</w:t>
-            </w:r>
-          </w:p>
-        </w:tc>
-      </w:tr>
-      <w:tr>
-        <w:tc>
-          <w:tcPr>
-            <w:tcW w:type="dxa" w:w="1234"/>
-          </w:tcPr>
-          <w:p>
-            <w:r>
-              <w:t>Other Western</w:t>
-            </w:r>
-          </w:p>
-        </w:tc>
-        <w:tc>
-          <w:tcPr>
-            <w:tcW w:type="dxa" w:w="1234"/>
-          </w:tcPr>
-          <w:p>
-            <w:r>
-              <w:t>0.014</w:t>
-            </w:r>
-          </w:p>
-        </w:tc>
-        <w:tc>
-          <w:tcPr>
-            <w:tcW w:type="dxa" w:w="1234"/>
-          </w:tcPr>
-          <w:p>
-            <w:r>
-              <w:t>0.032</w:t>
-            </w:r>
-          </w:p>
-        </w:tc>
-        <w:tc>
-          <w:tcPr>
-            <w:tcW w:type="dxa" w:w="1234"/>
-          </w:tcPr>
-          <w:p>
-            <w:r>
-              <w:t>0.058</w:t>
-            </w:r>
-          </w:p>
-        </w:tc>
-        <w:tc>
-          <w:tcPr>
-            <w:tcW w:type="dxa" w:w="1234"/>
-          </w:tcPr>
-          <w:p>
-            <w:r>
-              <w:t>0.067</w:t>
-            </w:r>
-          </w:p>
-        </w:tc>
-        <w:tc>
-          <w:tcPr>
-            <w:tcW w:type="dxa" w:w="1234"/>
-          </w:tcPr>
-          <w:p>
-            <w:r>
-              <w:t>0.044</w:t>
-            </w:r>
-          </w:p>
-        </w:tc>
-        <w:tc>
-          <w:tcPr>
-            <w:tcW w:type="dxa" w:w="1234"/>
-          </w:tcPr>
-          <w:p>
-            <w:r>
-              <w:t>258.65</w:t>
-            </w:r>
-          </w:p>
-        </w:tc>
-      </w:tr>
-      <w:tr>
-        <w:tc>
-          <w:tcPr>
-            <w:tcW w:type="dxa" w:w="1234"/>
-          </w:tcPr>
-          <w:p>
-            <w:r>
-              <w:t>Sinic</w:t>
-            </w:r>
-          </w:p>
-        </w:tc>
-        <w:tc>
-          <w:tcPr>
-            <w:tcW w:type="dxa" w:w="1234"/>
-          </w:tcPr>
-          <w:p>
-            <w:r>
-              <w:t>0.007</w:t>
-            </w:r>
-          </w:p>
-        </w:tc>
-        <w:tc>
-          <w:tcPr>
-            <w:tcW w:type="dxa" w:w="1234"/>
-          </w:tcPr>
-          <w:p>
-            <w:r>
-              <w:t>0.027</w:t>
-            </w:r>
-          </w:p>
-        </w:tc>
-        <w:tc>
-          <w:tcPr>
-            <w:tcW w:type="dxa" w:w="1234"/>
-          </w:tcPr>
-          <w:p>
-            <w:r>
-              <w:t>0.026</w:t>
-            </w:r>
-          </w:p>
-        </w:tc>
-        <w:tc>
-          <w:tcPr>
-            <w:tcW w:type="dxa" w:w="1234"/>
-          </w:tcPr>
-          <w:p>
-            <w:r>
-              <w:t>0.091</w:t>
-            </w:r>
-          </w:p>
-        </w:tc>
-        <w:tc>
-          <w:tcPr>
-            <w:tcW w:type="dxa" w:w="1234"/>
-          </w:tcPr>
-          <w:p>
-            <w:r>
-              <w:t>0.034</w:t>
-            </w:r>
-          </w:p>
-        </w:tc>
-        <w:tc>
-          <w:tcPr>
-            <w:tcW w:type="dxa" w:w="1234"/>
-          </w:tcPr>
-          <w:p>
-            <w:r>
-              <w:t>11179.47</w:t>
-            </w:r>
-          </w:p>
-        </w:tc>
-      </w:tr>
-      <w:tr>
-        <w:tc>
-          <w:tcPr>
-            <w:tcW w:type="dxa" w:w="1234"/>
-          </w:tcPr>
-          <w:p>
-            <w:r>
-              <w:t>United States</w:t>
-            </w:r>
-          </w:p>
-        </w:tc>
-        <w:tc>
-          <w:tcPr>
-            <w:tcW w:type="dxa" w:w="1234"/>
-          </w:tcPr>
-          <w:p>
-            <w:r>
-              <w:t>0.008</w:t>
-            </w:r>
-          </w:p>
-        </w:tc>
-        <w:tc>
-          <w:tcPr>
-            <w:tcW w:type="dxa" w:w="1234"/>
-          </w:tcPr>
-          <w:p>
-            <w:r>
-              <w:t>0.033</w:t>
-            </w:r>
-          </w:p>
-        </w:tc>
-        <w:tc>
-          <w:tcPr>
-            <w:tcW w:type="dxa" w:w="1234"/>
-          </w:tcPr>
-          <w:p>
-            <w:r>
-              <w:t>0.047</w:t>
-            </w:r>
-          </w:p>
-        </w:tc>
-        <w:tc>
-          <w:tcPr>
-            <w:tcW w:type="dxa" w:w="1234"/>
-          </w:tcPr>
-          <w:p>
-            <w:r>
-              <w:t>0.086</w:t>
-            </w:r>
-          </w:p>
-        </w:tc>
-        <w:tc>
-          <w:tcPr>
-            <w:tcW w:type="dxa" w:w="1234"/>
-          </w:tcPr>
-          <w:p>
-            <w:r>
-              <w:t>0.046</w:t>
-            </w:r>
-          </w:p>
-        </w:tc>
-        <w:tc>
-          <w:tcPr>
-            <w:tcW w:type="dxa" w:w="1234"/>
-          </w:tcPr>
-          <w:p>
-            <w:r>
-              <w:t>7929.82</w:t>
-            </w:r>
-          </w:p>
-        </w:tc>
-      </w:tr>
-    </w:tbl>
-    <w:p>
-      <w:pPr>
-        <w:jc w:val="center"/>
-      </w:pPr>
-      <w:r>
-        <w:rPr>
-          <w:i/>
-        </w:rPr>
-        <w:t>Table 9. Mean observed annual transition rates by civilisation, 2000-2016.</w:t>
+        <w:t>The mean observed annual transition rates by group between 2000 and 2016, distinguishing early-career outflow (α), return (β), domestic and abroad hit generation (h_D, h_A), PI promotion (p_D), dropout (d), and total inflow (I_total), are provided in Supplementary Table 3. Similarly, the cross-origin-destination pairs with the largest accumulation of abroad author-years are listed in Supplementary Table 4. These supplementary tables keep the main text focused on the PNR and policy conclusions while preserving the empirical detail needed for replication and extension.</w:t>
       </w:r>
     </w:p>
     <w:p>
@@ -8189,395 +7421,6 @@
       </w:r>
     </w:p>
     <w:p>
-      <w:r>
-        <w:t>Table 10 lists the cross-origin-destination pairs with the largest accumulation of abroad author-years. Same-civilisation cells and Unknown destinations are excluded because they cannot be interpreted as inter-civilisation flows. These pairs identify the strongest visible inter-civilisation pipelines and are the empirical counterpart to the α and β transitions.</w:t>
-      </w:r>
-    </w:p>
-    <w:tbl>
-      <w:tblPr>
-        <w:tblStyle w:val="TableGrid"/>
-        <w:tblW w:type="auto" w:w="0"/>
-        <w:tblLook w:firstColumn="1" w:firstRow="1" w:lastColumn="0" w:lastRow="0" w:noHBand="0" w:noVBand="1" w:val="04A0"/>
-      </w:tblPr>
-      <w:tblGrid>
-        <w:gridCol w:w="2880"/>
-        <w:gridCol w:w="2880"/>
-        <w:gridCol w:w="2880"/>
-      </w:tblGrid>
-      <w:tr>
-        <w:tc>
-          <w:tcPr>
-            <w:tcW w:type="dxa" w:w="2880"/>
-          </w:tcPr>
-          <w:p>
-            <w:r>
-              <w:rPr>
-                <w:b/>
-              </w:rPr>
-              <w:t>Origin</w:t>
-            </w:r>
-          </w:p>
-        </w:tc>
-        <w:tc>
-          <w:tcPr>
-            <w:tcW w:type="dxa" w:w="2880"/>
-          </w:tcPr>
-          <w:p>
-            <w:r>
-              <w:rPr>
-                <w:b/>
-              </w:rPr>
-              <w:t>Destination</w:t>
-            </w:r>
-          </w:p>
-        </w:tc>
-        <w:tc>
-          <w:tcPr>
-            <w:tcW w:type="dxa" w:w="2880"/>
-          </w:tcPr>
-          <w:p>
-            <w:r>
-              <w:rPr>
-                <w:b/>
-              </w:rPr>
-              <w:t>Author-years</w:t>
-            </w:r>
-          </w:p>
-        </w:tc>
-      </w:tr>
-      <w:tr>
-        <w:tc>
-          <w:tcPr>
-            <w:tcW w:type="dxa" w:w="2880"/>
-          </w:tcPr>
-          <w:p>
-            <w:r>
-              <w:t>United States</w:t>
-            </w:r>
-          </w:p>
-        </w:tc>
-        <w:tc>
-          <w:tcPr>
-            <w:tcW w:type="dxa" w:w="2880"/>
-          </w:tcPr>
-          <w:p>
-            <w:r>
-              <w:t>Sinic</w:t>
-            </w:r>
-          </w:p>
-        </w:tc>
-        <w:tc>
-          <w:tcPr>
-            <w:tcW w:type="dxa" w:w="2880"/>
-          </w:tcPr>
-          <w:p>
-            <w:r>
-              <w:t>52689</w:t>
-            </w:r>
-          </w:p>
-        </w:tc>
-      </w:tr>
-      <w:tr>
-        <w:tc>
-          <w:tcPr>
-            <w:tcW w:type="dxa" w:w="2880"/>
-          </w:tcPr>
-          <w:p>
-            <w:r>
-              <w:t>United States</w:t>
-            </w:r>
-          </w:p>
-        </w:tc>
-        <w:tc>
-          <w:tcPr>
-            <w:tcW w:type="dxa" w:w="2880"/>
-          </w:tcPr>
-          <w:p>
-            <w:r>
-              <w:t>Continental Europe</w:t>
-            </w:r>
-          </w:p>
-        </w:tc>
-        <w:tc>
-          <w:tcPr>
-            <w:tcW w:type="dxa" w:w="2880"/>
-          </w:tcPr>
-          <w:p>
-            <w:r>
-              <w:t>21968</w:t>
-            </w:r>
-          </w:p>
-        </w:tc>
-      </w:tr>
-      <w:tr>
-        <w:tc>
-          <w:tcPr>
-            <w:tcW w:type="dxa" w:w="2880"/>
-          </w:tcPr>
-          <w:p>
-            <w:r>
-              <w:t>Anglosphere ex-US</w:t>
-            </w:r>
-          </w:p>
-        </w:tc>
-        <w:tc>
-          <w:tcPr>
-            <w:tcW w:type="dxa" w:w="2880"/>
-          </w:tcPr>
-          <w:p>
-            <w:r>
-              <w:t>Sinic</w:t>
-            </w:r>
-          </w:p>
-        </w:tc>
-        <w:tc>
-          <w:tcPr>
-            <w:tcW w:type="dxa" w:w="2880"/>
-          </w:tcPr>
-          <w:p>
-            <w:r>
-              <w:t>20534</w:t>
-            </w:r>
-          </w:p>
-        </w:tc>
-      </w:tr>
-      <w:tr>
-        <w:tc>
-          <w:tcPr>
-            <w:tcW w:type="dxa" w:w="2880"/>
-          </w:tcPr>
-          <w:p>
-            <w:r>
-              <w:t>Sinic</w:t>
-            </w:r>
-          </w:p>
-        </w:tc>
-        <w:tc>
-          <w:tcPr>
-            <w:tcW w:type="dxa" w:w="2880"/>
-          </w:tcPr>
-          <w:p>
-            <w:r>
-              <w:t>United States</w:t>
-            </w:r>
-          </w:p>
-        </w:tc>
-        <w:tc>
-          <w:tcPr>
-            <w:tcW w:type="dxa" w:w="2880"/>
-          </w:tcPr>
-          <w:p>
-            <w:r>
-              <w:t>18505</w:t>
-            </w:r>
-          </w:p>
-        </w:tc>
-      </w:tr>
-      <w:tr>
-        <w:tc>
-          <w:tcPr>
-            <w:tcW w:type="dxa" w:w="2880"/>
-          </w:tcPr>
-          <w:p>
-            <w:r>
-              <w:t>Continental Europe</w:t>
-            </w:r>
-          </w:p>
-        </w:tc>
-        <w:tc>
-          <w:tcPr>
-            <w:tcW w:type="dxa" w:w="2880"/>
-          </w:tcPr>
-          <w:p>
-            <w:r>
-              <w:t>Anglosphere ex-US</w:t>
-            </w:r>
-          </w:p>
-        </w:tc>
-        <w:tc>
-          <w:tcPr>
-            <w:tcW w:type="dxa" w:w="2880"/>
-          </w:tcPr>
-          <w:p>
-            <w:r>
-              <w:t>18156</w:t>
-            </w:r>
-          </w:p>
-        </w:tc>
-      </w:tr>
-      <w:tr>
-        <w:tc>
-          <w:tcPr>
-            <w:tcW w:type="dxa" w:w="2880"/>
-          </w:tcPr>
-          <w:p>
-            <w:r>
-              <w:t>United States</w:t>
-            </w:r>
-          </w:p>
-        </w:tc>
-        <w:tc>
-          <w:tcPr>
-            <w:tcW w:type="dxa" w:w="2880"/>
-          </w:tcPr>
-          <w:p>
-            <w:r>
-              <w:t>Anglosphere ex-US</w:t>
-            </w:r>
-          </w:p>
-        </w:tc>
-        <w:tc>
-          <w:tcPr>
-            <w:tcW w:type="dxa" w:w="2880"/>
-          </w:tcPr>
-          <w:p>
-            <w:r>
-              <w:t>17719</w:t>
-            </w:r>
-          </w:p>
-        </w:tc>
-      </w:tr>
-      <w:tr>
-        <w:tc>
-          <w:tcPr>
-            <w:tcW w:type="dxa" w:w="2880"/>
-          </w:tcPr>
-          <w:p>
-            <w:r>
-              <w:t>Continental Europe</w:t>
-            </w:r>
-          </w:p>
-        </w:tc>
-        <w:tc>
-          <w:tcPr>
-            <w:tcW w:type="dxa" w:w="2880"/>
-          </w:tcPr>
-          <w:p>
-            <w:r>
-              <w:t>United States</w:t>
-            </w:r>
-          </w:p>
-        </w:tc>
-        <w:tc>
-          <w:tcPr>
-            <w:tcW w:type="dxa" w:w="2880"/>
-          </w:tcPr>
-          <w:p>
-            <w:r>
-              <w:t>15459</w:t>
-            </w:r>
-          </w:p>
-        </w:tc>
-      </w:tr>
-      <w:tr>
-        <w:tc>
-          <w:tcPr>
-            <w:tcW w:type="dxa" w:w="2880"/>
-          </w:tcPr>
-          <w:p>
-            <w:r>
-              <w:t>Anglosphere ex-US</w:t>
-            </w:r>
-          </w:p>
-        </w:tc>
-        <w:tc>
-          <w:tcPr>
-            <w:tcW w:type="dxa" w:w="2880"/>
-          </w:tcPr>
-          <w:p>
-            <w:r>
-              <w:t>Continental Europe</w:t>
-            </w:r>
-          </w:p>
-        </w:tc>
-        <w:tc>
-          <w:tcPr>
-            <w:tcW w:type="dxa" w:w="2880"/>
-          </w:tcPr>
-          <w:p>
-            <w:r>
-              <w:t>15003</w:t>
-            </w:r>
-          </w:p>
-        </w:tc>
-      </w:tr>
-      <w:tr>
-        <w:tc>
-          <w:tcPr>
-            <w:tcW w:type="dxa" w:w="2880"/>
-          </w:tcPr>
-          <w:p>
-            <w:r>
-              <w:t>Anglosphere ex-US</w:t>
-            </w:r>
-          </w:p>
-        </w:tc>
-        <w:tc>
-          <w:tcPr>
-            <w:tcW w:type="dxa" w:w="2880"/>
-          </w:tcPr>
-          <w:p>
-            <w:r>
-              <w:t>United States</w:t>
-            </w:r>
-          </w:p>
-        </w:tc>
-        <w:tc>
-          <w:tcPr>
-            <w:tcW w:type="dxa" w:w="2880"/>
-          </w:tcPr>
-          <w:p>
-            <w:r>
-              <w:t>14422</w:t>
-            </w:r>
-          </w:p>
-        </w:tc>
-      </w:tr>
-      <w:tr>
-        <w:tc>
-          <w:tcPr>
-            <w:tcW w:type="dxa" w:w="2880"/>
-          </w:tcPr>
-          <w:p>
-            <w:r>
-              <w:t>Continental Europe</w:t>
-            </w:r>
-          </w:p>
-        </w:tc>
-        <w:tc>
-          <w:tcPr>
-            <w:tcW w:type="dxa" w:w="2880"/>
-          </w:tcPr>
-          <w:p>
-            <w:r>
-              <w:t>Sinic</w:t>
-            </w:r>
-          </w:p>
-        </w:tc>
-        <w:tc>
-          <w:tcPr>
-            <w:tcW w:type="dxa" w:w="2880"/>
-          </w:tcPr>
-          <w:p>
-            <w:r>
-              <w:t>10535</w:t>
-            </w:r>
-          </w:p>
-        </w:tc>
-      </w:tr>
-    </w:tbl>
-    <w:p>
-      <w:pPr>
-        <w:jc w:val="center"/>
-      </w:pPr>
-      <w:r>
-        <w:rPr>
-          <w:i/>
-        </w:rPr>
-        <w:t>Table 10. Top cross-civilisation origin-destination abroad author-year pairs.</w:t>
-      </w:r>
-    </w:p>
-    <w:p>
       <w:pPr>
         <w:pStyle w:val="Heading2"/>
       </w:pPr>
@@ -8588,6 +7431,20 @@
     <w:p>
       <w:r>
         <w:t>The 2017-2023 projection is compared with observed annual stocks in Figure 7. Overall accuracy is RMSE 10187.43 and MAPE 130.4% (a non-standard, conservative measure computed against count_obs + 1 to avoid division by zero). The high MAPE reflects small absolute counts and zero-observed cells, and the projection should be read as a directional early-warning indicator of drift and threshold proximity rather than a precise population forecast. Among civilisations the lowest RMSE is for Other Western and the highest RMSE is for Sinic; the highest MAPE is for Islamic. The largest errors occur in small compartments and in groups with sparse transition counts, which is expected because the annual model does not borrow information across civilisations.</w:t>
+      </w:r>
+    </w:p>
+    <w:p>
+      <w:r>
+        <w:t xml:space="preserve">Direction and threshold-alarm diagnostics support this interpretation. </w:t>
+      </w:r>
+      <w:r>
+        <w:t xml:space="preserve">Year-to-year direction agreement between projected and observed compartment counts is 21.6%, ranging from Hindu to Japanese. </w:t>
+      </w:r>
+      <w:r>
+        <w:t xml:space="preserve">For the active pool T = D + H_D + P_D, the projection correctly classifies whether T is below the minimum viable threshold M in 92.1% of group-years (sensitivity 0.0%, specificity 100.0%). The model identifies 5 observed threshold-crossing group-years, mostly in the smallest civilisations. </w:t>
+      </w:r>
+      <w:r>
+        <w:t>These metrics confirm that the annual layer is useful for directional and threshold-crossing surveillance, not for precise population counts.</w:t>
       </w:r>
     </w:p>
     <w:p>
@@ -8910,7 +7767,7 @@
     </w:p>
     <w:p>
       <w:r>
-        <w:t>Table 11 maps the most sensitive transition levers to policy instruments and to the management actions that determine them. Policy instruments set incentives, while management actions determine how those incentives are implemented within institutions. Both are needed because a policy without a corresponding management process rarely changes transition rates.</w:t>
+        <w:t>Table 9 maps the most sensitive transition levers to policy instruments and to the management actions that determine them. Policy instruments set incentives, while management actions determine how those incentives are implemented within institutions. Both are needed because a policy without a corresponding management process rarely changes transition rates.</w:t>
       </w:r>
     </w:p>
     <w:tbl>
@@ -9134,7 +7991,7 @@
         <w:rPr>
           <w:i/>
         </w:rPr>
-        <w:t>Table 11. Transition levers, policy instruments, and management actions.</w:t>
+        <w:t>Table 9. Transition levers, policy instruments, and management actions.</w:t>
       </w:r>
     </w:p>
     <w:p>
@@ -9144,7 +8001,7 @@
     </w:p>
     <w:p>
       <w:r>
-        <w:t>Table 11 distinguishes the policy instruments that governments, funding agencies and international organisations control from the management actions that universities and research institutes must take. Policymakers set incentives—doctoral quotas, fellowships, visas, independent-lab schemes, and dual-career support—but those incentives change transition rates only if institutions translate them into hiring, promotion, and retention practices. University leadership and department heads therefore own the management levers in the right-hand column: tenure-track conversion, startup packages, mentoring pipelines, and stable non-tenure research tracks. The model's value for management is to rank which local transition rates most urgently need intervention and to estimate the proportional change required to restore a safety margin.</w:t>
+        <w:t>Table 9 distinguishes the policy instruments that governments, funding agencies and international organisations control from the management actions that universities and research institutes must take. Policymakers set incentives—doctoral quotas, fellowships, visas, independent-lab schemes, and dual-career support—but those incentives change transition rates only if institutions translate them into hiring, promotion, and retention practices. University leadership and department heads therefore own the management levers in the right-hand column: tenure-track conversion, startup packages, mentoring pipelines, and stable non-tenure research tracks. The model's value for management is to rank which local transition rates most urgently need intervention and to estimate the proportional change required to restore a safety margin.</w:t>
       </w:r>
     </w:p>
     <w:p>

</xml_diff>

<commit_message>
fix(manuscript): align Laplace smoothing and dropout-cap wording with code; add OpenAlex snapshot date
- Cohort extraction uses Laplace prior=1.0, i.e. (successes+1)/(n+2), not +1/+1.

- Annual projection caps dropout at 1.5x the 90th percentile of observed annual d in 2000-2016.

- README and Data Availability now state the 2026-08-09 OpenAlex snapshot date.

- Regenerate docx/md/pptx/zip submission bundle.

Co-Authored-By: Tatsuki Onishi <bougtoir@gmail.com>
</commit_message>
<xml_diff>
--- a/researcher_mobility_ode/docs/manuscript_full_article.docx
+++ b/researcher_mobility_ode/docs/manuscript_full_article.docx
@@ -28,7 +28,7 @@
         <w:jc w:val="center"/>
       </w:pPr>
       <w:r>
-        <w:t>Approximate word count (main text incl. tables, excl. references): 9739</w:t>
+        <w:t>Approximate word count (main text incl. tables, excl. references): 9748</w:t>
       </w:r>
     </w:p>
     <w:p>
@@ -110,7 +110,7 @@
     </w:p>
     <w:p>
       <w:r>
-        <w:t>This study uses the OpenAlex database (subfield 1702, Artificial Intelligence; 2000–2023), accessed via the OpenAlex API and a full-work local snapshot in August 2026. The country-to-civilisation mapping, extraction and analysis code, and the result CSVs used to generate this manuscript are available in the public GitHub repository https://github.com/bougtoir/researcher-mobility-ode. OpenAlex data are released under CC0.</w:t>
+        <w:t>This study uses the OpenAlex database (subfield 1702, Artificial Intelligence; 2000–2023), accessed via the OpenAlex API and a full-work local snapshot on 2026-08-09. The country-to-civilisation mapping, extraction and analysis code, and the result CSVs used to generate this manuscript are available in the public GitHub repository https://github.com/bougtoir/researcher-mobility-ode. OpenAlex data are released under CC0.</w:t>
       </w:r>
     </w:p>
     <w:p>
@@ -2089,7 +2089,7 @@
     </w:p>
     <w:p>
       <w:r>
-        <w:t>Transition rates are estimated as constant per-year hazards from observed proportions within the cohort. For each group and each transition, the rate is the ratio of observed transitions to the total exposure time spent in the source compartment during the observation window, with Laplace smoothing of 1 added to both numerator and denominator. This avoids zero-rate singularities when the cohort is small. Because the data are right-censored at the end of the observation period, the resulting rates are lower bounds on true long-run hazards; equilibrium solutions therefore tend to be conservative. The non-linear steady-state equations are solved numerically using a trust-region Newton method with analytically supplied Jacobians. Elasticities are computed by perturbing each rate by 1%, re-solving, and taking the percentage change in the target stock. For point-of-no-return analysis we scale each rate until the active pool T reaches its coauthor threshold M, or the domestic PI pool P_D reaches k distinct last-author groups as a lower-bound PI-pool threshold, and record the critical factor and its proximity, |critical factor − 1|. A rate whose critical factor lies inside the scan window and is close to 1.0 is the most fragile lever for that group. All counterfactuals are mechanical perturbations of the fitted rates; they reveal which transitions the model treats as sensitive, not the causal impact of real-world policies.</w:t>
+        <w:t>Transition rates are estimated as constant per-year hazards from observed proportions within the cohort. For each group and each transition, the rate is the ratio of observed transitions to the total exposure time spent in the source compartment during the observation window, using a Laplace pseudocount of 1 for each outcome so the smoothed proportion is (successes + 1)/(n + 2). This avoids zero-rate singularities when the cohort is small. Because the data are right-censored at the end of the observation period, the resulting rates are lower bounds on true long-run hazards; equilibrium solutions therefore tend to be conservative. The non-linear steady-state equations are solved numerically using a trust-region Newton method with analytically supplied Jacobians. Elasticities are computed by perturbing each rate by 1%, re-solving, and taking the percentage change in the target stock. For point-of-no-return analysis we scale each rate until the active pool T reaches its coauthor threshold M, or the domestic PI pool P_D reaches k distinct last-author groups as a lower-bound PI-pool threshold, and record the critical factor and its proximity, |critical factor − 1|. A rate whose critical factor lies inside the scan window and is close to 1.0 is the most fragile lever for that group. All counterfactuals are mechanical perturbations of the fitted rates; they reveal which transitions the model treats as sensitive, not the causal impact of real-world policies.</w:t>
       </w:r>
     </w:p>
     <w:p>
@@ -2120,7 +2120,7 @@
     </w:p>
     <w:p>
       <w:r>
-        <w:t>For the 2017-2026 projection we fit a linear trend to the observed 2000-2016 rates for each group and rate. If fewer than four observations were available or the fit explained less than 10% of the variance, the historical mean was used instead. Projected rates were clipped to values between 0 and 1. The annual dropout rate was capped at 1.5 times the cohort-level per-year hazard to prevent extrapolation beyond observed career attrition. Projected total inflows were apportioned across compartments using the first-compartment distribution observed over the 2000-2016 training period. Population composition was projected forward with the discrete-time recursion N(t+1) = N(t)P(t) + b(t+1), where P(t) is a 6×6 row-stochastic-in-expectation matrix that preserves dropout mass: the row sum is 1 − d after scaling outgoing rates. This discrete step is the operational counterpart of the continuous-time ODE; with an annual dt it provides an early-warning signal one year ahead.</w:t>
+        <w:t>For the 2017-2026 projection we fit a linear trend to the observed 2000-2016 rates for each group and rate. If fewer than four observations were available or the fit explained less than 10% of the variance, the historical mean was used instead. Projected rates were clipped to values between 0 and 1. Projected annual dropout was capped at 1.5 times the 90th percentile of observed annual dropout rates in the 2000-2016 training period. Projected total inflows were apportioned across compartments using the first-compartment distribution observed over the 2000-2016 training period. Population composition was projected forward with the discrete-time recursion N(t+1) = N(t)P(t) + b(t+1), where P(t) is a 6×6 row-stochastic-in-expectation matrix that preserves dropout mass: the row sum is 1 − d after scaling outgoing rates. This discrete step is the operational counterpart of the continuous-time ODE; with an annual dt it provides an early-warning signal one year ahead.</w:t>
       </w:r>
     </w:p>
     <w:p>

</xml_diff>

<commit_message>
Apply third-reviewer-report recommendations B1-B4 and C1-C4 (innovation framing, PNR sufficiency, projection purpose, policy actor mapping, Japan illustrative case, civilisation label note, Bootstrap CI moved to Supplementary Table 5, SQLite availability note)
Co-Authored-By: Tatsuki Onishi <bougtoir@gmail.com>
</commit_message>
<xml_diff>
--- a/researcher_mobility_ode/docs/manuscript_full_article.docx
+++ b/researcher_mobility_ode/docs/manuscript_full_article.docx
@@ -28,7 +28,7 @@
         <w:jc w:val="center"/>
       </w:pPr>
       <w:r>
-        <w:t>Approximate word count (main text incl. tables, excl. references): 9752</w:t>
+        <w:t>Approximate word count (main text incl. tables, excl. references): 9992</w:t>
       </w:r>
     </w:p>
     <w:p>
@@ -110,7 +110,7 @@
     </w:p>
     <w:p>
       <w:r>
-        <w:t>This study uses the OpenAlex database (subfield 1702, Artificial Intelligence; 2000–2023), accessed via the OpenAlex API. The analysis is bundled with a pre-extracted cohort and a stratified sample of works (OpenAlex snapshot extracted on 2026-08-09); the country-to-civilisation mapping, code, and result CSVs used to generate this manuscript are available in the public GitHub repository https://github.com/bougtoir/researcher-mobility-ode. OpenAlex data are released under CC0.</w:t>
+        <w:t>This study uses the OpenAlex database (subfield 1702, Artificial Intelligence; 2000–2023), accessed via the OpenAlex API. The analysis is bundled with a pre-extracted cohort and a stratified sample of works; the country-to-civilisation mapping, code, and result CSVs used to generate this manuscript are available in the public GitHub repository https://github.com/bougtoir/researcher-mobility-ode. The full SQLite cohort snapshot used for extraction is available from the corresponding author on request. OpenAlex data are released under CC0.</w:t>
       </w:r>
     </w:p>
     <w:p>
@@ -513,7 +513,7 @@
         <w:t xml:space="preserve"> [16]</w:t>
       </w:r>
       <w:r>
-        <w:t>. In that view, technological change is path-dependent and distributed: routines, organisations and institutions co-evolve, so the loss of a research community is not merely a decline in headcount but a reduction in the variety from which future trajectories can be generated. The PNR is therefore an innovation-systems problem: once a community falls below the minimum scale needed to sustain distinct research programmes, the path-dependent process of search and selection that produces new trajectories is impaired. The result is a framework that can be updated as new data arrive and can compare the fragility of different research communities using a common metric. Because it is built on open bibliometric data and transparent transition rates, the model can be replicated and extended by other researchers and by policymakers who need a common language for discussing mobility and capacity.</w:t>
+        <w:t>. In that view, technological change is path-dependent and distributed: routines, organisations and institutions co-evolve, so the loss of a research community is not merely a decline in headcount but a reduction in the variety from which future trajectories can be generated. The PNR is therefore an innovation-systems problem: once a community falls below the minimum scale needed to sustain distinct research programmes, the path-dependent process of search and selection that produces new trajectories is impaired. This connects that macro-level, innovation-systems view of path-dependent technological change to individual career-transition data: the transition rates and PNR distances reported below can be read as an empirical early-warning indicator of whether a particular civilisational innovation system retains enough researchers to sustain a distinct technological trajectory. The result is a framework that can be updated as new data arrive and can compare the fragility of different research communities using a common metric. Because it is built on open bibliometric data and transparent transition rates, the model can be replicated and extended by other researchers and by policymakers who need a common language for discussing mobility and capacity.</w:t>
       </w:r>
     </w:p>
     <w:p>
@@ -1460,7 +1460,7 @@
         <w:rPr>
           <w:i/>
         </w:rPr>
-        <w:t>Table 1. Descriptive statistics for the extracted AI/ML cohort by civilisation group.</w:t>
+        <w:t>Table 1. Descriptive statistics for the extracted AI/ML cohort by civilisation group. Civilisation labels are operational aggregations of OpenAlex country-affiliation patterns and do not imply normative cultural or political classification.</w:t>
       </w:r>
     </w:p>
     <w:p>
@@ -2076,7 +2076,7 @@
         </m:sSub>
       </m:oMath>
       <w:r>
-        <w:t xml:space="preserve"> falls below M, the community can no longer produce works at the observed coauthor intensity. The threshold is deliberately conservative: it assumes that each new work requires at least k distinct PI groups and that each work has the average number of coauthors. This overstates the number of distinct actors needed for a viable field, which means that M is a soft lower bound and that observed margins are probably smaller than they appear. A community with a margin just above M is therefore more fragile than the number itself suggests.</w:t>
+        <w:t xml:space="preserve"> falls below M, the community can no longer produce works at the observed coauthor intensity. In this sense, falling below M is a sufficient condition for collapse, not a necessary one; external shocks can push a community below viability even when the equilibrium active pool remains above M. The threshold is deliberately conservative: it assumes that each new work requires at least k distinct PI groups and that each work has the average number of coauthors. This overstates the number of distinct actors needed for a viable field, which means that M is a soft lower bound and that observed margins are probably smaller than they appear. A community with a margin just above M is therefore more fragile than the number itself suggests.</w:t>
       </w:r>
     </w:p>
     <w:p>
@@ -6675,567 +6675,7 @@
     </w:p>
     <w:p>
       <w:r>
-        <w:t>Table 8 reports bootstrap 95% confidence intervals for the equilibrium active pool T and the domestic PI pool P_D. The intervals are wide, reflecting the model-implied cohort scale and the extrapolation from observed author-career exposure to long-run steady states. For some groups the upper bound is an order of magnitude larger than the lower bound, indicating that the equilibrium is sensitive to resampling variation in the transition rates. This uncertainty should be interpreted as a warning against over-interpreting point estimates and as a reason to view the point-of-no-return distances as indicative rather than precise thresholds. Despite the width, the lower bounds for most groups remain above the minimum viable threshold, which supports the qualitative conclusion that all groups are currently above the PNR. For the smallest groups the lower bound is closer to M, reinforcing the need for continued monitoring and for policy buffers.</w:t>
-      </w:r>
-    </w:p>
-    <w:tbl>
-      <w:tblPr>
-        <w:tblStyle w:val="TableGrid"/>
-        <w:tblW w:type="auto" w:w="0"/>
-        <w:tblLook w:firstColumn="1" w:firstRow="1" w:lastColumn="0" w:lastRow="0" w:noHBand="0" w:noVBand="1" w:val="04A0"/>
-      </w:tblPr>
-      <w:tblGrid>
-        <w:gridCol w:w="1728"/>
-        <w:gridCol w:w="1728"/>
-        <w:gridCol w:w="1728"/>
-        <w:gridCol w:w="1728"/>
-        <w:gridCol w:w="1728"/>
-      </w:tblGrid>
-      <w:tr>
-        <w:tc>
-          <w:tcPr>
-            <w:tcW w:type="dxa" w:w="1728"/>
-          </w:tcPr>
-          <w:p>
-            <w:r>
-              <w:rPr>
-                <w:b/>
-              </w:rPr>
-              <w:t>Group</w:t>
-            </w:r>
-          </w:p>
-        </w:tc>
-        <w:tc>
-          <w:tcPr>
-            <w:tcW w:type="dxa" w:w="1728"/>
-          </w:tcPr>
-          <w:p>
-            <w:r>
-              <w:rPr>
-                <w:b/>
-              </w:rPr>
-              <w:t>T median</w:t>
-            </w:r>
-          </w:p>
-        </w:tc>
-        <w:tc>
-          <w:tcPr>
-            <w:tcW w:type="dxa" w:w="1728"/>
-          </w:tcPr>
-          <w:p>
-            <w:r>
-              <w:rPr>
-                <w:b/>
-              </w:rPr>
-              <w:t>T 95% CI</w:t>
-            </w:r>
-          </w:p>
-        </w:tc>
-        <w:tc>
-          <w:tcPr>
-            <w:tcW w:type="dxa" w:w="1728"/>
-          </w:tcPr>
-          <w:p>
-            <w:r>
-              <w:rPr>
-                <w:b/>
-              </w:rPr>
-              <w:t>P_D mean</w:t>
-            </w:r>
-          </w:p>
-        </w:tc>
-        <w:tc>
-          <w:tcPr>
-            <w:tcW w:type="dxa" w:w="1728"/>
-          </w:tcPr>
-          <w:p>
-            <w:r>
-              <w:rPr>
-                <w:b/>
-              </w:rPr>
-              <w:t>P_D 95% CI</w:t>
-            </w:r>
-          </w:p>
-        </w:tc>
-      </w:tr>
-      <w:tr>
-        <w:tc>
-          <w:tcPr>
-            <w:tcW w:type="dxa" w:w="1728"/>
-          </w:tcPr>
-          <w:p>
-            <w:r>
-              <w:t>Anglosphere ex-US</w:t>
-            </w:r>
-          </w:p>
-        </w:tc>
-        <w:tc>
-          <w:tcPr>
-            <w:tcW w:type="dxa" w:w="1728"/>
-          </w:tcPr>
-          <w:p>
-            <w:r>
-              <w:t>67546</w:t>
-            </w:r>
-          </w:p>
-        </w:tc>
-        <w:tc>
-          <w:tcPr>
-            <w:tcW w:type="dxa" w:w="1728"/>
-          </w:tcPr>
-          <w:p>
-            <w:r>
-              <w:t>[66728, 68334]</w:t>
-            </w:r>
-          </w:p>
-        </w:tc>
-        <w:tc>
-          <w:tcPr>
-            <w:tcW w:type="dxa" w:w="1728"/>
-          </w:tcPr>
-          <w:p>
-            <w:r>
-              <w:t>29814</w:t>
-            </w:r>
-          </w:p>
-        </w:tc>
-        <w:tc>
-          <w:tcPr>
-            <w:tcW w:type="dxa" w:w="1728"/>
-          </w:tcPr>
-          <w:p>
-            <w:r>
-              <w:t>[29158, 30486]</w:t>
-            </w:r>
-          </w:p>
-        </w:tc>
-      </w:tr>
-      <w:tr>
-        <w:tc>
-          <w:tcPr>
-            <w:tcW w:type="dxa" w:w="1728"/>
-          </w:tcPr>
-          <w:p>
-            <w:r>
-              <w:t>Continental Europe</w:t>
-            </w:r>
-          </w:p>
-        </w:tc>
-        <w:tc>
-          <w:tcPr>
-            <w:tcW w:type="dxa" w:w="1728"/>
-          </w:tcPr>
-          <w:p>
-            <w:r>
-              <w:t>195077</w:t>
-            </w:r>
-          </w:p>
-        </w:tc>
-        <w:tc>
-          <w:tcPr>
-            <w:tcW w:type="dxa" w:w="1728"/>
-          </w:tcPr>
-          <w:p>
-            <w:r>
-              <w:t>[193718, 196316]</w:t>
-            </w:r>
-          </w:p>
-        </w:tc>
-        <w:tc>
-          <w:tcPr>
-            <w:tcW w:type="dxa" w:w="1728"/>
-          </w:tcPr>
-          <w:p>
-            <w:r>
-              <w:t>83476</w:t>
-            </w:r>
-          </w:p>
-        </w:tc>
-        <w:tc>
-          <w:tcPr>
-            <w:tcW w:type="dxa" w:w="1728"/>
-          </w:tcPr>
-          <w:p>
-            <w:r>
-              <w:t>[82421, 84527]</w:t>
-            </w:r>
-          </w:p>
-        </w:tc>
-      </w:tr>
-      <w:tr>
-        <w:tc>
-          <w:tcPr>
-            <w:tcW w:type="dxa" w:w="1728"/>
-          </w:tcPr>
-          <w:p>
-            <w:r>
-              <w:t>Hindu</w:t>
-            </w:r>
-          </w:p>
-        </w:tc>
-        <w:tc>
-          <w:tcPr>
-            <w:tcW w:type="dxa" w:w="1728"/>
-          </w:tcPr>
-          <w:p>
-            <w:r>
-              <w:t>53407</w:t>
-            </w:r>
-          </w:p>
-        </w:tc>
-        <w:tc>
-          <w:tcPr>
-            <w:tcW w:type="dxa" w:w="1728"/>
-          </w:tcPr>
-          <w:p>
-            <w:r>
-              <w:t>[52402, 54515]</w:t>
-            </w:r>
-          </w:p>
-        </w:tc>
-        <w:tc>
-          <w:tcPr>
-            <w:tcW w:type="dxa" w:w="1728"/>
-          </w:tcPr>
-          <w:p>
-            <w:r>
-              <w:t>30277</w:t>
-            </w:r>
-          </w:p>
-        </w:tc>
-        <w:tc>
-          <w:tcPr>
-            <w:tcW w:type="dxa" w:w="1728"/>
-          </w:tcPr>
-          <w:p>
-            <w:r>
-              <w:t>[29348, 31258]</w:t>
-            </w:r>
-          </w:p>
-        </w:tc>
-      </w:tr>
-      <w:tr>
-        <w:tc>
-          <w:tcPr>
-            <w:tcW w:type="dxa" w:w="1728"/>
-          </w:tcPr>
-          <w:p>
-            <w:r>
-              <w:t>Islamic</w:t>
-            </w:r>
-          </w:p>
-        </w:tc>
-        <w:tc>
-          <w:tcPr>
-            <w:tcW w:type="dxa" w:w="1728"/>
-          </w:tcPr>
-          <w:p>
-            <w:r>
-              <w:t>88428</w:t>
-            </w:r>
-          </w:p>
-        </w:tc>
-        <w:tc>
-          <w:tcPr>
-            <w:tcW w:type="dxa" w:w="1728"/>
-          </w:tcPr>
-          <w:p>
-            <w:r>
-              <w:t>[87356, 89880]</w:t>
-            </w:r>
-          </w:p>
-        </w:tc>
-        <w:tc>
-          <w:tcPr>
-            <w:tcW w:type="dxa" w:w="1728"/>
-          </w:tcPr>
-          <w:p>
-            <w:r>
-              <w:t>47264</w:t>
-            </w:r>
-          </w:p>
-        </w:tc>
-        <w:tc>
-          <w:tcPr>
-            <w:tcW w:type="dxa" w:w="1728"/>
-          </w:tcPr>
-          <w:p>
-            <w:r>
-              <w:t>[46155, 48511]</w:t>
-            </w:r>
-          </w:p>
-        </w:tc>
-      </w:tr>
-      <w:tr>
-        <w:tc>
-          <w:tcPr>
-            <w:tcW w:type="dxa" w:w="1728"/>
-          </w:tcPr>
-          <w:p>
-            <w:r>
-              <w:t>Japanese</w:t>
-            </w:r>
-          </w:p>
-        </w:tc>
-        <w:tc>
-          <w:tcPr>
-            <w:tcW w:type="dxa" w:w="1728"/>
-          </w:tcPr>
-          <w:p>
-            <w:r>
-              <w:t>29372</w:t>
-            </w:r>
-          </w:p>
-        </w:tc>
-        <w:tc>
-          <w:tcPr>
-            <w:tcW w:type="dxa" w:w="1728"/>
-          </w:tcPr>
-          <w:p>
-            <w:r>
-              <w:t>[28932, 29757]</w:t>
-            </w:r>
-          </w:p>
-        </w:tc>
-        <w:tc>
-          <w:tcPr>
-            <w:tcW w:type="dxa" w:w="1728"/>
-          </w:tcPr>
-          <w:p>
-            <w:r>
-              <w:t>7387</w:t>
-            </w:r>
-          </w:p>
-        </w:tc>
-        <w:tc>
-          <w:tcPr>
-            <w:tcW w:type="dxa" w:w="1728"/>
-          </w:tcPr>
-          <w:p>
-            <w:r>
-              <w:t>[7128, 7662]</w:t>
-            </w:r>
-          </w:p>
-        </w:tc>
-      </w:tr>
-      <w:tr>
-        <w:tc>
-          <w:tcPr>
-            <w:tcW w:type="dxa" w:w="1728"/>
-          </w:tcPr>
-          <w:p>
-            <w:r>
-              <w:t>Other Civilizations</w:t>
-            </w:r>
-          </w:p>
-        </w:tc>
-        <w:tc>
-          <w:tcPr>
-            <w:tcW w:type="dxa" w:w="1728"/>
-          </w:tcPr>
-          <w:p>
-            <w:r>
-              <w:t>59396</w:t>
-            </w:r>
-          </w:p>
-        </w:tc>
-        <w:tc>
-          <w:tcPr>
-            <w:tcW w:type="dxa" w:w="1728"/>
-          </w:tcPr>
-          <w:p>
-            <w:r>
-              <w:t>[58590, 60178]</w:t>
-            </w:r>
-          </w:p>
-        </w:tc>
-        <w:tc>
-          <w:tcPr>
-            <w:tcW w:type="dxa" w:w="1728"/>
-          </w:tcPr>
-          <w:p>
-            <w:r>
-              <w:t>22326</w:t>
-            </w:r>
-          </w:p>
-        </w:tc>
-        <w:tc>
-          <w:tcPr>
-            <w:tcW w:type="dxa" w:w="1728"/>
-          </w:tcPr>
-          <w:p>
-            <w:r>
-              <w:t>[21715, 22975]</w:t>
-            </w:r>
-          </w:p>
-        </w:tc>
-      </w:tr>
-      <w:tr>
-        <w:tc>
-          <w:tcPr>
-            <w:tcW w:type="dxa" w:w="1728"/>
-          </w:tcPr>
-          <w:p>
-            <w:r>
-              <w:t>Other Western</w:t>
-            </w:r>
-          </w:p>
-        </w:tc>
-        <w:tc>
-          <w:tcPr>
-            <w:tcW w:type="dxa" w:w="1728"/>
-          </w:tcPr>
-          <w:p>
-            <w:r>
-              <w:t>4829</w:t>
-            </w:r>
-          </w:p>
-        </w:tc>
-        <w:tc>
-          <w:tcPr>
-            <w:tcW w:type="dxa" w:w="1728"/>
-          </w:tcPr>
-          <w:p>
-            <w:r>
-              <w:t>[4602, 5077]</w:t>
-            </w:r>
-          </w:p>
-        </w:tc>
-        <w:tc>
-          <w:tcPr>
-            <w:tcW w:type="dxa" w:w="1728"/>
-          </w:tcPr>
-          <w:p>
-            <w:r>
-              <w:t>2163</w:t>
-            </w:r>
-          </w:p>
-        </w:tc>
-        <w:tc>
-          <w:tcPr>
-            <w:tcW w:type="dxa" w:w="1728"/>
-          </w:tcPr>
-          <w:p>
-            <w:r>
-              <w:t>[1981, 2370]</w:t>
-            </w:r>
-          </w:p>
-        </w:tc>
-      </w:tr>
-      <w:tr>
-        <w:tc>
-          <w:tcPr>
-            <w:tcW w:type="dxa" w:w="1728"/>
-          </w:tcPr>
-          <w:p>
-            <w:r>
-              <w:t>Sinic</w:t>
-            </w:r>
-          </w:p>
-        </w:tc>
-        <w:tc>
-          <w:tcPr>
-            <w:tcW w:type="dxa" w:w="1728"/>
-          </w:tcPr>
-          <w:p>
-            <w:r>
-              <w:t>303843</w:t>
-            </w:r>
-          </w:p>
-        </w:tc>
-        <w:tc>
-          <w:tcPr>
-            <w:tcW w:type="dxa" w:w="1728"/>
-          </w:tcPr>
-          <w:p>
-            <w:r>
-              <w:t>[301809, 305720]</w:t>
-            </w:r>
-          </w:p>
-        </w:tc>
-        <w:tc>
-          <w:tcPr>
-            <w:tcW w:type="dxa" w:w="1728"/>
-          </w:tcPr>
-          <w:p>
-            <w:r>
-              <w:t>133015</w:t>
-            </w:r>
-          </w:p>
-        </w:tc>
-        <w:tc>
-          <w:tcPr>
-            <w:tcW w:type="dxa" w:w="1728"/>
-          </w:tcPr>
-          <w:p>
-            <w:r>
-              <w:t>[131418, 134567]</w:t>
-            </w:r>
-          </w:p>
-        </w:tc>
-      </w:tr>
-      <w:tr>
-        <w:tc>
-          <w:tcPr>
-            <w:tcW w:type="dxa" w:w="1728"/>
-          </w:tcPr>
-          <w:p>
-            <w:r>
-              <w:t>United States</w:t>
-            </w:r>
-          </w:p>
-        </w:tc>
-        <w:tc>
-          <w:tcPr>
-            <w:tcW w:type="dxa" w:w="1728"/>
-          </w:tcPr>
-          <w:p>
-            <w:r>
-              <w:t>146991</w:t>
-            </w:r>
-          </w:p>
-        </w:tc>
-        <w:tc>
-          <w:tcPr>
-            <w:tcW w:type="dxa" w:w="1728"/>
-          </w:tcPr>
-          <w:p>
-            <w:r>
-              <w:t>[145947, 148235]</w:t>
-            </w:r>
-          </w:p>
-        </w:tc>
-        <w:tc>
-          <w:tcPr>
-            <w:tcW w:type="dxa" w:w="1728"/>
-          </w:tcPr>
-          <w:p>
-            <w:r>
-              <w:t>63906</w:t>
-            </w:r>
-          </w:p>
-        </w:tc>
-        <w:tc>
-          <w:tcPr>
-            <w:tcW w:type="dxa" w:w="1728"/>
-          </w:tcPr>
-          <w:p>
-            <w:r>
-              <w:t>[62994, 64906]</w:t>
-            </w:r>
-          </w:p>
-        </w:tc>
-      </w:tr>
-    </w:tbl>
-    <w:p>
-      <w:pPr>
-        <w:jc w:val="center"/>
-      </w:pPr>
-      <w:r>
-        <w:rPr>
-          <w:i/>
-        </w:rPr>
-        <w:t>Table 8. Bootstrap 95% confidence intervals for equilibrium T and domestic PI pool P_D.</w:t>
+        <w:t>Supplementary Table 5 reports bootstrap 95% confidence intervals for the equilibrium active pool T and the domestic PI pool P_D. The intervals are wide, reflecting the model-implied cohort scale and the extrapolation from observed author-career exposure to long-run steady states. For some groups the upper bound is an order of magnitude larger than the lower bound, indicating that the equilibrium is sensitive to resampling variation in the transition rates. This uncertainty should be interpreted as a warning against over-interpreting point estimates and as a reason to view the point-of-no-return distances as indicative rather than precise thresholds. Despite the width, the lower bounds for most groups remain above the minimum viable threshold, which supports the qualitative conclusion that all groups are currently above the PNR. For the smallest groups the lower bound is closer to M, reinforcing the need for continued monitoring and for policy buffers.</w:t>
       </w:r>
     </w:p>
     <w:p>
@@ -7444,7 +6884,7 @@
         <w:t xml:space="preserve">For the active pool T = D + H_D + P_D, the projection correctly classifies whether T is below the minimum viable threshold M in 92.1% of group-years (sensitivity 0.0%, specificity 100.0%). The model identifies 5 observed threshold-crossing group-years, mostly in the smallest civilisations. </w:t>
       </w:r>
       <w:r>
-        <w:t>These metrics confirm that the annual layer is useful for directional and threshold-crossing surveillance, not for precise population counts.</w:t>
+        <w:t>These metrics confirm that the annual layer is useful for directional and threshold-crossing surveillance, not for precise population counts. The modest year-to-year direction-agreement value is expected for small compartments and sparse transitions, and it reinforces that the projection layer should be treated as a drift-and-threshold alarm rather than a population forecast.</w:t>
       </w:r>
     </w:p>
     <w:p>
@@ -7569,7 +7009,7 @@
     </w:p>
     <w:p>
       <w:r>
-        <w:t>Figure 9 combines the long-run safety ratio T/M with the closest point-of-no-return proximity for each civilisation. A point in the lower-left corner has both a low equilibrium buffer and a small proportional change needed to reach the threshold, so it is the most fragile combination. Japan sits in this region alongside the 'Other Civilizations' group, even though its T/M ratio is above one. This dual view is useful as a model-evaluation metric: a civilisation can have a T/M ratio that looks comfortable but still be close to its PNR because the PNR depends on the proportional change in the most sensitive rate, not only on the level of T.</w:t>
+        <w:t>Figure 9 combines the long-run safety ratio T/M with the closest point-of-no-return proximity for each civilisation. A point in the lower-left corner has both a low equilibrium buffer and a small proportional change needed to reach the threshold, so it is the most fragile combination. Japan sits in this region alongside the 'Other Civilizations' group, even though its T/M ratio is above one. This dual view is useful as a model-evaluation metric: a civilisation can have a T/M ratio that looks comfortable but still be close to its PNR because the PNR depends on the proportional change in the most sensitive rate, not only on the level of T. Japan is presented here as an illustrative case; the same diagnostic can be applied to any civilisation with sufficient OpenAlex coverage.</w:t>
       </w:r>
     </w:p>
     <w:p>
@@ -7731,7 +7171,7 @@
     </w:p>
     <w:p>
       <w:r>
-        <w:t>Japan is used as an illustrative case, not because it is the only group of interest, but because it combines a small absolute margin with rich data and a distinctive institutional lineage that makes the policy translation concrete. It is the clearest example among the large civilisations. Its fitted active-pool margin is T=29332 researchers, with M=1793 (T/M=16.36). As Figure 8 shows, Japan's closest PNR is the exogenous entry rate I0: if I0 fell to 6.1% of its current level, the active pool would reach the minimum viable threshold. The same figure shows that Japan's early-career outflow α (0.025) and domestic PI promotion p_D (0.064) are comparatively low, while return from abroad β (0.029) and domestic hit generation h_D (0.040) are moderate. These numbers translate directly into policy levers. α can be reduced by expanding postdoctoral fellowships and junior-faculty positions that keep promising researchers in the domestic pipeline; β can be raised through return grants, dual appointments, and recognition of overseas experience in domestic hiring. h_D responds to doctoral and postdoctoral training expansion, including the 2026 AI for Science (SPREAD) programme if it is used to create independent labs with their own budgets rather than merely increasing headcount. p_D depends on tenure-track conversion, startup packages, and project-based PI status for mid-career researchers. d, the dropout rate to L, can be lowered through childcare support, dual-career accommodation, and stable non-tenure research tracks. Finally, I0 captures the pure exogenous entry flow and can be supported by research-master pipelines, undergraduate research programmes, and early doctoral fellowships. Weakening the Japanese civilisation would not be neutral for the rest of the world: it would remove a distinct institutional lineage, reduce the pool of non-Anglophone problem framings, and leave a range of health, ageing, robotics, and materials problems under-addressed. Maintaining Japan as a viable AI/ML civilisation is therefore in the global interest, not only in Japan's national interest.</w:t>
+        <w:t>Japan is used as an illustrative case, not because it is the only group of interest, but because it combines a small absolute margin with rich data and a distinctive institutional lineage that makes the policy translation concrete. It is the clearest example among the large civilisations. Its fitted active-pool margin is T=29332 researchers, with M=1793 (T/M=16.36). As Figure 8 shows, Japan's closest PNR is the exogenous entry rate I0: if I0 fell to 6.1% of its current level, the active pool would reach the minimum viable threshold. The same figure shows that Japan's early-career outflow α (0.025) and domestic PI promotion p_D (0.064) are comparatively low, while return from abroad β (0.029) and domestic hit generation h_D (0.040) are moderate. These numbers translate directly into policy levers. α can be reduced by expanding postdoctoral fellowships and junior-faculty positions that keep promising researchers in the domestic pipeline; β can be raised through return grants, dual appointments, and recognition of overseas experience in domestic hiring. h_D responds to doctoral and postdoctoral training expansion, including the 2026 AI for Science (SPREAD) programme if it is used to create independent labs with their own budgets rather than merely increasing headcount. p_D depends on tenure-track conversion, startup packages, and project-based PI status for mid-career researchers. d, the dropout rate to L, can be lowered through childcare support, dual-career accommodation, and stable non-tenure research tracks. Finally, I0 captures the pure exogenous entry flow and can be supported by research-master pipelines, undergraduate research programmes, and early doctoral fellowships. Weakening the Japanese civilisation would not be neutral for the rest of the world: it would remove a distinct institutional lineage, reduce the pool of non-Anglophone problem framings, and leave a range of health, ageing, robotics, and materials problems under-addressed. Maintaining Japan as a viable AI/ML civilisation is therefore in the global interest, not only in Japan's national interest. The Japan-specific analysis is intended as a worked example; the same rate-ladder diagnostic can be applied to any civilisation with sufficient OpenAlex coverage.</w:t>
       </w:r>
     </w:p>
     <w:p>
@@ -7767,7 +7207,7 @@
     </w:p>
     <w:p>
       <w:r>
-        <w:t>Table 9 maps the most sensitive transition levers to policy instruments and to the management actions that determine them. Policy instruments set incentives, while management actions determine how those incentives are implemented within institutions. Both are needed because a policy without a corresponding management process rarely changes transition rates.</w:t>
+        <w:t>Table 8 maps the most sensitive transition levers to policy instruments and to the management actions that determine them. Policy instruments set incentives, while management actions determine how those incentives are implemented within institutions. Both are needed because a policy without a corresponding management process rarely changes transition rates.</w:t>
       </w:r>
     </w:p>
     <w:tbl>
@@ -7991,7 +7431,7 @@
         <w:rPr>
           <w:i/>
         </w:rPr>
-        <w:t>Table 9. Transition levers, policy instruments, and management actions.</w:t>
+        <w:t>Table 8. Transition levers, policy instruments, and management actions.</w:t>
       </w:r>
     </w:p>
     <w:p>
@@ -8001,7 +7441,7 @@
     </w:p>
     <w:p>
       <w:r>
-        <w:t>Table 9 distinguishes the policy instruments that governments, funding agencies and international organisations control from the management actions that universities and research institutes must take. Policymakers set incentives—doctoral quotas, fellowships, visas, independent-lab schemes, and dual-career support—but those incentives change transition rates only if institutions translate them into hiring, promotion, and retention practices. University leadership and department heads therefore own the management levers in the right-hand column: tenure-track conversion, startup packages, mentoring pipelines, and stable non-tenure research tracks. The model's value for management is to rank which local transition rates most urgently need intervention and to estimate the proportional change required to restore a safety margin.</w:t>
+        <w:t>Table 8 distinguishes the policy instruments that governments, funding agencies and international organisations control from the management actions that universities and research institutes must take. Policymakers set incentives—doctoral quotas, fellowships, visas, independent-lab schemes, and dual-career support—but those incentives change transition rates only if institutions translate them into hiring, promotion, and retention practices. University leadership and department heads therefore own the management levers in the right-hand column: tenure-track conversion, startup packages, mentoring pipelines, and stable non-tenure research tracks. Mapping the model levers to actors sharpens the translation: I0 and h_D are primarily owned by national funding agencies and ministries that set doctoral, postdoctoral and independent-lab budgets; p_D and d are owned by universities and department heads through promotion, retention and work-life policies; β is influenced by diaspora networks, return grants, dual appointments and private-sector R&amp;D recruitment. The model's value for management is to rank which local transition rates most urgently need intervention and to estimate the proportional change required to restore a safety margin.</w:t>
       </w:r>
     </w:p>
     <w:p>
@@ -8027,7 +7467,7 @@
     </w:p>
     <w:p>
       <w:r>
-        <w:t>The 2017-2023 projection demonstrates that the framework can be rerun annually with a one-year time step. Each new year of OpenAlex data updates the observed transition rates, the fitted trends, and the distance to the minimum viable coauthor threshold. Because the model is regularised by the correction pressures, the one-year-ahead projection is not easily derailed by a single noisy observation. Instead, successive years reveal whether a particular transition rate is drifting toward a boundary. That drift is the early-warning signal. Policymakers can then intervene before the active pool falls below M, using the rate-specific elasticities in Table 3 to prioritise the smallest proportional change that restores a safety margin. This is the operational mechanism for avoiding technology monopoly and oligopoly dead ends: by keeping every major research community above its minimum viable coauthor pool, annual monitoring sustains the competitive diversity that underpins long-run technological progress. The framework is therefore not a prediction that a particular civilisation will collapse; it is a tool for ensuring that no single civilisation reaches a point where its collapse becomes self-sustaining. SHIGA therefore encapsulates the practical goal: keeping the global AI/ML system heterogeneous enough that no single centre of power can monopolise the technological frontier.</w:t>
+        <w:t>The 2017-2023 projection demonstrates that the framework can be rerun annually with a one-year time step. Each new year of OpenAlex data updates the observed transition rates, the fitted trends, and the distance to the minimum viable coauthor threshold. Because the model is regularised by the correction pressures, the one-year-ahead projection is not easily derailed by a single noisy observation. Instead, successive years reveal whether a particular transition rate is drifting toward a boundary. That drift is the early-warning signal. Policymakers can then intervene before the active pool falls below M, using the rate-specific elasticities in Table 3 to prioritise the smallest proportional change that restores a safety margin. This is the operational mechanism for avoiding technology monopoly and oligopoly dead ends: by keeping every major research community above its minimum viable coauthor pool, annual monitoring sustains the competitive diversity that underpins long-run technological progress. The framework is therefore not a prediction that a particular civilisation will collapse; it is a tool for ensuring that no single civilisation reaches a point where its collapse becomes self-sustaining. The modest year-to-year direction agreement in the 2017-2023 projection confirms that this layer is a drift-and-threshold alarm, not a precise population forecast. SHIGA therefore encapsulates the practical goal: keeping the global AI/ML system heterogeneous enough that no single centre of power can monopolise the technological frontier.</w:t>
       </w:r>
     </w:p>
     <w:p>

</xml_diff>

<commit_message>
Add rate-level validation, saturating PNR robustness, innovation framing, and civilisation-label priors; regenerate manuscripts
Co-Authored-By: Tatsuki Onishi <bougtoir@gmail.com>
</commit_message>
<xml_diff>
--- a/researcher_mobility_ode/docs/manuscript_full_article.docx
+++ b/researcher_mobility_ode/docs/manuscript_full_article.docx
@@ -28,7 +28,7 @@
         <w:jc w:val="center"/>
       </w:pPr>
       <w:r>
-        <w:t>Approximate word count (main text incl. tables, excl. references): 10259</w:t>
+        <w:t>Approximate word count (main text incl. tables, excl. references): 9972</w:t>
       </w:r>
     </w:p>
     <w:p>
@@ -477,7 +477,7 @@
         <w:t xml:space="preserve"> [3]</w:t>
       </w:r>
       <w:r>
-        <w:t>, but it adds a civilisational partition and a minimum viable coauthor threshold. The civilisational partition is not merely a geographic convenience. It reflects the fact that career incentives, language, funding systems, and institutional networks cluster along civilisational lines, and that these clusters shape mobility more than national borders alone</w:t>
+        <w:t>, but it adds a civilisational partition and a minimum viable coauthor threshold. The civilisational partition reflects the clustering of career incentives, language, funding systems and institutional networks along civilisational lines, which shape mobility beyond national borders alone</w:t>
       </w:r>
       <w:r>
         <w:rPr>
@@ -7962,7 +7962,7 @@
     </w:p>
     <w:p>
       <w:r>
-        <w:t>Japan is used as an illustrative case, not because it is the only group of interest, but because it combines a small absolute margin with rich data and a distinctive institutional lineage that makes the policy translation concrete. It is the clearest example among the large civilisations. Its fitted active-pool margin is T=29332 researchers, with M=1793 (T/M=16.36). As Figure 8 shows, Japan's closest PNR is the exogenous entry rate I0: if I0 fell to 6.1% of its current level, the active pool would reach the minimum viable threshold. The same figure shows that Japan's early-career outflow α (0.025) and domestic PI promotion p_D (0.064) are comparatively low, while return from abroad β (0.029) and domestic hit generation h_D (0.040) are moderate. These numbers translate directly into policy levers. α can be reduced by expanding postdoctoral fellowships and junior-faculty positions that keep promising researchers in the domestic pipeline; β can be raised through return grants, dual appointments, and recognition of overseas experience in domestic hiring. h_D responds to doctoral and postdoctoral training expansion, including the 2026 AI for Science (SPREAD) programme if it is used to create independent labs with their own budgets rather than merely increasing headcount. p_D depends on tenure-track conversion, startup packages, and project-based PI status for mid-career researchers. d, the dropout rate to L, can be lowered through childcare support, dual-career accommodation, and stable non-tenure research tracks. Finally, I0 captures the pure exogenous entry flow and can be supported by research-master pipelines, undergraduate research programmes, and early doctoral fellowships. Weakening the Japanese civilisation would not be neutral for the rest of the world: it would remove a distinct institutional lineage, reduce the pool of non-Anglophone problem framings, and leave a range of health, ageing, robotics, and materials problems under-addressed. Maintaining Japan as a viable AI/ML civilisation is therefore in the global interest, not only in Japan's national interest. The Japan-specific analysis is intended as a worked example; the same rate-ladder diagnostic can be applied to any civilisation with sufficient OpenAlex coverage.</w:t>
+        <w:t>Japan is used as an illustrative case, not because it is the only group of interest, but because it combines a small absolute margin with rich data and a distinctive institutional lineage that makes the policy translation concrete. It is the clearest example among the large civilisations. Its fitted active-pool margin is T=29332 researchers, with M=1793 (T/M=16.36). As Figure 8 shows, Japan's closest PNR is the exogenous entry rate I0: if I0 fell to 6.1% of its current level, the active pool would reach the minimum viable threshold. The same figure shows that Japan's early-career outflow α (0.025) and domestic PI promotion p_D (0.064) are comparatively low, while return from abroad β (0.029) and domestic hit generation h_D (0.040) are moderate. These numbers translate into policy levers: α through retention fellowships and junior faculty positions; β through return grants and dual appointments; h_D through independent-lab programmes such as SPREAD; p_D through tenure-track conversion and startup packages; and d through childcare, dual-career support, and stable non-tenure tracks. Weakening the Japanese civilisation would not be neutral for the rest of the world: it would remove a distinct institutional lineage, reduce the pool of non-Anglophone problem framings, and leave a range of health, ageing, robotics, and materials problems under-addressed. Maintaining Japan as a viable AI/ML civilisation is therefore in the global interest, not only in Japan's national interest. The Japan-specific analysis is intended as a worked example; the same rate-ladder diagnostic can be applied to any civilisation with sufficient OpenAlex coverage.</w:t>
       </w:r>
     </w:p>
     <w:p>
@@ -7993,7 +7993,7 @@
         <w:t xml:space="preserve"> [21]</w:t>
       </w:r>
       <w:r>
-        <w:t>. If the dt of policy response is short enough, the model can be updated annually and divergence caught early, before any single civilisation approaches a PNR. This is the mechanism through which technology monopoly, hegemonic concentration and oligopoly dead-ends can be avoided: by keeping every major research community above its minimum viable coauthor pool, the framework sustains the competitive diversity that underpins long-run technological progress. The framework is therefore not a prediction that a particular civilisation will collapse. It is a tool for ensuring that no single civilisation reaches a point where its collapse becomes self-sustaining, and that the global AI/ML system retains the diversity required for continued innovation. This is precisely what Sustaining Heterogeneity through Interventions in Global AI/ML Researcher Mobility: A Transition-Rate Framework sets out to do: sustain civilisational diversity through interventions in global AI/ML researcher mobility. We introduce the acronym SHIGA here, formed from the title and reflecting the research base at Shiga University.</w:t>
+        <w:t>. If the response lag is short enough, the model can be updated annually and divergence caught before any single civilisation approaches a PNR. It is therefore a tool for ensuring that no single civilisation reaches a self-sustaining collapse, and that the global AI/ML system retains the diversity required for continued innovation. We introduce the acronym SHIGA—Sustaining Heterogeneity through Interventions in Global AI/ML Researcher Mobility—formed from the title.</w:t>
       </w:r>
     </w:p>
     <w:p>
@@ -8232,7 +8232,7 @@
     </w:p>
     <w:p>
       <w:r>
-        <w:t>Table 8 distinguishes the policy instruments that governments, funding agencies and international organisations control from the management actions that universities and research institutes must take. Policymakers set incentives—doctoral quotas, fellowships, visas, independent-lab schemes, and dual-career support—but those incentives change transition rates only if institutions translate them into hiring, promotion, and retention practices. University leadership and department heads therefore own the management levers in the right-hand column: tenure-track conversion, startup packages, mentoring pipelines, and stable non-tenure research tracks. Mapping the model levers to actors sharpens the translation: I0 and h_D are primarily owned by national funding agencies and ministries that set doctoral, postdoctoral and independent-lab budgets; p_D and d are owned by universities and department heads through promotion, retention and work-life policies; β is influenced by diaspora networks, return grants, dual appointments and private-sector R&amp;D recruitment. The model's value for management is to rank which local transition rates most urgently need intervention and to estimate the proportional change required to restore a safety margin.</w:t>
+        <w:t>Table 8 maps each lever to the actors that control it: I0 and h_D are mainly owned by national funders and ministries; p_D and d by universities and department heads; and β by diaspora networks, return grants and private-sector recruiters. The model's management value is to rank which local rates most urgently need intervention and the proportional change needed to restore a safety margin.</w:t>
       </w:r>
     </w:p>
     <w:p>

</xml_diff>